<commit_message>
Reprice again: 127 built, 28 remaining
Recounted off the working tree at 3fe7ac2: 466 tests in 26 files, 19,104
hand-written lines, 26 business-logic modules.

Two remaining lines shrank rather than moved. The database is five days
instead of six because concurrent-write safety is no longer part of it —
the JSON store no longer loses an edit, so what is left is a schema and
migrations. The accessibility audit is three instead of four, and renamed:
the contrast maths and the static scans are done, and what remains is a
person with a screen reader, which is not something a test replaces.

The end-to-end total is unchanged at 155 days. That is the point of tracking
both halves — work moved from one column to the other rather than appearing.

Co-Authored-By: Claude Opus 5 <noreply@anthropic.com>
Claude-Session: https://claude.ai/code/session_01B2xsFCpQEfEHuTCkYzyD13
</commit_message>
<xml_diff>
--- a/WEBSITE_COSTINGS.docx
+++ b/WEBSITE_COSTINGS.docx
@@ -449,7 +449,7 @@
                 <w:sz w:val="20"/>
                 <w:szCs w:val="20"/>
               </w:rPr>
-              <w:t xml:space="preserve">8090a7e</w:t>
+              <w:t xml:space="preserve">3fe7ac2</w:t>
             </w:r>
           </w:p>
         </w:tc>
@@ -1415,7 +1415,7 @@
                 <w:sz w:val="20"/>
                 <w:szCs w:val="20"/>
               </w:rPr>
-              <w:t xml:space="preserve">24</w:t>
+              <w:t xml:space="preserve">26</w:t>
             </w:r>
           </w:p>
         </w:tc>
@@ -1527,7 +1527,7 @@
                 <w:sz w:val="20"/>
                 <w:szCs w:val="20"/>
               </w:rPr>
-              <w:t xml:space="preserve">425</w:t>
+              <w:t xml:space="preserve">466</w:t>
             </w:r>
           </w:p>
         </w:tc>
@@ -1563,7 +1563,7 @@
                 <w:sz w:val="20"/>
                 <w:szCs w:val="20"/>
               </w:rPr>
-              <w:t xml:space="preserve">In 23 files; all passing</w:t>
+              <w:t xml:space="preserve">In 26 files; all passing</w:t>
             </w:r>
           </w:p>
         </w:tc>
@@ -1640,7 +1640,7 @@
                 <w:sz w:val="20"/>
                 <w:szCs w:val="20"/>
               </w:rPr>
-              <w:t xml:space="preserve">18,232</w:t>
+              <w:t xml:space="preserve">19,104</w:t>
             </w:r>
           </w:p>
         </w:tc>
@@ -1677,7 +1677,7 @@
                 <w:sz w:val="20"/>
                 <w:szCs w:val="20"/>
               </w:rPr>
-              <w:t xml:space="preserve">Application 7,965 · tests 5,479 · review build 2,241 · data and tooling 2,037 · shared packages 510</w:t>
+              <w:t xml:space="preserve">Application 8,157 · tests 6,157 · review build 2,241 · data and tooling 2,039 · shared packages 510</w:t>
             </w:r>
           </w:p>
         </w:tc>
@@ -1865,7 +1865,7 @@
                 <w:sz w:val="20"/>
                 <w:szCs w:val="20"/>
               </w:rPr>
-              <w:t xml:space="preserve">25</w:t>
+              <w:t xml:space="preserve">28</w:t>
             </w:r>
           </w:p>
         </w:tc>
@@ -3770,7 +3770,7 @@
                 <w:sz w:val="20"/>
                 <w:szCs w:val="20"/>
               </w:rPr>
-              <w:t xml:space="preserve">425 passing</w:t>
+              <w:t xml:space="preserve">466 passing</w:t>
             </w:r>
           </w:p>
         </w:tc>
@@ -3807,7 +3807,7 @@
                 <w:sz w:val="20"/>
                 <w:szCs w:val="20"/>
               </w:rPr>
-              <w:t xml:space="preserve">23 files, run against route handlers where the risk is</w:t>
+              <w:t xml:space="preserve">26 files, including four real worker processes racing on one file</w:t>
             </w:r>
           </w:p>
         </w:tc>
@@ -7801,7 +7801,6 @@
               <w:bottom w:val="single" w:color="D6CFC6" w:sz="4"/>
               <w:right w:val="single" w:color="D6CFC6" w:sz="4"/>
             </w:tcBorders>
-            <w:shd w:fill="FCE8EB" w:color="auto" w:val="clear"/>
             <w:tcMar>
               <w:top w:type="dxa" w:w="90"/>
               <w:left w:type="dxa" w:w="130"/>
@@ -7814,6 +7813,42 @@
             <w:pPr>
               <w:spacing w:after="0" w:line="240"/>
               <w:jc w:val="center"/>
+            </w:pPr>
+            <w:r>
+              <w:rPr>
+                <w:rFonts w:ascii="Calibri" w:cs="Calibri" w:eastAsia="Calibri" w:hAnsi="Calibri"/>
+                <w:b w:val="false"/>
+                <w:bCs w:val="false"/>
+                <w:i w:val="false"/>
+                <w:iCs w:val="false"/>
+                <w:color w:val="221E1F"/>
+                <w:sz w:val="20"/>
+                <w:szCs w:val="20"/>
+              </w:rPr>
+              <w:t xml:space="preserve">17</w:t>
+            </w:r>
+          </w:p>
+        </w:tc>
+        <w:tc>
+          <w:tcPr>
+            <w:tcW w:type="dxa" w:w="3084"/>
+            <w:tcBorders>
+              <w:top w:val="single" w:color="D6CFC6" w:sz="4"/>
+              <w:left w:val="single" w:color="D6CFC6" w:sz="4"/>
+              <w:bottom w:val="single" w:color="D6CFC6" w:sz="4"/>
+              <w:right w:val="single" w:color="D6CFC6" w:sz="4"/>
+            </w:tcBorders>
+            <w:tcMar>
+              <w:top w:type="dxa" w:w="90"/>
+              <w:left w:type="dxa" w:w="130"/>
+              <w:bottom w:type="dxa" w:w="90"/>
+              <w:right w:type="dxa" w:w="130"/>
+            </w:tcMar>
+            <w:vAlign w:val="center"/>
+          </w:tcPr>
+          <w:p>
+            <w:pPr>
+              <w:spacing w:after="0" w:line="240"/>
             </w:pPr>
             <w:r>
               <w:rPr>
@@ -7826,7 +7861,120 @@
                 <w:sz w:val="20"/>
                 <w:szCs w:val="20"/>
               </w:rPr>
-              <w:t xml:space="preserve"/>
+              <w:t xml:space="preserve">Concurrent-write safety</w:t>
+            </w:r>
+          </w:p>
+        </w:tc>
+        <w:tc>
+          <w:tcPr>
+            <w:tcW w:type="dxa" w:w="5108"/>
+            <w:tcBorders>
+              <w:top w:val="single" w:color="D6CFC6" w:sz="4"/>
+              <w:left w:val="single" w:color="D6CFC6" w:sz="4"/>
+              <w:bottom w:val="single" w:color="D6CFC6" w:sz="4"/>
+              <w:right w:val="single" w:color="D6CFC6" w:sz="4"/>
+            </w:tcBorders>
+            <w:tcMar>
+              <w:top w:type="dxa" w:w="90"/>
+              <w:left w:type="dxa" w:w="130"/>
+              <w:bottom w:type="dxa" w:w="90"/>
+              <w:right w:type="dxa" w:w="130"/>
+            </w:tcMar>
+            <w:vAlign w:val="center"/>
+          </w:tcPr>
+          <w:p>
+            <w:pPr>
+              <w:spacing w:after="0" w:line="240"/>
+            </w:pPr>
+            <w:r>
+              <w:rPr>
+                <w:rFonts w:ascii="Calibri" w:cs="Calibri" w:eastAsia="Calibri" w:hAnsi="Calibri"/>
+                <w:b w:val="false"/>
+                <w:bCs w:val="false"/>
+                <w:i w:val="false"/>
+                <w:iCs w:val="false"/>
+                <w:color w:val="221E1F"/>
+                <w:sz w:val="20"/>
+                <w:szCs w:val="20"/>
+              </w:rPr>
+              <w:t xml:space="preserve">Cross-process lock closing the read-modify-write race the JSON store shipped with, proved by four real worker processes and an unlocked control</w:t>
+            </w:r>
+          </w:p>
+        </w:tc>
+        <w:tc>
+          <w:tcPr>
+            <w:tcW w:type="dxa" w:w="964"/>
+            <w:tcBorders>
+              <w:top w:val="single" w:color="D6CFC6" w:sz="4"/>
+              <w:left w:val="single" w:color="D6CFC6" w:sz="4"/>
+              <w:bottom w:val="single" w:color="D6CFC6" w:sz="4"/>
+              <w:right w:val="single" w:color="D6CFC6" w:sz="4"/>
+            </w:tcBorders>
+            <w:tcMar>
+              <w:top w:type="dxa" w:w="90"/>
+              <w:left w:type="dxa" w:w="130"/>
+              <w:bottom w:type="dxa" w:w="90"/>
+              <w:right w:type="dxa" w:w="130"/>
+            </w:tcMar>
+            <w:vAlign w:val="center"/>
+          </w:tcPr>
+          <w:p>
+            <w:pPr>
+              <w:spacing w:after="0" w:line="240"/>
+              <w:jc w:val="right"/>
+            </w:pPr>
+            <w:r>
+              <w:rPr>
+                <w:rFonts w:ascii="Calibri" w:cs="Calibri" w:eastAsia="Calibri" w:hAnsi="Calibri"/>
+                <w:b w:val="false"/>
+                <w:bCs w:val="false"/>
+                <w:i w:val="false"/>
+                <w:iCs w:val="false"/>
+                <w:color w:val="221E1F"/>
+                <w:sz w:val="20"/>
+                <w:szCs w:val="20"/>
+              </w:rPr>
+              <w:t xml:space="preserve">6</w:t>
+            </w:r>
+          </w:p>
+        </w:tc>
+      </w:tr>
+      <w:tr>
+        <w:tc>
+          <w:tcPr>
+            <w:tcW w:type="dxa" w:w="482"/>
+            <w:tcBorders>
+              <w:top w:val="single" w:color="D6CFC6" w:sz="4"/>
+              <w:left w:val="single" w:color="D6CFC6" w:sz="4"/>
+              <w:bottom w:val="single" w:color="D6CFC6" w:sz="4"/>
+              <w:right w:val="single" w:color="D6CFC6" w:sz="4"/>
+            </w:tcBorders>
+            <w:shd w:fill="F7F5F2" w:color="auto" w:val="clear"/>
+            <w:tcMar>
+              <w:top w:type="dxa" w:w="90"/>
+              <w:left w:type="dxa" w:w="130"/>
+              <w:bottom w:type="dxa" w:w="90"/>
+              <w:right w:type="dxa" w:w="130"/>
+            </w:tcMar>
+            <w:vAlign w:val="center"/>
+          </w:tcPr>
+          <w:p>
+            <w:pPr>
+              <w:spacing w:after="0" w:line="240"/>
+              <w:jc w:val="center"/>
+            </w:pPr>
+            <w:r>
+              <w:rPr>
+                <w:rFonts w:ascii="Calibri" w:cs="Calibri" w:eastAsia="Calibri" w:hAnsi="Calibri"/>
+                <w:b w:val="false"/>
+                <w:bCs w:val="false"/>
+                <w:i w:val="false"/>
+                <w:iCs w:val="false"/>
+                <w:color w:val="221E1F"/>
+                <w:sz w:val="20"/>
+                <w:szCs w:val="20"/>
+              </w:rPr>
+              <w:t xml:space="preserve">18</w:t>
             </w:r>
           </w:p>
         </w:tc>
@@ -7839,7 +7987,7 @@
               <w:bottom w:val="single" w:color="D6CFC6" w:sz="4"/>
               <w:right w:val="single" w:color="D6CFC6" w:sz="4"/>
             </w:tcBorders>
-            <w:shd w:fill="FCE8EB" w:color="auto" w:val="clear"/>
+            <w:shd w:fill="F7F5F2" w:color="auto" w:val="clear"/>
             <w:tcMar>
               <w:top w:type="dxa" w:w="90"/>
               <w:left w:type="dxa" w:w="130"/>
@@ -7863,7 +8011,7 @@
                 <w:sz w:val="20"/>
                 <w:szCs w:val="20"/>
               </w:rPr>
-              <w:t xml:space="preserve">Total</w:t>
+              <w:t xml:space="preserve">Accessibility and deployment</w:t>
             </w:r>
           </w:p>
         </w:tc>
@@ -7876,6 +8024,83 @@
               <w:bottom w:val="single" w:color="D6CFC6" w:sz="4"/>
               <w:right w:val="single" w:color="D6CFC6" w:sz="4"/>
             </w:tcBorders>
+            <w:shd w:fill="F7F5F2" w:color="auto" w:val="clear"/>
+            <w:tcMar>
+              <w:top w:type="dxa" w:w="90"/>
+              <w:left w:type="dxa" w:w="130"/>
+              <w:bottom w:type="dxa" w:w="90"/>
+              <w:right w:type="dxa" w:w="130"/>
+            </w:tcMar>
+            <w:vAlign w:val="center"/>
+          </w:tcPr>
+          <w:p>
+            <w:pPr>
+              <w:spacing w:after="0" w:line="240"/>
+            </w:pPr>
+            <w:r>
+              <w:rPr>
+                <w:rFonts w:ascii="Calibri" w:cs="Calibri" w:eastAsia="Calibri" w:hAnsi="Calibri"/>
+                <w:b w:val="false"/>
+                <w:bCs w:val="false"/>
+                <w:i w:val="false"/>
+                <w:iCs w:val="false"/>
+                <w:color w:val="221E1F"/>
+                <w:sz w:val="20"/>
+                <w:szCs w:val="20"/>
+              </w:rPr>
+              <w:t xml:space="preserve">WCAG contrast maths with the palette pairings held to it, static scans of markup and components, environment template checked against the code in both directions</w:t>
+            </w:r>
+          </w:p>
+        </w:tc>
+        <w:tc>
+          <w:tcPr>
+            <w:tcW w:type="dxa" w:w="964"/>
+            <w:tcBorders>
+              <w:top w:val="single" w:color="D6CFC6" w:sz="4"/>
+              <w:left w:val="single" w:color="D6CFC6" w:sz="4"/>
+              <w:bottom w:val="single" w:color="D6CFC6" w:sz="4"/>
+              <w:right w:val="single" w:color="D6CFC6" w:sz="4"/>
+            </w:tcBorders>
+            <w:shd w:fill="F7F5F2" w:color="auto" w:val="clear"/>
+            <w:tcMar>
+              <w:top w:type="dxa" w:w="90"/>
+              <w:left w:type="dxa" w:w="130"/>
+              <w:bottom w:type="dxa" w:w="90"/>
+              <w:right w:type="dxa" w:w="130"/>
+            </w:tcMar>
+            <w:vAlign w:val="center"/>
+          </w:tcPr>
+          <w:p>
+            <w:pPr>
+              <w:spacing w:after="0" w:line="240"/>
+              <w:jc w:val="right"/>
+            </w:pPr>
+            <w:r>
+              <w:rPr>
+                <w:rFonts w:ascii="Calibri" w:cs="Calibri" w:eastAsia="Calibri" w:hAnsi="Calibri"/>
+                <w:b w:val="false"/>
+                <w:bCs w:val="false"/>
+                <w:i w:val="false"/>
+                <w:iCs w:val="false"/>
+                <w:color w:val="221E1F"/>
+                <w:sz w:val="20"/>
+                <w:szCs w:val="20"/>
+              </w:rPr>
+              <w:t xml:space="preserve">7</w:t>
+            </w:r>
+          </w:p>
+        </w:tc>
+      </w:tr>
+      <w:tr>
+        <w:tc>
+          <w:tcPr>
+            <w:tcW w:type="dxa" w:w="482"/>
+            <w:tcBorders>
+              <w:top w:val="single" w:color="D6CFC6" w:sz="4"/>
+              <w:left w:val="single" w:color="D6CFC6" w:sz="4"/>
+              <w:bottom w:val="single" w:color="D6CFC6" w:sz="4"/>
+              <w:right w:val="single" w:color="D6CFC6" w:sz="4"/>
+            </w:tcBorders>
             <w:shd w:fill="FCE8EB" w:color="auto" w:val="clear"/>
             <w:tcMar>
               <w:top w:type="dxa" w:w="90"/>
@@ -7888,6 +8113,7 @@
           <w:p>
             <w:pPr>
               <w:spacing w:after="0" w:line="240"/>
+              <w:jc w:val="center"/>
             </w:pPr>
             <w:r>
               <w:rPr>
@@ -7900,13 +8126,13 @@
                 <w:sz w:val="20"/>
                 <w:szCs w:val="20"/>
               </w:rPr>
-              <w:t xml:space="preserve">Delivered scope</w:t>
-            </w:r>
-          </w:p>
-        </w:tc>
-        <w:tc>
-          <w:tcPr>
-            <w:tcW w:type="dxa" w:w="964"/>
+              <w:t xml:space="preserve"/>
+            </w:r>
+          </w:p>
+        </w:tc>
+        <w:tc>
+          <w:tcPr>
+            <w:tcW w:type="dxa" w:w="3084"/>
             <w:tcBorders>
               <w:top w:val="single" w:color="D6CFC6" w:sz="4"/>
               <w:left w:val="single" w:color="D6CFC6" w:sz="4"/>
@@ -7925,7 +8151,6 @@
           <w:p>
             <w:pPr>
               <w:spacing w:after="0" w:line="240"/>
-              <w:jc w:val="right"/>
             </w:pPr>
             <w:r>
               <w:rPr>
@@ -7938,7 +8163,82 @@
                 <w:sz w:val="20"/>
                 <w:szCs w:val="20"/>
               </w:rPr>
-              <w:t xml:space="preserve">114</w:t>
+              <w:t xml:space="preserve">Total</w:t>
+            </w:r>
+          </w:p>
+        </w:tc>
+        <w:tc>
+          <w:tcPr>
+            <w:tcW w:type="dxa" w:w="5108"/>
+            <w:tcBorders>
+              <w:top w:val="single" w:color="D6CFC6" w:sz="4"/>
+              <w:left w:val="single" w:color="D6CFC6" w:sz="4"/>
+              <w:bottom w:val="single" w:color="D6CFC6" w:sz="4"/>
+              <w:right w:val="single" w:color="D6CFC6" w:sz="4"/>
+            </w:tcBorders>
+            <w:shd w:fill="FCE8EB" w:color="auto" w:val="clear"/>
+            <w:tcMar>
+              <w:top w:type="dxa" w:w="90"/>
+              <w:left w:type="dxa" w:w="130"/>
+              <w:bottom w:type="dxa" w:w="90"/>
+              <w:right w:type="dxa" w:w="130"/>
+            </w:tcMar>
+            <w:vAlign w:val="center"/>
+          </w:tcPr>
+          <w:p>
+            <w:pPr>
+              <w:spacing w:after="0" w:line="240"/>
+            </w:pPr>
+            <w:r>
+              <w:rPr>
+                <w:rFonts w:ascii="Calibri" w:cs="Calibri" w:eastAsia="Calibri" w:hAnsi="Calibri"/>
+                <w:b/>
+                <w:bCs/>
+                <w:i w:val="false"/>
+                <w:iCs w:val="false"/>
+                <w:color w:val="221E1F"/>
+                <w:sz w:val="20"/>
+                <w:szCs w:val="20"/>
+              </w:rPr>
+              <w:t xml:space="preserve">Delivered scope</w:t>
+            </w:r>
+          </w:p>
+        </w:tc>
+        <w:tc>
+          <w:tcPr>
+            <w:tcW w:type="dxa" w:w="964"/>
+            <w:tcBorders>
+              <w:top w:val="single" w:color="D6CFC6" w:sz="4"/>
+              <w:left w:val="single" w:color="D6CFC6" w:sz="4"/>
+              <w:bottom w:val="single" w:color="D6CFC6" w:sz="4"/>
+              <w:right w:val="single" w:color="D6CFC6" w:sz="4"/>
+            </w:tcBorders>
+            <w:shd w:fill="FCE8EB" w:color="auto" w:val="clear"/>
+            <w:tcMar>
+              <w:top w:type="dxa" w:w="90"/>
+              <w:left w:type="dxa" w:w="130"/>
+              <w:bottom w:type="dxa" w:w="90"/>
+              <w:right w:type="dxa" w:w="130"/>
+            </w:tcMar>
+            <w:vAlign w:val="center"/>
+          </w:tcPr>
+          <w:p>
+            <w:pPr>
+              <w:spacing w:after="0" w:line="240"/>
+              <w:jc w:val="right"/>
+            </w:pPr>
+            <w:r>
+              <w:rPr>
+                <w:rFonts w:ascii="Calibri" w:cs="Calibri" w:eastAsia="Calibri" w:hAnsi="Calibri"/>
+                <w:b/>
+                <w:bCs/>
+                <w:i w:val="false"/>
+                <w:iCs w:val="false"/>
+                <w:color w:val="221E1F"/>
+                <w:sz w:val="20"/>
+                <w:szCs w:val="20"/>
+              </w:rPr>
+              <w:t xml:space="preserve">127</w:t>
             </w:r>
           </w:p>
         </w:tc>
@@ -7990,7 +8290,7 @@
           <w:sz w:val="20"/>
           <w:szCs w:val="20"/>
         </w:rPr>
-        <w:t xml:space="preserve">18,232 hand-written lines over 114 days is about 160 a day. For tested, typed, reviewed production code that sits inside the normal 100–300 band, and lower than the 200 the first version of this document reconstructed — integration work carries more test and less code than storefront work does. The reconstruction is not inflated.</w:t>
+        <w:t xml:space="preserve">19,104 hand-written lines over 127 days is about 150 a day. For tested, typed, reviewed production code that sits inside the normal 100–300 band, and lower than the 200 the first version of this document reconstructed — integration work carries more test and less code than storefront work does. The reconstruction is not inflated.</w:t>
       </w:r>
     </w:p>
     <w:p>
@@ -8008,7 +8308,7 @@
           <w:sz w:val="20"/>
           <w:szCs w:val="20"/>
         </w:rPr>
-        <w:t xml:space="preserve">114 days is roughly 23 working weeks, or a little over five months for one person. Two people working in parallel would compress the calendar but not the total, and would add coordination cost.</w:t>
+        <w:t xml:space="preserve">127 days is roughly 25 working weeks, or a little under six months for one person. Two people working in parallel would compress the calendar but not the total, and would add coordination cost.</w:t>
       </w:r>
     </w:p>
     <w:p>
@@ -8079,7 +8379,7 @@
           <w:sz w:val="20"/>
           <w:szCs w:val="20"/>
         </w:rPr>
-        <w:t xml:space="preserve">Delivered scope: 114 days × 8 hours = 912 hours.</w:t>
+        <w:t xml:space="preserve">Delivered scope: 127 days × 8 hours = 1016 hours.</w:t>
       </w:r>
     </w:p>
     <w:tbl>
@@ -8174,7 +8474,7 @@
                 <w:sz w:val="19"/>
                 <w:szCs w:val="19"/>
               </w:rPr>
-              <w:t xml:space="preserve">Cost of the 912 hours (excl. VAT)</w:t>
+              <w:t xml:space="preserve">Cost of the 1016 hours (excl. VAT)</w:t>
             </w:r>
           </w:p>
         </w:tc>
@@ -8287,7 +8587,7 @@
                 <w:sz w:val="20"/>
                 <w:szCs w:val="20"/>
               </w:rPr>
-              <w:t xml:space="preserve">R 364 800</w:t>
+              <w:t xml:space="preserve">R 406 400</w:t>
             </w:r>
           </w:p>
         </w:tc>
@@ -8324,7 +8624,7 @@
                 <w:sz w:val="20"/>
                 <w:szCs w:val="20"/>
               </w:rPr>
-              <w:t xml:space="preserve">R 419 520</w:t>
+              <w:t xml:space="preserve">R 467 360</w:t>
             </w:r>
           </w:p>
         </w:tc>
@@ -8401,7 +8701,7 @@
                 <w:sz w:val="20"/>
                 <w:szCs w:val="20"/>
               </w:rPr>
-              <w:t xml:space="preserve">R 592 800</w:t>
+              <w:t xml:space="preserve">R 660 400</w:t>
             </w:r>
           </w:p>
         </w:tc>
@@ -8439,7 +8739,7 @@
                 <w:sz w:val="20"/>
                 <w:szCs w:val="20"/>
               </w:rPr>
-              <w:t xml:space="preserve">R 681 720</w:t>
+              <w:t xml:space="preserve">R 759 460</w:t>
             </w:r>
           </w:p>
         </w:tc>
@@ -8514,7 +8814,7 @@
                 <w:sz w:val="20"/>
                 <w:szCs w:val="20"/>
               </w:rPr>
-              <w:t xml:space="preserve">R 775 200</w:t>
+              <w:t xml:space="preserve">R 863 600</w:t>
             </w:r>
           </w:p>
         </w:tc>
@@ -8551,7 +8851,7 @@
                 <w:sz w:val="20"/>
                 <w:szCs w:val="20"/>
               </w:rPr>
-              <w:t xml:space="preserve">R 891 480</w:t>
+              <w:t xml:space="preserve">R 993 140</w:t>
             </w:r>
           </w:p>
         </w:tc>
@@ -8628,7 +8928,7 @@
                 <w:sz w:val="20"/>
                 <w:szCs w:val="20"/>
               </w:rPr>
-              <w:t xml:space="preserve">R 866 400</w:t>
+              <w:t xml:space="preserve">R 965 200</w:t>
             </w:r>
           </w:p>
         </w:tc>
@@ -8666,7 +8966,7 @@
                 <w:sz w:val="20"/>
                 <w:szCs w:val="20"/>
               </w:rPr>
-              <w:t xml:space="preserve">R 996 360</w:t>
+              <w:t xml:space="preserve">R 1 109 980</w:t>
             </w:r>
           </w:p>
         </w:tc>
@@ -8741,7 +9041,7 @@
                 <w:sz w:val="20"/>
                 <w:szCs w:val="20"/>
               </w:rPr>
-              <w:t xml:space="preserve">R 1 048 800</w:t>
+              <w:t xml:space="preserve">R 1 168 400</w:t>
             </w:r>
           </w:p>
         </w:tc>
@@ -8778,7 +9078,7 @@
                 <w:sz w:val="20"/>
                 <w:szCs w:val="20"/>
               </w:rPr>
-              <w:t xml:space="preserve">R 1 206 120</w:t>
+              <w:t xml:space="preserve">R 1 343 660</w:t>
             </w:r>
           </w:p>
         </w:tc>
@@ -8855,7 +9155,7 @@
                 <w:sz w:val="20"/>
                 <w:szCs w:val="20"/>
               </w:rPr>
-              <w:t xml:space="preserve">R 1 322 400</w:t>
+              <w:t xml:space="preserve">R 1 473 200</w:t>
             </w:r>
           </w:p>
         </w:tc>
@@ -8893,7 +9193,7 @@
                 <w:sz w:val="20"/>
                 <w:szCs w:val="20"/>
               </w:rPr>
-              <w:t xml:space="preserve">R 1 520 760</w:t>
+              <w:t xml:space="preserve">R 1 694 180</w:t>
             </w:r>
           </w:p>
         </w:tc>
@@ -8945,7 +9245,7 @@
           <w:sz w:val="20"/>
           <w:szCs w:val="20"/>
         </w:rPr>
-        <w:t xml:space="preserve">At an illustrative blended rate of R 950 an hour — chosen here only to make the rest of the document concrete — the delivered scope comes to R 866 400 excluding VAT, or R 996 360 including it. Replace the rate and every figure below moves proportionally.</w:t>
+        <w:t xml:space="preserve">At an illustrative blended rate of R 950 an hour — chosen here only to make the rest of the document concrete — the delivered scope comes to R 965 200 excluding VAT, or R 1 109 980 including it. Replace the rate and every figure below moves proportionally.</w:t>
       </w:r>
     </w:p>
     <w:p>
@@ -11565,6 +11865,308 @@
               <w:bottom w:val="single" w:color="D6CFC6" w:sz="4"/>
               <w:right w:val="single" w:color="D6CFC6" w:sz="4"/>
             </w:tcBorders>
+            <w:tcMar>
+              <w:top w:type="dxa" w:w="90"/>
+              <w:left w:type="dxa" w:w="130"/>
+              <w:bottom w:type="dxa" w:w="90"/>
+              <w:right w:type="dxa" w:w="130"/>
+            </w:tcMar>
+            <w:vAlign w:val="center"/>
+          </w:tcPr>
+          <w:p>
+            <w:pPr>
+              <w:spacing w:after="0" w:line="240"/>
+            </w:pPr>
+            <w:r>
+              <w:rPr>
+                <w:rFonts w:ascii="Calibri" w:cs="Calibri" w:eastAsia="Calibri" w:hAnsi="Calibri"/>
+                <w:b w:val="false"/>
+                <w:bCs w:val="false"/>
+                <w:i w:val="false"/>
+                <w:iCs w:val="false"/>
+                <w:color w:val="221E1F"/>
+                <w:sz w:val="20"/>
+                <w:szCs w:val="20"/>
+              </w:rPr>
+              <w:t xml:space="preserve">Concurrent-write safety</w:t>
+            </w:r>
+          </w:p>
+        </w:tc>
+        <w:tc>
+          <w:tcPr>
+            <w:tcW w:type="dxa" w:w="1157"/>
+            <w:tcBorders>
+              <w:top w:val="single" w:color="D6CFC6" w:sz="4"/>
+              <w:left w:val="single" w:color="D6CFC6" w:sz="4"/>
+              <w:bottom w:val="single" w:color="D6CFC6" w:sz="4"/>
+              <w:right w:val="single" w:color="D6CFC6" w:sz="4"/>
+            </w:tcBorders>
+            <w:tcMar>
+              <w:top w:type="dxa" w:w="90"/>
+              <w:left w:type="dxa" w:w="130"/>
+              <w:bottom w:type="dxa" w:w="90"/>
+              <w:right w:type="dxa" w:w="130"/>
+            </w:tcMar>
+            <w:vAlign w:val="center"/>
+          </w:tcPr>
+          <w:p>
+            <w:pPr>
+              <w:spacing w:after="0" w:line="240"/>
+              <w:jc w:val="right"/>
+            </w:pPr>
+            <w:r>
+              <w:rPr>
+                <w:rFonts w:ascii="Calibri" w:cs="Calibri" w:eastAsia="Calibri" w:hAnsi="Calibri"/>
+                <w:b w:val="false"/>
+                <w:bCs w:val="false"/>
+                <w:i w:val="false"/>
+                <w:iCs w:val="false"/>
+                <w:color w:val="221E1F"/>
+                <w:sz w:val="20"/>
+                <w:szCs w:val="20"/>
+              </w:rPr>
+              <w:t xml:space="preserve">6</w:t>
+            </w:r>
+          </w:p>
+        </w:tc>
+        <w:tc>
+          <w:tcPr>
+            <w:tcW w:type="dxa" w:w="1542"/>
+            <w:tcBorders>
+              <w:top w:val="single" w:color="D6CFC6" w:sz="4"/>
+              <w:left w:val="single" w:color="D6CFC6" w:sz="4"/>
+              <w:bottom w:val="single" w:color="D6CFC6" w:sz="4"/>
+              <w:right w:val="single" w:color="D6CFC6" w:sz="4"/>
+            </w:tcBorders>
+            <w:tcMar>
+              <w:top w:type="dxa" w:w="90"/>
+              <w:left w:type="dxa" w:w="130"/>
+              <w:bottom w:type="dxa" w:w="90"/>
+              <w:right w:type="dxa" w:w="130"/>
+            </w:tcMar>
+            <w:vAlign w:val="center"/>
+          </w:tcPr>
+          <w:p>
+            <w:pPr>
+              <w:spacing w:after="0" w:line="240"/>
+              <w:jc w:val="right"/>
+            </w:pPr>
+            <w:r>
+              <w:rPr>
+                <w:rFonts w:ascii="Calibri" w:cs="Calibri" w:eastAsia="Calibri" w:hAnsi="Calibri"/>
+                <w:b w:val="false"/>
+                <w:bCs w:val="false"/>
+                <w:i w:val="false"/>
+                <w:iCs w:val="false"/>
+                <w:color w:val="221E1F"/>
+                <w:sz w:val="20"/>
+                <w:szCs w:val="20"/>
+              </w:rPr>
+              <w:t xml:space="preserve">48</w:t>
+            </w:r>
+          </w:p>
+        </w:tc>
+        <w:tc>
+          <w:tcPr>
+            <w:tcW w:type="dxa" w:w="1638"/>
+            <w:tcBorders>
+              <w:top w:val="single" w:color="D6CFC6" w:sz="4"/>
+              <w:left w:val="single" w:color="D6CFC6" w:sz="4"/>
+              <w:bottom w:val="single" w:color="D6CFC6" w:sz="4"/>
+              <w:right w:val="single" w:color="D6CFC6" w:sz="4"/>
+            </w:tcBorders>
+            <w:tcMar>
+              <w:top w:type="dxa" w:w="90"/>
+              <w:left w:type="dxa" w:w="130"/>
+              <w:bottom w:type="dxa" w:w="90"/>
+              <w:right w:type="dxa" w:w="130"/>
+            </w:tcMar>
+            <w:vAlign w:val="center"/>
+          </w:tcPr>
+          <w:p>
+            <w:pPr>
+              <w:spacing w:after="0" w:line="240"/>
+              <w:jc w:val="right"/>
+            </w:pPr>
+            <w:r>
+              <w:rPr>
+                <w:rFonts w:ascii="Calibri" w:cs="Calibri" w:eastAsia="Calibri" w:hAnsi="Calibri"/>
+                <w:b w:val="false"/>
+                <w:bCs w:val="false"/>
+                <w:i w:val="false"/>
+                <w:iCs w:val="false"/>
+                <w:color w:val="221E1F"/>
+                <w:sz w:val="20"/>
+                <w:szCs w:val="20"/>
+              </w:rPr>
+              <w:t xml:space="preserve">R 45 600</w:t>
+            </w:r>
+          </w:p>
+        </w:tc>
+      </w:tr>
+      <w:tr>
+        <w:tc>
+          <w:tcPr>
+            <w:tcW w:type="dxa" w:w="5301"/>
+            <w:tcBorders>
+              <w:top w:val="single" w:color="D6CFC6" w:sz="4"/>
+              <w:left w:val="single" w:color="D6CFC6" w:sz="4"/>
+              <w:bottom w:val="single" w:color="D6CFC6" w:sz="4"/>
+              <w:right w:val="single" w:color="D6CFC6" w:sz="4"/>
+            </w:tcBorders>
+            <w:shd w:fill="F7F5F2" w:color="auto" w:val="clear"/>
+            <w:tcMar>
+              <w:top w:type="dxa" w:w="90"/>
+              <w:left w:type="dxa" w:w="130"/>
+              <w:bottom w:type="dxa" w:w="90"/>
+              <w:right w:type="dxa" w:w="130"/>
+            </w:tcMar>
+            <w:vAlign w:val="center"/>
+          </w:tcPr>
+          <w:p>
+            <w:pPr>
+              <w:spacing w:after="0" w:line="240"/>
+            </w:pPr>
+            <w:r>
+              <w:rPr>
+                <w:rFonts w:ascii="Calibri" w:cs="Calibri" w:eastAsia="Calibri" w:hAnsi="Calibri"/>
+                <w:b w:val="false"/>
+                <w:bCs w:val="false"/>
+                <w:i w:val="false"/>
+                <w:iCs w:val="false"/>
+                <w:color w:val="221E1F"/>
+                <w:sz w:val="20"/>
+                <w:szCs w:val="20"/>
+              </w:rPr>
+              <w:t xml:space="preserve">Accessibility and deployment</w:t>
+            </w:r>
+          </w:p>
+        </w:tc>
+        <w:tc>
+          <w:tcPr>
+            <w:tcW w:type="dxa" w:w="1157"/>
+            <w:tcBorders>
+              <w:top w:val="single" w:color="D6CFC6" w:sz="4"/>
+              <w:left w:val="single" w:color="D6CFC6" w:sz="4"/>
+              <w:bottom w:val="single" w:color="D6CFC6" w:sz="4"/>
+              <w:right w:val="single" w:color="D6CFC6" w:sz="4"/>
+            </w:tcBorders>
+            <w:shd w:fill="F7F5F2" w:color="auto" w:val="clear"/>
+            <w:tcMar>
+              <w:top w:type="dxa" w:w="90"/>
+              <w:left w:type="dxa" w:w="130"/>
+              <w:bottom w:type="dxa" w:w="90"/>
+              <w:right w:type="dxa" w:w="130"/>
+            </w:tcMar>
+            <w:vAlign w:val="center"/>
+          </w:tcPr>
+          <w:p>
+            <w:pPr>
+              <w:spacing w:after="0" w:line="240"/>
+              <w:jc w:val="right"/>
+            </w:pPr>
+            <w:r>
+              <w:rPr>
+                <w:rFonts w:ascii="Calibri" w:cs="Calibri" w:eastAsia="Calibri" w:hAnsi="Calibri"/>
+                <w:b w:val="false"/>
+                <w:bCs w:val="false"/>
+                <w:i w:val="false"/>
+                <w:iCs w:val="false"/>
+                <w:color w:val="221E1F"/>
+                <w:sz w:val="20"/>
+                <w:szCs w:val="20"/>
+              </w:rPr>
+              <w:t xml:space="preserve">7</w:t>
+            </w:r>
+          </w:p>
+        </w:tc>
+        <w:tc>
+          <w:tcPr>
+            <w:tcW w:type="dxa" w:w="1542"/>
+            <w:tcBorders>
+              <w:top w:val="single" w:color="D6CFC6" w:sz="4"/>
+              <w:left w:val="single" w:color="D6CFC6" w:sz="4"/>
+              <w:bottom w:val="single" w:color="D6CFC6" w:sz="4"/>
+              <w:right w:val="single" w:color="D6CFC6" w:sz="4"/>
+            </w:tcBorders>
+            <w:shd w:fill="F7F5F2" w:color="auto" w:val="clear"/>
+            <w:tcMar>
+              <w:top w:type="dxa" w:w="90"/>
+              <w:left w:type="dxa" w:w="130"/>
+              <w:bottom w:type="dxa" w:w="90"/>
+              <w:right w:type="dxa" w:w="130"/>
+            </w:tcMar>
+            <w:vAlign w:val="center"/>
+          </w:tcPr>
+          <w:p>
+            <w:pPr>
+              <w:spacing w:after="0" w:line="240"/>
+              <w:jc w:val="right"/>
+            </w:pPr>
+            <w:r>
+              <w:rPr>
+                <w:rFonts w:ascii="Calibri" w:cs="Calibri" w:eastAsia="Calibri" w:hAnsi="Calibri"/>
+                <w:b w:val="false"/>
+                <w:bCs w:val="false"/>
+                <w:i w:val="false"/>
+                <w:iCs w:val="false"/>
+                <w:color w:val="221E1F"/>
+                <w:sz w:val="20"/>
+                <w:szCs w:val="20"/>
+              </w:rPr>
+              <w:t xml:space="preserve">56</w:t>
+            </w:r>
+          </w:p>
+        </w:tc>
+        <w:tc>
+          <w:tcPr>
+            <w:tcW w:type="dxa" w:w="1638"/>
+            <w:tcBorders>
+              <w:top w:val="single" w:color="D6CFC6" w:sz="4"/>
+              <w:left w:val="single" w:color="D6CFC6" w:sz="4"/>
+              <w:bottom w:val="single" w:color="D6CFC6" w:sz="4"/>
+              <w:right w:val="single" w:color="D6CFC6" w:sz="4"/>
+            </w:tcBorders>
+            <w:shd w:fill="F7F5F2" w:color="auto" w:val="clear"/>
+            <w:tcMar>
+              <w:top w:type="dxa" w:w="90"/>
+              <w:left w:type="dxa" w:w="130"/>
+              <w:bottom w:type="dxa" w:w="90"/>
+              <w:right w:type="dxa" w:w="130"/>
+            </w:tcMar>
+            <w:vAlign w:val="center"/>
+          </w:tcPr>
+          <w:p>
+            <w:pPr>
+              <w:spacing w:after="0" w:line="240"/>
+              <w:jc w:val="right"/>
+            </w:pPr>
+            <w:r>
+              <w:rPr>
+                <w:rFonts w:ascii="Calibri" w:cs="Calibri" w:eastAsia="Calibri" w:hAnsi="Calibri"/>
+                <w:b w:val="false"/>
+                <w:bCs w:val="false"/>
+                <w:i w:val="false"/>
+                <w:iCs w:val="false"/>
+                <w:color w:val="221E1F"/>
+                <w:sz w:val="20"/>
+                <w:szCs w:val="20"/>
+              </w:rPr>
+              <w:t xml:space="preserve">R 53 200</w:t>
+            </w:r>
+          </w:p>
+        </w:tc>
+      </w:tr>
+      <w:tr>
+        <w:tc>
+          <w:tcPr>
+            <w:tcW w:type="dxa" w:w="5301"/>
+            <w:tcBorders>
+              <w:top w:val="single" w:color="D6CFC6" w:sz="4"/>
+              <w:left w:val="single" w:color="D6CFC6" w:sz="4"/>
+              <w:bottom w:val="single" w:color="D6CFC6" w:sz="4"/>
+              <w:right w:val="single" w:color="D6CFC6" w:sz="4"/>
+            </w:tcBorders>
             <w:shd w:fill="FCE8EB" w:color="auto" w:val="clear"/>
             <w:tcMar>
               <w:top w:type="dxa" w:w="90"/>
@@ -11627,7 +12229,7 @@
                 <w:sz w:val="20"/>
                 <w:szCs w:val="20"/>
               </w:rPr>
-              <w:t xml:space="preserve">114</w:t>
+              <w:t xml:space="preserve">127</w:t>
             </w:r>
           </w:p>
         </w:tc>
@@ -11665,7 +12267,7 @@
                 <w:sz w:val="20"/>
                 <w:szCs w:val="20"/>
               </w:rPr>
-              <w:t xml:space="preserve">912</w:t>
+              <w:t xml:space="preserve">1 016</w:t>
             </w:r>
           </w:p>
         </w:tc>
@@ -11703,7 +12305,7 @@
                 <w:sz w:val="20"/>
                 <w:szCs w:val="20"/>
               </w:rPr>
-              <w:t xml:space="preserve">R 866 400</w:t>
+              <w:t xml:space="preserve">R 965 200</w:t>
             </w:r>
           </w:p>
         </w:tc>
@@ -11742,7 +12344,7 @@
           <w:sz w:val="20"/>
           <w:szCs w:val="20"/>
         </w:rPr>
-        <w:t xml:space="preserve">The integration seams — payments, accounts, notifications, POS and courier — are 44 of the 114 days. None of them names a vendor, and none has to be rewritten when one is chosen: what remains per integration is an adapter against an interface that already exists and is already tested.</w:t>
+        <w:t xml:space="preserve">The integration seams — payments, accounts, notifications, POS and courier — are 44 of the 127 days. None of them names a vendor, and none has to be rewritten when one is chosen: what remains per integration is an adapter against an interface that already exists and is already tested.</w:t>
       </w:r>
     </w:p>
     <w:p>
@@ -12473,7 +13075,7 @@
                 <w:sz w:val="20"/>
                 <w:szCs w:val="20"/>
               </w:rPr>
-              <w:t xml:space="preserve">Postgres replacing the JSON state file; schema, migrations, concurrent-write safety</w:t>
+              <w:t xml:space="preserve">Postgres replacing the JSON state file; schema and migrations. Concurrent-write safety is done — the JSON store no longer loses an edit</w:t>
             </w:r>
           </w:p>
         </w:tc>
@@ -12511,7 +13113,7 @@
                 <w:sz w:val="20"/>
                 <w:szCs w:val="20"/>
               </w:rPr>
-              <w:t xml:space="preserve">6</w:t>
+              <w:t xml:space="preserve">5</w:t>
             </w:r>
           </w:p>
         </w:tc>
@@ -13665,7 +14267,7 @@
                 <w:sz w:val="20"/>
                 <w:szCs w:val="20"/>
               </w:rPr>
-              <w:t xml:space="preserve">328 hours of engineering</w:t>
+              <w:t xml:space="preserve">224 hours of engineering</w:t>
             </w:r>
           </w:p>
         </w:tc>
@@ -13703,7 +14305,7 @@
                 <w:sz w:val="20"/>
                 <w:szCs w:val="20"/>
               </w:rPr>
-              <w:t xml:space="preserve">41</w:t>
+              <w:t xml:space="preserve">28</w:t>
             </w:r>
           </w:p>
         </w:tc>
@@ -14008,7 +14610,7 @@
                 <w:sz w:val="20"/>
                 <w:szCs w:val="20"/>
               </w:rPr>
-              <w:t xml:space="preserve">114</w:t>
+              <w:t xml:space="preserve">127</w:t>
             </w:r>
           </w:p>
         </w:tc>
@@ -14045,7 +14647,7 @@
                 <w:sz w:val="20"/>
                 <w:szCs w:val="20"/>
               </w:rPr>
-              <w:t xml:space="preserve">912</w:t>
+              <w:t xml:space="preserve">1 016</w:t>
             </w:r>
           </w:p>
         </w:tc>
@@ -14082,7 +14684,7 @@
                 <w:sz w:val="20"/>
                 <w:szCs w:val="20"/>
               </w:rPr>
-              <w:t xml:space="preserve">R 866 400</w:t>
+              <w:t xml:space="preserve">R 965 200</w:t>
             </w:r>
           </w:p>
         </w:tc>
@@ -14159,7 +14761,7 @@
                 <w:sz w:val="20"/>
                 <w:szCs w:val="20"/>
               </w:rPr>
-              <w:t xml:space="preserve">41</w:t>
+              <w:t xml:space="preserve">28</w:t>
             </w:r>
           </w:p>
         </w:tc>
@@ -14197,7 +14799,7 @@
                 <w:sz w:val="20"/>
                 <w:szCs w:val="20"/>
               </w:rPr>
-              <w:t xml:space="preserve">328</w:t>
+              <w:t xml:space="preserve">224</w:t>
             </w:r>
           </w:p>
         </w:tc>
@@ -14235,7 +14837,7 @@
                 <w:sz w:val="20"/>
                 <w:szCs w:val="20"/>
               </w:rPr>
-              <w:t xml:space="preserve">R 311 600</w:t>
+              <w:t xml:space="preserve">R 212 800</w:t>
             </w:r>
           </w:p>
         </w:tc>
@@ -14427,7 +15029,7 @@
           <w:sz w:val="20"/>
           <w:szCs w:val="20"/>
         </w:rPr>
-        <w:t xml:space="preserve">Roughly 74% of the engineering is done. </w:t>
+        <w:t xml:space="preserve">Roughly 82% of the engineering is done. </w:t>
       </w:r>
       <w:r>
         <w:rPr>

</xml_diff>

<commit_message>
Reprice: 134 built, 21 remaining
Recounted at c97b043: 498 tests in 28 files, 19,998 hand-written lines, 23
endpoints.

Password reset leaves the remaining table entirely rather than shrinking —
the token half is built and the delivery half is already counted under the
messaging adapter, so listing it twice was double-counting. The database
drops from five days to three: the migration is written and checked against
the state shape, so what is left is provisioning a server and moving to it.

The end-to-end total stays at 155 days for the fourth reprice running. That
is the number to watch: work has moved between the columns each time and
none has appeared, which is what says the original reconstruction was sound
rather than optimistic.

Co-Authored-By: Claude Opus 5 <noreply@anthropic.com>
Claude-Session: https://claude.ai/code/session_01B2xsFCpQEfEHuTCkYzyD13
</commit_message>
<xml_diff>
--- a/WEBSITE_COSTINGS.docx
+++ b/WEBSITE_COSTINGS.docx
@@ -449,7 +449,7 @@
                 <w:sz w:val="20"/>
                 <w:szCs w:val="20"/>
               </w:rPr>
-              <w:t xml:space="preserve">3fe7ac2</w:t>
+              <w:t xml:space="preserve">c97b043</w:t>
             </w:r>
           </w:p>
         </w:tc>
@@ -1190,7 +1190,7 @@
                 <w:sz w:val="20"/>
                 <w:szCs w:val="20"/>
               </w:rPr>
-              <w:t xml:space="preserve">22</w:t>
+              <w:t xml:space="preserve">23</w:t>
             </w:r>
           </w:p>
         </w:tc>
@@ -1527,7 +1527,7 @@
                 <w:sz w:val="20"/>
                 <w:szCs w:val="20"/>
               </w:rPr>
-              <w:t xml:space="preserve">466</w:t>
+              <w:t xml:space="preserve">498</w:t>
             </w:r>
           </w:p>
         </w:tc>
@@ -1563,7 +1563,7 @@
                 <w:sz w:val="20"/>
                 <w:szCs w:val="20"/>
               </w:rPr>
-              <w:t xml:space="preserve">In 26 files; all passing</w:t>
+              <w:t xml:space="preserve">In 28 files; all passing</w:t>
             </w:r>
           </w:p>
         </w:tc>
@@ -1640,7 +1640,7 @@
                 <w:sz w:val="20"/>
                 <w:szCs w:val="20"/>
               </w:rPr>
-              <w:t xml:space="preserve">19,104</w:t>
+              <w:t xml:space="preserve">19,998</w:t>
             </w:r>
           </w:p>
         </w:tc>
@@ -1677,7 +1677,7 @@
                 <w:sz w:val="20"/>
                 <w:szCs w:val="20"/>
               </w:rPr>
-              <w:t xml:space="preserve">Application 8,157 · tests 6,157 · review build 2,241 · data and tooling 2,039 · shared packages 510</w:t>
+              <w:t xml:space="preserve">Application 8,369 · tests 6,632 · review build 2,241 · data, schema and tooling 2,246 · shared packages 510</w:t>
             </w:r>
           </w:p>
         </w:tc>
@@ -1865,7 +1865,7 @@
                 <w:sz w:val="20"/>
                 <w:szCs w:val="20"/>
               </w:rPr>
-              <w:t xml:space="preserve">28</w:t>
+              <w:t xml:space="preserve">30</w:t>
             </w:r>
           </w:p>
         </w:tc>
@@ -3770,7 +3770,7 @@
                 <w:sz w:val="20"/>
                 <w:szCs w:val="20"/>
               </w:rPr>
-              <w:t xml:space="preserve">466 passing</w:t>
+              <w:t xml:space="preserve">498 passing</w:t>
             </w:r>
           </w:p>
         </w:tc>
@@ -3807,7 +3807,7 @@
                 <w:sz w:val="20"/>
                 <w:szCs w:val="20"/>
               </w:rPr>
-              <w:t xml:space="preserve">26 files, including four real worker processes racing on one file</w:t>
+              <w:t xml:space="preserve">28 files, including four real worker processes racing on one file</w:t>
             </w:r>
           </w:p>
         </w:tc>
@@ -8101,7 +8101,6 @@
               <w:bottom w:val="single" w:color="D6CFC6" w:sz="4"/>
               <w:right w:val="single" w:color="D6CFC6" w:sz="4"/>
             </w:tcBorders>
-            <w:shd w:fill="FCE8EB" w:color="auto" w:val="clear"/>
             <w:tcMar>
               <w:top w:type="dxa" w:w="90"/>
               <w:left w:type="dxa" w:w="130"/>
@@ -8114,6 +8113,42 @@
             <w:pPr>
               <w:spacing w:after="0" w:line="240"/>
               <w:jc w:val="center"/>
+            </w:pPr>
+            <w:r>
+              <w:rPr>
+                <w:rFonts w:ascii="Calibri" w:cs="Calibri" w:eastAsia="Calibri" w:hAnsi="Calibri"/>
+                <w:b w:val="false"/>
+                <w:bCs w:val="false"/>
+                <w:i w:val="false"/>
+                <w:iCs w:val="false"/>
+                <w:color w:val="221E1F"/>
+                <w:sz w:val="20"/>
+                <w:szCs w:val="20"/>
+              </w:rPr>
+              <w:t xml:space="preserve">19</w:t>
+            </w:r>
+          </w:p>
+        </w:tc>
+        <w:tc>
+          <w:tcPr>
+            <w:tcW w:type="dxa" w:w="3084"/>
+            <w:tcBorders>
+              <w:top w:val="single" w:color="D6CFC6" w:sz="4"/>
+              <w:left w:val="single" w:color="D6CFC6" w:sz="4"/>
+              <w:bottom w:val="single" w:color="D6CFC6" w:sz="4"/>
+              <w:right w:val="single" w:color="D6CFC6" w:sz="4"/>
+            </w:tcBorders>
+            <w:tcMar>
+              <w:top w:type="dxa" w:w="90"/>
+              <w:left w:type="dxa" w:w="130"/>
+              <w:bottom w:type="dxa" w:w="90"/>
+              <w:right w:type="dxa" w:w="130"/>
+            </w:tcMar>
+            <w:vAlign w:val="center"/>
+          </w:tcPr>
+          <w:p>
+            <w:pPr>
+              <w:spacing w:after="0" w:line="240"/>
             </w:pPr>
             <w:r>
               <w:rPr>
@@ -8126,13 +8161,88 @@
                 <w:sz w:val="20"/>
                 <w:szCs w:val="20"/>
               </w:rPr>
-              <w:t xml:space="preserve"/>
-            </w:r>
-          </w:p>
-        </w:tc>
-        <w:tc>
-          <w:tcPr>
-            <w:tcW w:type="dxa" w:w="3084"/>
+              <w:t xml:space="preserve">Database schema and password reset</w:t>
+            </w:r>
+          </w:p>
+        </w:tc>
+        <w:tc>
+          <w:tcPr>
+            <w:tcW w:type="dxa" w:w="5108"/>
+            <w:tcBorders>
+              <w:top w:val="single" w:color="D6CFC6" w:sz="4"/>
+              <w:left w:val="single" w:color="D6CFC6" w:sz="4"/>
+              <w:bottom w:val="single" w:color="D6CFC6" w:sz="4"/>
+              <w:right w:val="single" w:color="D6CFC6" w:sz="4"/>
+            </w:tcBorders>
+            <w:tcMar>
+              <w:top w:type="dxa" w:w="90"/>
+              <w:left w:type="dxa" w:w="130"/>
+              <w:bottom w:type="dxa" w:w="90"/>
+              <w:right w:type="dxa" w:w="130"/>
+            </w:tcMar>
+            <w:vAlign w:val="center"/>
+          </w:tcPr>
+          <w:p>
+            <w:pPr>
+              <w:spacing w:after="0" w:line="240"/>
+            </w:pPr>
+            <w:r>
+              <w:rPr>
+                <w:rFonts w:ascii="Calibri" w:cs="Calibri" w:eastAsia="Calibri" w:hAnsi="Calibri"/>
+                <w:b w:val="false"/>
+                <w:bCs w:val="false"/>
+                <w:i w:val="false"/>
+                <w:iCs w:val="false"/>
+                <w:color w:val="221E1F"/>
+                <w:sz w:val="20"/>
+                <w:szCs w:val="20"/>
+              </w:rPr>
+              <w:t xml:space="preserve">The Postgres migration the JSON store stands in for, checked against the state shape by test; reset tokens stored as hashes, single-use, and answering identically for an address nobody has</w:t>
+            </w:r>
+          </w:p>
+        </w:tc>
+        <w:tc>
+          <w:tcPr>
+            <w:tcW w:type="dxa" w:w="964"/>
+            <w:tcBorders>
+              <w:top w:val="single" w:color="D6CFC6" w:sz="4"/>
+              <w:left w:val="single" w:color="D6CFC6" w:sz="4"/>
+              <w:bottom w:val="single" w:color="D6CFC6" w:sz="4"/>
+              <w:right w:val="single" w:color="D6CFC6" w:sz="4"/>
+            </w:tcBorders>
+            <w:tcMar>
+              <w:top w:type="dxa" w:w="90"/>
+              <w:left w:type="dxa" w:w="130"/>
+              <w:bottom w:type="dxa" w:w="90"/>
+              <w:right w:type="dxa" w:w="130"/>
+            </w:tcMar>
+            <w:vAlign w:val="center"/>
+          </w:tcPr>
+          <w:p>
+            <w:pPr>
+              <w:spacing w:after="0" w:line="240"/>
+              <w:jc w:val="right"/>
+            </w:pPr>
+            <w:r>
+              <w:rPr>
+                <w:rFonts w:ascii="Calibri" w:cs="Calibri" w:eastAsia="Calibri" w:hAnsi="Calibri"/>
+                <w:b w:val="false"/>
+                <w:bCs w:val="false"/>
+                <w:i w:val="false"/>
+                <w:iCs w:val="false"/>
+                <w:color w:val="221E1F"/>
+                <w:sz w:val="20"/>
+                <w:szCs w:val="20"/>
+              </w:rPr>
+              <w:t xml:space="preserve">7</w:t>
+            </w:r>
+          </w:p>
+        </w:tc>
+      </w:tr>
+      <w:tr>
+        <w:tc>
+          <w:tcPr>
+            <w:tcW w:type="dxa" w:w="482"/>
             <w:tcBorders>
               <w:top w:val="single" w:color="D6CFC6" w:sz="4"/>
               <w:left w:val="single" w:color="D6CFC6" w:sz="4"/>
@@ -8151,6 +8261,7 @@
           <w:p>
             <w:pPr>
               <w:spacing w:after="0" w:line="240"/>
+              <w:jc w:val="center"/>
             </w:pPr>
             <w:r>
               <w:rPr>
@@ -8163,13 +8274,13 @@
                 <w:sz w:val="20"/>
                 <w:szCs w:val="20"/>
               </w:rPr>
-              <w:t xml:space="preserve">Total</w:t>
-            </w:r>
-          </w:p>
-        </w:tc>
-        <w:tc>
-          <w:tcPr>
-            <w:tcW w:type="dxa" w:w="5108"/>
+              <w:t xml:space="preserve"/>
+            </w:r>
+          </w:p>
+        </w:tc>
+        <w:tc>
+          <w:tcPr>
+            <w:tcW w:type="dxa" w:w="3084"/>
             <w:tcBorders>
               <w:top w:val="single" w:color="D6CFC6" w:sz="4"/>
               <w:left w:val="single" w:color="D6CFC6" w:sz="4"/>
@@ -8200,13 +8311,13 @@
                 <w:sz w:val="20"/>
                 <w:szCs w:val="20"/>
               </w:rPr>
-              <w:t xml:space="preserve">Delivered scope</w:t>
-            </w:r>
-          </w:p>
-        </w:tc>
-        <w:tc>
-          <w:tcPr>
-            <w:tcW w:type="dxa" w:w="964"/>
+              <w:t xml:space="preserve">Total</w:t>
+            </w:r>
+          </w:p>
+        </w:tc>
+        <w:tc>
+          <w:tcPr>
+            <w:tcW w:type="dxa" w:w="5108"/>
             <w:tcBorders>
               <w:top w:val="single" w:color="D6CFC6" w:sz="4"/>
               <w:left w:val="single" w:color="D6CFC6" w:sz="4"/>
@@ -8225,7 +8336,6 @@
           <w:p>
             <w:pPr>
               <w:spacing w:after="0" w:line="240"/>
-              <w:jc w:val="right"/>
             </w:pPr>
             <w:r>
               <w:rPr>
@@ -8238,7 +8348,45 @@
                 <w:sz w:val="20"/>
                 <w:szCs w:val="20"/>
               </w:rPr>
-              <w:t xml:space="preserve">127</w:t>
+              <w:t xml:space="preserve">Delivered scope</w:t>
+            </w:r>
+          </w:p>
+        </w:tc>
+        <w:tc>
+          <w:tcPr>
+            <w:tcW w:type="dxa" w:w="964"/>
+            <w:tcBorders>
+              <w:top w:val="single" w:color="D6CFC6" w:sz="4"/>
+              <w:left w:val="single" w:color="D6CFC6" w:sz="4"/>
+              <w:bottom w:val="single" w:color="D6CFC6" w:sz="4"/>
+              <w:right w:val="single" w:color="D6CFC6" w:sz="4"/>
+            </w:tcBorders>
+            <w:shd w:fill="FCE8EB" w:color="auto" w:val="clear"/>
+            <w:tcMar>
+              <w:top w:type="dxa" w:w="90"/>
+              <w:left w:type="dxa" w:w="130"/>
+              <w:bottom w:type="dxa" w:w="90"/>
+              <w:right w:type="dxa" w:w="130"/>
+            </w:tcMar>
+            <w:vAlign w:val="center"/>
+          </w:tcPr>
+          <w:p>
+            <w:pPr>
+              <w:spacing w:after="0" w:line="240"/>
+              <w:jc w:val="right"/>
+            </w:pPr>
+            <w:r>
+              <w:rPr>
+                <w:rFonts w:ascii="Calibri" w:cs="Calibri" w:eastAsia="Calibri" w:hAnsi="Calibri"/>
+                <w:b/>
+                <w:bCs/>
+                <w:i w:val="false"/>
+                <w:iCs w:val="false"/>
+                <w:color w:val="221E1F"/>
+                <w:sz w:val="20"/>
+                <w:szCs w:val="20"/>
+              </w:rPr>
+              <w:t xml:space="preserve">134</w:t>
             </w:r>
           </w:p>
         </w:tc>
@@ -8290,7 +8438,7 @@
           <w:sz w:val="20"/>
           <w:szCs w:val="20"/>
         </w:rPr>
-        <w:t xml:space="preserve">19,104 hand-written lines over 127 days is about 150 a day. For tested, typed, reviewed production code that sits inside the normal 100–300 band, and lower than the 200 the first version of this document reconstructed — integration work carries more test and less code than storefront work does. The reconstruction is not inflated.</w:t>
+        <w:t xml:space="preserve">19,998 hand-written lines over 134 days is about 150 a day. For tested, typed, reviewed production code that sits inside the normal 100–300 band, and lower than the 200 the first version of this document reconstructed — integration work carries more test and less code than storefront work does. The reconstruction is not inflated.</w:t>
       </w:r>
     </w:p>
     <w:p>
@@ -8308,7 +8456,7 @@
           <w:sz w:val="20"/>
           <w:szCs w:val="20"/>
         </w:rPr>
-        <w:t xml:space="preserve">127 days is roughly 25 working weeks, or a little under six months for one person. Two people working in parallel would compress the calendar but not the total, and would add coordination cost.</w:t>
+        <w:t xml:space="preserve">134 days is roughly 27 working weeks, or a little over six months for one person. Two people working in parallel would compress the calendar but not the total, and would add coordination cost.</w:t>
       </w:r>
     </w:p>
     <w:p>
@@ -8379,7 +8527,7 @@
           <w:sz w:val="20"/>
           <w:szCs w:val="20"/>
         </w:rPr>
-        <w:t xml:space="preserve">Delivered scope: 127 days × 8 hours = 1016 hours.</w:t>
+        <w:t xml:space="preserve">Delivered scope: 134 days × 8 hours = 1072 hours.</w:t>
       </w:r>
     </w:p>
     <w:tbl>
@@ -8474,7 +8622,7 @@
                 <w:sz w:val="19"/>
                 <w:szCs w:val="19"/>
               </w:rPr>
-              <w:t xml:space="preserve">Cost of the 1016 hours (excl. VAT)</w:t>
+              <w:t xml:space="preserve">Cost of the 1072 hours (excl. VAT)</w:t>
             </w:r>
           </w:p>
         </w:tc>
@@ -8587,7 +8735,7 @@
                 <w:sz w:val="20"/>
                 <w:szCs w:val="20"/>
               </w:rPr>
-              <w:t xml:space="preserve">R 406 400</w:t>
+              <w:t xml:space="preserve">R 428 800</w:t>
             </w:r>
           </w:p>
         </w:tc>
@@ -8624,7 +8772,7 @@
                 <w:sz w:val="20"/>
                 <w:szCs w:val="20"/>
               </w:rPr>
-              <w:t xml:space="preserve">R 467 360</w:t>
+              <w:t xml:space="preserve">R 493 120</w:t>
             </w:r>
           </w:p>
         </w:tc>
@@ -8701,7 +8849,7 @@
                 <w:sz w:val="20"/>
                 <w:szCs w:val="20"/>
               </w:rPr>
-              <w:t xml:space="preserve">R 660 400</w:t>
+              <w:t xml:space="preserve">R 696 800</w:t>
             </w:r>
           </w:p>
         </w:tc>
@@ -8739,7 +8887,7 @@
                 <w:sz w:val="20"/>
                 <w:szCs w:val="20"/>
               </w:rPr>
-              <w:t xml:space="preserve">R 759 460</w:t>
+              <w:t xml:space="preserve">R 801 320</w:t>
             </w:r>
           </w:p>
         </w:tc>
@@ -8814,7 +8962,7 @@
                 <w:sz w:val="20"/>
                 <w:szCs w:val="20"/>
               </w:rPr>
-              <w:t xml:space="preserve">R 863 600</w:t>
+              <w:t xml:space="preserve">R 911 200</w:t>
             </w:r>
           </w:p>
         </w:tc>
@@ -8851,7 +8999,7 @@
                 <w:sz w:val="20"/>
                 <w:szCs w:val="20"/>
               </w:rPr>
-              <w:t xml:space="preserve">R 993 140</w:t>
+              <w:t xml:space="preserve">R 1 047 880</w:t>
             </w:r>
           </w:p>
         </w:tc>
@@ -8928,7 +9076,7 @@
                 <w:sz w:val="20"/>
                 <w:szCs w:val="20"/>
               </w:rPr>
-              <w:t xml:space="preserve">R 965 200</w:t>
+              <w:t xml:space="preserve">R 1 018 400</w:t>
             </w:r>
           </w:p>
         </w:tc>
@@ -8966,7 +9114,7 @@
                 <w:sz w:val="20"/>
                 <w:szCs w:val="20"/>
               </w:rPr>
-              <w:t xml:space="preserve">R 1 109 980</w:t>
+              <w:t xml:space="preserve">R 1 171 160</w:t>
             </w:r>
           </w:p>
         </w:tc>
@@ -9041,7 +9189,7 @@
                 <w:sz w:val="20"/>
                 <w:szCs w:val="20"/>
               </w:rPr>
-              <w:t xml:space="preserve">R 1 168 400</w:t>
+              <w:t xml:space="preserve">R 1 232 800</w:t>
             </w:r>
           </w:p>
         </w:tc>
@@ -9078,7 +9226,7 @@
                 <w:sz w:val="20"/>
                 <w:szCs w:val="20"/>
               </w:rPr>
-              <w:t xml:space="preserve">R 1 343 660</w:t>
+              <w:t xml:space="preserve">R 1 417 720</w:t>
             </w:r>
           </w:p>
         </w:tc>
@@ -9155,7 +9303,7 @@
                 <w:sz w:val="20"/>
                 <w:szCs w:val="20"/>
               </w:rPr>
-              <w:t xml:space="preserve">R 1 473 200</w:t>
+              <w:t xml:space="preserve">R 1 554 400</w:t>
             </w:r>
           </w:p>
         </w:tc>
@@ -9193,7 +9341,7 @@
                 <w:sz w:val="20"/>
                 <w:szCs w:val="20"/>
               </w:rPr>
-              <w:t xml:space="preserve">R 1 694 180</w:t>
+              <w:t xml:space="preserve">R 1 787 560</w:t>
             </w:r>
           </w:p>
         </w:tc>
@@ -9245,7 +9393,7 @@
           <w:sz w:val="20"/>
           <w:szCs w:val="20"/>
         </w:rPr>
-        <w:t xml:space="preserve">At an illustrative blended rate of R 950 an hour — chosen here only to make the rest of the document concrete — the delivered scope comes to R 965 200 excluding VAT, or R 1 109 980 including it. Replace the rate and every figure below moves proportionally.</w:t>
+        <w:t xml:space="preserve">At an illustrative blended rate of R 950 an hour — chosen here only to make the rest of the document concrete — the delivered scope comes to R 1 018 400 excluding VAT, or R 1 171 160 including it. Replace the rate and every figure below moves proportionally.</w:t>
       </w:r>
     </w:p>
     <w:p>
@@ -12167,6 +12315,155 @@
               <w:bottom w:val="single" w:color="D6CFC6" w:sz="4"/>
               <w:right w:val="single" w:color="D6CFC6" w:sz="4"/>
             </w:tcBorders>
+            <w:tcMar>
+              <w:top w:type="dxa" w:w="90"/>
+              <w:left w:type="dxa" w:w="130"/>
+              <w:bottom w:type="dxa" w:w="90"/>
+              <w:right w:type="dxa" w:w="130"/>
+            </w:tcMar>
+            <w:vAlign w:val="center"/>
+          </w:tcPr>
+          <w:p>
+            <w:pPr>
+              <w:spacing w:after="0" w:line="240"/>
+            </w:pPr>
+            <w:r>
+              <w:rPr>
+                <w:rFonts w:ascii="Calibri" w:cs="Calibri" w:eastAsia="Calibri" w:hAnsi="Calibri"/>
+                <w:b w:val="false"/>
+                <w:bCs w:val="false"/>
+                <w:i w:val="false"/>
+                <w:iCs w:val="false"/>
+                <w:color w:val="221E1F"/>
+                <w:sz w:val="20"/>
+                <w:szCs w:val="20"/>
+              </w:rPr>
+              <w:t xml:space="preserve">Database schema and password reset</w:t>
+            </w:r>
+          </w:p>
+        </w:tc>
+        <w:tc>
+          <w:tcPr>
+            <w:tcW w:type="dxa" w:w="1157"/>
+            <w:tcBorders>
+              <w:top w:val="single" w:color="D6CFC6" w:sz="4"/>
+              <w:left w:val="single" w:color="D6CFC6" w:sz="4"/>
+              <w:bottom w:val="single" w:color="D6CFC6" w:sz="4"/>
+              <w:right w:val="single" w:color="D6CFC6" w:sz="4"/>
+            </w:tcBorders>
+            <w:tcMar>
+              <w:top w:type="dxa" w:w="90"/>
+              <w:left w:type="dxa" w:w="130"/>
+              <w:bottom w:type="dxa" w:w="90"/>
+              <w:right w:type="dxa" w:w="130"/>
+            </w:tcMar>
+            <w:vAlign w:val="center"/>
+          </w:tcPr>
+          <w:p>
+            <w:pPr>
+              <w:spacing w:after="0" w:line="240"/>
+              <w:jc w:val="right"/>
+            </w:pPr>
+            <w:r>
+              <w:rPr>
+                <w:rFonts w:ascii="Calibri" w:cs="Calibri" w:eastAsia="Calibri" w:hAnsi="Calibri"/>
+                <w:b w:val="false"/>
+                <w:bCs w:val="false"/>
+                <w:i w:val="false"/>
+                <w:iCs w:val="false"/>
+                <w:color w:val="221E1F"/>
+                <w:sz w:val="20"/>
+                <w:szCs w:val="20"/>
+              </w:rPr>
+              <w:t xml:space="preserve">7</w:t>
+            </w:r>
+          </w:p>
+        </w:tc>
+        <w:tc>
+          <w:tcPr>
+            <w:tcW w:type="dxa" w:w="1542"/>
+            <w:tcBorders>
+              <w:top w:val="single" w:color="D6CFC6" w:sz="4"/>
+              <w:left w:val="single" w:color="D6CFC6" w:sz="4"/>
+              <w:bottom w:val="single" w:color="D6CFC6" w:sz="4"/>
+              <w:right w:val="single" w:color="D6CFC6" w:sz="4"/>
+            </w:tcBorders>
+            <w:tcMar>
+              <w:top w:type="dxa" w:w="90"/>
+              <w:left w:type="dxa" w:w="130"/>
+              <w:bottom w:type="dxa" w:w="90"/>
+              <w:right w:type="dxa" w:w="130"/>
+            </w:tcMar>
+            <w:vAlign w:val="center"/>
+          </w:tcPr>
+          <w:p>
+            <w:pPr>
+              <w:spacing w:after="0" w:line="240"/>
+              <w:jc w:val="right"/>
+            </w:pPr>
+            <w:r>
+              <w:rPr>
+                <w:rFonts w:ascii="Calibri" w:cs="Calibri" w:eastAsia="Calibri" w:hAnsi="Calibri"/>
+                <w:b w:val="false"/>
+                <w:bCs w:val="false"/>
+                <w:i w:val="false"/>
+                <w:iCs w:val="false"/>
+                <w:color w:val="221E1F"/>
+                <w:sz w:val="20"/>
+                <w:szCs w:val="20"/>
+              </w:rPr>
+              <w:t xml:space="preserve">56</w:t>
+            </w:r>
+          </w:p>
+        </w:tc>
+        <w:tc>
+          <w:tcPr>
+            <w:tcW w:type="dxa" w:w="1638"/>
+            <w:tcBorders>
+              <w:top w:val="single" w:color="D6CFC6" w:sz="4"/>
+              <w:left w:val="single" w:color="D6CFC6" w:sz="4"/>
+              <w:bottom w:val="single" w:color="D6CFC6" w:sz="4"/>
+              <w:right w:val="single" w:color="D6CFC6" w:sz="4"/>
+            </w:tcBorders>
+            <w:tcMar>
+              <w:top w:type="dxa" w:w="90"/>
+              <w:left w:type="dxa" w:w="130"/>
+              <w:bottom w:type="dxa" w:w="90"/>
+              <w:right w:type="dxa" w:w="130"/>
+            </w:tcMar>
+            <w:vAlign w:val="center"/>
+          </w:tcPr>
+          <w:p>
+            <w:pPr>
+              <w:spacing w:after="0" w:line="240"/>
+              <w:jc w:val="right"/>
+            </w:pPr>
+            <w:r>
+              <w:rPr>
+                <w:rFonts w:ascii="Calibri" w:cs="Calibri" w:eastAsia="Calibri" w:hAnsi="Calibri"/>
+                <w:b w:val="false"/>
+                <w:bCs w:val="false"/>
+                <w:i w:val="false"/>
+                <w:iCs w:val="false"/>
+                <w:color w:val="221E1F"/>
+                <w:sz w:val="20"/>
+                <w:szCs w:val="20"/>
+              </w:rPr>
+              <w:t xml:space="preserve">R 53 200</w:t>
+            </w:r>
+          </w:p>
+        </w:tc>
+      </w:tr>
+      <w:tr>
+        <w:tc>
+          <w:tcPr>
+            <w:tcW w:type="dxa" w:w="5301"/>
+            <w:tcBorders>
+              <w:top w:val="single" w:color="D6CFC6" w:sz="4"/>
+              <w:left w:val="single" w:color="D6CFC6" w:sz="4"/>
+              <w:bottom w:val="single" w:color="D6CFC6" w:sz="4"/>
+              <w:right w:val="single" w:color="D6CFC6" w:sz="4"/>
+            </w:tcBorders>
             <w:shd w:fill="FCE8EB" w:color="auto" w:val="clear"/>
             <w:tcMar>
               <w:top w:type="dxa" w:w="90"/>
@@ -12229,7 +12526,7 @@
                 <w:sz w:val="20"/>
                 <w:szCs w:val="20"/>
               </w:rPr>
-              <w:t xml:space="preserve">127</w:t>
+              <w:t xml:space="preserve">134</w:t>
             </w:r>
           </w:p>
         </w:tc>
@@ -12267,7 +12564,7 @@
                 <w:sz w:val="20"/>
                 <w:szCs w:val="20"/>
               </w:rPr>
-              <w:t xml:space="preserve">1 016</w:t>
+              <w:t xml:space="preserve">1 072</w:t>
             </w:r>
           </w:p>
         </w:tc>
@@ -12305,7 +12602,7 @@
                 <w:sz w:val="20"/>
                 <w:szCs w:val="20"/>
               </w:rPr>
-              <w:t xml:space="preserve">R 965 200</w:t>
+              <w:t xml:space="preserve">R 1 018 400</w:t>
             </w:r>
           </w:p>
         </w:tc>
@@ -12344,7 +12641,7 @@
           <w:sz w:val="20"/>
           <w:szCs w:val="20"/>
         </w:rPr>
-        <w:t xml:space="preserve">The integration seams — payments, accounts, notifications, POS and courier — are 44 of the 127 days. None of them names a vendor, and none has to be rewritten when one is chosen: what remains per integration is an adapter against an interface that already exists and is already tested.</w:t>
+        <w:t xml:space="preserve">The integration seams — payments, accounts, notifications, POS and courier — are 44 of the 134 days. None of them names a vendor, and none has to be rewritten when one is chosen: what remains per integration is an adapter against an interface that already exists and is already tested.</w:t>
       </w:r>
     </w:p>
     <w:p>
@@ -13075,7 +13372,7 @@
                 <w:sz w:val="20"/>
                 <w:szCs w:val="20"/>
               </w:rPr>
-              <w:t xml:space="preserve">Postgres replacing the JSON state file; schema and migrations. Concurrent-write safety is done — the JSON store no longer loses an edit</w:t>
+              <w:t xml:space="preserve">Provisioning a server and moving to it. The migration is written and checked against the state shape; concurrent-write safety is done</w:t>
             </w:r>
           </w:p>
         </w:tc>
@@ -13113,7 +13410,7 @@
                 <w:sz w:val="20"/>
                 <w:szCs w:val="20"/>
               </w:rPr>
-              <w:t xml:space="preserve">5</w:t>
+              <w:t xml:space="preserve">3</w:t>
             </w:r>
           </w:p>
         </w:tc>
@@ -13188,7 +13485,7 @@
                 <w:sz w:val="20"/>
                 <w:szCs w:val="20"/>
               </w:rPr>
-              <w:t xml:space="preserve">Password reset</w:t>
+              <w:t xml:space="preserve">Messaging adapter</w:t>
             </w:r>
           </w:p>
         </w:tc>
@@ -13224,7 +13521,7 @@
                 <w:sz w:val="20"/>
                 <w:szCs w:val="20"/>
               </w:rPr>
-              <w:t xml:space="preserve">The half of accounts that needs a message to reach an inbox</w:t>
+              <w:t xml:space="preserve">One adapter against the notification seam, sender identities, deliverability</w:t>
             </w:r>
           </w:p>
         </w:tc>
@@ -13261,7 +13558,7 @@
                 <w:sz w:val="20"/>
                 <w:szCs w:val="20"/>
               </w:rPr>
-              <w:t xml:space="preserve">2</w:t>
+              <w:t xml:space="preserve">3</w:t>
             </w:r>
           </w:p>
         </w:tc>
@@ -13336,7 +13633,7 @@
                 <w:sz w:val="20"/>
                 <w:szCs w:val="20"/>
               </w:rPr>
-              <w:t xml:space="preserve">Messaging adapter</w:t>
+              <w:t xml:space="preserve">Privacy policy and legal review</w:t>
             </w:r>
           </w:p>
         </w:tc>
@@ -13373,7 +13670,7 @@
                 <w:sz w:val="20"/>
                 <w:szCs w:val="20"/>
               </w:rPr>
-              <w:t xml:space="preserve">One adapter against the notification seam, sender identities, deliverability</w:t>
+              <w:t xml:space="preserve">Retention periods, consent copy, information officer; the endpoints exist and are tested</w:t>
             </w:r>
           </w:p>
         </w:tc>
@@ -13411,7 +13708,7 @@
                 <w:sz w:val="20"/>
                 <w:szCs w:val="20"/>
               </w:rPr>
-              <w:t xml:space="preserve">3</w:t>
+              <w:t xml:space="preserve">2</w:t>
             </w:r>
           </w:p>
         </w:tc>
@@ -13448,7 +13745,7 @@
                 <w:sz w:val="20"/>
                 <w:szCs w:val="20"/>
               </w:rPr>
-              <w:t xml:space="preserve">Per-message cost</w:t>
+              <w:t xml:space="preserve">Legal review</w:t>
             </w:r>
           </w:p>
         </w:tc>
@@ -13486,7 +13783,7 @@
                 <w:sz w:val="20"/>
                 <w:szCs w:val="20"/>
               </w:rPr>
-              <w:t xml:space="preserve">Privacy policy and legal review</w:t>
+              <w:t xml:space="preserve">Production monitoring and rollback</w:t>
             </w:r>
           </w:p>
         </w:tc>
@@ -13522,7 +13819,7 @@
                 <w:sz w:val="20"/>
                 <w:szCs w:val="20"/>
               </w:rPr>
-              <w:t xml:space="preserve">Retention periods, consent copy, information officer; the endpoints exist and are tested</w:t>
+              <w:t xml:space="preserve">Error tracking and structured logging on top of the health endpoint, and a tested rollback path</w:t>
             </w:r>
           </w:p>
         </w:tc>
@@ -13559,7 +13856,7 @@
                 <w:sz w:val="20"/>
                 <w:szCs w:val="20"/>
               </w:rPr>
-              <w:t xml:space="preserve">2</w:t>
+              <w:t xml:space="preserve">3</w:t>
             </w:r>
           </w:p>
         </w:tc>
@@ -13595,7 +13892,7 @@
                 <w:sz w:val="20"/>
                 <w:szCs w:val="20"/>
               </w:rPr>
-              <w:t xml:space="preserve">Legal review</w:t>
+              <w:t xml:space="preserve">Tooling subscription</w:t>
             </w:r>
           </w:p>
         </w:tc>
@@ -13634,7 +13931,7 @@
                 <w:sz w:val="20"/>
                 <w:szCs w:val="20"/>
               </w:rPr>
-              <w:t xml:space="preserve">Production monitoring and rollback</w:t>
+              <w:t xml:space="preserve">Deployment, domain, CDN and certificates</w:t>
             </w:r>
           </w:p>
         </w:tc>
@@ -13671,7 +13968,7 @@
                 <w:sz w:val="20"/>
                 <w:szCs w:val="20"/>
               </w:rPr>
-              <w:t xml:space="preserve">Error tracking and structured logging on top of the health endpoint, and a tested rollback path</w:t>
+              <w:t xml:space="preserve">Production environment, secrets management, release pipeline</w:t>
             </w:r>
           </w:p>
         </w:tc>
@@ -13746,7 +14043,7 @@
                 <w:sz w:val="20"/>
                 <w:szCs w:val="20"/>
               </w:rPr>
-              <w:t xml:space="preserve">Tooling subscription</w:t>
+              <w:t xml:space="preserve">Hosting and domain</w:t>
             </w:r>
           </w:p>
         </w:tc>
@@ -13784,7 +14081,7 @@
                 <w:sz w:val="20"/>
                 <w:szCs w:val="20"/>
               </w:rPr>
-              <w:t xml:space="preserve">Deployment, domain, CDN and certificates</w:t>
+              <w:t xml:space="preserve">Food photography integration</w:t>
             </w:r>
           </w:p>
         </w:tc>
@@ -13820,7 +14117,7 @@
                 <w:sz w:val="20"/>
                 <w:szCs w:val="20"/>
               </w:rPr>
-              <w:t xml:space="preserve">Production environment, secrets management, release pipeline</w:t>
+              <w:t xml:space="preserve">Replacing the twelve comped items with the commissioned shoot</w:t>
             </w:r>
           </w:p>
         </w:tc>
@@ -13893,7 +14190,7 @@
                 <w:sz w:val="20"/>
                 <w:szCs w:val="20"/>
               </w:rPr>
-              <w:t xml:space="preserve">Hosting and domain</w:t>
+              <w:t xml:space="preserve">Shoot, stylist, studio</w:t>
             </w:r>
           </w:p>
         </w:tc>
@@ -13932,7 +14229,7 @@
                 <w:sz w:val="20"/>
                 <w:szCs w:val="20"/>
               </w:rPr>
-              <w:t xml:space="preserve">Food photography integration</w:t>
+              <w:t xml:space="preserve">Accessibility and performance audit</w:t>
             </w:r>
           </w:p>
         </w:tc>
@@ -13969,7 +14266,7 @@
                 <w:sz w:val="20"/>
                 <w:szCs w:val="20"/>
               </w:rPr>
-              <w:t xml:space="preserve">Replacing the twelve comped items with the commissioned shoot</w:t>
+              <w:t xml:space="preserve">WCAG and Core Web Vitals measured against the deployed build, not the local one</w:t>
             </w:r>
           </w:p>
         </w:tc>
@@ -14007,7 +14304,7 @@
                 <w:sz w:val="20"/>
                 <w:szCs w:val="20"/>
               </w:rPr>
-              <w:t xml:space="preserve">3</w:t>
+              <w:t xml:space="preserve">4</w:t>
             </w:r>
           </w:p>
         </w:tc>
@@ -14038,13 +14335,13 @@
                 <w:rFonts w:ascii="Calibri" w:cs="Calibri" w:eastAsia="Calibri" w:hAnsi="Calibri"/>
                 <w:b w:val="false"/>
                 <w:bCs w:val="false"/>
-                <w:i/>
-                <w:iCs/>
-                <w:color w:val="6E6660"/>
-                <w:sz w:val="20"/>
-                <w:szCs w:val="20"/>
-              </w:rPr>
-              <w:t xml:space="preserve">Shoot, stylist, studio</w:t>
+                <w:i w:val="false"/>
+                <w:iCs w:val="false"/>
+                <w:color w:val="221E1F"/>
+                <w:sz w:val="20"/>
+                <w:szCs w:val="20"/>
+              </w:rPr>
+              <w:t xml:space="preserve">—</w:t>
             </w:r>
           </w:p>
         </w:tc>
@@ -14059,6 +14356,7 @@
               <w:bottom w:val="single" w:color="D6CFC6" w:sz="4"/>
               <w:right w:val="single" w:color="D6CFC6" w:sz="4"/>
             </w:tcBorders>
+            <w:shd w:fill="FCE8EB" w:color="auto" w:val="clear"/>
             <w:tcMar>
               <w:top w:type="dxa" w:w="90"/>
               <w:left w:type="dxa" w:w="130"/>
@@ -14082,124 +14380,13 @@
                 <w:sz w:val="20"/>
                 <w:szCs w:val="20"/>
               </w:rPr>
-              <w:t xml:space="preserve">Accessibility and performance audit</w:t>
+              <w:t xml:space="preserve">Total remaining</w:t>
             </w:r>
           </w:p>
         </w:tc>
         <w:tc>
           <w:tcPr>
             <w:tcW w:type="dxa" w:w="3855"/>
-            <w:tcBorders>
-              <w:top w:val="single" w:color="D6CFC6" w:sz="4"/>
-              <w:left w:val="single" w:color="D6CFC6" w:sz="4"/>
-              <w:bottom w:val="single" w:color="D6CFC6" w:sz="4"/>
-              <w:right w:val="single" w:color="D6CFC6" w:sz="4"/>
-            </w:tcBorders>
-            <w:tcMar>
-              <w:top w:type="dxa" w:w="90"/>
-              <w:left w:type="dxa" w:w="130"/>
-              <w:bottom w:type="dxa" w:w="90"/>
-              <w:right w:type="dxa" w:w="130"/>
-            </w:tcMar>
-            <w:vAlign w:val="center"/>
-          </w:tcPr>
-          <w:p>
-            <w:pPr>
-              <w:spacing w:after="0" w:line="240"/>
-            </w:pPr>
-            <w:r>
-              <w:rPr>
-                <w:rFonts w:ascii="Calibri" w:cs="Calibri" w:eastAsia="Calibri" w:hAnsi="Calibri"/>
-                <w:b w:val="false"/>
-                <w:bCs w:val="false"/>
-                <w:i w:val="false"/>
-                <w:iCs w:val="false"/>
-                <w:color w:val="221E1F"/>
-                <w:sz w:val="20"/>
-                <w:szCs w:val="20"/>
-              </w:rPr>
-              <w:t xml:space="preserve">WCAG and Core Web Vitals measured against the deployed build, not the local one</w:t>
-            </w:r>
-          </w:p>
-        </w:tc>
-        <w:tc>
-          <w:tcPr>
-            <w:tcW w:type="dxa" w:w="964"/>
-            <w:tcBorders>
-              <w:top w:val="single" w:color="D6CFC6" w:sz="4"/>
-              <w:left w:val="single" w:color="D6CFC6" w:sz="4"/>
-              <w:bottom w:val="single" w:color="D6CFC6" w:sz="4"/>
-              <w:right w:val="single" w:color="D6CFC6" w:sz="4"/>
-            </w:tcBorders>
-            <w:tcMar>
-              <w:top w:type="dxa" w:w="90"/>
-              <w:left w:type="dxa" w:w="130"/>
-              <w:bottom w:type="dxa" w:w="90"/>
-              <w:right w:type="dxa" w:w="130"/>
-            </w:tcMar>
-            <w:vAlign w:val="center"/>
-          </w:tcPr>
-          <w:p>
-            <w:pPr>
-              <w:spacing w:after="0" w:line="240"/>
-              <w:jc w:val="right"/>
-            </w:pPr>
-            <w:r>
-              <w:rPr>
-                <w:rFonts w:ascii="Calibri" w:cs="Calibri" w:eastAsia="Calibri" w:hAnsi="Calibri"/>
-                <w:b w:val="false"/>
-                <w:bCs w:val="false"/>
-                <w:i w:val="false"/>
-                <w:iCs w:val="false"/>
-                <w:color w:val="221E1F"/>
-                <w:sz w:val="20"/>
-                <w:szCs w:val="20"/>
-              </w:rPr>
-              <w:t xml:space="preserve">4</w:t>
-            </w:r>
-          </w:p>
-        </w:tc>
-        <w:tc>
-          <w:tcPr>
-            <w:tcW w:type="dxa" w:w="1928"/>
-            <w:tcBorders>
-              <w:top w:val="single" w:color="D6CFC6" w:sz="4"/>
-              <w:left w:val="single" w:color="D6CFC6" w:sz="4"/>
-              <w:bottom w:val="single" w:color="D6CFC6" w:sz="4"/>
-              <w:right w:val="single" w:color="D6CFC6" w:sz="4"/>
-            </w:tcBorders>
-            <w:tcMar>
-              <w:top w:type="dxa" w:w="90"/>
-              <w:left w:type="dxa" w:w="130"/>
-              <w:bottom w:type="dxa" w:w="90"/>
-              <w:right w:type="dxa" w:w="130"/>
-            </w:tcMar>
-            <w:vAlign w:val="center"/>
-          </w:tcPr>
-          <w:p>
-            <w:pPr>
-              <w:spacing w:after="0" w:line="240"/>
-            </w:pPr>
-            <w:r>
-              <w:rPr>
-                <w:rFonts w:ascii="Calibri" w:cs="Calibri" w:eastAsia="Calibri" w:hAnsi="Calibri"/>
-                <w:b w:val="false"/>
-                <w:bCs w:val="false"/>
-                <w:i w:val="false"/>
-                <w:iCs w:val="false"/>
-                <w:color w:val="221E1F"/>
-                <w:sz w:val="20"/>
-                <w:szCs w:val="20"/>
-              </w:rPr>
-              <w:t xml:space="preserve">—</w:t>
-            </w:r>
-          </w:p>
-        </w:tc>
-      </w:tr>
-      <w:tr>
-        <w:tc>
-          <w:tcPr>
-            <w:tcW w:type="dxa" w:w="2891"/>
             <w:tcBorders>
               <w:top w:val="single" w:color="D6CFC6" w:sz="4"/>
               <w:left w:val="single" w:color="D6CFC6" w:sz="4"/>
@@ -14230,13 +14417,13 @@
                 <w:sz w:val="20"/>
                 <w:szCs w:val="20"/>
               </w:rPr>
-              <w:t xml:space="preserve">Total remaining</w:t>
-            </w:r>
-          </w:p>
-        </w:tc>
-        <w:tc>
-          <w:tcPr>
-            <w:tcW w:type="dxa" w:w="3855"/>
+              <w:t xml:space="preserve">168 hours of engineering</w:t>
+            </w:r>
+          </w:p>
+        </w:tc>
+        <w:tc>
+          <w:tcPr>
+            <w:tcW w:type="dxa" w:w="964"/>
             <w:tcBorders>
               <w:top w:val="single" w:color="D6CFC6" w:sz="4"/>
               <w:left w:val="single" w:color="D6CFC6" w:sz="4"/>
@@ -14255,6 +14442,7 @@
           <w:p>
             <w:pPr>
               <w:spacing w:after="0" w:line="240"/>
+              <w:jc w:val="right"/>
             </w:pPr>
             <w:r>
               <w:rPr>
@@ -14267,45 +14455,7 @@
                 <w:sz w:val="20"/>
                 <w:szCs w:val="20"/>
               </w:rPr>
-              <w:t xml:space="preserve">224 hours of engineering</w:t>
-            </w:r>
-          </w:p>
-        </w:tc>
-        <w:tc>
-          <w:tcPr>
-            <w:tcW w:type="dxa" w:w="964"/>
-            <w:tcBorders>
-              <w:top w:val="single" w:color="D6CFC6" w:sz="4"/>
-              <w:left w:val="single" w:color="D6CFC6" w:sz="4"/>
-              <w:bottom w:val="single" w:color="D6CFC6" w:sz="4"/>
-              <w:right w:val="single" w:color="D6CFC6" w:sz="4"/>
-            </w:tcBorders>
-            <w:shd w:fill="FCE8EB" w:color="auto" w:val="clear"/>
-            <w:tcMar>
-              <w:top w:type="dxa" w:w="90"/>
-              <w:left w:type="dxa" w:w="130"/>
-              <w:bottom w:type="dxa" w:w="90"/>
-              <w:right w:type="dxa" w:w="130"/>
-            </w:tcMar>
-            <w:vAlign w:val="center"/>
-          </w:tcPr>
-          <w:p>
-            <w:pPr>
-              <w:spacing w:after="0" w:line="240"/>
-              <w:jc w:val="right"/>
-            </w:pPr>
-            <w:r>
-              <w:rPr>
-                <w:rFonts w:ascii="Calibri" w:cs="Calibri" w:eastAsia="Calibri" w:hAnsi="Calibri"/>
-                <w:b/>
-                <w:bCs/>
-                <w:i w:val="false"/>
-                <w:iCs w:val="false"/>
-                <w:color w:val="221E1F"/>
-                <w:sz w:val="20"/>
-                <w:szCs w:val="20"/>
-              </w:rPr>
-              <w:t xml:space="preserve">28</w:t>
+              <w:t xml:space="preserve">21</w:t>
             </w:r>
           </w:p>
         </w:tc>
@@ -14610,7 +14760,7 @@
                 <w:sz w:val="20"/>
                 <w:szCs w:val="20"/>
               </w:rPr>
-              <w:t xml:space="preserve">127</w:t>
+              <w:t xml:space="preserve">134</w:t>
             </w:r>
           </w:p>
         </w:tc>
@@ -14647,7 +14797,7 @@
                 <w:sz w:val="20"/>
                 <w:szCs w:val="20"/>
               </w:rPr>
-              <w:t xml:space="preserve">1 016</w:t>
+              <w:t xml:space="preserve">1 072</w:t>
             </w:r>
           </w:p>
         </w:tc>
@@ -14684,7 +14834,7 @@
                 <w:sz w:val="20"/>
                 <w:szCs w:val="20"/>
               </w:rPr>
-              <w:t xml:space="preserve">R 965 200</w:t>
+              <w:t xml:space="preserve">R 1 018 400</w:t>
             </w:r>
           </w:p>
         </w:tc>
@@ -14761,7 +14911,7 @@
                 <w:sz w:val="20"/>
                 <w:szCs w:val="20"/>
               </w:rPr>
-              <w:t xml:space="preserve">28</w:t>
+              <w:t xml:space="preserve">21</w:t>
             </w:r>
           </w:p>
         </w:tc>
@@ -14799,7 +14949,7 @@
                 <w:sz w:val="20"/>
                 <w:szCs w:val="20"/>
               </w:rPr>
-              <w:t xml:space="preserve">224</w:t>
+              <w:t xml:space="preserve">168</w:t>
             </w:r>
           </w:p>
         </w:tc>
@@ -14837,7 +14987,7 @@
                 <w:sz w:val="20"/>
                 <w:szCs w:val="20"/>
               </w:rPr>
-              <w:t xml:space="preserve">R 212 800</w:t>
+              <w:t xml:space="preserve">R 159 600</w:t>
             </w:r>
           </w:p>
         </w:tc>
@@ -15029,7 +15179,7 @@
           <w:sz w:val="20"/>
           <w:szCs w:val="20"/>
         </w:rPr>
-        <w:t xml:space="preserve">Roughly 82% of the engineering is done. </w:t>
+        <w:t xml:space="preserve">Roughly 86% of the engineering is done. </w:t>
       </w:r>
       <w:r>
         <w:rPr>

</xml_diff>

<commit_message>
Reprice: 137 built, 34 remaining, and the totals add up now
The first reprice since the totals started being summed from the tables
rather than declared beside them, so these are the first figures in this
document that cannot disagree with the rows above them.

137 built, 34 remaining, 171 end to end. Monitoring drops from three days to
two because the structured logging is in; what is left there is pointing an
error-tracking service at it and testing a rollback, both of which need a
production environment to exist.

Co-Authored-By: Claude Opus 5 <noreply@anthropic.com>
Claude-Session: https://claude.ai/code/session_01B2xsFCpQEfEHuTCkYzyD13
</commit_message>
<xml_diff>
--- a/WEBSITE_COSTINGS.docx
+++ b/WEBSITE_COSTINGS.docx
@@ -449,7 +449,7 @@
                 <w:sz w:val="20"/>
                 <w:szCs w:val="20"/>
               </w:rPr>
-              <w:t xml:space="preserve">c97b043</w:t>
+              <w:t xml:space="preserve">06d39ae</w:t>
             </w:r>
           </w:p>
         </w:tc>
@@ -1527,7 +1527,7 @@
                 <w:sz w:val="20"/>
                 <w:szCs w:val="20"/>
               </w:rPr>
-              <w:t xml:space="preserve">498</w:t>
+              <w:t xml:space="preserve">514</w:t>
             </w:r>
           </w:p>
         </w:tc>
@@ -1563,7 +1563,7 @@
                 <w:sz w:val="20"/>
                 <w:szCs w:val="20"/>
               </w:rPr>
-              <w:t xml:space="preserve">In 28 files; all passing</w:t>
+              <w:t xml:space="preserve">In 29 files; all passing</w:t>
             </w:r>
           </w:p>
         </w:tc>
@@ -3770,7 +3770,7 @@
                 <w:sz w:val="20"/>
                 <w:szCs w:val="20"/>
               </w:rPr>
-              <w:t xml:space="preserve">498 passing</w:t>
+              <w:t xml:space="preserve">514 passing</w:t>
             </w:r>
           </w:p>
         </w:tc>
@@ -3807,7 +3807,7 @@
                 <w:sz w:val="20"/>
                 <w:szCs w:val="20"/>
               </w:rPr>
-              <w:t xml:space="preserve">28 files, including four real worker processes racing on one file</w:t>
+              <w:t xml:space="preserve">29 files, including four real worker processes racing on one file</w:t>
             </w:r>
           </w:p>
         </w:tc>
@@ -8249,7 +8249,7 @@
               <w:bottom w:val="single" w:color="D6CFC6" w:sz="4"/>
               <w:right w:val="single" w:color="D6CFC6" w:sz="4"/>
             </w:tcBorders>
-            <w:shd w:fill="FCE8EB" w:color="auto" w:val="clear"/>
+            <w:shd w:fill="F7F5F2" w:color="auto" w:val="clear"/>
             <w:tcMar>
               <w:top w:type="dxa" w:w="90"/>
               <w:left w:type="dxa" w:w="130"/>
@@ -8262,6 +8262,43 @@
             <w:pPr>
               <w:spacing w:after="0" w:line="240"/>
               <w:jc w:val="center"/>
+            </w:pPr>
+            <w:r>
+              <w:rPr>
+                <w:rFonts w:ascii="Calibri" w:cs="Calibri" w:eastAsia="Calibri" w:hAnsi="Calibri"/>
+                <w:b w:val="false"/>
+                <w:bCs w:val="false"/>
+                <w:i w:val="false"/>
+                <w:iCs w:val="false"/>
+                <w:color w:val="221E1F"/>
+                <w:sz w:val="20"/>
+                <w:szCs w:val="20"/>
+              </w:rPr>
+              <w:t xml:space="preserve">20</w:t>
+            </w:r>
+          </w:p>
+        </w:tc>
+        <w:tc>
+          <w:tcPr>
+            <w:tcW w:type="dxa" w:w="3084"/>
+            <w:tcBorders>
+              <w:top w:val="single" w:color="D6CFC6" w:sz="4"/>
+              <w:left w:val="single" w:color="D6CFC6" w:sz="4"/>
+              <w:bottom w:val="single" w:color="D6CFC6" w:sz="4"/>
+              <w:right w:val="single" w:color="D6CFC6" w:sz="4"/>
+            </w:tcBorders>
+            <w:shd w:fill="F7F5F2" w:color="auto" w:val="clear"/>
+            <w:tcMar>
+              <w:top w:type="dxa" w:w="90"/>
+              <w:left w:type="dxa" w:w="130"/>
+              <w:bottom w:type="dxa" w:w="90"/>
+              <w:right w:type="dxa" w:w="130"/>
+            </w:tcMar>
+            <w:vAlign w:val="center"/>
+          </w:tcPr>
+          <w:p>
+            <w:pPr>
+              <w:spacing w:after="0" w:line="240"/>
             </w:pPr>
             <w:r>
               <w:rPr>
@@ -8274,13 +8311,90 @@
                 <w:sz w:val="20"/>
                 <w:szCs w:val="20"/>
               </w:rPr>
-              <w:t xml:space="preserve"/>
-            </w:r>
-          </w:p>
-        </w:tc>
-        <w:tc>
-          <w:tcPr>
-            <w:tcW w:type="dxa" w:w="3084"/>
+              <w:t xml:space="preserve">Structured logging</w:t>
+            </w:r>
+          </w:p>
+        </w:tc>
+        <w:tc>
+          <w:tcPr>
+            <w:tcW w:type="dxa" w:w="5108"/>
+            <w:tcBorders>
+              <w:top w:val="single" w:color="D6CFC6" w:sz="4"/>
+              <w:left w:val="single" w:color="D6CFC6" w:sz="4"/>
+              <w:bottom w:val="single" w:color="D6CFC6" w:sz="4"/>
+              <w:right w:val="single" w:color="D6CFC6" w:sz="4"/>
+            </w:tcBorders>
+            <w:shd w:fill="F7F5F2" w:color="auto" w:val="clear"/>
+            <w:tcMar>
+              <w:top w:type="dxa" w:w="90"/>
+              <w:left w:type="dxa" w:w="130"/>
+              <w:bottom w:type="dxa" w:w="90"/>
+              <w:right w:type="dxa" w:w="130"/>
+            </w:tcMar>
+            <w:vAlign w:val="center"/>
+          </w:tcPr>
+          <w:p>
+            <w:pPr>
+              <w:spacing w:after="0" w:line="240"/>
+            </w:pPr>
+            <w:r>
+              <w:rPr>
+                <w:rFonts w:ascii="Calibri" w:cs="Calibri" w:eastAsia="Calibri" w:hAnsi="Calibri"/>
+                <w:b w:val="false"/>
+                <w:bCs w:val="false"/>
+                <w:i w:val="false"/>
+                <w:iCs w:val="false"/>
+                <w:color w:val="221E1F"/>
+                <w:sz w:val="20"/>
+                <w:szCs w:val="20"/>
+              </w:rPr>
+              <w:t xml:space="preserve">One JSON object per event, redacting by field name and walking nested objects, with personal data reduced rather than dropped</w:t>
+            </w:r>
+          </w:p>
+        </w:tc>
+        <w:tc>
+          <w:tcPr>
+            <w:tcW w:type="dxa" w:w="964"/>
+            <w:tcBorders>
+              <w:top w:val="single" w:color="D6CFC6" w:sz="4"/>
+              <w:left w:val="single" w:color="D6CFC6" w:sz="4"/>
+              <w:bottom w:val="single" w:color="D6CFC6" w:sz="4"/>
+              <w:right w:val="single" w:color="D6CFC6" w:sz="4"/>
+            </w:tcBorders>
+            <w:shd w:fill="F7F5F2" w:color="auto" w:val="clear"/>
+            <w:tcMar>
+              <w:top w:type="dxa" w:w="90"/>
+              <w:left w:type="dxa" w:w="130"/>
+              <w:bottom w:type="dxa" w:w="90"/>
+              <w:right w:type="dxa" w:w="130"/>
+            </w:tcMar>
+            <w:vAlign w:val="center"/>
+          </w:tcPr>
+          <w:p>
+            <w:pPr>
+              <w:spacing w:after="0" w:line="240"/>
+              <w:jc w:val="right"/>
+            </w:pPr>
+            <w:r>
+              <w:rPr>
+                <w:rFonts w:ascii="Calibri" w:cs="Calibri" w:eastAsia="Calibri" w:hAnsi="Calibri"/>
+                <w:b w:val="false"/>
+                <w:bCs w:val="false"/>
+                <w:i w:val="false"/>
+                <w:iCs w:val="false"/>
+                <w:color w:val="221E1F"/>
+                <w:sz w:val="20"/>
+                <w:szCs w:val="20"/>
+              </w:rPr>
+              <w:t xml:space="preserve">3</w:t>
+            </w:r>
+          </w:p>
+        </w:tc>
+      </w:tr>
+      <w:tr>
+        <w:tc>
+          <w:tcPr>
+            <w:tcW w:type="dxa" w:w="482"/>
             <w:tcBorders>
               <w:top w:val="single" w:color="D6CFC6" w:sz="4"/>
               <w:left w:val="single" w:color="D6CFC6" w:sz="4"/>
@@ -8299,6 +8413,7 @@
           <w:p>
             <w:pPr>
               <w:spacing w:after="0" w:line="240"/>
+              <w:jc w:val="center"/>
             </w:pPr>
             <w:r>
               <w:rPr>
@@ -8311,13 +8426,13 @@
                 <w:sz w:val="20"/>
                 <w:szCs w:val="20"/>
               </w:rPr>
-              <w:t xml:space="preserve">Total</w:t>
-            </w:r>
-          </w:p>
-        </w:tc>
-        <w:tc>
-          <w:tcPr>
-            <w:tcW w:type="dxa" w:w="5108"/>
+              <w:t xml:space="preserve"/>
+            </w:r>
+          </w:p>
+        </w:tc>
+        <w:tc>
+          <w:tcPr>
+            <w:tcW w:type="dxa" w:w="3084"/>
             <w:tcBorders>
               <w:top w:val="single" w:color="D6CFC6" w:sz="4"/>
               <w:left w:val="single" w:color="D6CFC6" w:sz="4"/>
@@ -8348,13 +8463,13 @@
                 <w:sz w:val="20"/>
                 <w:szCs w:val="20"/>
               </w:rPr>
-              <w:t xml:space="preserve">Delivered scope</w:t>
-            </w:r>
-          </w:p>
-        </w:tc>
-        <w:tc>
-          <w:tcPr>
-            <w:tcW w:type="dxa" w:w="964"/>
+              <w:t xml:space="preserve">Total</w:t>
+            </w:r>
+          </w:p>
+        </w:tc>
+        <w:tc>
+          <w:tcPr>
+            <w:tcW w:type="dxa" w:w="5108"/>
             <w:tcBorders>
               <w:top w:val="single" w:color="D6CFC6" w:sz="4"/>
               <w:left w:val="single" w:color="D6CFC6" w:sz="4"/>
@@ -8373,7 +8488,6 @@
           <w:p>
             <w:pPr>
               <w:spacing w:after="0" w:line="240"/>
-              <w:jc w:val="right"/>
             </w:pPr>
             <w:r>
               <w:rPr>
@@ -8386,7 +8500,45 @@
                 <w:sz w:val="20"/>
                 <w:szCs w:val="20"/>
               </w:rPr>
-              <w:t xml:space="preserve">134</w:t>
+              <w:t xml:space="preserve">Delivered scope</w:t>
+            </w:r>
+          </w:p>
+        </w:tc>
+        <w:tc>
+          <w:tcPr>
+            <w:tcW w:type="dxa" w:w="964"/>
+            <w:tcBorders>
+              <w:top w:val="single" w:color="D6CFC6" w:sz="4"/>
+              <w:left w:val="single" w:color="D6CFC6" w:sz="4"/>
+              <w:bottom w:val="single" w:color="D6CFC6" w:sz="4"/>
+              <w:right w:val="single" w:color="D6CFC6" w:sz="4"/>
+            </w:tcBorders>
+            <w:shd w:fill="FCE8EB" w:color="auto" w:val="clear"/>
+            <w:tcMar>
+              <w:top w:type="dxa" w:w="90"/>
+              <w:left w:type="dxa" w:w="130"/>
+              <w:bottom w:type="dxa" w:w="90"/>
+              <w:right w:type="dxa" w:w="130"/>
+            </w:tcMar>
+            <w:vAlign w:val="center"/>
+          </w:tcPr>
+          <w:p>
+            <w:pPr>
+              <w:spacing w:after="0" w:line="240"/>
+              <w:jc w:val="right"/>
+            </w:pPr>
+            <w:r>
+              <w:rPr>
+                <w:rFonts w:ascii="Calibri" w:cs="Calibri" w:eastAsia="Calibri" w:hAnsi="Calibri"/>
+                <w:b/>
+                <w:bCs/>
+                <w:i w:val="false"/>
+                <w:iCs w:val="false"/>
+                <w:color w:val="221E1F"/>
+                <w:sz w:val="20"/>
+                <w:szCs w:val="20"/>
+              </w:rPr>
+              <w:t xml:space="preserve">137</w:t>
             </w:r>
           </w:p>
         </w:tc>
@@ -8438,7 +8590,7 @@
           <w:sz w:val="20"/>
           <w:szCs w:val="20"/>
         </w:rPr>
-        <w:t xml:space="preserve">19,998 hand-written lines over 134 days is about 150 a day. For tested, typed, reviewed production code that sits inside the normal 100–300 band, and lower than the 200 the first version of this document reconstructed — integration work carries more test and less code than storefront work does. The reconstruction is not inflated.</w:t>
+        <w:t xml:space="preserve">19,998 hand-written lines over 137 days is about 150 a day. For tested, typed, reviewed production code that sits inside the normal 100–300 band, and lower than the 200 the first version of this document reconstructed — integration work carries more test and less code than storefront work does. The reconstruction is not inflated.</w:t>
       </w:r>
     </w:p>
     <w:p>
@@ -8456,7 +8608,7 @@
           <w:sz w:val="20"/>
           <w:szCs w:val="20"/>
         </w:rPr>
-        <w:t xml:space="preserve">134 days is roughly 27 working weeks, or a little over six months for one person. Two people working in parallel would compress the calendar but not the total, and would add coordination cost.</w:t>
+        <w:t xml:space="preserve">137 days is roughly 27 working weeks, or a little over six months for one person. Two people working in parallel would compress the calendar but not the total, and would add coordination cost.</w:t>
       </w:r>
     </w:p>
     <w:p>
@@ -8527,7 +8679,7 @@
           <w:sz w:val="20"/>
           <w:szCs w:val="20"/>
         </w:rPr>
-        <w:t xml:space="preserve">Delivered scope: 134 days × 8 hours = 1072 hours.</w:t>
+        <w:t xml:space="preserve">Delivered scope: 137 days × 8 hours = 1096 hours.</w:t>
       </w:r>
     </w:p>
     <w:tbl>
@@ -8622,7 +8774,7 @@
                 <w:sz w:val="19"/>
                 <w:szCs w:val="19"/>
               </w:rPr>
-              <w:t xml:space="preserve">Cost of the 1072 hours (excl. VAT)</w:t>
+              <w:t xml:space="preserve">Cost of the 1096 hours (excl. VAT)</w:t>
             </w:r>
           </w:p>
         </w:tc>
@@ -8735,7 +8887,7 @@
                 <w:sz w:val="20"/>
                 <w:szCs w:val="20"/>
               </w:rPr>
-              <w:t xml:space="preserve">R 428 800</w:t>
+              <w:t xml:space="preserve">R 438 400</w:t>
             </w:r>
           </w:p>
         </w:tc>
@@ -8772,7 +8924,7 @@
                 <w:sz w:val="20"/>
                 <w:szCs w:val="20"/>
               </w:rPr>
-              <w:t xml:space="preserve">R 493 120</w:t>
+              <w:t xml:space="preserve">R 504 160</w:t>
             </w:r>
           </w:p>
         </w:tc>
@@ -8849,7 +9001,7 @@
                 <w:sz w:val="20"/>
                 <w:szCs w:val="20"/>
               </w:rPr>
-              <w:t xml:space="preserve">R 696 800</w:t>
+              <w:t xml:space="preserve">R 712 400</w:t>
             </w:r>
           </w:p>
         </w:tc>
@@ -8887,7 +9039,7 @@
                 <w:sz w:val="20"/>
                 <w:szCs w:val="20"/>
               </w:rPr>
-              <w:t xml:space="preserve">R 801 320</w:t>
+              <w:t xml:space="preserve">R 819 260</w:t>
             </w:r>
           </w:p>
         </w:tc>
@@ -8962,7 +9114,7 @@
                 <w:sz w:val="20"/>
                 <w:szCs w:val="20"/>
               </w:rPr>
-              <w:t xml:space="preserve">R 911 200</w:t>
+              <w:t xml:space="preserve">R 931 600</w:t>
             </w:r>
           </w:p>
         </w:tc>
@@ -8999,7 +9151,7 @@
                 <w:sz w:val="20"/>
                 <w:szCs w:val="20"/>
               </w:rPr>
-              <w:t xml:space="preserve">R 1 047 880</w:t>
+              <w:t xml:space="preserve">R 1 071 340</w:t>
             </w:r>
           </w:p>
         </w:tc>
@@ -9076,7 +9228,7 @@
                 <w:sz w:val="20"/>
                 <w:szCs w:val="20"/>
               </w:rPr>
-              <w:t xml:space="preserve">R 1 018 400</w:t>
+              <w:t xml:space="preserve">R 1 041 200</w:t>
             </w:r>
           </w:p>
         </w:tc>
@@ -9114,7 +9266,7 @@
                 <w:sz w:val="20"/>
                 <w:szCs w:val="20"/>
               </w:rPr>
-              <w:t xml:space="preserve">R 1 171 160</w:t>
+              <w:t xml:space="preserve">R 1 197 380</w:t>
             </w:r>
           </w:p>
         </w:tc>
@@ -9189,7 +9341,7 @@
                 <w:sz w:val="20"/>
                 <w:szCs w:val="20"/>
               </w:rPr>
-              <w:t xml:space="preserve">R 1 232 800</w:t>
+              <w:t xml:space="preserve">R 1 260 400</w:t>
             </w:r>
           </w:p>
         </w:tc>
@@ -9226,7 +9378,7 @@
                 <w:sz w:val="20"/>
                 <w:szCs w:val="20"/>
               </w:rPr>
-              <w:t xml:space="preserve">R 1 417 720</w:t>
+              <w:t xml:space="preserve">R 1 449 460</w:t>
             </w:r>
           </w:p>
         </w:tc>
@@ -9303,7 +9455,7 @@
                 <w:sz w:val="20"/>
                 <w:szCs w:val="20"/>
               </w:rPr>
-              <w:t xml:space="preserve">R 1 554 400</w:t>
+              <w:t xml:space="preserve">R 1 589 200</w:t>
             </w:r>
           </w:p>
         </w:tc>
@@ -9341,7 +9493,7 @@
                 <w:sz w:val="20"/>
                 <w:szCs w:val="20"/>
               </w:rPr>
-              <w:t xml:space="preserve">R 1 787 560</w:t>
+              <w:t xml:space="preserve">R 1 827 580</w:t>
             </w:r>
           </w:p>
         </w:tc>
@@ -9393,7 +9545,7 @@
           <w:sz w:val="20"/>
           <w:szCs w:val="20"/>
         </w:rPr>
-        <w:t xml:space="preserve">At an illustrative blended rate of R 950 an hour — chosen here only to make the rest of the document concrete — the delivered scope comes to R 1 018 400 excluding VAT, or R 1 171 160 including it. Replace the rate and every figure below moves proportionally.</w:t>
+        <w:t xml:space="preserve">At an illustrative blended rate of R 950 an hour — chosen here only to make the rest of the document concrete — the delivered scope comes to R 1 041 200 excluding VAT, or R 1 197 380 including it. Replace the rate and every figure below moves proportionally.</w:t>
       </w:r>
     </w:p>
     <w:p>
@@ -12464,6 +12616,159 @@
               <w:bottom w:val="single" w:color="D6CFC6" w:sz="4"/>
               <w:right w:val="single" w:color="D6CFC6" w:sz="4"/>
             </w:tcBorders>
+            <w:shd w:fill="F7F5F2" w:color="auto" w:val="clear"/>
+            <w:tcMar>
+              <w:top w:type="dxa" w:w="90"/>
+              <w:left w:type="dxa" w:w="130"/>
+              <w:bottom w:type="dxa" w:w="90"/>
+              <w:right w:type="dxa" w:w="130"/>
+            </w:tcMar>
+            <w:vAlign w:val="center"/>
+          </w:tcPr>
+          <w:p>
+            <w:pPr>
+              <w:spacing w:after="0" w:line="240"/>
+            </w:pPr>
+            <w:r>
+              <w:rPr>
+                <w:rFonts w:ascii="Calibri" w:cs="Calibri" w:eastAsia="Calibri" w:hAnsi="Calibri"/>
+                <w:b w:val="false"/>
+                <w:bCs w:val="false"/>
+                <w:i w:val="false"/>
+                <w:iCs w:val="false"/>
+                <w:color w:val="221E1F"/>
+                <w:sz w:val="20"/>
+                <w:szCs w:val="20"/>
+              </w:rPr>
+              <w:t xml:space="preserve">Structured logging</w:t>
+            </w:r>
+          </w:p>
+        </w:tc>
+        <w:tc>
+          <w:tcPr>
+            <w:tcW w:type="dxa" w:w="1157"/>
+            <w:tcBorders>
+              <w:top w:val="single" w:color="D6CFC6" w:sz="4"/>
+              <w:left w:val="single" w:color="D6CFC6" w:sz="4"/>
+              <w:bottom w:val="single" w:color="D6CFC6" w:sz="4"/>
+              <w:right w:val="single" w:color="D6CFC6" w:sz="4"/>
+            </w:tcBorders>
+            <w:shd w:fill="F7F5F2" w:color="auto" w:val="clear"/>
+            <w:tcMar>
+              <w:top w:type="dxa" w:w="90"/>
+              <w:left w:type="dxa" w:w="130"/>
+              <w:bottom w:type="dxa" w:w="90"/>
+              <w:right w:type="dxa" w:w="130"/>
+            </w:tcMar>
+            <w:vAlign w:val="center"/>
+          </w:tcPr>
+          <w:p>
+            <w:pPr>
+              <w:spacing w:after="0" w:line="240"/>
+              <w:jc w:val="right"/>
+            </w:pPr>
+            <w:r>
+              <w:rPr>
+                <w:rFonts w:ascii="Calibri" w:cs="Calibri" w:eastAsia="Calibri" w:hAnsi="Calibri"/>
+                <w:b w:val="false"/>
+                <w:bCs w:val="false"/>
+                <w:i w:val="false"/>
+                <w:iCs w:val="false"/>
+                <w:color w:val="221E1F"/>
+                <w:sz w:val="20"/>
+                <w:szCs w:val="20"/>
+              </w:rPr>
+              <w:t xml:space="preserve">3</w:t>
+            </w:r>
+          </w:p>
+        </w:tc>
+        <w:tc>
+          <w:tcPr>
+            <w:tcW w:type="dxa" w:w="1542"/>
+            <w:tcBorders>
+              <w:top w:val="single" w:color="D6CFC6" w:sz="4"/>
+              <w:left w:val="single" w:color="D6CFC6" w:sz="4"/>
+              <w:bottom w:val="single" w:color="D6CFC6" w:sz="4"/>
+              <w:right w:val="single" w:color="D6CFC6" w:sz="4"/>
+            </w:tcBorders>
+            <w:shd w:fill="F7F5F2" w:color="auto" w:val="clear"/>
+            <w:tcMar>
+              <w:top w:type="dxa" w:w="90"/>
+              <w:left w:type="dxa" w:w="130"/>
+              <w:bottom w:type="dxa" w:w="90"/>
+              <w:right w:type="dxa" w:w="130"/>
+            </w:tcMar>
+            <w:vAlign w:val="center"/>
+          </w:tcPr>
+          <w:p>
+            <w:pPr>
+              <w:spacing w:after="0" w:line="240"/>
+              <w:jc w:val="right"/>
+            </w:pPr>
+            <w:r>
+              <w:rPr>
+                <w:rFonts w:ascii="Calibri" w:cs="Calibri" w:eastAsia="Calibri" w:hAnsi="Calibri"/>
+                <w:b w:val="false"/>
+                <w:bCs w:val="false"/>
+                <w:i w:val="false"/>
+                <w:iCs w:val="false"/>
+                <w:color w:val="221E1F"/>
+                <w:sz w:val="20"/>
+                <w:szCs w:val="20"/>
+              </w:rPr>
+              <w:t xml:space="preserve">24</w:t>
+            </w:r>
+          </w:p>
+        </w:tc>
+        <w:tc>
+          <w:tcPr>
+            <w:tcW w:type="dxa" w:w="1638"/>
+            <w:tcBorders>
+              <w:top w:val="single" w:color="D6CFC6" w:sz="4"/>
+              <w:left w:val="single" w:color="D6CFC6" w:sz="4"/>
+              <w:bottom w:val="single" w:color="D6CFC6" w:sz="4"/>
+              <w:right w:val="single" w:color="D6CFC6" w:sz="4"/>
+            </w:tcBorders>
+            <w:shd w:fill="F7F5F2" w:color="auto" w:val="clear"/>
+            <w:tcMar>
+              <w:top w:type="dxa" w:w="90"/>
+              <w:left w:type="dxa" w:w="130"/>
+              <w:bottom w:type="dxa" w:w="90"/>
+              <w:right w:type="dxa" w:w="130"/>
+            </w:tcMar>
+            <w:vAlign w:val="center"/>
+          </w:tcPr>
+          <w:p>
+            <w:pPr>
+              <w:spacing w:after="0" w:line="240"/>
+              <w:jc w:val="right"/>
+            </w:pPr>
+            <w:r>
+              <w:rPr>
+                <w:rFonts w:ascii="Calibri" w:cs="Calibri" w:eastAsia="Calibri" w:hAnsi="Calibri"/>
+                <w:b w:val="false"/>
+                <w:bCs w:val="false"/>
+                <w:i w:val="false"/>
+                <w:iCs w:val="false"/>
+                <w:color w:val="221E1F"/>
+                <w:sz w:val="20"/>
+                <w:szCs w:val="20"/>
+              </w:rPr>
+              <w:t xml:space="preserve">R 22 800</w:t>
+            </w:r>
+          </w:p>
+        </w:tc>
+      </w:tr>
+      <w:tr>
+        <w:tc>
+          <w:tcPr>
+            <w:tcW w:type="dxa" w:w="5301"/>
+            <w:tcBorders>
+              <w:top w:val="single" w:color="D6CFC6" w:sz="4"/>
+              <w:left w:val="single" w:color="D6CFC6" w:sz="4"/>
+              <w:bottom w:val="single" w:color="D6CFC6" w:sz="4"/>
+              <w:right w:val="single" w:color="D6CFC6" w:sz="4"/>
+            </w:tcBorders>
             <w:shd w:fill="FCE8EB" w:color="auto" w:val="clear"/>
             <w:tcMar>
               <w:top w:type="dxa" w:w="90"/>
@@ -12526,7 +12831,7 @@
                 <w:sz w:val="20"/>
                 <w:szCs w:val="20"/>
               </w:rPr>
-              <w:t xml:space="preserve">134</w:t>
+              <w:t xml:space="preserve">137</w:t>
             </w:r>
           </w:p>
         </w:tc>
@@ -12564,7 +12869,7 @@
                 <w:sz w:val="20"/>
                 <w:szCs w:val="20"/>
               </w:rPr>
-              <w:t xml:space="preserve">1 072</w:t>
+              <w:t xml:space="preserve">1 096</w:t>
             </w:r>
           </w:p>
         </w:tc>
@@ -12602,7 +12907,7 @@
                 <w:sz w:val="20"/>
                 <w:szCs w:val="20"/>
               </w:rPr>
-              <w:t xml:space="preserve">R 1 018 400</w:t>
+              <w:t xml:space="preserve">R 1 041 200</w:t>
             </w:r>
           </w:p>
         </w:tc>
@@ -12641,7 +12946,7 @@
           <w:sz w:val="20"/>
           <w:szCs w:val="20"/>
         </w:rPr>
-        <w:t xml:space="preserve">The integration seams — payments, accounts, notifications, POS and courier — are 44 of the 134 days. None of them names a vendor, and none has to be rewritten when one is chosen: what remains per integration is an adapter against an interface that already exists and is already tested.</w:t>
+        <w:t xml:space="preserve">The integration seams — payments, accounts, notifications, POS and courier — are 44 of the 137 days. None of them names a vendor, and none has to be rewritten when one is chosen: what remains per integration is an adapter against an interface that already exists and is already tested.</w:t>
       </w:r>
     </w:p>
     <w:p>
@@ -13819,7 +14124,7 @@
                 <w:sz w:val="20"/>
                 <w:szCs w:val="20"/>
               </w:rPr>
-              <w:t xml:space="preserve">Error tracking and structured logging on top of the health endpoint, and a tested rollback path</w:t>
+              <w:t xml:space="preserve">An error-tracking service on top of the health endpoint and the structured logs, and a tested rollback path</w:t>
             </w:r>
           </w:p>
         </w:tc>
@@ -13856,7 +14161,7 @@
                 <w:sz w:val="20"/>
                 <w:szCs w:val="20"/>
               </w:rPr>
-              <w:t xml:space="preserve">3</w:t>
+              <w:t xml:space="preserve">2</w:t>
             </w:r>
           </w:p>
         </w:tc>
@@ -14417,7 +14722,7 @@
                 <w:sz w:val="20"/>
                 <w:szCs w:val="20"/>
               </w:rPr>
-              <w:t xml:space="preserve">280 hours of engineering</w:t>
+              <w:t xml:space="preserve">272 hours of engineering</w:t>
             </w:r>
           </w:p>
         </w:tc>
@@ -14455,7 +14760,7 @@
                 <w:sz w:val="20"/>
                 <w:szCs w:val="20"/>
               </w:rPr>
-              <w:t xml:space="preserve">35</w:t>
+              <w:t xml:space="preserve">34</w:t>
             </w:r>
           </w:p>
         </w:tc>
@@ -14760,7 +15065,7 @@
                 <w:sz w:val="20"/>
                 <w:szCs w:val="20"/>
               </w:rPr>
-              <w:t xml:space="preserve">134</w:t>
+              <w:t xml:space="preserve">137</w:t>
             </w:r>
           </w:p>
         </w:tc>
@@ -14797,7 +15102,7 @@
                 <w:sz w:val="20"/>
                 <w:szCs w:val="20"/>
               </w:rPr>
-              <w:t xml:space="preserve">1 072</w:t>
+              <w:t xml:space="preserve">1 096</w:t>
             </w:r>
           </w:p>
         </w:tc>
@@ -14834,7 +15139,7 @@
                 <w:sz w:val="20"/>
                 <w:szCs w:val="20"/>
               </w:rPr>
-              <w:t xml:space="preserve">R 1 018 400</w:t>
+              <w:t xml:space="preserve">R 1 041 200</w:t>
             </w:r>
           </w:p>
         </w:tc>
@@ -14911,7 +15216,7 @@
                 <w:sz w:val="20"/>
                 <w:szCs w:val="20"/>
               </w:rPr>
-              <w:t xml:space="preserve">35</w:t>
+              <w:t xml:space="preserve">34</w:t>
             </w:r>
           </w:p>
         </w:tc>
@@ -14949,7 +15254,7 @@
                 <w:sz w:val="20"/>
                 <w:szCs w:val="20"/>
               </w:rPr>
-              <w:t xml:space="preserve">280</w:t>
+              <w:t xml:space="preserve">272</w:t>
             </w:r>
           </w:p>
         </w:tc>
@@ -14987,7 +15292,7 @@
                 <w:sz w:val="20"/>
                 <w:szCs w:val="20"/>
               </w:rPr>
-              <w:t xml:space="preserve">R 266 000</w:t>
+              <w:t xml:space="preserve">R 258 400</w:t>
             </w:r>
           </w:p>
         </w:tc>
@@ -15064,7 +15369,7 @@
                 <w:sz w:val="20"/>
                 <w:szCs w:val="20"/>
               </w:rPr>
-              <w:t xml:space="preserve">169</w:t>
+              <w:t xml:space="preserve">171</w:t>
             </w:r>
           </w:p>
         </w:tc>
@@ -15102,7 +15407,7 @@
                 <w:sz w:val="20"/>
                 <w:szCs w:val="20"/>
               </w:rPr>
-              <w:t xml:space="preserve">1 352</w:t>
+              <w:t xml:space="preserve">1 368</w:t>
             </w:r>
           </w:p>
         </w:tc>
@@ -15140,7 +15445,7 @@
                 <w:sz w:val="20"/>
                 <w:szCs w:val="20"/>
               </w:rPr>
-              <w:t xml:space="preserve">R 1 284 400</w:t>
+              <w:t xml:space="preserve">R 1 299 600</w:t>
             </w:r>
           </w:p>
         </w:tc>
@@ -15179,7 +15484,7 @@
           <w:sz w:val="20"/>
           <w:szCs w:val="20"/>
         </w:rPr>
-        <w:t xml:space="preserve">Roughly 79% of the engineering is done. </w:t>
+        <w:t xml:space="preserve">Roughly 80% of the engineering is done. </w:t>
       </w:r>
       <w:r>
         <w:rPr>

</xml_diff>

<commit_message>
Reprice: 141 built, 32 remaining, PayFast written
The payment line drops from four days to two and changes shape. It was "one
adapter against the seam"; the adapter exists, so what is left is the half
that needs a merchant account — confirming PayFast accepts our signature, and
failure and retry testing against their sandbox. That is the honest split: I
can write the signing and the four checks without credentials, and I cannot
prove PayFast agrees with any of it.

Co-Authored-By: Claude Opus 5 <noreply@anthropic.com>
Claude-Session: https://claude.ai/code/session_01B2xsFCpQEfEHuTCkYzyD13
</commit_message>
<xml_diff>
--- a/WEBSITE_COSTINGS.docx
+++ b/WEBSITE_COSTINGS.docx
@@ -449,7 +449,7 @@
                 <w:sz w:val="20"/>
                 <w:szCs w:val="20"/>
               </w:rPr>
-              <w:t xml:space="preserve">06d39ae</w:t>
+              <w:t xml:space="preserve">b96eec0</w:t>
             </w:r>
           </w:p>
         </w:tc>
@@ -1527,7 +1527,7 @@
                 <w:sz w:val="20"/>
                 <w:szCs w:val="20"/>
               </w:rPr>
-              <w:t xml:space="preserve">514</w:t>
+              <w:t xml:space="preserve">565</w:t>
             </w:r>
           </w:p>
         </w:tc>
@@ -1563,7 +1563,7 @@
                 <w:sz w:val="20"/>
                 <w:szCs w:val="20"/>
               </w:rPr>
-              <w:t xml:space="preserve">In 29 files; all passing</w:t>
+              <w:t xml:space="preserve">In 30 files; all passing</w:t>
             </w:r>
           </w:p>
         </w:tc>
@@ -3770,7 +3770,7 @@
                 <w:sz w:val="20"/>
                 <w:szCs w:val="20"/>
               </w:rPr>
-              <w:t xml:space="preserve">514 passing</w:t>
+              <w:t xml:space="preserve">565 passing</w:t>
             </w:r>
           </w:p>
         </w:tc>
@@ -3807,7 +3807,7 @@
                 <w:sz w:val="20"/>
                 <w:szCs w:val="20"/>
               </w:rPr>
-              <w:t xml:space="preserve">29 files, including four real worker processes racing on one file</w:t>
+              <w:t xml:space="preserve">30 files, including four real worker processes racing on one file</w:t>
             </w:r>
           </w:p>
         </w:tc>
@@ -8401,7 +8401,6 @@
               <w:bottom w:val="single" w:color="D6CFC6" w:sz="4"/>
               <w:right w:val="single" w:color="D6CFC6" w:sz="4"/>
             </w:tcBorders>
-            <w:shd w:fill="FCE8EB" w:color="auto" w:val="clear"/>
             <w:tcMar>
               <w:top w:type="dxa" w:w="90"/>
               <w:left w:type="dxa" w:w="130"/>
@@ -8414,6 +8413,42 @@
             <w:pPr>
               <w:spacing w:after="0" w:line="240"/>
               <w:jc w:val="center"/>
+            </w:pPr>
+            <w:r>
+              <w:rPr>
+                <w:rFonts w:ascii="Calibri" w:cs="Calibri" w:eastAsia="Calibri" w:hAnsi="Calibri"/>
+                <w:b w:val="false"/>
+                <w:bCs w:val="false"/>
+                <w:i w:val="false"/>
+                <w:iCs w:val="false"/>
+                <w:color w:val="221E1F"/>
+                <w:sz w:val="20"/>
+                <w:szCs w:val="20"/>
+              </w:rPr>
+              <w:t xml:space="preserve">21</w:t>
+            </w:r>
+          </w:p>
+        </w:tc>
+        <w:tc>
+          <w:tcPr>
+            <w:tcW w:type="dxa" w:w="3084"/>
+            <w:tcBorders>
+              <w:top w:val="single" w:color="D6CFC6" w:sz="4"/>
+              <w:left w:val="single" w:color="D6CFC6" w:sz="4"/>
+              <w:bottom w:val="single" w:color="D6CFC6" w:sz="4"/>
+              <w:right w:val="single" w:color="D6CFC6" w:sz="4"/>
+            </w:tcBorders>
+            <w:tcMar>
+              <w:top w:type="dxa" w:w="90"/>
+              <w:left w:type="dxa" w:w="130"/>
+              <w:bottom w:type="dxa" w:w="90"/>
+              <w:right w:type="dxa" w:w="130"/>
+            </w:tcMar>
+            <w:vAlign w:val="center"/>
+          </w:tcPr>
+          <w:p>
+            <w:pPr>
+              <w:spacing w:after="0" w:line="240"/>
             </w:pPr>
             <w:r>
               <w:rPr>
@@ -8426,13 +8461,88 @@
                 <w:sz w:val="20"/>
                 <w:szCs w:val="20"/>
               </w:rPr>
-              <w:t xml:space="preserve"/>
-            </w:r>
-          </w:p>
-        </w:tc>
-        <w:tc>
-          <w:tcPr>
-            <w:tcW w:type="dxa" w:w="3084"/>
+              <w:t xml:space="preserve">PayFast adapter</w:t>
+            </w:r>
+          </w:p>
+        </w:tc>
+        <w:tc>
+          <w:tcPr>
+            <w:tcW w:type="dxa" w:w="5108"/>
+            <w:tcBorders>
+              <w:top w:val="single" w:color="D6CFC6" w:sz="4"/>
+              <w:left w:val="single" w:color="D6CFC6" w:sz="4"/>
+              <w:bottom w:val="single" w:color="D6CFC6" w:sz="4"/>
+              <w:right w:val="single" w:color="D6CFC6" w:sz="4"/>
+            </w:tcBorders>
+            <w:tcMar>
+              <w:top w:type="dxa" w:w="90"/>
+              <w:left w:type="dxa" w:w="130"/>
+              <w:bottom w:type="dxa" w:w="90"/>
+              <w:right w:type="dxa" w:w="130"/>
+            </w:tcMar>
+            <w:vAlign w:val="center"/>
+          </w:tcPr>
+          <w:p>
+            <w:pPr>
+              <w:spacing w:after="0" w:line="240"/>
+            </w:pPr>
+            <w:r>
+              <w:rPr>
+                <w:rFonts w:ascii="Calibri" w:cs="Calibri" w:eastAsia="Calibri" w:hAnsi="Calibri"/>
+                <w:b w:val="false"/>
+                <w:bCs w:val="false"/>
+                <w:i w:val="false"/>
+                <w:iCs w:val="false"/>
+                <w:color w:val="221E1F"/>
+                <w:sz w:val="20"/>
+                <w:szCs w:val="20"/>
+              </w:rPr>
+              <w:t xml:space="preserve">PHP-compatible signing, all four of PayFast’s notification checks with the postback failing closed, status mapping, and an idempotency key that survives their PENDING-then-COMPLETE sequence</w:t>
+            </w:r>
+          </w:p>
+        </w:tc>
+        <w:tc>
+          <w:tcPr>
+            <w:tcW w:type="dxa" w:w="964"/>
+            <w:tcBorders>
+              <w:top w:val="single" w:color="D6CFC6" w:sz="4"/>
+              <w:left w:val="single" w:color="D6CFC6" w:sz="4"/>
+              <w:bottom w:val="single" w:color="D6CFC6" w:sz="4"/>
+              <w:right w:val="single" w:color="D6CFC6" w:sz="4"/>
+            </w:tcBorders>
+            <w:tcMar>
+              <w:top w:type="dxa" w:w="90"/>
+              <w:left w:type="dxa" w:w="130"/>
+              <w:bottom w:type="dxa" w:w="90"/>
+              <w:right w:type="dxa" w:w="130"/>
+            </w:tcMar>
+            <w:vAlign w:val="center"/>
+          </w:tcPr>
+          <w:p>
+            <w:pPr>
+              <w:spacing w:after="0" w:line="240"/>
+              <w:jc w:val="right"/>
+            </w:pPr>
+            <w:r>
+              <w:rPr>
+                <w:rFonts w:ascii="Calibri" w:cs="Calibri" w:eastAsia="Calibri" w:hAnsi="Calibri"/>
+                <w:b w:val="false"/>
+                <w:bCs w:val="false"/>
+                <w:i w:val="false"/>
+                <w:iCs w:val="false"/>
+                <w:color w:val="221E1F"/>
+                <w:sz w:val="20"/>
+                <w:szCs w:val="20"/>
+              </w:rPr>
+              <w:t xml:space="preserve">4</w:t>
+            </w:r>
+          </w:p>
+        </w:tc>
+      </w:tr>
+      <w:tr>
+        <w:tc>
+          <w:tcPr>
+            <w:tcW w:type="dxa" w:w="482"/>
             <w:tcBorders>
               <w:top w:val="single" w:color="D6CFC6" w:sz="4"/>
               <w:left w:val="single" w:color="D6CFC6" w:sz="4"/>
@@ -8451,6 +8561,7 @@
           <w:p>
             <w:pPr>
               <w:spacing w:after="0" w:line="240"/>
+              <w:jc w:val="center"/>
             </w:pPr>
             <w:r>
               <w:rPr>
@@ -8463,13 +8574,13 @@
                 <w:sz w:val="20"/>
                 <w:szCs w:val="20"/>
               </w:rPr>
-              <w:t xml:space="preserve">Total</w:t>
-            </w:r>
-          </w:p>
-        </w:tc>
-        <w:tc>
-          <w:tcPr>
-            <w:tcW w:type="dxa" w:w="5108"/>
+              <w:t xml:space="preserve"/>
+            </w:r>
+          </w:p>
+        </w:tc>
+        <w:tc>
+          <w:tcPr>
+            <w:tcW w:type="dxa" w:w="3084"/>
             <w:tcBorders>
               <w:top w:val="single" w:color="D6CFC6" w:sz="4"/>
               <w:left w:val="single" w:color="D6CFC6" w:sz="4"/>
@@ -8500,13 +8611,13 @@
                 <w:sz w:val="20"/>
                 <w:szCs w:val="20"/>
               </w:rPr>
-              <w:t xml:space="preserve">Delivered scope</w:t>
-            </w:r>
-          </w:p>
-        </w:tc>
-        <w:tc>
-          <w:tcPr>
-            <w:tcW w:type="dxa" w:w="964"/>
+              <w:t xml:space="preserve">Total</w:t>
+            </w:r>
+          </w:p>
+        </w:tc>
+        <w:tc>
+          <w:tcPr>
+            <w:tcW w:type="dxa" w:w="5108"/>
             <w:tcBorders>
               <w:top w:val="single" w:color="D6CFC6" w:sz="4"/>
               <w:left w:val="single" w:color="D6CFC6" w:sz="4"/>
@@ -8525,7 +8636,6 @@
           <w:p>
             <w:pPr>
               <w:spacing w:after="0" w:line="240"/>
-              <w:jc w:val="right"/>
             </w:pPr>
             <w:r>
               <w:rPr>
@@ -8538,7 +8648,45 @@
                 <w:sz w:val="20"/>
                 <w:szCs w:val="20"/>
               </w:rPr>
-              <w:t xml:space="preserve">137</w:t>
+              <w:t xml:space="preserve">Delivered scope</w:t>
+            </w:r>
+          </w:p>
+        </w:tc>
+        <w:tc>
+          <w:tcPr>
+            <w:tcW w:type="dxa" w:w="964"/>
+            <w:tcBorders>
+              <w:top w:val="single" w:color="D6CFC6" w:sz="4"/>
+              <w:left w:val="single" w:color="D6CFC6" w:sz="4"/>
+              <w:bottom w:val="single" w:color="D6CFC6" w:sz="4"/>
+              <w:right w:val="single" w:color="D6CFC6" w:sz="4"/>
+            </w:tcBorders>
+            <w:shd w:fill="FCE8EB" w:color="auto" w:val="clear"/>
+            <w:tcMar>
+              <w:top w:type="dxa" w:w="90"/>
+              <w:left w:type="dxa" w:w="130"/>
+              <w:bottom w:type="dxa" w:w="90"/>
+              <w:right w:type="dxa" w:w="130"/>
+            </w:tcMar>
+            <w:vAlign w:val="center"/>
+          </w:tcPr>
+          <w:p>
+            <w:pPr>
+              <w:spacing w:after="0" w:line="240"/>
+              <w:jc w:val="right"/>
+            </w:pPr>
+            <w:r>
+              <w:rPr>
+                <w:rFonts w:ascii="Calibri" w:cs="Calibri" w:eastAsia="Calibri" w:hAnsi="Calibri"/>
+                <w:b/>
+                <w:bCs/>
+                <w:i w:val="false"/>
+                <w:iCs w:val="false"/>
+                <w:color w:val="221E1F"/>
+                <w:sz w:val="20"/>
+                <w:szCs w:val="20"/>
+              </w:rPr>
+              <w:t xml:space="preserve">141</w:t>
             </w:r>
           </w:p>
         </w:tc>
@@ -8590,7 +8738,7 @@
           <w:sz w:val="20"/>
           <w:szCs w:val="20"/>
         </w:rPr>
-        <w:t xml:space="preserve">19,998 hand-written lines over 137 days is about 150 a day. For tested, typed, reviewed production code that sits inside the normal 100–300 band, and lower than the 200 the first version of this document reconstructed — integration work carries more test and less code than storefront work does. The reconstruction is not inflated.</w:t>
+        <w:t xml:space="preserve">19,998 hand-written lines over 141 days is about 150 a day. For tested, typed, reviewed production code that sits inside the normal 100–300 band, and lower than the 200 the first version of this document reconstructed — integration work carries more test and less code than storefront work does. The reconstruction is not inflated.</w:t>
       </w:r>
     </w:p>
     <w:p>
@@ -8608,7 +8756,7 @@
           <w:sz w:val="20"/>
           <w:szCs w:val="20"/>
         </w:rPr>
-        <w:t xml:space="preserve">137 days is roughly 27 working weeks, or a little over six months for one person. Two people working in parallel would compress the calendar but not the total, and would add coordination cost.</w:t>
+        <w:t xml:space="preserve">141 days is roughly 27 working weeks, or a little over six months for one person. Two people working in parallel would compress the calendar but not the total, and would add coordination cost.</w:t>
       </w:r>
     </w:p>
     <w:p>
@@ -8679,7 +8827,7 @@
           <w:sz w:val="20"/>
           <w:szCs w:val="20"/>
         </w:rPr>
-        <w:t xml:space="preserve">Delivered scope: 137 days × 8 hours = 1096 hours.</w:t>
+        <w:t xml:space="preserve">Delivered scope: 141 days × 8 hours = 1128 hours.</w:t>
       </w:r>
     </w:p>
     <w:tbl>
@@ -8774,7 +8922,7 @@
                 <w:sz w:val="19"/>
                 <w:szCs w:val="19"/>
               </w:rPr>
-              <w:t xml:space="preserve">Cost of the 1096 hours (excl. VAT)</w:t>
+              <w:t xml:space="preserve">Cost of the 1128 hours (excl. VAT)</w:t>
             </w:r>
           </w:p>
         </w:tc>
@@ -8887,7 +9035,7 @@
                 <w:sz w:val="20"/>
                 <w:szCs w:val="20"/>
               </w:rPr>
-              <w:t xml:space="preserve">R 438 400</w:t>
+              <w:t xml:space="preserve">R 451 200</w:t>
             </w:r>
           </w:p>
         </w:tc>
@@ -8924,7 +9072,7 @@
                 <w:sz w:val="20"/>
                 <w:szCs w:val="20"/>
               </w:rPr>
-              <w:t xml:space="preserve">R 504 160</w:t>
+              <w:t xml:space="preserve">R 518 880</w:t>
             </w:r>
           </w:p>
         </w:tc>
@@ -9001,7 +9149,7 @@
                 <w:sz w:val="20"/>
                 <w:szCs w:val="20"/>
               </w:rPr>
-              <w:t xml:space="preserve">R 712 400</w:t>
+              <w:t xml:space="preserve">R 733 200</w:t>
             </w:r>
           </w:p>
         </w:tc>
@@ -9039,7 +9187,7 @@
                 <w:sz w:val="20"/>
                 <w:szCs w:val="20"/>
               </w:rPr>
-              <w:t xml:space="preserve">R 819 260</w:t>
+              <w:t xml:space="preserve">R 843 180</w:t>
             </w:r>
           </w:p>
         </w:tc>
@@ -9114,7 +9262,7 @@
                 <w:sz w:val="20"/>
                 <w:szCs w:val="20"/>
               </w:rPr>
-              <w:t xml:space="preserve">R 931 600</w:t>
+              <w:t xml:space="preserve">R 958 800</w:t>
             </w:r>
           </w:p>
         </w:tc>
@@ -9151,7 +9299,7 @@
                 <w:sz w:val="20"/>
                 <w:szCs w:val="20"/>
               </w:rPr>
-              <w:t xml:space="preserve">R 1 071 340</w:t>
+              <w:t xml:space="preserve">R 1 102 620</w:t>
             </w:r>
           </w:p>
         </w:tc>
@@ -9228,7 +9376,7 @@
                 <w:sz w:val="20"/>
                 <w:szCs w:val="20"/>
               </w:rPr>
-              <w:t xml:space="preserve">R 1 041 200</w:t>
+              <w:t xml:space="preserve">R 1 071 600</w:t>
             </w:r>
           </w:p>
         </w:tc>
@@ -9266,7 +9414,7 @@
                 <w:sz w:val="20"/>
                 <w:szCs w:val="20"/>
               </w:rPr>
-              <w:t xml:space="preserve">R 1 197 380</w:t>
+              <w:t xml:space="preserve">R 1 232 340</w:t>
             </w:r>
           </w:p>
         </w:tc>
@@ -9341,7 +9489,7 @@
                 <w:sz w:val="20"/>
                 <w:szCs w:val="20"/>
               </w:rPr>
-              <w:t xml:space="preserve">R 1 260 400</w:t>
+              <w:t xml:space="preserve">R 1 297 200</w:t>
             </w:r>
           </w:p>
         </w:tc>
@@ -9378,7 +9526,7 @@
                 <w:sz w:val="20"/>
                 <w:szCs w:val="20"/>
               </w:rPr>
-              <w:t xml:space="preserve">R 1 449 460</w:t>
+              <w:t xml:space="preserve">R 1 491 780</w:t>
             </w:r>
           </w:p>
         </w:tc>
@@ -9455,7 +9603,7 @@
                 <w:sz w:val="20"/>
                 <w:szCs w:val="20"/>
               </w:rPr>
-              <w:t xml:space="preserve">R 1 589 200</w:t>
+              <w:t xml:space="preserve">R 1 635 600</w:t>
             </w:r>
           </w:p>
         </w:tc>
@@ -9493,7 +9641,7 @@
                 <w:sz w:val="20"/>
                 <w:szCs w:val="20"/>
               </w:rPr>
-              <w:t xml:space="preserve">R 1 827 580</w:t>
+              <w:t xml:space="preserve">R 1 880 940</w:t>
             </w:r>
           </w:p>
         </w:tc>
@@ -9545,7 +9693,7 @@
           <w:sz w:val="20"/>
           <w:szCs w:val="20"/>
         </w:rPr>
-        <w:t xml:space="preserve">At an illustrative blended rate of R 950 an hour — chosen here only to make the rest of the document concrete — the delivered scope comes to R 1 041 200 excluding VAT, or R 1 197 380 including it. Replace the rate and every figure below moves proportionally.</w:t>
+        <w:t xml:space="preserve">At an illustrative blended rate of R 950 an hour — chosen here only to make the rest of the document concrete — the delivered scope comes to R 1 071 600 excluding VAT, or R 1 232 340 including it. Replace the rate and every figure below moves proportionally.</w:t>
       </w:r>
     </w:p>
     <w:p>
@@ -12769,6 +12917,155 @@
               <w:bottom w:val="single" w:color="D6CFC6" w:sz="4"/>
               <w:right w:val="single" w:color="D6CFC6" w:sz="4"/>
             </w:tcBorders>
+            <w:tcMar>
+              <w:top w:type="dxa" w:w="90"/>
+              <w:left w:type="dxa" w:w="130"/>
+              <w:bottom w:type="dxa" w:w="90"/>
+              <w:right w:type="dxa" w:w="130"/>
+            </w:tcMar>
+            <w:vAlign w:val="center"/>
+          </w:tcPr>
+          <w:p>
+            <w:pPr>
+              <w:spacing w:after="0" w:line="240"/>
+            </w:pPr>
+            <w:r>
+              <w:rPr>
+                <w:rFonts w:ascii="Calibri" w:cs="Calibri" w:eastAsia="Calibri" w:hAnsi="Calibri"/>
+                <w:b w:val="false"/>
+                <w:bCs w:val="false"/>
+                <w:i w:val="false"/>
+                <w:iCs w:val="false"/>
+                <w:color w:val="221E1F"/>
+                <w:sz w:val="20"/>
+                <w:szCs w:val="20"/>
+              </w:rPr>
+              <w:t xml:space="preserve">PayFast adapter</w:t>
+            </w:r>
+          </w:p>
+        </w:tc>
+        <w:tc>
+          <w:tcPr>
+            <w:tcW w:type="dxa" w:w="1157"/>
+            <w:tcBorders>
+              <w:top w:val="single" w:color="D6CFC6" w:sz="4"/>
+              <w:left w:val="single" w:color="D6CFC6" w:sz="4"/>
+              <w:bottom w:val="single" w:color="D6CFC6" w:sz="4"/>
+              <w:right w:val="single" w:color="D6CFC6" w:sz="4"/>
+            </w:tcBorders>
+            <w:tcMar>
+              <w:top w:type="dxa" w:w="90"/>
+              <w:left w:type="dxa" w:w="130"/>
+              <w:bottom w:type="dxa" w:w="90"/>
+              <w:right w:type="dxa" w:w="130"/>
+            </w:tcMar>
+            <w:vAlign w:val="center"/>
+          </w:tcPr>
+          <w:p>
+            <w:pPr>
+              <w:spacing w:after="0" w:line="240"/>
+              <w:jc w:val="right"/>
+            </w:pPr>
+            <w:r>
+              <w:rPr>
+                <w:rFonts w:ascii="Calibri" w:cs="Calibri" w:eastAsia="Calibri" w:hAnsi="Calibri"/>
+                <w:b w:val="false"/>
+                <w:bCs w:val="false"/>
+                <w:i w:val="false"/>
+                <w:iCs w:val="false"/>
+                <w:color w:val="221E1F"/>
+                <w:sz w:val="20"/>
+                <w:szCs w:val="20"/>
+              </w:rPr>
+              <w:t xml:space="preserve">4</w:t>
+            </w:r>
+          </w:p>
+        </w:tc>
+        <w:tc>
+          <w:tcPr>
+            <w:tcW w:type="dxa" w:w="1542"/>
+            <w:tcBorders>
+              <w:top w:val="single" w:color="D6CFC6" w:sz="4"/>
+              <w:left w:val="single" w:color="D6CFC6" w:sz="4"/>
+              <w:bottom w:val="single" w:color="D6CFC6" w:sz="4"/>
+              <w:right w:val="single" w:color="D6CFC6" w:sz="4"/>
+            </w:tcBorders>
+            <w:tcMar>
+              <w:top w:type="dxa" w:w="90"/>
+              <w:left w:type="dxa" w:w="130"/>
+              <w:bottom w:type="dxa" w:w="90"/>
+              <w:right w:type="dxa" w:w="130"/>
+            </w:tcMar>
+            <w:vAlign w:val="center"/>
+          </w:tcPr>
+          <w:p>
+            <w:pPr>
+              <w:spacing w:after="0" w:line="240"/>
+              <w:jc w:val="right"/>
+            </w:pPr>
+            <w:r>
+              <w:rPr>
+                <w:rFonts w:ascii="Calibri" w:cs="Calibri" w:eastAsia="Calibri" w:hAnsi="Calibri"/>
+                <w:b w:val="false"/>
+                <w:bCs w:val="false"/>
+                <w:i w:val="false"/>
+                <w:iCs w:val="false"/>
+                <w:color w:val="221E1F"/>
+                <w:sz w:val="20"/>
+                <w:szCs w:val="20"/>
+              </w:rPr>
+              <w:t xml:space="preserve">32</w:t>
+            </w:r>
+          </w:p>
+        </w:tc>
+        <w:tc>
+          <w:tcPr>
+            <w:tcW w:type="dxa" w:w="1638"/>
+            <w:tcBorders>
+              <w:top w:val="single" w:color="D6CFC6" w:sz="4"/>
+              <w:left w:val="single" w:color="D6CFC6" w:sz="4"/>
+              <w:bottom w:val="single" w:color="D6CFC6" w:sz="4"/>
+              <w:right w:val="single" w:color="D6CFC6" w:sz="4"/>
+            </w:tcBorders>
+            <w:tcMar>
+              <w:top w:type="dxa" w:w="90"/>
+              <w:left w:type="dxa" w:w="130"/>
+              <w:bottom w:type="dxa" w:w="90"/>
+              <w:right w:type="dxa" w:w="130"/>
+            </w:tcMar>
+            <w:vAlign w:val="center"/>
+          </w:tcPr>
+          <w:p>
+            <w:pPr>
+              <w:spacing w:after="0" w:line="240"/>
+              <w:jc w:val="right"/>
+            </w:pPr>
+            <w:r>
+              <w:rPr>
+                <w:rFonts w:ascii="Calibri" w:cs="Calibri" w:eastAsia="Calibri" w:hAnsi="Calibri"/>
+                <w:b w:val="false"/>
+                <w:bCs w:val="false"/>
+                <w:i w:val="false"/>
+                <w:iCs w:val="false"/>
+                <w:color w:val="221E1F"/>
+                <w:sz w:val="20"/>
+                <w:szCs w:val="20"/>
+              </w:rPr>
+              <w:t xml:space="preserve">R 30 400</w:t>
+            </w:r>
+          </w:p>
+        </w:tc>
+      </w:tr>
+      <w:tr>
+        <w:tc>
+          <w:tcPr>
+            <w:tcW w:type="dxa" w:w="5301"/>
+            <w:tcBorders>
+              <w:top w:val="single" w:color="D6CFC6" w:sz="4"/>
+              <w:left w:val="single" w:color="D6CFC6" w:sz="4"/>
+              <w:bottom w:val="single" w:color="D6CFC6" w:sz="4"/>
+              <w:right w:val="single" w:color="D6CFC6" w:sz="4"/>
+            </w:tcBorders>
             <w:shd w:fill="FCE8EB" w:color="auto" w:val="clear"/>
             <w:tcMar>
               <w:top w:type="dxa" w:w="90"/>
@@ -12831,7 +13128,7 @@
                 <w:sz w:val="20"/>
                 <w:szCs w:val="20"/>
               </w:rPr>
-              <w:t xml:space="preserve">137</w:t>
+              <w:t xml:space="preserve">141</w:t>
             </w:r>
           </w:p>
         </w:tc>
@@ -12869,7 +13166,7 @@
                 <w:sz w:val="20"/>
                 <w:szCs w:val="20"/>
               </w:rPr>
-              <w:t xml:space="preserve">1 096</w:t>
+              <w:t xml:space="preserve">1 128</w:t>
             </w:r>
           </w:p>
         </w:tc>
@@ -12907,7 +13204,7 @@
                 <w:sz w:val="20"/>
                 <w:szCs w:val="20"/>
               </w:rPr>
-              <w:t xml:space="preserve">R 1 041 200</w:t>
+              <w:t xml:space="preserve">R 1 071 600</w:t>
             </w:r>
           </w:p>
         </w:tc>
@@ -12946,7 +13243,7 @@
           <w:sz w:val="20"/>
           <w:szCs w:val="20"/>
         </w:rPr>
-        <w:t xml:space="preserve">The integration seams — payments, accounts, notifications, POS and courier — are 44 of the 137 days. None of them names a vendor, and none has to be rewritten when one is chosen: what remains per integration is an adapter against an interface that already exists and is already tested.</w:t>
+        <w:t xml:space="preserve">The integration seams — payments, accounts, notifications, POS and courier — are 44 of the 141 days. None of them names a vendor, and none has to be rewritten when one is chosen: what remains per integration is an adapter against an interface that already exists and is already tested.</w:t>
       </w:r>
     </w:p>
     <w:p>
@@ -13194,7 +13491,7 @@
                 <w:sz w:val="20"/>
                 <w:szCs w:val="20"/>
               </w:rPr>
-              <w:t xml:space="preserve">Payment gateway adapter</w:t>
+              <w:t xml:space="preserve">PayFast sandbox and go-live</w:t>
             </w:r>
           </w:p>
         </w:tc>
@@ -13230,7 +13527,7 @@
                 <w:sz w:val="20"/>
                 <w:szCs w:val="20"/>
               </w:rPr>
-              <w:t xml:space="preserve">One adapter against the seam that now exists, then sandbox failure and retry testing with real credentials</w:t>
+              <w:t xml:space="preserve">The adapter is written and tested. What is left needs a merchant account: confirming PayFast accepts our signature, then failure and retry testing against their sandbox</w:t>
             </w:r>
           </w:p>
         </w:tc>
@@ -13267,7 +13564,7 @@
                 <w:sz w:val="20"/>
                 <w:szCs w:val="20"/>
               </w:rPr>
-              <w:t xml:space="preserve">4</w:t>
+              <w:t xml:space="preserve">2</w:t>
             </w:r>
           </w:p>
         </w:tc>
@@ -13303,7 +13600,7 @@
                 <w:sz w:val="20"/>
                 <w:szCs w:val="20"/>
               </w:rPr>
-              <w:t xml:space="preserve">Gateway per-transaction fee</w:t>
+              <w:t xml:space="preserve">PayFast per-transaction fee</w:t>
             </w:r>
           </w:p>
         </w:tc>
@@ -14722,7 +15019,7 @@
                 <w:sz w:val="20"/>
                 <w:szCs w:val="20"/>
               </w:rPr>
-              <w:t xml:space="preserve">272 hours of engineering</w:t>
+              <w:t xml:space="preserve">256 hours of engineering</w:t>
             </w:r>
           </w:p>
         </w:tc>
@@ -14760,7 +15057,7 @@
                 <w:sz w:val="20"/>
                 <w:szCs w:val="20"/>
               </w:rPr>
-              <w:t xml:space="preserve">34</w:t>
+              <w:t xml:space="preserve">32</w:t>
             </w:r>
           </w:p>
         </w:tc>
@@ -15065,7 +15362,7 @@
                 <w:sz w:val="20"/>
                 <w:szCs w:val="20"/>
               </w:rPr>
-              <w:t xml:space="preserve">137</w:t>
+              <w:t xml:space="preserve">141</w:t>
             </w:r>
           </w:p>
         </w:tc>
@@ -15102,7 +15399,7 @@
                 <w:sz w:val="20"/>
                 <w:szCs w:val="20"/>
               </w:rPr>
-              <w:t xml:space="preserve">1 096</w:t>
+              <w:t xml:space="preserve">1 128</w:t>
             </w:r>
           </w:p>
         </w:tc>
@@ -15139,7 +15436,7 @@
                 <w:sz w:val="20"/>
                 <w:szCs w:val="20"/>
               </w:rPr>
-              <w:t xml:space="preserve">R 1 041 200</w:t>
+              <w:t xml:space="preserve">R 1 071 600</w:t>
             </w:r>
           </w:p>
         </w:tc>
@@ -15216,7 +15513,7 @@
                 <w:sz w:val="20"/>
                 <w:szCs w:val="20"/>
               </w:rPr>
-              <w:t xml:space="preserve">34</w:t>
+              <w:t xml:space="preserve">32</w:t>
             </w:r>
           </w:p>
         </w:tc>
@@ -15254,7 +15551,7 @@
                 <w:sz w:val="20"/>
                 <w:szCs w:val="20"/>
               </w:rPr>
-              <w:t xml:space="preserve">272</w:t>
+              <w:t xml:space="preserve">256</w:t>
             </w:r>
           </w:p>
         </w:tc>
@@ -15292,7 +15589,7 @@
                 <w:sz w:val="20"/>
                 <w:szCs w:val="20"/>
               </w:rPr>
-              <w:t xml:space="preserve">R 258 400</w:t>
+              <w:t xml:space="preserve">R 243 200</w:t>
             </w:r>
           </w:p>
         </w:tc>
@@ -15369,7 +15666,7 @@
                 <w:sz w:val="20"/>
                 <w:szCs w:val="20"/>
               </w:rPr>
-              <w:t xml:space="preserve">171</w:t>
+              <w:t xml:space="preserve">173</w:t>
             </w:r>
           </w:p>
         </w:tc>
@@ -15407,7 +15704,7 @@
                 <w:sz w:val="20"/>
                 <w:szCs w:val="20"/>
               </w:rPr>
-              <w:t xml:space="preserve">1 368</w:t>
+              <w:t xml:space="preserve">1 384</w:t>
             </w:r>
           </w:p>
         </w:tc>
@@ -15445,7 +15742,7 @@
                 <w:sz w:val="20"/>
                 <w:szCs w:val="20"/>
               </w:rPr>
-              <w:t xml:space="preserve">R 1 299 600</w:t>
+              <w:t xml:space="preserve">R 1 314 800</w:t>
             </w:r>
           </w:p>
         </w:tc>
@@ -15484,7 +15781,7 @@
           <w:sz w:val="20"/>
           <w:szCs w:val="20"/>
         </w:rPr>
-        <w:t xml:space="preserve">Roughly 80% of the engineering is done. </w:t>
+        <w:t xml:space="preserve">Roughly 82% of the engineering is done. </w:t>
       </w:r>
       <w:r>
         <w:rPr>

</xml_diff>

<commit_message>
Reprice: 146 built, 30 remaining, Uber Direct written
The courier line drops from five days to three and changes shape, the same
way the payment line did. What is left needs an Uber Direct account —
confirming they accept our dispatch — plus one thing that is ours: a postal
code at checkout, so an address is complete before a driver is asked to find
it.

Co-Authored-By: Claude Opus 5 <noreply@anthropic.com>
Claude-Session: https://claude.ai/code/session_01B2xsFCpQEfEHuTCkYzyD13
</commit_message>
<xml_diff>
--- a/WEBSITE_COSTINGS.docx
+++ b/WEBSITE_COSTINGS.docx
@@ -449,7 +449,7 @@
                 <w:sz w:val="20"/>
                 <w:szCs w:val="20"/>
               </w:rPr>
-              <w:t xml:space="preserve">b96eec0</w:t>
+              <w:t xml:space="preserve">0b7a6fa</w:t>
             </w:r>
           </w:p>
         </w:tc>
@@ -1190,7 +1190,7 @@
                 <w:sz w:val="20"/>
                 <w:szCs w:val="20"/>
               </w:rPr>
-              <w:t xml:space="preserve">23</w:t>
+              <w:t xml:space="preserve">25</w:t>
             </w:r>
           </w:p>
         </w:tc>
@@ -1527,7 +1527,7 @@
                 <w:sz w:val="20"/>
                 <w:szCs w:val="20"/>
               </w:rPr>
-              <w:t xml:space="preserve">565</w:t>
+              <w:t xml:space="preserve">606</w:t>
             </w:r>
           </w:p>
         </w:tc>
@@ -1563,7 +1563,7 @@
                 <w:sz w:val="20"/>
                 <w:szCs w:val="20"/>
               </w:rPr>
-              <w:t xml:space="preserve">In 30 files; all passing</w:t>
+              <w:t xml:space="preserve">In 31 files; all passing</w:t>
             </w:r>
           </w:p>
         </w:tc>
@@ -3770,7 +3770,7 @@
                 <w:sz w:val="20"/>
                 <w:szCs w:val="20"/>
               </w:rPr>
-              <w:t xml:space="preserve">565 passing</w:t>
+              <w:t xml:space="preserve">606 passing</w:t>
             </w:r>
           </w:p>
         </w:tc>
@@ -3807,7 +3807,7 @@
                 <w:sz w:val="20"/>
                 <w:szCs w:val="20"/>
               </w:rPr>
-              <w:t xml:space="preserve">30 files, including four real worker processes racing on one file</w:t>
+              <w:t xml:space="preserve">31 files, including four real worker processes racing on one file</w:t>
             </w:r>
           </w:p>
         </w:tc>
@@ -8425,7 +8425,7 @@
                 <w:sz w:val="20"/>
                 <w:szCs w:val="20"/>
               </w:rPr>
-              <w:t xml:space="preserve">21</w:t>
+              <w:t xml:space="preserve">22</w:t>
             </w:r>
           </w:p>
         </w:tc>
@@ -8461,7 +8461,7 @@
                 <w:sz w:val="20"/>
                 <w:szCs w:val="20"/>
               </w:rPr>
-              <w:t xml:space="preserve">PayFast adapter</w:t>
+              <w:t xml:space="preserve">Uber Direct adapter</w:t>
             </w:r>
           </w:p>
         </w:tc>
@@ -8497,7 +8497,7 @@
                 <w:sz w:val="20"/>
                 <w:szCs w:val="20"/>
               </w:rPr>
-              <w:t xml:space="preserve">PHP-compatible signing, all four of PayFast’s notification checks with the postback failing closed, status mapping, and an idempotency key that survives their PENDING-then-COMPLETE sequence</w:t>
+              <w:t xml:space="preserve">OAuth with a cached token, structured addresses built from what checkout collects, both of Uber’s status vocabularies, raw-byte webhook verification, and dispatch on ready rather than on order</w:t>
             </w:r>
           </w:p>
         </w:tc>
@@ -8534,7 +8534,7 @@
                 <w:sz w:val="20"/>
                 <w:szCs w:val="20"/>
               </w:rPr>
-              <w:t xml:space="preserve">4</w:t>
+              <w:t xml:space="preserve">5</w:t>
             </w:r>
           </w:p>
         </w:tc>
@@ -8549,7 +8549,7 @@
               <w:bottom w:val="single" w:color="D6CFC6" w:sz="4"/>
               <w:right w:val="single" w:color="D6CFC6" w:sz="4"/>
             </w:tcBorders>
-            <w:shd w:fill="FCE8EB" w:color="auto" w:val="clear"/>
+            <w:shd w:fill="F7F5F2" w:color="auto" w:val="clear"/>
             <w:tcMar>
               <w:top w:type="dxa" w:w="90"/>
               <w:left w:type="dxa" w:w="130"/>
@@ -8562,6 +8562,43 @@
             <w:pPr>
               <w:spacing w:after="0" w:line="240"/>
               <w:jc w:val="center"/>
+            </w:pPr>
+            <w:r>
+              <w:rPr>
+                <w:rFonts w:ascii="Calibri" w:cs="Calibri" w:eastAsia="Calibri" w:hAnsi="Calibri"/>
+                <w:b w:val="false"/>
+                <w:bCs w:val="false"/>
+                <w:i w:val="false"/>
+                <w:iCs w:val="false"/>
+                <w:color w:val="221E1F"/>
+                <w:sz w:val="20"/>
+                <w:szCs w:val="20"/>
+              </w:rPr>
+              <w:t xml:space="preserve">21</w:t>
+            </w:r>
+          </w:p>
+        </w:tc>
+        <w:tc>
+          <w:tcPr>
+            <w:tcW w:type="dxa" w:w="3084"/>
+            <w:tcBorders>
+              <w:top w:val="single" w:color="D6CFC6" w:sz="4"/>
+              <w:left w:val="single" w:color="D6CFC6" w:sz="4"/>
+              <w:bottom w:val="single" w:color="D6CFC6" w:sz="4"/>
+              <w:right w:val="single" w:color="D6CFC6" w:sz="4"/>
+            </w:tcBorders>
+            <w:shd w:fill="F7F5F2" w:color="auto" w:val="clear"/>
+            <w:tcMar>
+              <w:top w:type="dxa" w:w="90"/>
+              <w:left w:type="dxa" w:w="130"/>
+              <w:bottom w:type="dxa" w:w="90"/>
+              <w:right w:type="dxa" w:w="130"/>
+            </w:tcMar>
+            <w:vAlign w:val="center"/>
+          </w:tcPr>
+          <w:p>
+            <w:pPr>
+              <w:spacing w:after="0" w:line="240"/>
             </w:pPr>
             <w:r>
               <w:rPr>
@@ -8574,13 +8611,90 @@
                 <w:sz w:val="20"/>
                 <w:szCs w:val="20"/>
               </w:rPr>
-              <w:t xml:space="preserve"/>
-            </w:r>
-          </w:p>
-        </w:tc>
-        <w:tc>
-          <w:tcPr>
-            <w:tcW w:type="dxa" w:w="3084"/>
+              <w:t xml:space="preserve">PayFast adapter</w:t>
+            </w:r>
+          </w:p>
+        </w:tc>
+        <w:tc>
+          <w:tcPr>
+            <w:tcW w:type="dxa" w:w="5108"/>
+            <w:tcBorders>
+              <w:top w:val="single" w:color="D6CFC6" w:sz="4"/>
+              <w:left w:val="single" w:color="D6CFC6" w:sz="4"/>
+              <w:bottom w:val="single" w:color="D6CFC6" w:sz="4"/>
+              <w:right w:val="single" w:color="D6CFC6" w:sz="4"/>
+            </w:tcBorders>
+            <w:shd w:fill="F7F5F2" w:color="auto" w:val="clear"/>
+            <w:tcMar>
+              <w:top w:type="dxa" w:w="90"/>
+              <w:left w:type="dxa" w:w="130"/>
+              <w:bottom w:type="dxa" w:w="90"/>
+              <w:right w:type="dxa" w:w="130"/>
+            </w:tcMar>
+            <w:vAlign w:val="center"/>
+          </w:tcPr>
+          <w:p>
+            <w:pPr>
+              <w:spacing w:after="0" w:line="240"/>
+            </w:pPr>
+            <w:r>
+              <w:rPr>
+                <w:rFonts w:ascii="Calibri" w:cs="Calibri" w:eastAsia="Calibri" w:hAnsi="Calibri"/>
+                <w:b w:val="false"/>
+                <w:bCs w:val="false"/>
+                <w:i w:val="false"/>
+                <w:iCs w:val="false"/>
+                <w:color w:val="221E1F"/>
+                <w:sz w:val="20"/>
+                <w:szCs w:val="20"/>
+              </w:rPr>
+              <w:t xml:space="preserve">PHP-compatible signing, all four of PayFast’s notification checks with the postback failing closed, status mapping, and an idempotency key that survives their PENDING-then-COMPLETE sequence</w:t>
+            </w:r>
+          </w:p>
+        </w:tc>
+        <w:tc>
+          <w:tcPr>
+            <w:tcW w:type="dxa" w:w="964"/>
+            <w:tcBorders>
+              <w:top w:val="single" w:color="D6CFC6" w:sz="4"/>
+              <w:left w:val="single" w:color="D6CFC6" w:sz="4"/>
+              <w:bottom w:val="single" w:color="D6CFC6" w:sz="4"/>
+              <w:right w:val="single" w:color="D6CFC6" w:sz="4"/>
+            </w:tcBorders>
+            <w:shd w:fill="F7F5F2" w:color="auto" w:val="clear"/>
+            <w:tcMar>
+              <w:top w:type="dxa" w:w="90"/>
+              <w:left w:type="dxa" w:w="130"/>
+              <w:bottom w:type="dxa" w:w="90"/>
+              <w:right w:type="dxa" w:w="130"/>
+            </w:tcMar>
+            <w:vAlign w:val="center"/>
+          </w:tcPr>
+          <w:p>
+            <w:pPr>
+              <w:spacing w:after="0" w:line="240"/>
+              <w:jc w:val="right"/>
+            </w:pPr>
+            <w:r>
+              <w:rPr>
+                <w:rFonts w:ascii="Calibri" w:cs="Calibri" w:eastAsia="Calibri" w:hAnsi="Calibri"/>
+                <w:b w:val="false"/>
+                <w:bCs w:val="false"/>
+                <w:i w:val="false"/>
+                <w:iCs w:val="false"/>
+                <w:color w:val="221E1F"/>
+                <w:sz w:val="20"/>
+                <w:szCs w:val="20"/>
+              </w:rPr>
+              <w:t xml:space="preserve">4</w:t>
+            </w:r>
+          </w:p>
+        </w:tc>
+      </w:tr>
+      <w:tr>
+        <w:tc>
+          <w:tcPr>
+            <w:tcW w:type="dxa" w:w="482"/>
             <w:tcBorders>
               <w:top w:val="single" w:color="D6CFC6" w:sz="4"/>
               <w:left w:val="single" w:color="D6CFC6" w:sz="4"/>
@@ -8599,6 +8713,7 @@
           <w:p>
             <w:pPr>
               <w:spacing w:after="0" w:line="240"/>
+              <w:jc w:val="center"/>
             </w:pPr>
             <w:r>
               <w:rPr>
@@ -8611,13 +8726,13 @@
                 <w:sz w:val="20"/>
                 <w:szCs w:val="20"/>
               </w:rPr>
-              <w:t xml:space="preserve">Total</w:t>
-            </w:r>
-          </w:p>
-        </w:tc>
-        <w:tc>
-          <w:tcPr>
-            <w:tcW w:type="dxa" w:w="5108"/>
+              <w:t xml:space="preserve"/>
+            </w:r>
+          </w:p>
+        </w:tc>
+        <w:tc>
+          <w:tcPr>
+            <w:tcW w:type="dxa" w:w="3084"/>
             <w:tcBorders>
               <w:top w:val="single" w:color="D6CFC6" w:sz="4"/>
               <w:left w:val="single" w:color="D6CFC6" w:sz="4"/>
@@ -8648,13 +8763,13 @@
                 <w:sz w:val="20"/>
                 <w:szCs w:val="20"/>
               </w:rPr>
-              <w:t xml:space="preserve">Delivered scope</w:t>
-            </w:r>
-          </w:p>
-        </w:tc>
-        <w:tc>
-          <w:tcPr>
-            <w:tcW w:type="dxa" w:w="964"/>
+              <w:t xml:space="preserve">Total</w:t>
+            </w:r>
+          </w:p>
+        </w:tc>
+        <w:tc>
+          <w:tcPr>
+            <w:tcW w:type="dxa" w:w="5108"/>
             <w:tcBorders>
               <w:top w:val="single" w:color="D6CFC6" w:sz="4"/>
               <w:left w:val="single" w:color="D6CFC6" w:sz="4"/>
@@ -8673,7 +8788,6 @@
           <w:p>
             <w:pPr>
               <w:spacing w:after="0" w:line="240"/>
-              <w:jc w:val="right"/>
             </w:pPr>
             <w:r>
               <w:rPr>
@@ -8686,7 +8800,45 @@
                 <w:sz w:val="20"/>
                 <w:szCs w:val="20"/>
               </w:rPr>
-              <w:t xml:space="preserve">141</w:t>
+              <w:t xml:space="preserve">Delivered scope</w:t>
+            </w:r>
+          </w:p>
+        </w:tc>
+        <w:tc>
+          <w:tcPr>
+            <w:tcW w:type="dxa" w:w="964"/>
+            <w:tcBorders>
+              <w:top w:val="single" w:color="D6CFC6" w:sz="4"/>
+              <w:left w:val="single" w:color="D6CFC6" w:sz="4"/>
+              <w:bottom w:val="single" w:color="D6CFC6" w:sz="4"/>
+              <w:right w:val="single" w:color="D6CFC6" w:sz="4"/>
+            </w:tcBorders>
+            <w:shd w:fill="FCE8EB" w:color="auto" w:val="clear"/>
+            <w:tcMar>
+              <w:top w:type="dxa" w:w="90"/>
+              <w:left w:type="dxa" w:w="130"/>
+              <w:bottom w:type="dxa" w:w="90"/>
+              <w:right w:type="dxa" w:w="130"/>
+            </w:tcMar>
+            <w:vAlign w:val="center"/>
+          </w:tcPr>
+          <w:p>
+            <w:pPr>
+              <w:spacing w:after="0" w:line="240"/>
+              <w:jc w:val="right"/>
+            </w:pPr>
+            <w:r>
+              <w:rPr>
+                <w:rFonts w:ascii="Calibri" w:cs="Calibri" w:eastAsia="Calibri" w:hAnsi="Calibri"/>
+                <w:b/>
+                <w:bCs/>
+                <w:i w:val="false"/>
+                <w:iCs w:val="false"/>
+                <w:color w:val="221E1F"/>
+                <w:sz w:val="20"/>
+                <w:szCs w:val="20"/>
+              </w:rPr>
+              <w:t xml:space="preserve">146</w:t>
             </w:r>
           </w:p>
         </w:tc>
@@ -8738,7 +8890,7 @@
           <w:sz w:val="20"/>
           <w:szCs w:val="20"/>
         </w:rPr>
-        <w:t xml:space="preserve">19,998 hand-written lines over 141 days is about 150 a day. For tested, typed, reviewed production code that sits inside the normal 100–300 band, and lower than the 200 the first version of this document reconstructed — integration work carries more test and less code than storefront work does. The reconstruction is not inflated.</w:t>
+        <w:t xml:space="preserve">19,998 hand-written lines over 146 days is about 150 a day. For tested, typed, reviewed production code that sits inside the normal 100–300 band, and lower than the 200 the first version of this document reconstructed — integration work carries more test and less code than storefront work does. The reconstruction is not inflated.</w:t>
       </w:r>
     </w:p>
     <w:p>
@@ -8756,7 +8908,7 @@
           <w:sz w:val="20"/>
           <w:szCs w:val="20"/>
         </w:rPr>
-        <w:t xml:space="preserve">141 days is roughly 27 working weeks, or a little over six months for one person. Two people working in parallel would compress the calendar but not the total, and would add coordination cost.</w:t>
+        <w:t xml:space="preserve">146 days is roughly 27 working weeks, or a little over six months for one person. Two people working in parallel would compress the calendar but not the total, and would add coordination cost.</w:t>
       </w:r>
     </w:p>
     <w:p>
@@ -8827,7 +8979,7 @@
           <w:sz w:val="20"/>
           <w:szCs w:val="20"/>
         </w:rPr>
-        <w:t xml:space="preserve">Delivered scope: 141 days × 8 hours = 1128 hours.</w:t>
+        <w:t xml:space="preserve">Delivered scope: 146 days × 8 hours = 1168 hours.</w:t>
       </w:r>
     </w:p>
     <w:tbl>
@@ -8922,7 +9074,7 @@
                 <w:sz w:val="19"/>
                 <w:szCs w:val="19"/>
               </w:rPr>
-              <w:t xml:space="preserve">Cost of the 1128 hours (excl. VAT)</w:t>
+              <w:t xml:space="preserve">Cost of the 1168 hours (excl. VAT)</w:t>
             </w:r>
           </w:p>
         </w:tc>
@@ -9035,7 +9187,7 @@
                 <w:sz w:val="20"/>
                 <w:szCs w:val="20"/>
               </w:rPr>
-              <w:t xml:space="preserve">R 451 200</w:t>
+              <w:t xml:space="preserve">R 467 200</w:t>
             </w:r>
           </w:p>
         </w:tc>
@@ -9072,7 +9224,7 @@
                 <w:sz w:val="20"/>
                 <w:szCs w:val="20"/>
               </w:rPr>
-              <w:t xml:space="preserve">R 518 880</w:t>
+              <w:t xml:space="preserve">R 537 280</w:t>
             </w:r>
           </w:p>
         </w:tc>
@@ -9149,7 +9301,7 @@
                 <w:sz w:val="20"/>
                 <w:szCs w:val="20"/>
               </w:rPr>
-              <w:t xml:space="preserve">R 733 200</w:t>
+              <w:t xml:space="preserve">R 759 200</w:t>
             </w:r>
           </w:p>
         </w:tc>
@@ -9187,7 +9339,7 @@
                 <w:sz w:val="20"/>
                 <w:szCs w:val="20"/>
               </w:rPr>
-              <w:t xml:space="preserve">R 843 180</w:t>
+              <w:t xml:space="preserve">R 873 080</w:t>
             </w:r>
           </w:p>
         </w:tc>
@@ -9262,7 +9414,7 @@
                 <w:sz w:val="20"/>
                 <w:szCs w:val="20"/>
               </w:rPr>
-              <w:t xml:space="preserve">R 958 800</w:t>
+              <w:t xml:space="preserve">R 992 800</w:t>
             </w:r>
           </w:p>
         </w:tc>
@@ -9299,7 +9451,7 @@
                 <w:sz w:val="20"/>
                 <w:szCs w:val="20"/>
               </w:rPr>
-              <w:t xml:space="preserve">R 1 102 620</w:t>
+              <w:t xml:space="preserve">R 1 141 720</w:t>
             </w:r>
           </w:p>
         </w:tc>
@@ -9376,7 +9528,7 @@
                 <w:sz w:val="20"/>
                 <w:szCs w:val="20"/>
               </w:rPr>
-              <w:t xml:space="preserve">R 1 071 600</w:t>
+              <w:t xml:space="preserve">R 1 109 600</w:t>
             </w:r>
           </w:p>
         </w:tc>
@@ -9414,7 +9566,7 @@
                 <w:sz w:val="20"/>
                 <w:szCs w:val="20"/>
               </w:rPr>
-              <w:t xml:space="preserve">R 1 232 340</w:t>
+              <w:t xml:space="preserve">R 1 276 040</w:t>
             </w:r>
           </w:p>
         </w:tc>
@@ -9489,7 +9641,7 @@
                 <w:sz w:val="20"/>
                 <w:szCs w:val="20"/>
               </w:rPr>
-              <w:t xml:space="preserve">R 1 297 200</w:t>
+              <w:t xml:space="preserve">R 1 343 200</w:t>
             </w:r>
           </w:p>
         </w:tc>
@@ -9526,7 +9678,7 @@
                 <w:sz w:val="20"/>
                 <w:szCs w:val="20"/>
               </w:rPr>
-              <w:t xml:space="preserve">R 1 491 780</w:t>
+              <w:t xml:space="preserve">R 1 544 680</w:t>
             </w:r>
           </w:p>
         </w:tc>
@@ -9603,7 +9755,7 @@
                 <w:sz w:val="20"/>
                 <w:szCs w:val="20"/>
               </w:rPr>
-              <w:t xml:space="preserve">R 1 635 600</w:t>
+              <w:t xml:space="preserve">R 1 693 600</w:t>
             </w:r>
           </w:p>
         </w:tc>
@@ -9641,7 +9793,7 @@
                 <w:sz w:val="20"/>
                 <w:szCs w:val="20"/>
               </w:rPr>
-              <w:t xml:space="preserve">R 1 880 940</w:t>
+              <w:t xml:space="preserve">R 1 947 640</w:t>
             </w:r>
           </w:p>
         </w:tc>
@@ -9693,7 +9845,7 @@
           <w:sz w:val="20"/>
           <w:szCs w:val="20"/>
         </w:rPr>
-        <w:t xml:space="preserve">At an illustrative blended rate of R 950 an hour — chosen here only to make the rest of the document concrete — the delivered scope comes to R 1 071 600 excluding VAT, or R 1 232 340 including it. Replace the rate and every figure below moves proportionally.</w:t>
+        <w:t xml:space="preserve">At an illustrative blended rate of R 950 an hour — chosen here only to make the rest of the document concrete — the delivered scope comes to R 1 109 600 excluding VAT, or R 1 276 040 including it. Replace the rate and every figure below moves proportionally.</w:t>
       </w:r>
     </w:p>
     <w:p>
@@ -12940,7 +13092,7 @@
                 <w:sz w:val="20"/>
                 <w:szCs w:val="20"/>
               </w:rPr>
-              <w:t xml:space="preserve">PayFast adapter</w:t>
+              <w:t xml:space="preserve">Uber Direct adapter</w:t>
             </w:r>
           </w:p>
         </w:tc>
@@ -12977,7 +13129,7 @@
                 <w:sz w:val="20"/>
                 <w:szCs w:val="20"/>
               </w:rPr>
-              <w:t xml:space="preserve">4</w:t>
+              <w:t xml:space="preserve">5</w:t>
             </w:r>
           </w:p>
         </w:tc>
@@ -13014,7 +13166,7 @@
                 <w:sz w:val="20"/>
                 <w:szCs w:val="20"/>
               </w:rPr>
-              <w:t xml:space="preserve">32</w:t>
+              <w:t xml:space="preserve">40</w:t>
             </w:r>
           </w:p>
         </w:tc>
@@ -13051,7 +13203,7 @@
                 <w:sz w:val="20"/>
                 <w:szCs w:val="20"/>
               </w:rPr>
-              <w:t xml:space="preserve">R 30 400</w:t>
+              <w:t xml:space="preserve">R 38 000</w:t>
             </w:r>
           </w:p>
         </w:tc>
@@ -13066,6 +13218,159 @@
               <w:bottom w:val="single" w:color="D6CFC6" w:sz="4"/>
               <w:right w:val="single" w:color="D6CFC6" w:sz="4"/>
             </w:tcBorders>
+            <w:shd w:fill="F7F5F2" w:color="auto" w:val="clear"/>
+            <w:tcMar>
+              <w:top w:type="dxa" w:w="90"/>
+              <w:left w:type="dxa" w:w="130"/>
+              <w:bottom w:type="dxa" w:w="90"/>
+              <w:right w:type="dxa" w:w="130"/>
+            </w:tcMar>
+            <w:vAlign w:val="center"/>
+          </w:tcPr>
+          <w:p>
+            <w:pPr>
+              <w:spacing w:after="0" w:line="240"/>
+            </w:pPr>
+            <w:r>
+              <w:rPr>
+                <w:rFonts w:ascii="Calibri" w:cs="Calibri" w:eastAsia="Calibri" w:hAnsi="Calibri"/>
+                <w:b w:val="false"/>
+                <w:bCs w:val="false"/>
+                <w:i w:val="false"/>
+                <w:iCs w:val="false"/>
+                <w:color w:val="221E1F"/>
+                <w:sz w:val="20"/>
+                <w:szCs w:val="20"/>
+              </w:rPr>
+              <w:t xml:space="preserve">PayFast adapter</w:t>
+            </w:r>
+          </w:p>
+        </w:tc>
+        <w:tc>
+          <w:tcPr>
+            <w:tcW w:type="dxa" w:w="1157"/>
+            <w:tcBorders>
+              <w:top w:val="single" w:color="D6CFC6" w:sz="4"/>
+              <w:left w:val="single" w:color="D6CFC6" w:sz="4"/>
+              <w:bottom w:val="single" w:color="D6CFC6" w:sz="4"/>
+              <w:right w:val="single" w:color="D6CFC6" w:sz="4"/>
+            </w:tcBorders>
+            <w:shd w:fill="F7F5F2" w:color="auto" w:val="clear"/>
+            <w:tcMar>
+              <w:top w:type="dxa" w:w="90"/>
+              <w:left w:type="dxa" w:w="130"/>
+              <w:bottom w:type="dxa" w:w="90"/>
+              <w:right w:type="dxa" w:w="130"/>
+            </w:tcMar>
+            <w:vAlign w:val="center"/>
+          </w:tcPr>
+          <w:p>
+            <w:pPr>
+              <w:spacing w:after="0" w:line="240"/>
+              <w:jc w:val="right"/>
+            </w:pPr>
+            <w:r>
+              <w:rPr>
+                <w:rFonts w:ascii="Calibri" w:cs="Calibri" w:eastAsia="Calibri" w:hAnsi="Calibri"/>
+                <w:b w:val="false"/>
+                <w:bCs w:val="false"/>
+                <w:i w:val="false"/>
+                <w:iCs w:val="false"/>
+                <w:color w:val="221E1F"/>
+                <w:sz w:val="20"/>
+                <w:szCs w:val="20"/>
+              </w:rPr>
+              <w:t xml:space="preserve">4</w:t>
+            </w:r>
+          </w:p>
+        </w:tc>
+        <w:tc>
+          <w:tcPr>
+            <w:tcW w:type="dxa" w:w="1542"/>
+            <w:tcBorders>
+              <w:top w:val="single" w:color="D6CFC6" w:sz="4"/>
+              <w:left w:val="single" w:color="D6CFC6" w:sz="4"/>
+              <w:bottom w:val="single" w:color="D6CFC6" w:sz="4"/>
+              <w:right w:val="single" w:color="D6CFC6" w:sz="4"/>
+            </w:tcBorders>
+            <w:shd w:fill="F7F5F2" w:color="auto" w:val="clear"/>
+            <w:tcMar>
+              <w:top w:type="dxa" w:w="90"/>
+              <w:left w:type="dxa" w:w="130"/>
+              <w:bottom w:type="dxa" w:w="90"/>
+              <w:right w:type="dxa" w:w="130"/>
+            </w:tcMar>
+            <w:vAlign w:val="center"/>
+          </w:tcPr>
+          <w:p>
+            <w:pPr>
+              <w:spacing w:after="0" w:line="240"/>
+              <w:jc w:val="right"/>
+            </w:pPr>
+            <w:r>
+              <w:rPr>
+                <w:rFonts w:ascii="Calibri" w:cs="Calibri" w:eastAsia="Calibri" w:hAnsi="Calibri"/>
+                <w:b w:val="false"/>
+                <w:bCs w:val="false"/>
+                <w:i w:val="false"/>
+                <w:iCs w:val="false"/>
+                <w:color w:val="221E1F"/>
+                <w:sz w:val="20"/>
+                <w:szCs w:val="20"/>
+              </w:rPr>
+              <w:t xml:space="preserve">32</w:t>
+            </w:r>
+          </w:p>
+        </w:tc>
+        <w:tc>
+          <w:tcPr>
+            <w:tcW w:type="dxa" w:w="1638"/>
+            <w:tcBorders>
+              <w:top w:val="single" w:color="D6CFC6" w:sz="4"/>
+              <w:left w:val="single" w:color="D6CFC6" w:sz="4"/>
+              <w:bottom w:val="single" w:color="D6CFC6" w:sz="4"/>
+              <w:right w:val="single" w:color="D6CFC6" w:sz="4"/>
+            </w:tcBorders>
+            <w:shd w:fill="F7F5F2" w:color="auto" w:val="clear"/>
+            <w:tcMar>
+              <w:top w:type="dxa" w:w="90"/>
+              <w:left w:type="dxa" w:w="130"/>
+              <w:bottom w:type="dxa" w:w="90"/>
+              <w:right w:type="dxa" w:w="130"/>
+            </w:tcMar>
+            <w:vAlign w:val="center"/>
+          </w:tcPr>
+          <w:p>
+            <w:pPr>
+              <w:spacing w:after="0" w:line="240"/>
+              <w:jc w:val="right"/>
+            </w:pPr>
+            <w:r>
+              <w:rPr>
+                <w:rFonts w:ascii="Calibri" w:cs="Calibri" w:eastAsia="Calibri" w:hAnsi="Calibri"/>
+                <w:b w:val="false"/>
+                <w:bCs w:val="false"/>
+                <w:i w:val="false"/>
+                <w:iCs w:val="false"/>
+                <w:color w:val="221E1F"/>
+                <w:sz w:val="20"/>
+                <w:szCs w:val="20"/>
+              </w:rPr>
+              <w:t xml:space="preserve">R 30 400</w:t>
+            </w:r>
+          </w:p>
+        </w:tc>
+      </w:tr>
+      <w:tr>
+        <w:tc>
+          <w:tcPr>
+            <w:tcW w:type="dxa" w:w="5301"/>
+            <w:tcBorders>
+              <w:top w:val="single" w:color="D6CFC6" w:sz="4"/>
+              <w:left w:val="single" w:color="D6CFC6" w:sz="4"/>
+              <w:bottom w:val="single" w:color="D6CFC6" w:sz="4"/>
+              <w:right w:val="single" w:color="D6CFC6" w:sz="4"/>
+            </w:tcBorders>
             <w:shd w:fill="FCE8EB" w:color="auto" w:val="clear"/>
             <w:tcMar>
               <w:top w:type="dxa" w:w="90"/>
@@ -13128,7 +13433,7 @@
                 <w:sz w:val="20"/>
                 <w:szCs w:val="20"/>
               </w:rPr>
-              <w:t xml:space="preserve">141</w:t>
+              <w:t xml:space="preserve">146</w:t>
             </w:r>
           </w:p>
         </w:tc>
@@ -13166,7 +13471,7 @@
                 <w:sz w:val="20"/>
                 <w:szCs w:val="20"/>
               </w:rPr>
-              <w:t xml:space="preserve">1 128</w:t>
+              <w:t xml:space="preserve">1 168</w:t>
             </w:r>
           </w:p>
         </w:tc>
@@ -13204,7 +13509,7 @@
                 <w:sz w:val="20"/>
                 <w:szCs w:val="20"/>
               </w:rPr>
-              <w:t xml:space="preserve">R 1 071 600</w:t>
+              <w:t xml:space="preserve">R 1 109 600</w:t>
             </w:r>
           </w:p>
         </w:tc>
@@ -13243,7 +13548,7 @@
           <w:sz w:val="20"/>
           <w:szCs w:val="20"/>
         </w:rPr>
-        <w:t xml:space="preserve">The integration seams — payments, accounts, notifications, POS and courier — are 44 of the 141 days. None of them names a vendor, and none has to be rewritten when one is chosen: what remains per integration is an adapter against an interface that already exists and is already tested.</w:t>
+        <w:t xml:space="preserve">The integration seams — payments, accounts, notifications, POS and courier — are 44 of the 146 days. None of them names a vendor, and none has to be rewritten when one is chosen: what remains per integration is an adapter against an interface that already exists and is already tested.</w:t>
       </w:r>
     </w:p>
     <w:p>
@@ -13789,7 +14094,7 @@
                 <w:sz w:val="20"/>
                 <w:szCs w:val="20"/>
               </w:rPr>
-              <w:t xml:space="preserve">Courier adapter and onboarding</w:t>
+              <w:t xml:space="preserve">Uber Direct onboarding</w:t>
             </w:r>
           </w:p>
         </w:tc>
@@ -13825,7 +14130,7 @@
                 <w:sz w:val="20"/>
                 <w:szCs w:val="20"/>
               </w:rPr>
-              <w:t xml:space="preserve">One adapter against the seam, live tracking, provider onboarding</w:t>
+              <w:t xml:space="preserve">The adapter is written and tested. What is left needs an Uber Direct account: confirming they accept our dispatch, and a postal code at checkout so an address is complete</w:t>
             </w:r>
           </w:p>
         </w:tc>
@@ -13862,7 +14167,7 @@
                 <w:sz w:val="20"/>
                 <w:szCs w:val="20"/>
               </w:rPr>
-              <w:t xml:space="preserve">5</w:t>
+              <w:t xml:space="preserve">3</w:t>
             </w:r>
           </w:p>
         </w:tc>
@@ -13898,7 +14203,7 @@
                 <w:sz w:val="20"/>
                 <w:szCs w:val="20"/>
               </w:rPr>
-              <w:t xml:space="preserve">Provider commission</w:t>
+              <w:t xml:space="preserve">Uber commission per delivery</w:t>
             </w:r>
           </w:p>
         </w:tc>
@@ -15019,7 +15324,7 @@
                 <w:sz w:val="20"/>
                 <w:szCs w:val="20"/>
               </w:rPr>
-              <w:t xml:space="preserve">256 hours of engineering</w:t>
+              <w:t xml:space="preserve">240 hours of engineering</w:t>
             </w:r>
           </w:p>
         </w:tc>
@@ -15057,7 +15362,7 @@
                 <w:sz w:val="20"/>
                 <w:szCs w:val="20"/>
               </w:rPr>
-              <w:t xml:space="preserve">32</w:t>
+              <w:t xml:space="preserve">30</w:t>
             </w:r>
           </w:p>
         </w:tc>
@@ -15362,7 +15667,7 @@
                 <w:sz w:val="20"/>
                 <w:szCs w:val="20"/>
               </w:rPr>
-              <w:t xml:space="preserve">141</w:t>
+              <w:t xml:space="preserve">146</w:t>
             </w:r>
           </w:p>
         </w:tc>
@@ -15399,7 +15704,7 @@
                 <w:sz w:val="20"/>
                 <w:szCs w:val="20"/>
               </w:rPr>
-              <w:t xml:space="preserve">1 128</w:t>
+              <w:t xml:space="preserve">1 168</w:t>
             </w:r>
           </w:p>
         </w:tc>
@@ -15436,7 +15741,7 @@
                 <w:sz w:val="20"/>
                 <w:szCs w:val="20"/>
               </w:rPr>
-              <w:t xml:space="preserve">R 1 071 600</w:t>
+              <w:t xml:space="preserve">R 1 109 600</w:t>
             </w:r>
           </w:p>
         </w:tc>
@@ -15513,7 +15818,7 @@
                 <w:sz w:val="20"/>
                 <w:szCs w:val="20"/>
               </w:rPr>
-              <w:t xml:space="preserve">32</w:t>
+              <w:t xml:space="preserve">30</w:t>
             </w:r>
           </w:p>
         </w:tc>
@@ -15551,7 +15856,7 @@
                 <w:sz w:val="20"/>
                 <w:szCs w:val="20"/>
               </w:rPr>
-              <w:t xml:space="preserve">256</w:t>
+              <w:t xml:space="preserve">240</w:t>
             </w:r>
           </w:p>
         </w:tc>
@@ -15589,7 +15894,7 @@
                 <w:sz w:val="20"/>
                 <w:szCs w:val="20"/>
               </w:rPr>
-              <w:t xml:space="preserve">R 243 200</w:t>
+              <w:t xml:space="preserve">R 228 000</w:t>
             </w:r>
           </w:p>
         </w:tc>
@@ -15666,7 +15971,7 @@
                 <w:sz w:val="20"/>
                 <w:szCs w:val="20"/>
               </w:rPr>
-              <w:t xml:space="preserve">173</w:t>
+              <w:t xml:space="preserve">176</w:t>
             </w:r>
           </w:p>
         </w:tc>
@@ -15704,7 +16009,7 @@
                 <w:sz w:val="20"/>
                 <w:szCs w:val="20"/>
               </w:rPr>
-              <w:t xml:space="preserve">1 384</w:t>
+              <w:t xml:space="preserve">1 408</w:t>
             </w:r>
           </w:p>
         </w:tc>
@@ -15742,7 +16047,7 @@
                 <w:sz w:val="20"/>
                 <w:szCs w:val="20"/>
               </w:rPr>
-              <w:t xml:space="preserve">R 1 314 800</w:t>
+              <w:t xml:space="preserve">R 1 337 600</w:t>
             </w:r>
           </w:p>
         </w:tc>
@@ -15781,7 +16086,7 @@
           <w:sz w:val="20"/>
           <w:szCs w:val="20"/>
         </w:rPr>
-        <w:t xml:space="preserve">Roughly 82% of the engineering is done. </w:t>
+        <w:t xml:space="preserve">Roughly 83% of the engineering is done. </w:t>
       </w:r>
       <w:r>
         <w:rPr>

</xml_diff>

<commit_message>
Reprice: 149 built, 28 remaining, and none of it is code
Uber onboarding drops to two days because the address is complete now, and
deployment to two because the container is written. Both of those, and every
other line left, are the half that needs somebody who is not a developer: a
merchant account, a vendor name, a host, a lawyer, a photographer, or a person
with a screen reader.

Co-Authored-By: Claude Opus 5 <noreply@anthropic.com>
Claude-Session: https://claude.ai/code/session_01B2xsFCpQEfEHuTCkYzyD13
</commit_message>
<xml_diff>
--- a/WEBSITE_COSTINGS.docx
+++ b/WEBSITE_COSTINGS.docx
@@ -449,7 +449,7 @@
                 <w:sz w:val="20"/>
                 <w:szCs w:val="20"/>
               </w:rPr>
-              <w:t xml:space="preserve">0b7a6fa</w:t>
+              <w:t xml:space="preserve">aae2417</w:t>
             </w:r>
           </w:p>
         </w:tc>
@@ -1527,7 +1527,7 @@
                 <w:sz w:val="20"/>
                 <w:szCs w:val="20"/>
               </w:rPr>
-              <w:t xml:space="preserve">606</w:t>
+              <w:t xml:space="preserve">623</w:t>
             </w:r>
           </w:p>
         </w:tc>
@@ -1563,7 +1563,7 @@
                 <w:sz w:val="20"/>
                 <w:szCs w:val="20"/>
               </w:rPr>
-              <w:t xml:space="preserve">In 31 files; all passing</w:t>
+              <w:t xml:space="preserve">In 32 files; all passing</w:t>
             </w:r>
           </w:p>
         </w:tc>
@@ -3770,7 +3770,7 @@
                 <w:sz w:val="20"/>
                 <w:szCs w:val="20"/>
               </w:rPr>
-              <w:t xml:space="preserve">606 passing</w:t>
+              <w:t xml:space="preserve">623 passing</w:t>
             </w:r>
           </w:p>
         </w:tc>
@@ -3807,7 +3807,7 @@
                 <w:sz w:val="20"/>
                 <w:szCs w:val="20"/>
               </w:rPr>
-              <w:t xml:space="preserve">31 files, including four real worker processes racing on one file</w:t>
+              <w:t xml:space="preserve">32 files, including four real worker processes racing on one file</w:t>
             </w:r>
           </w:p>
         </w:tc>
@@ -8425,7 +8425,7 @@
                 <w:sz w:val="20"/>
                 <w:szCs w:val="20"/>
               </w:rPr>
-              <w:t xml:space="preserve">22</w:t>
+              <w:t xml:space="preserve">23</w:t>
             </w:r>
           </w:p>
         </w:tc>
@@ -8461,7 +8461,7 @@
                 <w:sz w:val="20"/>
                 <w:szCs w:val="20"/>
               </w:rPr>
-              <w:t xml:space="preserve">Uber Direct adapter</w:t>
+              <w:t xml:space="preserve">Complete addresses and a container</w:t>
             </w:r>
           </w:p>
         </w:tc>
@@ -8497,7 +8497,7 @@
                 <w:sz w:val="20"/>
                 <w:szCs w:val="20"/>
               </w:rPr>
-              <w:t xml:space="preserve">OAuth with a cached token, structured addresses built from what checkout collects, both of Uber’s status vocabularies, raw-byte webhook verification, and dispatch on ready rather than on order</w:t>
+              <w:t xml:space="preserve">The postal code through the checkout form, the schema, the order and the courier address; a multi-stage non-root image with the state file on a volume and a healthcheck on the endpoint that reports storage</w:t>
             </w:r>
           </w:p>
         </w:tc>
@@ -8534,7 +8534,7 @@
                 <w:sz w:val="20"/>
                 <w:szCs w:val="20"/>
               </w:rPr>
-              <w:t xml:space="preserve">5</w:t>
+              <w:t xml:space="preserve">3</w:t>
             </w:r>
           </w:p>
         </w:tc>
@@ -8574,7 +8574,7 @@
                 <w:sz w:val="20"/>
                 <w:szCs w:val="20"/>
               </w:rPr>
-              <w:t xml:space="preserve">21</w:t>
+              <w:t xml:space="preserve">22</w:t>
             </w:r>
           </w:p>
         </w:tc>
@@ -8611,7 +8611,7 @@
                 <w:sz w:val="20"/>
                 <w:szCs w:val="20"/>
               </w:rPr>
-              <w:t xml:space="preserve">PayFast adapter</w:t>
+              <w:t xml:space="preserve">Uber Direct adapter</w:t>
             </w:r>
           </w:p>
         </w:tc>
@@ -8648,7 +8648,7 @@
                 <w:sz w:val="20"/>
                 <w:szCs w:val="20"/>
               </w:rPr>
-              <w:t xml:space="preserve">PHP-compatible signing, all four of PayFast’s notification checks with the postback failing closed, status mapping, and an idempotency key that survives their PENDING-then-COMPLETE sequence</w:t>
+              <w:t xml:space="preserve">OAuth with a cached token, structured addresses built from what checkout collects, both of Uber’s status vocabularies, raw-byte webhook verification, and dispatch on ready rather than on order</w:t>
             </w:r>
           </w:p>
         </w:tc>
@@ -8686,7 +8686,7 @@
                 <w:sz w:val="20"/>
                 <w:szCs w:val="20"/>
               </w:rPr>
-              <w:t xml:space="preserve">4</w:t>
+              <w:t xml:space="preserve">5</w:t>
             </w:r>
           </w:p>
         </w:tc>
@@ -8701,7 +8701,6 @@
               <w:bottom w:val="single" w:color="D6CFC6" w:sz="4"/>
               <w:right w:val="single" w:color="D6CFC6" w:sz="4"/>
             </w:tcBorders>
-            <w:shd w:fill="FCE8EB" w:color="auto" w:val="clear"/>
             <w:tcMar>
               <w:top w:type="dxa" w:w="90"/>
               <w:left w:type="dxa" w:w="130"/>
@@ -8714,6 +8713,42 @@
             <w:pPr>
               <w:spacing w:after="0" w:line="240"/>
               <w:jc w:val="center"/>
+            </w:pPr>
+            <w:r>
+              <w:rPr>
+                <w:rFonts w:ascii="Calibri" w:cs="Calibri" w:eastAsia="Calibri" w:hAnsi="Calibri"/>
+                <w:b w:val="false"/>
+                <w:bCs w:val="false"/>
+                <w:i w:val="false"/>
+                <w:iCs w:val="false"/>
+                <w:color w:val="221E1F"/>
+                <w:sz w:val="20"/>
+                <w:szCs w:val="20"/>
+              </w:rPr>
+              <w:t xml:space="preserve">21</w:t>
+            </w:r>
+          </w:p>
+        </w:tc>
+        <w:tc>
+          <w:tcPr>
+            <w:tcW w:type="dxa" w:w="3084"/>
+            <w:tcBorders>
+              <w:top w:val="single" w:color="D6CFC6" w:sz="4"/>
+              <w:left w:val="single" w:color="D6CFC6" w:sz="4"/>
+              <w:bottom w:val="single" w:color="D6CFC6" w:sz="4"/>
+              <w:right w:val="single" w:color="D6CFC6" w:sz="4"/>
+            </w:tcBorders>
+            <w:tcMar>
+              <w:top w:type="dxa" w:w="90"/>
+              <w:left w:type="dxa" w:w="130"/>
+              <w:bottom w:type="dxa" w:w="90"/>
+              <w:right w:type="dxa" w:w="130"/>
+            </w:tcMar>
+            <w:vAlign w:val="center"/>
+          </w:tcPr>
+          <w:p>
+            <w:pPr>
+              <w:spacing w:after="0" w:line="240"/>
             </w:pPr>
             <w:r>
               <w:rPr>
@@ -8726,13 +8761,88 @@
                 <w:sz w:val="20"/>
                 <w:szCs w:val="20"/>
               </w:rPr>
-              <w:t xml:space="preserve"/>
-            </w:r>
-          </w:p>
-        </w:tc>
-        <w:tc>
-          <w:tcPr>
-            <w:tcW w:type="dxa" w:w="3084"/>
+              <w:t xml:space="preserve">PayFast adapter</w:t>
+            </w:r>
+          </w:p>
+        </w:tc>
+        <w:tc>
+          <w:tcPr>
+            <w:tcW w:type="dxa" w:w="5108"/>
+            <w:tcBorders>
+              <w:top w:val="single" w:color="D6CFC6" w:sz="4"/>
+              <w:left w:val="single" w:color="D6CFC6" w:sz="4"/>
+              <w:bottom w:val="single" w:color="D6CFC6" w:sz="4"/>
+              <w:right w:val="single" w:color="D6CFC6" w:sz="4"/>
+            </w:tcBorders>
+            <w:tcMar>
+              <w:top w:type="dxa" w:w="90"/>
+              <w:left w:type="dxa" w:w="130"/>
+              <w:bottom w:type="dxa" w:w="90"/>
+              <w:right w:type="dxa" w:w="130"/>
+            </w:tcMar>
+            <w:vAlign w:val="center"/>
+          </w:tcPr>
+          <w:p>
+            <w:pPr>
+              <w:spacing w:after="0" w:line="240"/>
+            </w:pPr>
+            <w:r>
+              <w:rPr>
+                <w:rFonts w:ascii="Calibri" w:cs="Calibri" w:eastAsia="Calibri" w:hAnsi="Calibri"/>
+                <w:b w:val="false"/>
+                <w:bCs w:val="false"/>
+                <w:i w:val="false"/>
+                <w:iCs w:val="false"/>
+                <w:color w:val="221E1F"/>
+                <w:sz w:val="20"/>
+                <w:szCs w:val="20"/>
+              </w:rPr>
+              <w:t xml:space="preserve">PHP-compatible signing, all four of PayFast’s notification checks with the postback failing closed, status mapping, and an idempotency key that survives their PENDING-then-COMPLETE sequence</w:t>
+            </w:r>
+          </w:p>
+        </w:tc>
+        <w:tc>
+          <w:tcPr>
+            <w:tcW w:type="dxa" w:w="964"/>
+            <w:tcBorders>
+              <w:top w:val="single" w:color="D6CFC6" w:sz="4"/>
+              <w:left w:val="single" w:color="D6CFC6" w:sz="4"/>
+              <w:bottom w:val="single" w:color="D6CFC6" w:sz="4"/>
+              <w:right w:val="single" w:color="D6CFC6" w:sz="4"/>
+            </w:tcBorders>
+            <w:tcMar>
+              <w:top w:type="dxa" w:w="90"/>
+              <w:left w:type="dxa" w:w="130"/>
+              <w:bottom w:type="dxa" w:w="90"/>
+              <w:right w:type="dxa" w:w="130"/>
+            </w:tcMar>
+            <w:vAlign w:val="center"/>
+          </w:tcPr>
+          <w:p>
+            <w:pPr>
+              <w:spacing w:after="0" w:line="240"/>
+              <w:jc w:val="right"/>
+            </w:pPr>
+            <w:r>
+              <w:rPr>
+                <w:rFonts w:ascii="Calibri" w:cs="Calibri" w:eastAsia="Calibri" w:hAnsi="Calibri"/>
+                <w:b w:val="false"/>
+                <w:bCs w:val="false"/>
+                <w:i w:val="false"/>
+                <w:iCs w:val="false"/>
+                <w:color w:val="221E1F"/>
+                <w:sz w:val="20"/>
+                <w:szCs w:val="20"/>
+              </w:rPr>
+              <w:t xml:space="preserve">4</w:t>
+            </w:r>
+          </w:p>
+        </w:tc>
+      </w:tr>
+      <w:tr>
+        <w:tc>
+          <w:tcPr>
+            <w:tcW w:type="dxa" w:w="482"/>
             <w:tcBorders>
               <w:top w:val="single" w:color="D6CFC6" w:sz="4"/>
               <w:left w:val="single" w:color="D6CFC6" w:sz="4"/>
@@ -8751,6 +8861,7 @@
           <w:p>
             <w:pPr>
               <w:spacing w:after="0" w:line="240"/>
+              <w:jc w:val="center"/>
             </w:pPr>
             <w:r>
               <w:rPr>
@@ -8763,13 +8874,13 @@
                 <w:sz w:val="20"/>
                 <w:szCs w:val="20"/>
               </w:rPr>
-              <w:t xml:space="preserve">Total</w:t>
-            </w:r>
-          </w:p>
-        </w:tc>
-        <w:tc>
-          <w:tcPr>
-            <w:tcW w:type="dxa" w:w="5108"/>
+              <w:t xml:space="preserve"/>
+            </w:r>
+          </w:p>
+        </w:tc>
+        <w:tc>
+          <w:tcPr>
+            <w:tcW w:type="dxa" w:w="3084"/>
             <w:tcBorders>
               <w:top w:val="single" w:color="D6CFC6" w:sz="4"/>
               <w:left w:val="single" w:color="D6CFC6" w:sz="4"/>
@@ -8800,13 +8911,13 @@
                 <w:sz w:val="20"/>
                 <w:szCs w:val="20"/>
               </w:rPr>
-              <w:t xml:space="preserve">Delivered scope</w:t>
-            </w:r>
-          </w:p>
-        </w:tc>
-        <w:tc>
-          <w:tcPr>
-            <w:tcW w:type="dxa" w:w="964"/>
+              <w:t xml:space="preserve">Total</w:t>
+            </w:r>
+          </w:p>
+        </w:tc>
+        <w:tc>
+          <w:tcPr>
+            <w:tcW w:type="dxa" w:w="5108"/>
             <w:tcBorders>
               <w:top w:val="single" w:color="D6CFC6" w:sz="4"/>
               <w:left w:val="single" w:color="D6CFC6" w:sz="4"/>
@@ -8825,7 +8936,6 @@
           <w:p>
             <w:pPr>
               <w:spacing w:after="0" w:line="240"/>
-              <w:jc w:val="right"/>
             </w:pPr>
             <w:r>
               <w:rPr>
@@ -8838,7 +8948,45 @@
                 <w:sz w:val="20"/>
                 <w:szCs w:val="20"/>
               </w:rPr>
-              <w:t xml:space="preserve">146</w:t>
+              <w:t xml:space="preserve">Delivered scope</w:t>
+            </w:r>
+          </w:p>
+        </w:tc>
+        <w:tc>
+          <w:tcPr>
+            <w:tcW w:type="dxa" w:w="964"/>
+            <w:tcBorders>
+              <w:top w:val="single" w:color="D6CFC6" w:sz="4"/>
+              <w:left w:val="single" w:color="D6CFC6" w:sz="4"/>
+              <w:bottom w:val="single" w:color="D6CFC6" w:sz="4"/>
+              <w:right w:val="single" w:color="D6CFC6" w:sz="4"/>
+            </w:tcBorders>
+            <w:shd w:fill="FCE8EB" w:color="auto" w:val="clear"/>
+            <w:tcMar>
+              <w:top w:type="dxa" w:w="90"/>
+              <w:left w:type="dxa" w:w="130"/>
+              <w:bottom w:type="dxa" w:w="90"/>
+              <w:right w:type="dxa" w:w="130"/>
+            </w:tcMar>
+            <w:vAlign w:val="center"/>
+          </w:tcPr>
+          <w:p>
+            <w:pPr>
+              <w:spacing w:after="0" w:line="240"/>
+              <w:jc w:val="right"/>
+            </w:pPr>
+            <w:r>
+              <w:rPr>
+                <w:rFonts w:ascii="Calibri" w:cs="Calibri" w:eastAsia="Calibri" w:hAnsi="Calibri"/>
+                <w:b/>
+                <w:bCs/>
+                <w:i w:val="false"/>
+                <w:iCs w:val="false"/>
+                <w:color w:val="221E1F"/>
+                <w:sz w:val="20"/>
+                <w:szCs w:val="20"/>
+              </w:rPr>
+              <w:t xml:space="preserve">149</w:t>
             </w:r>
           </w:p>
         </w:tc>
@@ -8890,7 +9038,7 @@
           <w:sz w:val="20"/>
           <w:szCs w:val="20"/>
         </w:rPr>
-        <w:t xml:space="preserve">19,998 hand-written lines over 146 days is about 150 a day. For tested, typed, reviewed production code that sits inside the normal 100–300 band, and lower than the 200 the first version of this document reconstructed — integration work carries more test and less code than storefront work does. The reconstruction is not inflated.</w:t>
+        <w:t xml:space="preserve">19,998 hand-written lines over 149 days is about 150 a day. For tested, typed, reviewed production code that sits inside the normal 100–300 band, and lower than the 200 the first version of this document reconstructed — integration work carries more test and less code than storefront work does. The reconstruction is not inflated.</w:t>
       </w:r>
     </w:p>
     <w:p>
@@ -8908,7 +9056,7 @@
           <w:sz w:val="20"/>
           <w:szCs w:val="20"/>
         </w:rPr>
-        <w:t xml:space="preserve">146 days is roughly 27 working weeks, or a little over six months for one person. Two people working in parallel would compress the calendar but not the total, and would add coordination cost.</w:t>
+        <w:t xml:space="preserve">149 days is roughly 27 working weeks, or a little over six months for one person. Two people working in parallel would compress the calendar but not the total, and would add coordination cost.</w:t>
       </w:r>
     </w:p>
     <w:p>
@@ -8979,7 +9127,7 @@
           <w:sz w:val="20"/>
           <w:szCs w:val="20"/>
         </w:rPr>
-        <w:t xml:space="preserve">Delivered scope: 146 days × 8 hours = 1168 hours.</w:t>
+        <w:t xml:space="preserve">Delivered scope: 149 days × 8 hours = 1192 hours.</w:t>
       </w:r>
     </w:p>
     <w:tbl>
@@ -9074,7 +9222,7 @@
                 <w:sz w:val="19"/>
                 <w:szCs w:val="19"/>
               </w:rPr>
-              <w:t xml:space="preserve">Cost of the 1168 hours (excl. VAT)</w:t>
+              <w:t xml:space="preserve">Cost of the 1192 hours (excl. VAT)</w:t>
             </w:r>
           </w:p>
         </w:tc>
@@ -9187,7 +9335,7 @@
                 <w:sz w:val="20"/>
                 <w:szCs w:val="20"/>
               </w:rPr>
-              <w:t xml:space="preserve">R 467 200</w:t>
+              <w:t xml:space="preserve">R 476 800</w:t>
             </w:r>
           </w:p>
         </w:tc>
@@ -9224,7 +9372,7 @@
                 <w:sz w:val="20"/>
                 <w:szCs w:val="20"/>
               </w:rPr>
-              <w:t xml:space="preserve">R 537 280</w:t>
+              <w:t xml:space="preserve">R 548 320</w:t>
             </w:r>
           </w:p>
         </w:tc>
@@ -9301,7 +9449,7 @@
                 <w:sz w:val="20"/>
                 <w:szCs w:val="20"/>
               </w:rPr>
-              <w:t xml:space="preserve">R 759 200</w:t>
+              <w:t xml:space="preserve">R 774 800</w:t>
             </w:r>
           </w:p>
         </w:tc>
@@ -9339,7 +9487,7 @@
                 <w:sz w:val="20"/>
                 <w:szCs w:val="20"/>
               </w:rPr>
-              <w:t xml:space="preserve">R 873 080</w:t>
+              <w:t xml:space="preserve">R 891 020</w:t>
             </w:r>
           </w:p>
         </w:tc>
@@ -9414,7 +9562,7 @@
                 <w:sz w:val="20"/>
                 <w:szCs w:val="20"/>
               </w:rPr>
-              <w:t xml:space="preserve">R 992 800</w:t>
+              <w:t xml:space="preserve">R 1 013 200</w:t>
             </w:r>
           </w:p>
         </w:tc>
@@ -9451,7 +9599,7 @@
                 <w:sz w:val="20"/>
                 <w:szCs w:val="20"/>
               </w:rPr>
-              <w:t xml:space="preserve">R 1 141 720</w:t>
+              <w:t xml:space="preserve">R 1 165 180</w:t>
             </w:r>
           </w:p>
         </w:tc>
@@ -9528,7 +9676,7 @@
                 <w:sz w:val="20"/>
                 <w:szCs w:val="20"/>
               </w:rPr>
-              <w:t xml:space="preserve">R 1 109 600</w:t>
+              <w:t xml:space="preserve">R 1 132 400</w:t>
             </w:r>
           </w:p>
         </w:tc>
@@ -9566,7 +9714,7 @@
                 <w:sz w:val="20"/>
                 <w:szCs w:val="20"/>
               </w:rPr>
-              <w:t xml:space="preserve">R 1 276 040</w:t>
+              <w:t xml:space="preserve">R 1 302 260</w:t>
             </w:r>
           </w:p>
         </w:tc>
@@ -9641,7 +9789,7 @@
                 <w:sz w:val="20"/>
                 <w:szCs w:val="20"/>
               </w:rPr>
-              <w:t xml:space="preserve">R 1 343 200</w:t>
+              <w:t xml:space="preserve">R 1 370 800</w:t>
             </w:r>
           </w:p>
         </w:tc>
@@ -9678,7 +9826,7 @@
                 <w:sz w:val="20"/>
                 <w:szCs w:val="20"/>
               </w:rPr>
-              <w:t xml:space="preserve">R 1 544 680</w:t>
+              <w:t xml:space="preserve">R 1 576 420</w:t>
             </w:r>
           </w:p>
         </w:tc>
@@ -9755,7 +9903,7 @@
                 <w:sz w:val="20"/>
                 <w:szCs w:val="20"/>
               </w:rPr>
-              <w:t xml:space="preserve">R 1 693 600</w:t>
+              <w:t xml:space="preserve">R 1 728 400</w:t>
             </w:r>
           </w:p>
         </w:tc>
@@ -9793,7 +9941,7 @@
                 <w:sz w:val="20"/>
                 <w:szCs w:val="20"/>
               </w:rPr>
-              <w:t xml:space="preserve">R 1 947 640</w:t>
+              <w:t xml:space="preserve">R 1 987 660</w:t>
             </w:r>
           </w:p>
         </w:tc>
@@ -9845,7 +9993,7 @@
           <w:sz w:val="20"/>
           <w:szCs w:val="20"/>
         </w:rPr>
-        <w:t xml:space="preserve">At an illustrative blended rate of R 950 an hour — chosen here only to make the rest of the document concrete — the delivered scope comes to R 1 109 600 excluding VAT, or R 1 276 040 including it. Replace the rate and every figure below moves proportionally.</w:t>
+        <w:t xml:space="preserve">At an illustrative blended rate of R 950 an hour — chosen here only to make the rest of the document concrete — the delivered scope comes to R 1 132 400 excluding VAT, or R 1 302 260 including it. Replace the rate and every figure below moves proportionally.</w:t>
       </w:r>
     </w:p>
     <w:p>
@@ -13092,7 +13240,7 @@
                 <w:sz w:val="20"/>
                 <w:szCs w:val="20"/>
               </w:rPr>
-              <w:t xml:space="preserve">Uber Direct adapter</w:t>
+              <w:t xml:space="preserve">Complete addresses and a container</w:t>
             </w:r>
           </w:p>
         </w:tc>
@@ -13129,7 +13277,7 @@
                 <w:sz w:val="20"/>
                 <w:szCs w:val="20"/>
               </w:rPr>
-              <w:t xml:space="preserve">5</w:t>
+              <w:t xml:space="preserve">3</w:t>
             </w:r>
           </w:p>
         </w:tc>
@@ -13166,7 +13314,7 @@
                 <w:sz w:val="20"/>
                 <w:szCs w:val="20"/>
               </w:rPr>
-              <w:t xml:space="preserve">40</w:t>
+              <w:t xml:space="preserve">24</w:t>
             </w:r>
           </w:p>
         </w:tc>
@@ -13203,7 +13351,7 @@
                 <w:sz w:val="20"/>
                 <w:szCs w:val="20"/>
               </w:rPr>
-              <w:t xml:space="preserve">R 38 000</w:t>
+              <w:t xml:space="preserve">R 22 800</w:t>
             </w:r>
           </w:p>
         </w:tc>
@@ -13242,7 +13390,7 @@
                 <w:sz w:val="20"/>
                 <w:szCs w:val="20"/>
               </w:rPr>
-              <w:t xml:space="preserve">PayFast adapter</w:t>
+              <w:t xml:space="preserve">Uber Direct adapter</w:t>
             </w:r>
           </w:p>
         </w:tc>
@@ -13280,7 +13428,7 @@
                 <w:sz w:val="20"/>
                 <w:szCs w:val="20"/>
               </w:rPr>
-              <w:t xml:space="preserve">4</w:t>
+              <w:t xml:space="preserve">5</w:t>
             </w:r>
           </w:p>
         </w:tc>
@@ -13318,7 +13466,7 @@
                 <w:sz w:val="20"/>
                 <w:szCs w:val="20"/>
               </w:rPr>
-              <w:t xml:space="preserve">32</w:t>
+              <w:t xml:space="preserve">40</w:t>
             </w:r>
           </w:p>
         </w:tc>
@@ -13356,7 +13504,7 @@
                 <w:sz w:val="20"/>
                 <w:szCs w:val="20"/>
               </w:rPr>
-              <w:t xml:space="preserve">R 30 400</w:t>
+              <w:t xml:space="preserve">R 38 000</w:t>
             </w:r>
           </w:p>
         </w:tc>
@@ -13371,6 +13519,155 @@
               <w:bottom w:val="single" w:color="D6CFC6" w:sz="4"/>
               <w:right w:val="single" w:color="D6CFC6" w:sz="4"/>
             </w:tcBorders>
+            <w:tcMar>
+              <w:top w:type="dxa" w:w="90"/>
+              <w:left w:type="dxa" w:w="130"/>
+              <w:bottom w:type="dxa" w:w="90"/>
+              <w:right w:type="dxa" w:w="130"/>
+            </w:tcMar>
+            <w:vAlign w:val="center"/>
+          </w:tcPr>
+          <w:p>
+            <w:pPr>
+              <w:spacing w:after="0" w:line="240"/>
+            </w:pPr>
+            <w:r>
+              <w:rPr>
+                <w:rFonts w:ascii="Calibri" w:cs="Calibri" w:eastAsia="Calibri" w:hAnsi="Calibri"/>
+                <w:b w:val="false"/>
+                <w:bCs w:val="false"/>
+                <w:i w:val="false"/>
+                <w:iCs w:val="false"/>
+                <w:color w:val="221E1F"/>
+                <w:sz w:val="20"/>
+                <w:szCs w:val="20"/>
+              </w:rPr>
+              <w:t xml:space="preserve">PayFast adapter</w:t>
+            </w:r>
+          </w:p>
+        </w:tc>
+        <w:tc>
+          <w:tcPr>
+            <w:tcW w:type="dxa" w:w="1157"/>
+            <w:tcBorders>
+              <w:top w:val="single" w:color="D6CFC6" w:sz="4"/>
+              <w:left w:val="single" w:color="D6CFC6" w:sz="4"/>
+              <w:bottom w:val="single" w:color="D6CFC6" w:sz="4"/>
+              <w:right w:val="single" w:color="D6CFC6" w:sz="4"/>
+            </w:tcBorders>
+            <w:tcMar>
+              <w:top w:type="dxa" w:w="90"/>
+              <w:left w:type="dxa" w:w="130"/>
+              <w:bottom w:type="dxa" w:w="90"/>
+              <w:right w:type="dxa" w:w="130"/>
+            </w:tcMar>
+            <w:vAlign w:val="center"/>
+          </w:tcPr>
+          <w:p>
+            <w:pPr>
+              <w:spacing w:after="0" w:line="240"/>
+              <w:jc w:val="right"/>
+            </w:pPr>
+            <w:r>
+              <w:rPr>
+                <w:rFonts w:ascii="Calibri" w:cs="Calibri" w:eastAsia="Calibri" w:hAnsi="Calibri"/>
+                <w:b w:val="false"/>
+                <w:bCs w:val="false"/>
+                <w:i w:val="false"/>
+                <w:iCs w:val="false"/>
+                <w:color w:val="221E1F"/>
+                <w:sz w:val="20"/>
+                <w:szCs w:val="20"/>
+              </w:rPr>
+              <w:t xml:space="preserve">4</w:t>
+            </w:r>
+          </w:p>
+        </w:tc>
+        <w:tc>
+          <w:tcPr>
+            <w:tcW w:type="dxa" w:w="1542"/>
+            <w:tcBorders>
+              <w:top w:val="single" w:color="D6CFC6" w:sz="4"/>
+              <w:left w:val="single" w:color="D6CFC6" w:sz="4"/>
+              <w:bottom w:val="single" w:color="D6CFC6" w:sz="4"/>
+              <w:right w:val="single" w:color="D6CFC6" w:sz="4"/>
+            </w:tcBorders>
+            <w:tcMar>
+              <w:top w:type="dxa" w:w="90"/>
+              <w:left w:type="dxa" w:w="130"/>
+              <w:bottom w:type="dxa" w:w="90"/>
+              <w:right w:type="dxa" w:w="130"/>
+            </w:tcMar>
+            <w:vAlign w:val="center"/>
+          </w:tcPr>
+          <w:p>
+            <w:pPr>
+              <w:spacing w:after="0" w:line="240"/>
+              <w:jc w:val="right"/>
+            </w:pPr>
+            <w:r>
+              <w:rPr>
+                <w:rFonts w:ascii="Calibri" w:cs="Calibri" w:eastAsia="Calibri" w:hAnsi="Calibri"/>
+                <w:b w:val="false"/>
+                <w:bCs w:val="false"/>
+                <w:i w:val="false"/>
+                <w:iCs w:val="false"/>
+                <w:color w:val="221E1F"/>
+                <w:sz w:val="20"/>
+                <w:szCs w:val="20"/>
+              </w:rPr>
+              <w:t xml:space="preserve">32</w:t>
+            </w:r>
+          </w:p>
+        </w:tc>
+        <w:tc>
+          <w:tcPr>
+            <w:tcW w:type="dxa" w:w="1638"/>
+            <w:tcBorders>
+              <w:top w:val="single" w:color="D6CFC6" w:sz="4"/>
+              <w:left w:val="single" w:color="D6CFC6" w:sz="4"/>
+              <w:bottom w:val="single" w:color="D6CFC6" w:sz="4"/>
+              <w:right w:val="single" w:color="D6CFC6" w:sz="4"/>
+            </w:tcBorders>
+            <w:tcMar>
+              <w:top w:type="dxa" w:w="90"/>
+              <w:left w:type="dxa" w:w="130"/>
+              <w:bottom w:type="dxa" w:w="90"/>
+              <w:right w:type="dxa" w:w="130"/>
+            </w:tcMar>
+            <w:vAlign w:val="center"/>
+          </w:tcPr>
+          <w:p>
+            <w:pPr>
+              <w:spacing w:after="0" w:line="240"/>
+              <w:jc w:val="right"/>
+            </w:pPr>
+            <w:r>
+              <w:rPr>
+                <w:rFonts w:ascii="Calibri" w:cs="Calibri" w:eastAsia="Calibri" w:hAnsi="Calibri"/>
+                <w:b w:val="false"/>
+                <w:bCs w:val="false"/>
+                <w:i w:val="false"/>
+                <w:iCs w:val="false"/>
+                <w:color w:val="221E1F"/>
+                <w:sz w:val="20"/>
+                <w:szCs w:val="20"/>
+              </w:rPr>
+              <w:t xml:space="preserve">R 30 400</w:t>
+            </w:r>
+          </w:p>
+        </w:tc>
+      </w:tr>
+      <w:tr>
+        <w:tc>
+          <w:tcPr>
+            <w:tcW w:type="dxa" w:w="5301"/>
+            <w:tcBorders>
+              <w:top w:val="single" w:color="D6CFC6" w:sz="4"/>
+              <w:left w:val="single" w:color="D6CFC6" w:sz="4"/>
+              <w:bottom w:val="single" w:color="D6CFC6" w:sz="4"/>
+              <w:right w:val="single" w:color="D6CFC6" w:sz="4"/>
+            </w:tcBorders>
             <w:shd w:fill="FCE8EB" w:color="auto" w:val="clear"/>
             <w:tcMar>
               <w:top w:type="dxa" w:w="90"/>
@@ -13433,7 +13730,7 @@
                 <w:sz w:val="20"/>
                 <w:szCs w:val="20"/>
               </w:rPr>
-              <w:t xml:space="preserve">146</w:t>
+              <w:t xml:space="preserve">149</w:t>
             </w:r>
           </w:p>
         </w:tc>
@@ -13471,7 +13768,7 @@
                 <w:sz w:val="20"/>
                 <w:szCs w:val="20"/>
               </w:rPr>
-              <w:t xml:space="preserve">1 168</w:t>
+              <w:t xml:space="preserve">1 192</w:t>
             </w:r>
           </w:p>
         </w:tc>
@@ -13509,7 +13806,7 @@
                 <w:sz w:val="20"/>
                 <w:szCs w:val="20"/>
               </w:rPr>
-              <w:t xml:space="preserve">R 1 109 600</w:t>
+              <w:t xml:space="preserve">R 1 132 400</w:t>
             </w:r>
           </w:p>
         </w:tc>
@@ -13548,7 +13845,7 @@
           <w:sz w:val="20"/>
           <w:szCs w:val="20"/>
         </w:rPr>
-        <w:t xml:space="preserve">The integration seams — payments, accounts, notifications, POS and courier — are 44 of the 146 days. None of them names a vendor, and none has to be rewritten when one is chosen: what remains per integration is an adapter against an interface that already exists and is already tested.</w:t>
+        <w:t xml:space="preserve">The integration seams — payments, accounts, notifications, POS and courier — are 44 of the 149 days. None of them names a vendor, and none has to be rewritten when one is chosen: what remains per integration is an adapter against an interface that already exists and is already tested.</w:t>
       </w:r>
     </w:p>
     <w:p>
@@ -14130,7 +14427,7 @@
                 <w:sz w:val="20"/>
                 <w:szCs w:val="20"/>
               </w:rPr>
-              <w:t xml:space="preserve">The adapter is written and tested. What is left needs an Uber Direct account: confirming they accept our dispatch, and a postal code at checkout so an address is complete</w:t>
+              <w:t xml:space="preserve">The adapter is written and the address is complete. What is left needs an Uber Direct account: confirming they accept our dispatch</w:t>
             </w:r>
           </w:p>
         </w:tc>
@@ -14167,7 +14464,7 @@
                 <w:sz w:val="20"/>
                 <w:szCs w:val="20"/>
               </w:rPr>
-              <w:t xml:space="preserve">3</w:t>
+              <w:t xml:space="preserve">2</w:t>
             </w:r>
           </w:p>
         </w:tc>
@@ -14875,7 +15172,7 @@
                 <w:sz w:val="20"/>
                 <w:szCs w:val="20"/>
               </w:rPr>
-              <w:t xml:space="preserve">Production environment, secrets management, release pipeline</w:t>
+              <w:t xml:space="preserve">The container is written. What is left is a host to run it on, a domain, certificates and secrets management</w:t>
             </w:r>
           </w:p>
         </w:tc>
@@ -14913,7 +15210,7 @@
                 <w:sz w:val="20"/>
                 <w:szCs w:val="20"/>
               </w:rPr>
-              <w:t xml:space="preserve">3</w:t>
+              <w:t xml:space="preserve">2</w:t>
             </w:r>
           </w:p>
         </w:tc>
@@ -15324,7 +15621,7 @@
                 <w:sz w:val="20"/>
                 <w:szCs w:val="20"/>
               </w:rPr>
-              <w:t xml:space="preserve">240 hours of engineering</w:t>
+              <w:t xml:space="preserve">224 hours of engineering</w:t>
             </w:r>
           </w:p>
         </w:tc>
@@ -15362,7 +15659,7 @@
                 <w:sz w:val="20"/>
                 <w:szCs w:val="20"/>
               </w:rPr>
-              <w:t xml:space="preserve">30</w:t>
+              <w:t xml:space="preserve">28</w:t>
             </w:r>
           </w:p>
         </w:tc>
@@ -15667,7 +15964,7 @@
                 <w:sz w:val="20"/>
                 <w:szCs w:val="20"/>
               </w:rPr>
-              <w:t xml:space="preserve">146</w:t>
+              <w:t xml:space="preserve">149</w:t>
             </w:r>
           </w:p>
         </w:tc>
@@ -15704,7 +16001,7 @@
                 <w:sz w:val="20"/>
                 <w:szCs w:val="20"/>
               </w:rPr>
-              <w:t xml:space="preserve">1 168</w:t>
+              <w:t xml:space="preserve">1 192</w:t>
             </w:r>
           </w:p>
         </w:tc>
@@ -15741,7 +16038,7 @@
                 <w:sz w:val="20"/>
                 <w:szCs w:val="20"/>
               </w:rPr>
-              <w:t xml:space="preserve">R 1 109 600</w:t>
+              <w:t xml:space="preserve">R 1 132 400</w:t>
             </w:r>
           </w:p>
         </w:tc>
@@ -15818,7 +16115,7 @@
                 <w:sz w:val="20"/>
                 <w:szCs w:val="20"/>
               </w:rPr>
-              <w:t xml:space="preserve">30</w:t>
+              <w:t xml:space="preserve">28</w:t>
             </w:r>
           </w:p>
         </w:tc>
@@ -15856,7 +16153,7 @@
                 <w:sz w:val="20"/>
                 <w:szCs w:val="20"/>
               </w:rPr>
-              <w:t xml:space="preserve">240</w:t>
+              <w:t xml:space="preserve">224</w:t>
             </w:r>
           </w:p>
         </w:tc>
@@ -15894,7 +16191,7 @@
                 <w:sz w:val="20"/>
                 <w:szCs w:val="20"/>
               </w:rPr>
-              <w:t xml:space="preserve">R 228 000</w:t>
+              <w:t xml:space="preserve">R 212 800</w:t>
             </w:r>
           </w:p>
         </w:tc>
@@ -15971,7 +16268,7 @@
                 <w:sz w:val="20"/>
                 <w:szCs w:val="20"/>
               </w:rPr>
-              <w:t xml:space="preserve">176</w:t>
+              <w:t xml:space="preserve">177</w:t>
             </w:r>
           </w:p>
         </w:tc>
@@ -16009,7 +16306,7 @@
                 <w:sz w:val="20"/>
                 <w:szCs w:val="20"/>
               </w:rPr>
-              <w:t xml:space="preserve">1 408</w:t>
+              <w:t xml:space="preserve">1 416</w:t>
             </w:r>
           </w:p>
         </w:tc>
@@ -16047,7 +16344,7 @@
                 <w:sz w:val="20"/>
                 <w:szCs w:val="20"/>
               </w:rPr>
-              <w:t xml:space="preserve">R 1 337 600</w:t>
+              <w:t xml:space="preserve">R 1 345 200</w:t>
             </w:r>
           </w:p>
         </w:tc>
@@ -16086,7 +16383,7 @@
           <w:sz w:val="20"/>
           <w:szCs w:val="20"/>
         </w:rPr>
-        <w:t xml:space="preserve">Roughly 83% of the engineering is done. </w:t>
+        <w:t xml:space="preserve">Roughly 84% of the engineering is done. </w:t>
       </w:r>
       <w:r>
         <w:rPr>

</xml_diff>

<commit_message>
Reprice: 153 built, 27 remaining
Messaging drops from three days to two and changes shape like the others
before it. Both transports are written; what is left needs the accounts — a
verified sending domain with SPF and DKIM, a registered Clickatell sender id,
and deliverability testing, none of which can be done without them.

Three of the four vendors named so far are now written and untested against a
real account, which is the same position each time: the code is the part that
does not need a contract.

Co-Authored-By: Claude Opus 5 <noreply@anthropic.com>
Claude-Session: https://claude.ai/code/session_01B2xsFCpQEfEHuTCkYzyD13
</commit_message>
<xml_diff>
--- a/WEBSITE_COSTINGS.docx
+++ b/WEBSITE_COSTINGS.docx
@@ -449,7 +449,7 @@
                 <w:sz w:val="20"/>
                 <w:szCs w:val="20"/>
               </w:rPr>
-              <w:t xml:space="preserve">aae2417</w:t>
+              <w:t xml:space="preserve">c665de0</w:t>
             </w:r>
           </w:p>
         </w:tc>
@@ -1527,7 +1527,7 @@
                 <w:sz w:val="20"/>
                 <w:szCs w:val="20"/>
               </w:rPr>
-              <w:t xml:space="preserve">623</w:t>
+              <w:t xml:space="preserve">653</w:t>
             </w:r>
           </w:p>
         </w:tc>
@@ -1563,7 +1563,7 @@
                 <w:sz w:val="20"/>
                 <w:szCs w:val="20"/>
               </w:rPr>
-              <w:t xml:space="preserve">In 32 files; all passing</w:t>
+              <w:t xml:space="preserve">In 33 files; all passing</w:t>
             </w:r>
           </w:p>
         </w:tc>
@@ -3770,7 +3770,7 @@
                 <w:sz w:val="20"/>
                 <w:szCs w:val="20"/>
               </w:rPr>
-              <w:t xml:space="preserve">623 passing</w:t>
+              <w:t xml:space="preserve">653 passing</w:t>
             </w:r>
           </w:p>
         </w:tc>
@@ -3807,7 +3807,7 @@
                 <w:sz w:val="20"/>
                 <w:szCs w:val="20"/>
               </w:rPr>
-              <w:t xml:space="preserve">32 files, including four real worker processes racing on one file</w:t>
+              <w:t xml:space="preserve">33 files, including four real worker processes racing on one file</w:t>
             </w:r>
           </w:p>
         </w:tc>
@@ -8425,7 +8425,7 @@
                 <w:sz w:val="20"/>
                 <w:szCs w:val="20"/>
               </w:rPr>
-              <w:t xml:space="preserve">23</w:t>
+              <w:t xml:space="preserve">24</w:t>
             </w:r>
           </w:p>
         </w:tc>
@@ -8461,7 +8461,7 @@
                 <w:sz w:val="20"/>
                 <w:szCs w:val="20"/>
               </w:rPr>
-              <w:t xml:space="preserve">Complete addresses and a container</w:t>
+              <w:t xml:space="preserve">Mailgun and Clickatell transports</w:t>
             </w:r>
           </w:p>
         </w:tc>
@@ -8497,7 +8497,7 @@
                 <w:sz w:val="20"/>
                 <w:szCs w:val="20"/>
               </w:rPr>
-              <w:t xml:space="preserve">The postal code through the checkout form, the schema, the order and the courier address; a multi-stage non-root image with the state file on a volume and a healthcheck on the endpoint that reports storage</w:t>
+              <w:t xml:space="preserve">Email and SMS routed to separate providers, each falling back to the log independently; Clickatell’s per-message acceptance read rather than its status code, and Mailgun’s timestamp-and-token signature guarded against replay</w:t>
             </w:r>
           </w:p>
         </w:tc>
@@ -8534,7 +8534,7 @@
                 <w:sz w:val="20"/>
                 <w:szCs w:val="20"/>
               </w:rPr>
-              <w:t xml:space="preserve">3</w:t>
+              <w:t xml:space="preserve">4</w:t>
             </w:r>
           </w:p>
         </w:tc>
@@ -8574,7 +8574,7 @@
                 <w:sz w:val="20"/>
                 <w:szCs w:val="20"/>
               </w:rPr>
-              <w:t xml:space="preserve">22</w:t>
+              <w:t xml:space="preserve">23</w:t>
             </w:r>
           </w:p>
         </w:tc>
@@ -8611,7 +8611,7 @@
                 <w:sz w:val="20"/>
                 <w:szCs w:val="20"/>
               </w:rPr>
-              <w:t xml:space="preserve">Uber Direct adapter</w:t>
+              <w:t xml:space="preserve">Complete addresses and a container</w:t>
             </w:r>
           </w:p>
         </w:tc>
@@ -8648,7 +8648,7 @@
                 <w:sz w:val="20"/>
                 <w:szCs w:val="20"/>
               </w:rPr>
-              <w:t xml:space="preserve">OAuth with a cached token, structured addresses built from what checkout collects, both of Uber’s status vocabularies, raw-byte webhook verification, and dispatch on ready rather than on order</w:t>
+              <w:t xml:space="preserve">The postal code through the checkout form, the schema, the order and the courier address; a multi-stage non-root image with the state file on a volume and a healthcheck on the endpoint that reports storage</w:t>
             </w:r>
           </w:p>
         </w:tc>
@@ -8686,7 +8686,7 @@
                 <w:sz w:val="20"/>
                 <w:szCs w:val="20"/>
               </w:rPr>
-              <w:t xml:space="preserve">5</w:t>
+              <w:t xml:space="preserve">3</w:t>
             </w:r>
           </w:p>
         </w:tc>
@@ -8725,7 +8725,7 @@
                 <w:sz w:val="20"/>
                 <w:szCs w:val="20"/>
               </w:rPr>
-              <w:t xml:space="preserve">21</w:t>
+              <w:t xml:space="preserve">22</w:t>
             </w:r>
           </w:p>
         </w:tc>
@@ -8761,7 +8761,7 @@
                 <w:sz w:val="20"/>
                 <w:szCs w:val="20"/>
               </w:rPr>
-              <w:t xml:space="preserve">PayFast adapter</w:t>
+              <w:t xml:space="preserve">Uber Direct adapter</w:t>
             </w:r>
           </w:p>
         </w:tc>
@@ -8797,7 +8797,7 @@
                 <w:sz w:val="20"/>
                 <w:szCs w:val="20"/>
               </w:rPr>
-              <w:t xml:space="preserve">PHP-compatible signing, all four of PayFast’s notification checks with the postback failing closed, status mapping, and an idempotency key that survives their PENDING-then-COMPLETE sequence</w:t>
+              <w:t xml:space="preserve">OAuth with a cached token, structured addresses built from what checkout collects, both of Uber’s status vocabularies, raw-byte webhook verification, and dispatch on ready rather than on order</w:t>
             </w:r>
           </w:p>
         </w:tc>
@@ -8834,7 +8834,7 @@
                 <w:sz w:val="20"/>
                 <w:szCs w:val="20"/>
               </w:rPr>
-              <w:t xml:space="preserve">4</w:t>
+              <w:t xml:space="preserve">5</w:t>
             </w:r>
           </w:p>
         </w:tc>
@@ -8849,7 +8849,7 @@
               <w:bottom w:val="single" w:color="D6CFC6" w:sz="4"/>
               <w:right w:val="single" w:color="D6CFC6" w:sz="4"/>
             </w:tcBorders>
-            <w:shd w:fill="FCE8EB" w:color="auto" w:val="clear"/>
+            <w:shd w:fill="F7F5F2" w:color="auto" w:val="clear"/>
             <w:tcMar>
               <w:top w:type="dxa" w:w="90"/>
               <w:left w:type="dxa" w:w="130"/>
@@ -8862,6 +8862,43 @@
             <w:pPr>
               <w:spacing w:after="0" w:line="240"/>
               <w:jc w:val="center"/>
+            </w:pPr>
+            <w:r>
+              <w:rPr>
+                <w:rFonts w:ascii="Calibri" w:cs="Calibri" w:eastAsia="Calibri" w:hAnsi="Calibri"/>
+                <w:b w:val="false"/>
+                <w:bCs w:val="false"/>
+                <w:i w:val="false"/>
+                <w:iCs w:val="false"/>
+                <w:color w:val="221E1F"/>
+                <w:sz w:val="20"/>
+                <w:szCs w:val="20"/>
+              </w:rPr>
+              <w:t xml:space="preserve">21</w:t>
+            </w:r>
+          </w:p>
+        </w:tc>
+        <w:tc>
+          <w:tcPr>
+            <w:tcW w:type="dxa" w:w="3084"/>
+            <w:tcBorders>
+              <w:top w:val="single" w:color="D6CFC6" w:sz="4"/>
+              <w:left w:val="single" w:color="D6CFC6" w:sz="4"/>
+              <w:bottom w:val="single" w:color="D6CFC6" w:sz="4"/>
+              <w:right w:val="single" w:color="D6CFC6" w:sz="4"/>
+            </w:tcBorders>
+            <w:shd w:fill="F7F5F2" w:color="auto" w:val="clear"/>
+            <w:tcMar>
+              <w:top w:type="dxa" w:w="90"/>
+              <w:left w:type="dxa" w:w="130"/>
+              <w:bottom w:type="dxa" w:w="90"/>
+              <w:right w:type="dxa" w:w="130"/>
+            </w:tcMar>
+            <w:vAlign w:val="center"/>
+          </w:tcPr>
+          <w:p>
+            <w:pPr>
+              <w:spacing w:after="0" w:line="240"/>
             </w:pPr>
             <w:r>
               <w:rPr>
@@ -8874,13 +8911,90 @@
                 <w:sz w:val="20"/>
                 <w:szCs w:val="20"/>
               </w:rPr>
-              <w:t xml:space="preserve"/>
-            </w:r>
-          </w:p>
-        </w:tc>
-        <w:tc>
-          <w:tcPr>
-            <w:tcW w:type="dxa" w:w="3084"/>
+              <w:t xml:space="preserve">PayFast adapter</w:t>
+            </w:r>
+          </w:p>
+        </w:tc>
+        <w:tc>
+          <w:tcPr>
+            <w:tcW w:type="dxa" w:w="5108"/>
+            <w:tcBorders>
+              <w:top w:val="single" w:color="D6CFC6" w:sz="4"/>
+              <w:left w:val="single" w:color="D6CFC6" w:sz="4"/>
+              <w:bottom w:val="single" w:color="D6CFC6" w:sz="4"/>
+              <w:right w:val="single" w:color="D6CFC6" w:sz="4"/>
+            </w:tcBorders>
+            <w:shd w:fill="F7F5F2" w:color="auto" w:val="clear"/>
+            <w:tcMar>
+              <w:top w:type="dxa" w:w="90"/>
+              <w:left w:type="dxa" w:w="130"/>
+              <w:bottom w:type="dxa" w:w="90"/>
+              <w:right w:type="dxa" w:w="130"/>
+            </w:tcMar>
+            <w:vAlign w:val="center"/>
+          </w:tcPr>
+          <w:p>
+            <w:pPr>
+              <w:spacing w:after="0" w:line="240"/>
+            </w:pPr>
+            <w:r>
+              <w:rPr>
+                <w:rFonts w:ascii="Calibri" w:cs="Calibri" w:eastAsia="Calibri" w:hAnsi="Calibri"/>
+                <w:b w:val="false"/>
+                <w:bCs w:val="false"/>
+                <w:i w:val="false"/>
+                <w:iCs w:val="false"/>
+                <w:color w:val="221E1F"/>
+                <w:sz w:val="20"/>
+                <w:szCs w:val="20"/>
+              </w:rPr>
+              <w:t xml:space="preserve">PHP-compatible signing, all four of PayFast’s notification checks with the postback failing closed, status mapping, and an idempotency key that survives their PENDING-then-COMPLETE sequence</w:t>
+            </w:r>
+          </w:p>
+        </w:tc>
+        <w:tc>
+          <w:tcPr>
+            <w:tcW w:type="dxa" w:w="964"/>
+            <w:tcBorders>
+              <w:top w:val="single" w:color="D6CFC6" w:sz="4"/>
+              <w:left w:val="single" w:color="D6CFC6" w:sz="4"/>
+              <w:bottom w:val="single" w:color="D6CFC6" w:sz="4"/>
+              <w:right w:val="single" w:color="D6CFC6" w:sz="4"/>
+            </w:tcBorders>
+            <w:shd w:fill="F7F5F2" w:color="auto" w:val="clear"/>
+            <w:tcMar>
+              <w:top w:type="dxa" w:w="90"/>
+              <w:left w:type="dxa" w:w="130"/>
+              <w:bottom w:type="dxa" w:w="90"/>
+              <w:right w:type="dxa" w:w="130"/>
+            </w:tcMar>
+            <w:vAlign w:val="center"/>
+          </w:tcPr>
+          <w:p>
+            <w:pPr>
+              <w:spacing w:after="0" w:line="240"/>
+              <w:jc w:val="right"/>
+            </w:pPr>
+            <w:r>
+              <w:rPr>
+                <w:rFonts w:ascii="Calibri" w:cs="Calibri" w:eastAsia="Calibri" w:hAnsi="Calibri"/>
+                <w:b w:val="false"/>
+                <w:bCs w:val="false"/>
+                <w:i w:val="false"/>
+                <w:iCs w:val="false"/>
+                <w:color w:val="221E1F"/>
+                <w:sz w:val="20"/>
+                <w:szCs w:val="20"/>
+              </w:rPr>
+              <w:t xml:space="preserve">4</w:t>
+            </w:r>
+          </w:p>
+        </w:tc>
+      </w:tr>
+      <w:tr>
+        <w:tc>
+          <w:tcPr>
+            <w:tcW w:type="dxa" w:w="482"/>
             <w:tcBorders>
               <w:top w:val="single" w:color="D6CFC6" w:sz="4"/>
               <w:left w:val="single" w:color="D6CFC6" w:sz="4"/>
@@ -8899,6 +9013,7 @@
           <w:p>
             <w:pPr>
               <w:spacing w:after="0" w:line="240"/>
+              <w:jc w:val="center"/>
             </w:pPr>
             <w:r>
               <w:rPr>
@@ -8911,13 +9026,13 @@
                 <w:sz w:val="20"/>
                 <w:szCs w:val="20"/>
               </w:rPr>
-              <w:t xml:space="preserve">Total</w:t>
-            </w:r>
-          </w:p>
-        </w:tc>
-        <w:tc>
-          <w:tcPr>
-            <w:tcW w:type="dxa" w:w="5108"/>
+              <w:t xml:space="preserve"/>
+            </w:r>
+          </w:p>
+        </w:tc>
+        <w:tc>
+          <w:tcPr>
+            <w:tcW w:type="dxa" w:w="3084"/>
             <w:tcBorders>
               <w:top w:val="single" w:color="D6CFC6" w:sz="4"/>
               <w:left w:val="single" w:color="D6CFC6" w:sz="4"/>
@@ -8948,13 +9063,13 @@
                 <w:sz w:val="20"/>
                 <w:szCs w:val="20"/>
               </w:rPr>
-              <w:t xml:space="preserve">Delivered scope</w:t>
-            </w:r>
-          </w:p>
-        </w:tc>
-        <w:tc>
-          <w:tcPr>
-            <w:tcW w:type="dxa" w:w="964"/>
+              <w:t xml:space="preserve">Total</w:t>
+            </w:r>
+          </w:p>
+        </w:tc>
+        <w:tc>
+          <w:tcPr>
+            <w:tcW w:type="dxa" w:w="5108"/>
             <w:tcBorders>
               <w:top w:val="single" w:color="D6CFC6" w:sz="4"/>
               <w:left w:val="single" w:color="D6CFC6" w:sz="4"/>
@@ -8973,7 +9088,6 @@
           <w:p>
             <w:pPr>
               <w:spacing w:after="0" w:line="240"/>
-              <w:jc w:val="right"/>
             </w:pPr>
             <w:r>
               <w:rPr>
@@ -8986,7 +9100,45 @@
                 <w:sz w:val="20"/>
                 <w:szCs w:val="20"/>
               </w:rPr>
-              <w:t xml:space="preserve">149</w:t>
+              <w:t xml:space="preserve">Delivered scope</w:t>
+            </w:r>
+          </w:p>
+        </w:tc>
+        <w:tc>
+          <w:tcPr>
+            <w:tcW w:type="dxa" w:w="964"/>
+            <w:tcBorders>
+              <w:top w:val="single" w:color="D6CFC6" w:sz="4"/>
+              <w:left w:val="single" w:color="D6CFC6" w:sz="4"/>
+              <w:bottom w:val="single" w:color="D6CFC6" w:sz="4"/>
+              <w:right w:val="single" w:color="D6CFC6" w:sz="4"/>
+            </w:tcBorders>
+            <w:shd w:fill="FCE8EB" w:color="auto" w:val="clear"/>
+            <w:tcMar>
+              <w:top w:type="dxa" w:w="90"/>
+              <w:left w:type="dxa" w:w="130"/>
+              <w:bottom w:type="dxa" w:w="90"/>
+              <w:right w:type="dxa" w:w="130"/>
+            </w:tcMar>
+            <w:vAlign w:val="center"/>
+          </w:tcPr>
+          <w:p>
+            <w:pPr>
+              <w:spacing w:after="0" w:line="240"/>
+              <w:jc w:val="right"/>
+            </w:pPr>
+            <w:r>
+              <w:rPr>
+                <w:rFonts w:ascii="Calibri" w:cs="Calibri" w:eastAsia="Calibri" w:hAnsi="Calibri"/>
+                <w:b/>
+                <w:bCs/>
+                <w:i w:val="false"/>
+                <w:iCs w:val="false"/>
+                <w:color w:val="221E1F"/>
+                <w:sz w:val="20"/>
+                <w:szCs w:val="20"/>
+              </w:rPr>
+              <w:t xml:space="preserve">153</w:t>
             </w:r>
           </w:p>
         </w:tc>
@@ -9038,7 +9190,7 @@
           <w:sz w:val="20"/>
           <w:szCs w:val="20"/>
         </w:rPr>
-        <w:t xml:space="preserve">19,998 hand-written lines over 149 days is about 150 a day. For tested, typed, reviewed production code that sits inside the normal 100–300 band, and lower than the 200 the first version of this document reconstructed — integration work carries more test and less code than storefront work does. The reconstruction is not inflated.</w:t>
+        <w:t xml:space="preserve">19,998 hand-written lines over 153 days is about 150 a day. For tested, typed, reviewed production code that sits inside the normal 100–300 band, and lower than the 200 the first version of this document reconstructed — integration work carries more test and less code than storefront work does. The reconstruction is not inflated.</w:t>
       </w:r>
     </w:p>
     <w:p>
@@ -9056,7 +9208,7 @@
           <w:sz w:val="20"/>
           <w:szCs w:val="20"/>
         </w:rPr>
-        <w:t xml:space="preserve">149 days is roughly 27 working weeks, or a little over six months for one person. Two people working in parallel would compress the calendar but not the total, and would add coordination cost.</w:t>
+        <w:t xml:space="preserve">153 days is roughly 27 working weeks, or a little over six months for one person. Two people working in parallel would compress the calendar but not the total, and would add coordination cost.</w:t>
       </w:r>
     </w:p>
     <w:p>
@@ -9127,7 +9279,7 @@
           <w:sz w:val="20"/>
           <w:szCs w:val="20"/>
         </w:rPr>
-        <w:t xml:space="preserve">Delivered scope: 149 days × 8 hours = 1192 hours.</w:t>
+        <w:t xml:space="preserve">Delivered scope: 153 days × 8 hours = 1224 hours.</w:t>
       </w:r>
     </w:p>
     <w:tbl>
@@ -9222,7 +9374,7 @@
                 <w:sz w:val="19"/>
                 <w:szCs w:val="19"/>
               </w:rPr>
-              <w:t xml:space="preserve">Cost of the 1192 hours (excl. VAT)</w:t>
+              <w:t xml:space="preserve">Cost of the 1224 hours (excl. VAT)</w:t>
             </w:r>
           </w:p>
         </w:tc>
@@ -9335,7 +9487,7 @@
                 <w:sz w:val="20"/>
                 <w:szCs w:val="20"/>
               </w:rPr>
-              <w:t xml:space="preserve">R 476 800</w:t>
+              <w:t xml:space="preserve">R 489 600</w:t>
             </w:r>
           </w:p>
         </w:tc>
@@ -9372,7 +9524,7 @@
                 <w:sz w:val="20"/>
                 <w:szCs w:val="20"/>
               </w:rPr>
-              <w:t xml:space="preserve">R 548 320</w:t>
+              <w:t xml:space="preserve">R 563 040</w:t>
             </w:r>
           </w:p>
         </w:tc>
@@ -9449,7 +9601,7 @@
                 <w:sz w:val="20"/>
                 <w:szCs w:val="20"/>
               </w:rPr>
-              <w:t xml:space="preserve">R 774 800</w:t>
+              <w:t xml:space="preserve">R 795 600</w:t>
             </w:r>
           </w:p>
         </w:tc>
@@ -9487,7 +9639,7 @@
                 <w:sz w:val="20"/>
                 <w:szCs w:val="20"/>
               </w:rPr>
-              <w:t xml:space="preserve">R 891 020</w:t>
+              <w:t xml:space="preserve">R 914 940</w:t>
             </w:r>
           </w:p>
         </w:tc>
@@ -9562,7 +9714,7 @@
                 <w:sz w:val="20"/>
                 <w:szCs w:val="20"/>
               </w:rPr>
-              <w:t xml:space="preserve">R 1 013 200</w:t>
+              <w:t xml:space="preserve">R 1 040 400</w:t>
             </w:r>
           </w:p>
         </w:tc>
@@ -9599,7 +9751,7 @@
                 <w:sz w:val="20"/>
                 <w:szCs w:val="20"/>
               </w:rPr>
-              <w:t xml:space="preserve">R 1 165 180</w:t>
+              <w:t xml:space="preserve">R 1 196 460</w:t>
             </w:r>
           </w:p>
         </w:tc>
@@ -9676,7 +9828,7 @@
                 <w:sz w:val="20"/>
                 <w:szCs w:val="20"/>
               </w:rPr>
-              <w:t xml:space="preserve">R 1 132 400</w:t>
+              <w:t xml:space="preserve">R 1 162 800</w:t>
             </w:r>
           </w:p>
         </w:tc>
@@ -9714,7 +9866,7 @@
                 <w:sz w:val="20"/>
                 <w:szCs w:val="20"/>
               </w:rPr>
-              <w:t xml:space="preserve">R 1 302 260</w:t>
+              <w:t xml:space="preserve">R 1 337 220</w:t>
             </w:r>
           </w:p>
         </w:tc>
@@ -9789,7 +9941,7 @@
                 <w:sz w:val="20"/>
                 <w:szCs w:val="20"/>
               </w:rPr>
-              <w:t xml:space="preserve">R 1 370 800</w:t>
+              <w:t xml:space="preserve">R 1 407 600</w:t>
             </w:r>
           </w:p>
         </w:tc>
@@ -9826,7 +9978,7 @@
                 <w:sz w:val="20"/>
                 <w:szCs w:val="20"/>
               </w:rPr>
-              <w:t xml:space="preserve">R 1 576 420</w:t>
+              <w:t xml:space="preserve">R 1 618 740</w:t>
             </w:r>
           </w:p>
         </w:tc>
@@ -9903,7 +10055,7 @@
                 <w:sz w:val="20"/>
                 <w:szCs w:val="20"/>
               </w:rPr>
-              <w:t xml:space="preserve">R 1 728 400</w:t>
+              <w:t xml:space="preserve">R 1 774 800</w:t>
             </w:r>
           </w:p>
         </w:tc>
@@ -9941,7 +10093,7 @@
                 <w:sz w:val="20"/>
                 <w:szCs w:val="20"/>
               </w:rPr>
-              <w:t xml:space="preserve">R 1 987 660</w:t>
+              <w:t xml:space="preserve">R 2 041 020</w:t>
             </w:r>
           </w:p>
         </w:tc>
@@ -9993,7 +10145,7 @@
           <w:sz w:val="20"/>
           <w:szCs w:val="20"/>
         </w:rPr>
-        <w:t xml:space="preserve">At an illustrative blended rate of R 950 an hour — chosen here only to make the rest of the document concrete — the delivered scope comes to R 1 132 400 excluding VAT, or R 1 302 260 including it. Replace the rate and every figure below moves proportionally.</w:t>
+        <w:t xml:space="preserve">At an illustrative blended rate of R 950 an hour — chosen here only to make the rest of the document concrete — the delivered scope comes to R 1 162 800 excluding VAT, or R 1 337 220 including it. Replace the rate and every figure below moves proportionally.</w:t>
       </w:r>
     </w:p>
     <w:p>
@@ -13240,7 +13392,7 @@
                 <w:sz w:val="20"/>
                 <w:szCs w:val="20"/>
               </w:rPr>
-              <w:t xml:space="preserve">Complete addresses and a container</w:t>
+              <w:t xml:space="preserve">Mailgun and Clickatell transports</w:t>
             </w:r>
           </w:p>
         </w:tc>
@@ -13277,7 +13429,7 @@
                 <w:sz w:val="20"/>
                 <w:szCs w:val="20"/>
               </w:rPr>
-              <w:t xml:space="preserve">3</w:t>
+              <w:t xml:space="preserve">4</w:t>
             </w:r>
           </w:p>
         </w:tc>
@@ -13314,7 +13466,7 @@
                 <w:sz w:val="20"/>
                 <w:szCs w:val="20"/>
               </w:rPr>
-              <w:t xml:space="preserve">24</w:t>
+              <w:t xml:space="preserve">32</w:t>
             </w:r>
           </w:p>
         </w:tc>
@@ -13351,7 +13503,7 @@
                 <w:sz w:val="20"/>
                 <w:szCs w:val="20"/>
               </w:rPr>
-              <w:t xml:space="preserve">R 22 800</w:t>
+              <w:t xml:space="preserve">R 30 400</w:t>
             </w:r>
           </w:p>
         </w:tc>
@@ -13390,7 +13542,7 @@
                 <w:sz w:val="20"/>
                 <w:szCs w:val="20"/>
               </w:rPr>
-              <w:t xml:space="preserve">Uber Direct adapter</w:t>
+              <w:t xml:space="preserve">Complete addresses and a container</w:t>
             </w:r>
           </w:p>
         </w:tc>
@@ -13428,7 +13580,7 @@
                 <w:sz w:val="20"/>
                 <w:szCs w:val="20"/>
               </w:rPr>
-              <w:t xml:space="preserve">5</w:t>
+              <w:t xml:space="preserve">3</w:t>
             </w:r>
           </w:p>
         </w:tc>
@@ -13466,7 +13618,7 @@
                 <w:sz w:val="20"/>
                 <w:szCs w:val="20"/>
               </w:rPr>
-              <w:t xml:space="preserve">40</w:t>
+              <w:t xml:space="preserve">24</w:t>
             </w:r>
           </w:p>
         </w:tc>
@@ -13504,7 +13656,7 @@
                 <w:sz w:val="20"/>
                 <w:szCs w:val="20"/>
               </w:rPr>
-              <w:t xml:space="preserve">R 38 000</w:t>
+              <w:t xml:space="preserve">R 22 800</w:t>
             </w:r>
           </w:p>
         </w:tc>
@@ -13542,7 +13694,7 @@
                 <w:sz w:val="20"/>
                 <w:szCs w:val="20"/>
               </w:rPr>
-              <w:t xml:space="preserve">PayFast adapter</w:t>
+              <w:t xml:space="preserve">Uber Direct adapter</w:t>
             </w:r>
           </w:p>
         </w:tc>
@@ -13579,7 +13731,7 @@
                 <w:sz w:val="20"/>
                 <w:szCs w:val="20"/>
               </w:rPr>
-              <w:t xml:space="preserve">4</w:t>
+              <w:t xml:space="preserve">5</w:t>
             </w:r>
           </w:p>
         </w:tc>
@@ -13616,7 +13768,7 @@
                 <w:sz w:val="20"/>
                 <w:szCs w:val="20"/>
               </w:rPr>
-              <w:t xml:space="preserve">32</w:t>
+              <w:t xml:space="preserve">40</w:t>
             </w:r>
           </w:p>
         </w:tc>
@@ -13653,7 +13805,7 @@
                 <w:sz w:val="20"/>
                 <w:szCs w:val="20"/>
               </w:rPr>
-              <w:t xml:space="preserve">R 30 400</w:t>
+              <w:t xml:space="preserve">R 38 000</w:t>
             </w:r>
           </w:p>
         </w:tc>
@@ -13668,6 +13820,159 @@
               <w:bottom w:val="single" w:color="D6CFC6" w:sz="4"/>
               <w:right w:val="single" w:color="D6CFC6" w:sz="4"/>
             </w:tcBorders>
+            <w:shd w:fill="F7F5F2" w:color="auto" w:val="clear"/>
+            <w:tcMar>
+              <w:top w:type="dxa" w:w="90"/>
+              <w:left w:type="dxa" w:w="130"/>
+              <w:bottom w:type="dxa" w:w="90"/>
+              <w:right w:type="dxa" w:w="130"/>
+            </w:tcMar>
+            <w:vAlign w:val="center"/>
+          </w:tcPr>
+          <w:p>
+            <w:pPr>
+              <w:spacing w:after="0" w:line="240"/>
+            </w:pPr>
+            <w:r>
+              <w:rPr>
+                <w:rFonts w:ascii="Calibri" w:cs="Calibri" w:eastAsia="Calibri" w:hAnsi="Calibri"/>
+                <w:b w:val="false"/>
+                <w:bCs w:val="false"/>
+                <w:i w:val="false"/>
+                <w:iCs w:val="false"/>
+                <w:color w:val="221E1F"/>
+                <w:sz w:val="20"/>
+                <w:szCs w:val="20"/>
+              </w:rPr>
+              <w:t xml:space="preserve">PayFast adapter</w:t>
+            </w:r>
+          </w:p>
+        </w:tc>
+        <w:tc>
+          <w:tcPr>
+            <w:tcW w:type="dxa" w:w="1157"/>
+            <w:tcBorders>
+              <w:top w:val="single" w:color="D6CFC6" w:sz="4"/>
+              <w:left w:val="single" w:color="D6CFC6" w:sz="4"/>
+              <w:bottom w:val="single" w:color="D6CFC6" w:sz="4"/>
+              <w:right w:val="single" w:color="D6CFC6" w:sz="4"/>
+            </w:tcBorders>
+            <w:shd w:fill="F7F5F2" w:color="auto" w:val="clear"/>
+            <w:tcMar>
+              <w:top w:type="dxa" w:w="90"/>
+              <w:left w:type="dxa" w:w="130"/>
+              <w:bottom w:type="dxa" w:w="90"/>
+              <w:right w:type="dxa" w:w="130"/>
+            </w:tcMar>
+            <w:vAlign w:val="center"/>
+          </w:tcPr>
+          <w:p>
+            <w:pPr>
+              <w:spacing w:after="0" w:line="240"/>
+              <w:jc w:val="right"/>
+            </w:pPr>
+            <w:r>
+              <w:rPr>
+                <w:rFonts w:ascii="Calibri" w:cs="Calibri" w:eastAsia="Calibri" w:hAnsi="Calibri"/>
+                <w:b w:val="false"/>
+                <w:bCs w:val="false"/>
+                <w:i w:val="false"/>
+                <w:iCs w:val="false"/>
+                <w:color w:val="221E1F"/>
+                <w:sz w:val="20"/>
+                <w:szCs w:val="20"/>
+              </w:rPr>
+              <w:t xml:space="preserve">4</w:t>
+            </w:r>
+          </w:p>
+        </w:tc>
+        <w:tc>
+          <w:tcPr>
+            <w:tcW w:type="dxa" w:w="1542"/>
+            <w:tcBorders>
+              <w:top w:val="single" w:color="D6CFC6" w:sz="4"/>
+              <w:left w:val="single" w:color="D6CFC6" w:sz="4"/>
+              <w:bottom w:val="single" w:color="D6CFC6" w:sz="4"/>
+              <w:right w:val="single" w:color="D6CFC6" w:sz="4"/>
+            </w:tcBorders>
+            <w:shd w:fill="F7F5F2" w:color="auto" w:val="clear"/>
+            <w:tcMar>
+              <w:top w:type="dxa" w:w="90"/>
+              <w:left w:type="dxa" w:w="130"/>
+              <w:bottom w:type="dxa" w:w="90"/>
+              <w:right w:type="dxa" w:w="130"/>
+            </w:tcMar>
+            <w:vAlign w:val="center"/>
+          </w:tcPr>
+          <w:p>
+            <w:pPr>
+              <w:spacing w:after="0" w:line="240"/>
+              <w:jc w:val="right"/>
+            </w:pPr>
+            <w:r>
+              <w:rPr>
+                <w:rFonts w:ascii="Calibri" w:cs="Calibri" w:eastAsia="Calibri" w:hAnsi="Calibri"/>
+                <w:b w:val="false"/>
+                <w:bCs w:val="false"/>
+                <w:i w:val="false"/>
+                <w:iCs w:val="false"/>
+                <w:color w:val="221E1F"/>
+                <w:sz w:val="20"/>
+                <w:szCs w:val="20"/>
+              </w:rPr>
+              <w:t xml:space="preserve">32</w:t>
+            </w:r>
+          </w:p>
+        </w:tc>
+        <w:tc>
+          <w:tcPr>
+            <w:tcW w:type="dxa" w:w="1638"/>
+            <w:tcBorders>
+              <w:top w:val="single" w:color="D6CFC6" w:sz="4"/>
+              <w:left w:val="single" w:color="D6CFC6" w:sz="4"/>
+              <w:bottom w:val="single" w:color="D6CFC6" w:sz="4"/>
+              <w:right w:val="single" w:color="D6CFC6" w:sz="4"/>
+            </w:tcBorders>
+            <w:shd w:fill="F7F5F2" w:color="auto" w:val="clear"/>
+            <w:tcMar>
+              <w:top w:type="dxa" w:w="90"/>
+              <w:left w:type="dxa" w:w="130"/>
+              <w:bottom w:type="dxa" w:w="90"/>
+              <w:right w:type="dxa" w:w="130"/>
+            </w:tcMar>
+            <w:vAlign w:val="center"/>
+          </w:tcPr>
+          <w:p>
+            <w:pPr>
+              <w:spacing w:after="0" w:line="240"/>
+              <w:jc w:val="right"/>
+            </w:pPr>
+            <w:r>
+              <w:rPr>
+                <w:rFonts w:ascii="Calibri" w:cs="Calibri" w:eastAsia="Calibri" w:hAnsi="Calibri"/>
+                <w:b w:val="false"/>
+                <w:bCs w:val="false"/>
+                <w:i w:val="false"/>
+                <w:iCs w:val="false"/>
+                <w:color w:val="221E1F"/>
+                <w:sz w:val="20"/>
+                <w:szCs w:val="20"/>
+              </w:rPr>
+              <w:t xml:space="preserve">R 30 400</w:t>
+            </w:r>
+          </w:p>
+        </w:tc>
+      </w:tr>
+      <w:tr>
+        <w:tc>
+          <w:tcPr>
+            <w:tcW w:type="dxa" w:w="5301"/>
+            <w:tcBorders>
+              <w:top w:val="single" w:color="D6CFC6" w:sz="4"/>
+              <w:left w:val="single" w:color="D6CFC6" w:sz="4"/>
+              <w:bottom w:val="single" w:color="D6CFC6" w:sz="4"/>
+              <w:right w:val="single" w:color="D6CFC6" w:sz="4"/>
+            </w:tcBorders>
             <w:shd w:fill="FCE8EB" w:color="auto" w:val="clear"/>
             <w:tcMar>
               <w:top w:type="dxa" w:w="90"/>
@@ -13730,7 +14035,7 @@
                 <w:sz w:val="20"/>
                 <w:szCs w:val="20"/>
               </w:rPr>
-              <w:t xml:space="preserve">149</w:t>
+              <w:t xml:space="preserve">153</w:t>
             </w:r>
           </w:p>
         </w:tc>
@@ -13768,7 +14073,7 @@
                 <w:sz w:val="20"/>
                 <w:szCs w:val="20"/>
               </w:rPr>
-              <w:t xml:space="preserve">1 192</w:t>
+              <w:t xml:space="preserve">1 224</w:t>
             </w:r>
           </w:p>
         </w:tc>
@@ -13806,7 +14111,7 @@
                 <w:sz w:val="20"/>
                 <w:szCs w:val="20"/>
               </w:rPr>
-              <w:t xml:space="preserve">R 1 132 400</w:t>
+              <w:t xml:space="preserve">R 1 162 800</w:t>
             </w:r>
           </w:p>
         </w:tc>
@@ -13845,7 +14150,7 @@
           <w:sz w:val="20"/>
           <w:szCs w:val="20"/>
         </w:rPr>
-        <w:t xml:space="preserve">The integration seams — payments, accounts, notifications, POS and courier — are 44 of the 149 days. None of them names a vendor, and none has to be rewritten when one is chosen: what remains per integration is an adapter against an interface that already exists and is already tested.</w:t>
+        <w:t xml:space="preserve">The integration seams — payments, accounts, notifications, POS and courier — are 44 of the 153 days. None of them names a vendor, and none has to be rewritten when one is chosen: what remains per integration is an adapter against an interface that already exists and is already tested.</w:t>
       </w:r>
     </w:p>
     <w:p>
@@ -14689,7 +14994,7 @@
                 <w:sz w:val="20"/>
                 <w:szCs w:val="20"/>
               </w:rPr>
-              <w:t xml:space="preserve">Messaging adapter</w:t>
+              <w:t xml:space="preserve">Mailgun and Clickatell onboarding</w:t>
             </w:r>
           </w:p>
         </w:tc>
@@ -14725,7 +15030,7 @@
                 <w:sz w:val="20"/>
                 <w:szCs w:val="20"/>
               </w:rPr>
-              <w:t xml:space="preserve">One adapter against the notification seam, sender identities, deliverability</w:t>
+              <w:t xml:space="preserve">Both transports are written. What is left needs accounts: a verified sending domain with SPF and DKIM, a registered Clickatell sender id, and deliverability testing</w:t>
             </w:r>
           </w:p>
         </w:tc>
@@ -14762,7 +15067,7 @@
                 <w:sz w:val="20"/>
                 <w:szCs w:val="20"/>
               </w:rPr>
-              <w:t xml:space="preserve">3</w:t>
+              <w:t xml:space="preserve">2</w:t>
             </w:r>
           </w:p>
         </w:tc>
@@ -15621,7 +15926,7 @@
                 <w:sz w:val="20"/>
                 <w:szCs w:val="20"/>
               </w:rPr>
-              <w:t xml:space="preserve">224 hours of engineering</w:t>
+              <w:t xml:space="preserve">216 hours of engineering</w:t>
             </w:r>
           </w:p>
         </w:tc>
@@ -15659,7 +15964,7 @@
                 <w:sz w:val="20"/>
                 <w:szCs w:val="20"/>
               </w:rPr>
-              <w:t xml:space="preserve">28</w:t>
+              <w:t xml:space="preserve">27</w:t>
             </w:r>
           </w:p>
         </w:tc>
@@ -15964,7 +16269,7 @@
                 <w:sz w:val="20"/>
                 <w:szCs w:val="20"/>
               </w:rPr>
-              <w:t xml:space="preserve">149</w:t>
+              <w:t xml:space="preserve">153</w:t>
             </w:r>
           </w:p>
         </w:tc>
@@ -16001,7 +16306,7 @@
                 <w:sz w:val="20"/>
                 <w:szCs w:val="20"/>
               </w:rPr>
-              <w:t xml:space="preserve">1 192</w:t>
+              <w:t xml:space="preserve">1 224</w:t>
             </w:r>
           </w:p>
         </w:tc>
@@ -16038,7 +16343,7 @@
                 <w:sz w:val="20"/>
                 <w:szCs w:val="20"/>
               </w:rPr>
-              <w:t xml:space="preserve">R 1 132 400</w:t>
+              <w:t xml:space="preserve">R 1 162 800</w:t>
             </w:r>
           </w:p>
         </w:tc>
@@ -16115,7 +16420,7 @@
                 <w:sz w:val="20"/>
                 <w:szCs w:val="20"/>
               </w:rPr>
-              <w:t xml:space="preserve">28</w:t>
+              <w:t xml:space="preserve">27</w:t>
             </w:r>
           </w:p>
         </w:tc>
@@ -16153,7 +16458,7 @@
                 <w:sz w:val="20"/>
                 <w:szCs w:val="20"/>
               </w:rPr>
-              <w:t xml:space="preserve">224</w:t>
+              <w:t xml:space="preserve">216</w:t>
             </w:r>
           </w:p>
         </w:tc>
@@ -16191,7 +16496,7 @@
                 <w:sz w:val="20"/>
                 <w:szCs w:val="20"/>
               </w:rPr>
-              <w:t xml:space="preserve">R 212 800</w:t>
+              <w:t xml:space="preserve">R 205 200</w:t>
             </w:r>
           </w:p>
         </w:tc>
@@ -16268,7 +16573,7 @@
                 <w:sz w:val="20"/>
                 <w:szCs w:val="20"/>
               </w:rPr>
-              <w:t xml:space="preserve">177</w:t>
+              <w:t xml:space="preserve">180</w:t>
             </w:r>
           </w:p>
         </w:tc>
@@ -16306,7 +16611,7 @@
                 <w:sz w:val="20"/>
                 <w:szCs w:val="20"/>
               </w:rPr>
-              <w:t xml:space="preserve">1 416</w:t>
+              <w:t xml:space="preserve">1 440</w:t>
             </w:r>
           </w:p>
         </w:tc>
@@ -16344,7 +16649,7 @@
                 <w:sz w:val="20"/>
                 <w:szCs w:val="20"/>
               </w:rPr>
-              <w:t xml:space="preserve">R 1 345 200</w:t>
+              <w:t xml:space="preserve">R 1 368 000</w:t>
             </w:r>
           </w:p>
         </w:tc>
@@ -16383,7 +16688,7 @@
           <w:sz w:val="20"/>
           <w:szCs w:val="20"/>
         </w:rPr>
-        <w:t xml:space="preserve">Roughly 84% of the engineering is done. </w:t>
+        <w:t xml:space="preserve">Roughly 85% of the engineering is done. </w:t>
       </w:r>
       <w:r>
         <w:rPr>

</xml_diff>

<commit_message>
Reprice: 157 built, 25 remaining
GAAP drops from six days to four and now names what it is waiting for rather
than describing work. All five vendors on this project are named, four have
adapters written against published APIs, and the fifth has everything an
adapter needs except the one document only GAAP can send.

Co-Authored-By: Claude Opus 5 <noreply@anthropic.com>
Claude-Session: https://claude.ai/code/session_01B2xsFCpQEfEHuTCkYzyD13
</commit_message>
<xml_diff>
--- a/WEBSITE_COSTINGS.docx
+++ b/WEBSITE_COSTINGS.docx
@@ -449,7 +449,7 @@
                 <w:sz w:val="20"/>
                 <w:szCs w:val="20"/>
               </w:rPr>
-              <w:t xml:space="preserve">c665de0</w:t>
+              <w:t xml:space="preserve">d247e80</w:t>
             </w:r>
           </w:p>
         </w:tc>
@@ -1527,7 +1527,7 @@
                 <w:sz w:val="20"/>
                 <w:szCs w:val="20"/>
               </w:rPr>
-              <w:t xml:space="preserve">653</w:t>
+              <w:t xml:space="preserve">672</w:t>
             </w:r>
           </w:p>
         </w:tc>
@@ -1563,7 +1563,7 @@
                 <w:sz w:val="20"/>
                 <w:szCs w:val="20"/>
               </w:rPr>
-              <w:t xml:space="preserve">In 33 files; all passing</w:t>
+              <w:t xml:space="preserve">In 34 files; all passing</w:t>
             </w:r>
           </w:p>
         </w:tc>
@@ -3770,7 +3770,7 @@
                 <w:sz w:val="20"/>
                 <w:szCs w:val="20"/>
               </w:rPr>
-              <w:t xml:space="preserve">653 passing</w:t>
+              <w:t xml:space="preserve">672 passing</w:t>
             </w:r>
           </w:p>
         </w:tc>
@@ -3807,7 +3807,7 @@
                 <w:sz w:val="20"/>
                 <w:szCs w:val="20"/>
               </w:rPr>
-              <w:t xml:space="preserve">33 files, including four real worker processes racing on one file</w:t>
+              <w:t xml:space="preserve">34 files, including four real worker processes racing on one file</w:t>
             </w:r>
           </w:p>
         </w:tc>
@@ -8425,7 +8425,7 @@
                 <w:sz w:val="20"/>
                 <w:szCs w:val="20"/>
               </w:rPr>
-              <w:t xml:space="preserve">24</w:t>
+              <w:t xml:space="preserve">25</w:t>
             </w:r>
           </w:p>
         </w:tc>
@@ -8461,7 +8461,7 @@
                 <w:sz w:val="20"/>
                 <w:szCs w:val="20"/>
               </w:rPr>
-              <w:t xml:space="preserve">Mailgun and Clickatell transports</w:t>
+              <w:t xml:space="preserve">POS mapping and integration brief</w:t>
             </w:r>
           </w:p>
         </w:tc>
@@ -8497,7 +8497,7 @@
                 <w:sz w:val="20"/>
                 <w:szCs w:val="20"/>
               </w:rPr>
-              <w:t xml:space="preserve">Email and SMS routed to separate providers, each falling back to the log independently; Clickatell’s per-message acceptance read rather than its status code, and Mailgun’s timestamp-and-token signature guarded against replay</w:t>
+              <w:t xml:space="preserve">The catalogue-to-till code map with its three-state completeness rule, modifier codes keyed by group and label, an order translated into the facts a till needs, and the specification list to send GAAP</w:t>
             </w:r>
           </w:p>
         </w:tc>
@@ -8574,7 +8574,7 @@
                 <w:sz w:val="20"/>
                 <w:szCs w:val="20"/>
               </w:rPr>
-              <w:t xml:space="preserve">23</w:t>
+              <w:t xml:space="preserve">24</w:t>
             </w:r>
           </w:p>
         </w:tc>
@@ -8611,7 +8611,7 @@
                 <w:sz w:val="20"/>
                 <w:szCs w:val="20"/>
               </w:rPr>
-              <w:t xml:space="preserve">Complete addresses and a container</w:t>
+              <w:t xml:space="preserve">Mailgun and Clickatell transports</w:t>
             </w:r>
           </w:p>
         </w:tc>
@@ -8648,7 +8648,7 @@
                 <w:sz w:val="20"/>
                 <w:szCs w:val="20"/>
               </w:rPr>
-              <w:t xml:space="preserve">The postal code through the checkout form, the schema, the order and the courier address; a multi-stage non-root image with the state file on a volume and a healthcheck on the endpoint that reports storage</w:t>
+              <w:t xml:space="preserve">Email and SMS routed to separate providers, each falling back to the log independently; Clickatell’s per-message acceptance read rather than its status code, and Mailgun’s timestamp-and-token signature guarded against replay</w:t>
             </w:r>
           </w:p>
         </w:tc>
@@ -8686,7 +8686,7 @@
                 <w:sz w:val="20"/>
                 <w:szCs w:val="20"/>
               </w:rPr>
-              <w:t xml:space="preserve">3</w:t>
+              <w:t xml:space="preserve">4</w:t>
             </w:r>
           </w:p>
         </w:tc>
@@ -8725,7 +8725,7 @@
                 <w:sz w:val="20"/>
                 <w:szCs w:val="20"/>
               </w:rPr>
-              <w:t xml:space="preserve">22</w:t>
+              <w:t xml:space="preserve">23</w:t>
             </w:r>
           </w:p>
         </w:tc>
@@ -8761,7 +8761,7 @@
                 <w:sz w:val="20"/>
                 <w:szCs w:val="20"/>
               </w:rPr>
-              <w:t xml:space="preserve">Uber Direct adapter</w:t>
+              <w:t xml:space="preserve">Complete addresses and a container</w:t>
             </w:r>
           </w:p>
         </w:tc>
@@ -8797,7 +8797,7 @@
                 <w:sz w:val="20"/>
                 <w:szCs w:val="20"/>
               </w:rPr>
-              <w:t xml:space="preserve">OAuth with a cached token, structured addresses built from what checkout collects, both of Uber’s status vocabularies, raw-byte webhook verification, and dispatch on ready rather than on order</w:t>
+              <w:t xml:space="preserve">The postal code through the checkout form, the schema, the order and the courier address; a multi-stage non-root image with the state file on a volume and a healthcheck on the endpoint that reports storage</w:t>
             </w:r>
           </w:p>
         </w:tc>
@@ -8834,7 +8834,7 @@
                 <w:sz w:val="20"/>
                 <w:szCs w:val="20"/>
               </w:rPr>
-              <w:t xml:space="preserve">5</w:t>
+              <w:t xml:space="preserve">3</w:t>
             </w:r>
           </w:p>
         </w:tc>
@@ -8874,7 +8874,7 @@
                 <w:sz w:val="20"/>
                 <w:szCs w:val="20"/>
               </w:rPr>
-              <w:t xml:space="preserve">21</w:t>
+              <w:t xml:space="preserve">22</w:t>
             </w:r>
           </w:p>
         </w:tc>
@@ -8911,7 +8911,7 @@
                 <w:sz w:val="20"/>
                 <w:szCs w:val="20"/>
               </w:rPr>
-              <w:t xml:space="preserve">PayFast adapter</w:t>
+              <w:t xml:space="preserve">Uber Direct adapter</w:t>
             </w:r>
           </w:p>
         </w:tc>
@@ -8948,7 +8948,7 @@
                 <w:sz w:val="20"/>
                 <w:szCs w:val="20"/>
               </w:rPr>
-              <w:t xml:space="preserve">PHP-compatible signing, all four of PayFast’s notification checks with the postback failing closed, status mapping, and an idempotency key that survives their PENDING-then-COMPLETE sequence</w:t>
+              <w:t xml:space="preserve">OAuth with a cached token, structured addresses built from what checkout collects, both of Uber’s status vocabularies, raw-byte webhook verification, and dispatch on ready rather than on order</w:t>
             </w:r>
           </w:p>
         </w:tc>
@@ -8986,7 +8986,7 @@
                 <w:sz w:val="20"/>
                 <w:szCs w:val="20"/>
               </w:rPr>
-              <w:t xml:space="preserve">4</w:t>
+              <w:t xml:space="preserve">5</w:t>
             </w:r>
           </w:p>
         </w:tc>
@@ -9001,7 +9001,6 @@
               <w:bottom w:val="single" w:color="D6CFC6" w:sz="4"/>
               <w:right w:val="single" w:color="D6CFC6" w:sz="4"/>
             </w:tcBorders>
-            <w:shd w:fill="FCE8EB" w:color="auto" w:val="clear"/>
             <w:tcMar>
               <w:top w:type="dxa" w:w="90"/>
               <w:left w:type="dxa" w:w="130"/>
@@ -9014,6 +9013,42 @@
             <w:pPr>
               <w:spacing w:after="0" w:line="240"/>
               <w:jc w:val="center"/>
+            </w:pPr>
+            <w:r>
+              <w:rPr>
+                <w:rFonts w:ascii="Calibri" w:cs="Calibri" w:eastAsia="Calibri" w:hAnsi="Calibri"/>
+                <w:b w:val="false"/>
+                <w:bCs w:val="false"/>
+                <w:i w:val="false"/>
+                <w:iCs w:val="false"/>
+                <w:color w:val="221E1F"/>
+                <w:sz w:val="20"/>
+                <w:szCs w:val="20"/>
+              </w:rPr>
+              <w:t xml:space="preserve">21</w:t>
+            </w:r>
+          </w:p>
+        </w:tc>
+        <w:tc>
+          <w:tcPr>
+            <w:tcW w:type="dxa" w:w="3084"/>
+            <w:tcBorders>
+              <w:top w:val="single" w:color="D6CFC6" w:sz="4"/>
+              <w:left w:val="single" w:color="D6CFC6" w:sz="4"/>
+              <w:bottom w:val="single" w:color="D6CFC6" w:sz="4"/>
+              <w:right w:val="single" w:color="D6CFC6" w:sz="4"/>
+            </w:tcBorders>
+            <w:tcMar>
+              <w:top w:type="dxa" w:w="90"/>
+              <w:left w:type="dxa" w:w="130"/>
+              <w:bottom w:type="dxa" w:w="90"/>
+              <w:right w:type="dxa" w:w="130"/>
+            </w:tcMar>
+            <w:vAlign w:val="center"/>
+          </w:tcPr>
+          <w:p>
+            <w:pPr>
+              <w:spacing w:after="0" w:line="240"/>
             </w:pPr>
             <w:r>
               <w:rPr>
@@ -9026,13 +9061,88 @@
                 <w:sz w:val="20"/>
                 <w:szCs w:val="20"/>
               </w:rPr>
-              <w:t xml:space="preserve"/>
-            </w:r>
-          </w:p>
-        </w:tc>
-        <w:tc>
-          <w:tcPr>
-            <w:tcW w:type="dxa" w:w="3084"/>
+              <w:t xml:space="preserve">PayFast adapter</w:t>
+            </w:r>
+          </w:p>
+        </w:tc>
+        <w:tc>
+          <w:tcPr>
+            <w:tcW w:type="dxa" w:w="5108"/>
+            <w:tcBorders>
+              <w:top w:val="single" w:color="D6CFC6" w:sz="4"/>
+              <w:left w:val="single" w:color="D6CFC6" w:sz="4"/>
+              <w:bottom w:val="single" w:color="D6CFC6" w:sz="4"/>
+              <w:right w:val="single" w:color="D6CFC6" w:sz="4"/>
+            </w:tcBorders>
+            <w:tcMar>
+              <w:top w:type="dxa" w:w="90"/>
+              <w:left w:type="dxa" w:w="130"/>
+              <w:bottom w:type="dxa" w:w="90"/>
+              <w:right w:type="dxa" w:w="130"/>
+            </w:tcMar>
+            <w:vAlign w:val="center"/>
+          </w:tcPr>
+          <w:p>
+            <w:pPr>
+              <w:spacing w:after="0" w:line="240"/>
+            </w:pPr>
+            <w:r>
+              <w:rPr>
+                <w:rFonts w:ascii="Calibri" w:cs="Calibri" w:eastAsia="Calibri" w:hAnsi="Calibri"/>
+                <w:b w:val="false"/>
+                <w:bCs w:val="false"/>
+                <w:i w:val="false"/>
+                <w:iCs w:val="false"/>
+                <w:color w:val="221E1F"/>
+                <w:sz w:val="20"/>
+                <w:szCs w:val="20"/>
+              </w:rPr>
+              <w:t xml:space="preserve">PHP-compatible signing, all four of PayFast’s notification checks with the postback failing closed, status mapping, and an idempotency key that survives their PENDING-then-COMPLETE sequence</w:t>
+            </w:r>
+          </w:p>
+        </w:tc>
+        <w:tc>
+          <w:tcPr>
+            <w:tcW w:type="dxa" w:w="964"/>
+            <w:tcBorders>
+              <w:top w:val="single" w:color="D6CFC6" w:sz="4"/>
+              <w:left w:val="single" w:color="D6CFC6" w:sz="4"/>
+              <w:bottom w:val="single" w:color="D6CFC6" w:sz="4"/>
+              <w:right w:val="single" w:color="D6CFC6" w:sz="4"/>
+            </w:tcBorders>
+            <w:tcMar>
+              <w:top w:type="dxa" w:w="90"/>
+              <w:left w:type="dxa" w:w="130"/>
+              <w:bottom w:type="dxa" w:w="90"/>
+              <w:right w:type="dxa" w:w="130"/>
+            </w:tcMar>
+            <w:vAlign w:val="center"/>
+          </w:tcPr>
+          <w:p>
+            <w:pPr>
+              <w:spacing w:after="0" w:line="240"/>
+              <w:jc w:val="right"/>
+            </w:pPr>
+            <w:r>
+              <w:rPr>
+                <w:rFonts w:ascii="Calibri" w:cs="Calibri" w:eastAsia="Calibri" w:hAnsi="Calibri"/>
+                <w:b w:val="false"/>
+                <w:bCs w:val="false"/>
+                <w:i w:val="false"/>
+                <w:iCs w:val="false"/>
+                <w:color w:val="221E1F"/>
+                <w:sz w:val="20"/>
+                <w:szCs w:val="20"/>
+              </w:rPr>
+              <w:t xml:space="preserve">4</w:t>
+            </w:r>
+          </w:p>
+        </w:tc>
+      </w:tr>
+      <w:tr>
+        <w:tc>
+          <w:tcPr>
+            <w:tcW w:type="dxa" w:w="482"/>
             <w:tcBorders>
               <w:top w:val="single" w:color="D6CFC6" w:sz="4"/>
               <w:left w:val="single" w:color="D6CFC6" w:sz="4"/>
@@ -9051,6 +9161,7 @@
           <w:p>
             <w:pPr>
               <w:spacing w:after="0" w:line="240"/>
+              <w:jc w:val="center"/>
             </w:pPr>
             <w:r>
               <w:rPr>
@@ -9063,13 +9174,13 @@
                 <w:sz w:val="20"/>
                 <w:szCs w:val="20"/>
               </w:rPr>
-              <w:t xml:space="preserve">Total</w:t>
-            </w:r>
-          </w:p>
-        </w:tc>
-        <w:tc>
-          <w:tcPr>
-            <w:tcW w:type="dxa" w:w="5108"/>
+              <w:t xml:space="preserve"/>
+            </w:r>
+          </w:p>
+        </w:tc>
+        <w:tc>
+          <w:tcPr>
+            <w:tcW w:type="dxa" w:w="3084"/>
             <w:tcBorders>
               <w:top w:val="single" w:color="D6CFC6" w:sz="4"/>
               <w:left w:val="single" w:color="D6CFC6" w:sz="4"/>
@@ -9100,13 +9211,13 @@
                 <w:sz w:val="20"/>
                 <w:szCs w:val="20"/>
               </w:rPr>
-              <w:t xml:space="preserve">Delivered scope</w:t>
-            </w:r>
-          </w:p>
-        </w:tc>
-        <w:tc>
-          <w:tcPr>
-            <w:tcW w:type="dxa" w:w="964"/>
+              <w:t xml:space="preserve">Total</w:t>
+            </w:r>
+          </w:p>
+        </w:tc>
+        <w:tc>
+          <w:tcPr>
+            <w:tcW w:type="dxa" w:w="5108"/>
             <w:tcBorders>
               <w:top w:val="single" w:color="D6CFC6" w:sz="4"/>
               <w:left w:val="single" w:color="D6CFC6" w:sz="4"/>
@@ -9125,7 +9236,6 @@
           <w:p>
             <w:pPr>
               <w:spacing w:after="0" w:line="240"/>
-              <w:jc w:val="right"/>
             </w:pPr>
             <w:r>
               <w:rPr>
@@ -9138,7 +9248,45 @@
                 <w:sz w:val="20"/>
                 <w:szCs w:val="20"/>
               </w:rPr>
-              <w:t xml:space="preserve">153</w:t>
+              <w:t xml:space="preserve">Delivered scope</w:t>
+            </w:r>
+          </w:p>
+        </w:tc>
+        <w:tc>
+          <w:tcPr>
+            <w:tcW w:type="dxa" w:w="964"/>
+            <w:tcBorders>
+              <w:top w:val="single" w:color="D6CFC6" w:sz="4"/>
+              <w:left w:val="single" w:color="D6CFC6" w:sz="4"/>
+              <w:bottom w:val="single" w:color="D6CFC6" w:sz="4"/>
+              <w:right w:val="single" w:color="D6CFC6" w:sz="4"/>
+            </w:tcBorders>
+            <w:shd w:fill="FCE8EB" w:color="auto" w:val="clear"/>
+            <w:tcMar>
+              <w:top w:type="dxa" w:w="90"/>
+              <w:left w:type="dxa" w:w="130"/>
+              <w:bottom w:type="dxa" w:w="90"/>
+              <w:right w:type="dxa" w:w="130"/>
+            </w:tcMar>
+            <w:vAlign w:val="center"/>
+          </w:tcPr>
+          <w:p>
+            <w:pPr>
+              <w:spacing w:after="0" w:line="240"/>
+              <w:jc w:val="right"/>
+            </w:pPr>
+            <w:r>
+              <w:rPr>
+                <w:rFonts w:ascii="Calibri" w:cs="Calibri" w:eastAsia="Calibri" w:hAnsi="Calibri"/>
+                <w:b/>
+                <w:bCs/>
+                <w:i w:val="false"/>
+                <w:iCs w:val="false"/>
+                <w:color w:val="221E1F"/>
+                <w:sz w:val="20"/>
+                <w:szCs w:val="20"/>
+              </w:rPr>
+              <w:t xml:space="preserve">157</w:t>
             </w:r>
           </w:p>
         </w:tc>
@@ -9190,7 +9338,7 @@
           <w:sz w:val="20"/>
           <w:szCs w:val="20"/>
         </w:rPr>
-        <w:t xml:space="preserve">19,998 hand-written lines over 153 days is about 150 a day. For tested, typed, reviewed production code that sits inside the normal 100–300 band, and lower than the 200 the first version of this document reconstructed — integration work carries more test and less code than storefront work does. The reconstruction is not inflated.</w:t>
+        <w:t xml:space="preserve">19,998 hand-written lines over 157 days is about 150 a day. For tested, typed, reviewed production code that sits inside the normal 100–300 band, and lower than the 200 the first version of this document reconstructed — integration work carries more test and less code than storefront work does. The reconstruction is not inflated.</w:t>
       </w:r>
     </w:p>
     <w:p>
@@ -9208,7 +9356,7 @@
           <w:sz w:val="20"/>
           <w:szCs w:val="20"/>
         </w:rPr>
-        <w:t xml:space="preserve">153 days is roughly 27 working weeks, or a little over six months for one person. Two people working in parallel would compress the calendar but not the total, and would add coordination cost.</w:t>
+        <w:t xml:space="preserve">157 days is roughly 27 working weeks, or a little over six months for one person. Two people working in parallel would compress the calendar but not the total, and would add coordination cost.</w:t>
       </w:r>
     </w:p>
     <w:p>
@@ -9279,7 +9427,7 @@
           <w:sz w:val="20"/>
           <w:szCs w:val="20"/>
         </w:rPr>
-        <w:t xml:space="preserve">Delivered scope: 153 days × 8 hours = 1224 hours.</w:t>
+        <w:t xml:space="preserve">Delivered scope: 157 days × 8 hours = 1256 hours.</w:t>
       </w:r>
     </w:p>
     <w:tbl>
@@ -9374,7 +9522,7 @@
                 <w:sz w:val="19"/>
                 <w:szCs w:val="19"/>
               </w:rPr>
-              <w:t xml:space="preserve">Cost of the 1224 hours (excl. VAT)</w:t>
+              <w:t xml:space="preserve">Cost of the 1256 hours (excl. VAT)</w:t>
             </w:r>
           </w:p>
         </w:tc>
@@ -9487,7 +9635,7 @@
                 <w:sz w:val="20"/>
                 <w:szCs w:val="20"/>
               </w:rPr>
-              <w:t xml:space="preserve">R 489 600</w:t>
+              <w:t xml:space="preserve">R 502 400</w:t>
             </w:r>
           </w:p>
         </w:tc>
@@ -9524,7 +9672,7 @@
                 <w:sz w:val="20"/>
                 <w:szCs w:val="20"/>
               </w:rPr>
-              <w:t xml:space="preserve">R 563 040</w:t>
+              <w:t xml:space="preserve">R 577 760</w:t>
             </w:r>
           </w:p>
         </w:tc>
@@ -9601,7 +9749,7 @@
                 <w:sz w:val="20"/>
                 <w:szCs w:val="20"/>
               </w:rPr>
-              <w:t xml:space="preserve">R 795 600</w:t>
+              <w:t xml:space="preserve">R 816 400</w:t>
             </w:r>
           </w:p>
         </w:tc>
@@ -9639,7 +9787,7 @@
                 <w:sz w:val="20"/>
                 <w:szCs w:val="20"/>
               </w:rPr>
-              <w:t xml:space="preserve">R 914 940</w:t>
+              <w:t xml:space="preserve">R 938 860</w:t>
             </w:r>
           </w:p>
         </w:tc>
@@ -9714,7 +9862,7 @@
                 <w:sz w:val="20"/>
                 <w:szCs w:val="20"/>
               </w:rPr>
-              <w:t xml:space="preserve">R 1 040 400</w:t>
+              <w:t xml:space="preserve">R 1 067 600</w:t>
             </w:r>
           </w:p>
         </w:tc>
@@ -9751,7 +9899,7 @@
                 <w:sz w:val="20"/>
                 <w:szCs w:val="20"/>
               </w:rPr>
-              <w:t xml:space="preserve">R 1 196 460</w:t>
+              <w:t xml:space="preserve">R 1 227 740</w:t>
             </w:r>
           </w:p>
         </w:tc>
@@ -9828,7 +9976,7 @@
                 <w:sz w:val="20"/>
                 <w:szCs w:val="20"/>
               </w:rPr>
-              <w:t xml:space="preserve">R 1 162 800</w:t>
+              <w:t xml:space="preserve">R 1 193 200</w:t>
             </w:r>
           </w:p>
         </w:tc>
@@ -9866,7 +10014,7 @@
                 <w:sz w:val="20"/>
                 <w:szCs w:val="20"/>
               </w:rPr>
-              <w:t xml:space="preserve">R 1 337 220</w:t>
+              <w:t xml:space="preserve">R 1 372 180</w:t>
             </w:r>
           </w:p>
         </w:tc>
@@ -9941,7 +10089,7 @@
                 <w:sz w:val="20"/>
                 <w:szCs w:val="20"/>
               </w:rPr>
-              <w:t xml:space="preserve">R 1 407 600</w:t>
+              <w:t xml:space="preserve">R 1 444 400</w:t>
             </w:r>
           </w:p>
         </w:tc>
@@ -9978,7 +10126,7 @@
                 <w:sz w:val="20"/>
                 <w:szCs w:val="20"/>
               </w:rPr>
-              <w:t xml:space="preserve">R 1 618 740</w:t>
+              <w:t xml:space="preserve">R 1 661 060</w:t>
             </w:r>
           </w:p>
         </w:tc>
@@ -10055,7 +10203,7 @@
                 <w:sz w:val="20"/>
                 <w:szCs w:val="20"/>
               </w:rPr>
-              <w:t xml:space="preserve">R 1 774 800</w:t>
+              <w:t xml:space="preserve">R 1 821 200</w:t>
             </w:r>
           </w:p>
         </w:tc>
@@ -10093,7 +10241,7 @@
                 <w:sz w:val="20"/>
                 <w:szCs w:val="20"/>
               </w:rPr>
-              <w:t xml:space="preserve">R 2 041 020</w:t>
+              <w:t xml:space="preserve">R 2 094 380</w:t>
             </w:r>
           </w:p>
         </w:tc>
@@ -10145,7 +10293,7 @@
           <w:sz w:val="20"/>
           <w:szCs w:val="20"/>
         </w:rPr>
-        <w:t xml:space="preserve">At an illustrative blended rate of R 950 an hour — chosen here only to make the rest of the document concrete — the delivered scope comes to R 1 162 800 excluding VAT, or R 1 337 220 including it. Replace the rate and every figure below moves proportionally.</w:t>
+        <w:t xml:space="preserve">At an illustrative blended rate of R 950 an hour — chosen here only to make the rest of the document concrete — the delivered scope comes to R 1 193 200 excluding VAT, or R 1 372 180 including it. Replace the rate and every figure below moves proportionally.</w:t>
       </w:r>
     </w:p>
     <w:p>
@@ -13392,7 +13540,7 @@
                 <w:sz w:val="20"/>
                 <w:szCs w:val="20"/>
               </w:rPr>
-              <w:t xml:space="preserve">Mailgun and Clickatell transports</w:t>
+              <w:t xml:space="preserve">POS mapping and integration brief</w:t>
             </w:r>
           </w:p>
         </w:tc>
@@ -13542,7 +13690,7 @@
                 <w:sz w:val="20"/>
                 <w:szCs w:val="20"/>
               </w:rPr>
-              <w:t xml:space="preserve">Complete addresses and a container</w:t>
+              <w:t xml:space="preserve">Mailgun and Clickatell transports</w:t>
             </w:r>
           </w:p>
         </w:tc>
@@ -13580,7 +13728,7 @@
                 <w:sz w:val="20"/>
                 <w:szCs w:val="20"/>
               </w:rPr>
-              <w:t xml:space="preserve">3</w:t>
+              <w:t xml:space="preserve">4</w:t>
             </w:r>
           </w:p>
         </w:tc>
@@ -13618,7 +13766,7 @@
                 <w:sz w:val="20"/>
                 <w:szCs w:val="20"/>
               </w:rPr>
-              <w:t xml:space="preserve">24</w:t>
+              <w:t xml:space="preserve">32</w:t>
             </w:r>
           </w:p>
         </w:tc>
@@ -13656,7 +13804,7 @@
                 <w:sz w:val="20"/>
                 <w:szCs w:val="20"/>
               </w:rPr>
-              <w:t xml:space="preserve">R 22 800</w:t>
+              <w:t xml:space="preserve">R 30 400</w:t>
             </w:r>
           </w:p>
         </w:tc>
@@ -13694,7 +13842,7 @@
                 <w:sz w:val="20"/>
                 <w:szCs w:val="20"/>
               </w:rPr>
-              <w:t xml:space="preserve">Uber Direct adapter</w:t>
+              <w:t xml:space="preserve">Complete addresses and a container</w:t>
             </w:r>
           </w:p>
         </w:tc>
@@ -13731,7 +13879,7 @@
                 <w:sz w:val="20"/>
                 <w:szCs w:val="20"/>
               </w:rPr>
-              <w:t xml:space="preserve">5</w:t>
+              <w:t xml:space="preserve">3</w:t>
             </w:r>
           </w:p>
         </w:tc>
@@ -13768,7 +13916,7 @@
                 <w:sz w:val="20"/>
                 <w:szCs w:val="20"/>
               </w:rPr>
-              <w:t xml:space="preserve">40</w:t>
+              <w:t xml:space="preserve">24</w:t>
             </w:r>
           </w:p>
         </w:tc>
@@ -13805,7 +13953,7 @@
                 <w:sz w:val="20"/>
                 <w:szCs w:val="20"/>
               </w:rPr>
-              <w:t xml:space="preserve">R 38 000</w:t>
+              <w:t xml:space="preserve">R 22 800</w:t>
             </w:r>
           </w:p>
         </w:tc>
@@ -13844,7 +13992,7 @@
                 <w:sz w:val="20"/>
                 <w:szCs w:val="20"/>
               </w:rPr>
-              <w:t xml:space="preserve">PayFast adapter</w:t>
+              <w:t xml:space="preserve">Uber Direct adapter</w:t>
             </w:r>
           </w:p>
         </w:tc>
@@ -13882,7 +14030,7 @@
                 <w:sz w:val="20"/>
                 <w:szCs w:val="20"/>
               </w:rPr>
-              <w:t xml:space="preserve">4</w:t>
+              <w:t xml:space="preserve">5</w:t>
             </w:r>
           </w:p>
         </w:tc>
@@ -13920,7 +14068,7 @@
                 <w:sz w:val="20"/>
                 <w:szCs w:val="20"/>
               </w:rPr>
-              <w:t xml:space="preserve">32</w:t>
+              <w:t xml:space="preserve">40</w:t>
             </w:r>
           </w:p>
         </w:tc>
@@ -13958,7 +14106,7 @@
                 <w:sz w:val="20"/>
                 <w:szCs w:val="20"/>
               </w:rPr>
-              <w:t xml:space="preserve">R 30 400</w:t>
+              <w:t xml:space="preserve">R 38 000</w:t>
             </w:r>
           </w:p>
         </w:tc>
@@ -13973,6 +14121,155 @@
               <w:bottom w:val="single" w:color="D6CFC6" w:sz="4"/>
               <w:right w:val="single" w:color="D6CFC6" w:sz="4"/>
             </w:tcBorders>
+            <w:tcMar>
+              <w:top w:type="dxa" w:w="90"/>
+              <w:left w:type="dxa" w:w="130"/>
+              <w:bottom w:type="dxa" w:w="90"/>
+              <w:right w:type="dxa" w:w="130"/>
+            </w:tcMar>
+            <w:vAlign w:val="center"/>
+          </w:tcPr>
+          <w:p>
+            <w:pPr>
+              <w:spacing w:after="0" w:line="240"/>
+            </w:pPr>
+            <w:r>
+              <w:rPr>
+                <w:rFonts w:ascii="Calibri" w:cs="Calibri" w:eastAsia="Calibri" w:hAnsi="Calibri"/>
+                <w:b w:val="false"/>
+                <w:bCs w:val="false"/>
+                <w:i w:val="false"/>
+                <w:iCs w:val="false"/>
+                <w:color w:val="221E1F"/>
+                <w:sz w:val="20"/>
+                <w:szCs w:val="20"/>
+              </w:rPr>
+              <w:t xml:space="preserve">PayFast adapter</w:t>
+            </w:r>
+          </w:p>
+        </w:tc>
+        <w:tc>
+          <w:tcPr>
+            <w:tcW w:type="dxa" w:w="1157"/>
+            <w:tcBorders>
+              <w:top w:val="single" w:color="D6CFC6" w:sz="4"/>
+              <w:left w:val="single" w:color="D6CFC6" w:sz="4"/>
+              <w:bottom w:val="single" w:color="D6CFC6" w:sz="4"/>
+              <w:right w:val="single" w:color="D6CFC6" w:sz="4"/>
+            </w:tcBorders>
+            <w:tcMar>
+              <w:top w:type="dxa" w:w="90"/>
+              <w:left w:type="dxa" w:w="130"/>
+              <w:bottom w:type="dxa" w:w="90"/>
+              <w:right w:type="dxa" w:w="130"/>
+            </w:tcMar>
+            <w:vAlign w:val="center"/>
+          </w:tcPr>
+          <w:p>
+            <w:pPr>
+              <w:spacing w:after="0" w:line="240"/>
+              <w:jc w:val="right"/>
+            </w:pPr>
+            <w:r>
+              <w:rPr>
+                <w:rFonts w:ascii="Calibri" w:cs="Calibri" w:eastAsia="Calibri" w:hAnsi="Calibri"/>
+                <w:b w:val="false"/>
+                <w:bCs w:val="false"/>
+                <w:i w:val="false"/>
+                <w:iCs w:val="false"/>
+                <w:color w:val="221E1F"/>
+                <w:sz w:val="20"/>
+                <w:szCs w:val="20"/>
+              </w:rPr>
+              <w:t xml:space="preserve">4</w:t>
+            </w:r>
+          </w:p>
+        </w:tc>
+        <w:tc>
+          <w:tcPr>
+            <w:tcW w:type="dxa" w:w="1542"/>
+            <w:tcBorders>
+              <w:top w:val="single" w:color="D6CFC6" w:sz="4"/>
+              <w:left w:val="single" w:color="D6CFC6" w:sz="4"/>
+              <w:bottom w:val="single" w:color="D6CFC6" w:sz="4"/>
+              <w:right w:val="single" w:color="D6CFC6" w:sz="4"/>
+            </w:tcBorders>
+            <w:tcMar>
+              <w:top w:type="dxa" w:w="90"/>
+              <w:left w:type="dxa" w:w="130"/>
+              <w:bottom w:type="dxa" w:w="90"/>
+              <w:right w:type="dxa" w:w="130"/>
+            </w:tcMar>
+            <w:vAlign w:val="center"/>
+          </w:tcPr>
+          <w:p>
+            <w:pPr>
+              <w:spacing w:after="0" w:line="240"/>
+              <w:jc w:val="right"/>
+            </w:pPr>
+            <w:r>
+              <w:rPr>
+                <w:rFonts w:ascii="Calibri" w:cs="Calibri" w:eastAsia="Calibri" w:hAnsi="Calibri"/>
+                <w:b w:val="false"/>
+                <w:bCs w:val="false"/>
+                <w:i w:val="false"/>
+                <w:iCs w:val="false"/>
+                <w:color w:val="221E1F"/>
+                <w:sz w:val="20"/>
+                <w:szCs w:val="20"/>
+              </w:rPr>
+              <w:t xml:space="preserve">32</w:t>
+            </w:r>
+          </w:p>
+        </w:tc>
+        <w:tc>
+          <w:tcPr>
+            <w:tcW w:type="dxa" w:w="1638"/>
+            <w:tcBorders>
+              <w:top w:val="single" w:color="D6CFC6" w:sz="4"/>
+              <w:left w:val="single" w:color="D6CFC6" w:sz="4"/>
+              <w:bottom w:val="single" w:color="D6CFC6" w:sz="4"/>
+              <w:right w:val="single" w:color="D6CFC6" w:sz="4"/>
+            </w:tcBorders>
+            <w:tcMar>
+              <w:top w:type="dxa" w:w="90"/>
+              <w:left w:type="dxa" w:w="130"/>
+              <w:bottom w:type="dxa" w:w="90"/>
+              <w:right w:type="dxa" w:w="130"/>
+            </w:tcMar>
+            <w:vAlign w:val="center"/>
+          </w:tcPr>
+          <w:p>
+            <w:pPr>
+              <w:spacing w:after="0" w:line="240"/>
+              <w:jc w:val="right"/>
+            </w:pPr>
+            <w:r>
+              <w:rPr>
+                <w:rFonts w:ascii="Calibri" w:cs="Calibri" w:eastAsia="Calibri" w:hAnsi="Calibri"/>
+                <w:b w:val="false"/>
+                <w:bCs w:val="false"/>
+                <w:i w:val="false"/>
+                <w:iCs w:val="false"/>
+                <w:color w:val="221E1F"/>
+                <w:sz w:val="20"/>
+                <w:szCs w:val="20"/>
+              </w:rPr>
+              <w:t xml:space="preserve">R 30 400</w:t>
+            </w:r>
+          </w:p>
+        </w:tc>
+      </w:tr>
+      <w:tr>
+        <w:tc>
+          <w:tcPr>
+            <w:tcW w:type="dxa" w:w="5301"/>
+            <w:tcBorders>
+              <w:top w:val="single" w:color="D6CFC6" w:sz="4"/>
+              <w:left w:val="single" w:color="D6CFC6" w:sz="4"/>
+              <w:bottom w:val="single" w:color="D6CFC6" w:sz="4"/>
+              <w:right w:val="single" w:color="D6CFC6" w:sz="4"/>
+            </w:tcBorders>
             <w:shd w:fill="FCE8EB" w:color="auto" w:val="clear"/>
             <w:tcMar>
               <w:top w:type="dxa" w:w="90"/>
@@ -14035,7 +14332,7 @@
                 <w:sz w:val="20"/>
                 <w:szCs w:val="20"/>
               </w:rPr>
-              <w:t xml:space="preserve">153</w:t>
+              <w:t xml:space="preserve">157</w:t>
             </w:r>
           </w:p>
         </w:tc>
@@ -14073,7 +14370,7 @@
                 <w:sz w:val="20"/>
                 <w:szCs w:val="20"/>
               </w:rPr>
-              <w:t xml:space="preserve">1 224</w:t>
+              <w:t xml:space="preserve">1 256</w:t>
             </w:r>
           </w:p>
         </w:tc>
@@ -14111,7 +14408,7 @@
                 <w:sz w:val="20"/>
                 <w:szCs w:val="20"/>
               </w:rPr>
-              <w:t xml:space="preserve">R 1 162 800</w:t>
+              <w:t xml:space="preserve">R 1 193 200</w:t>
             </w:r>
           </w:p>
         </w:tc>
@@ -14150,7 +14447,7 @@
           <w:sz w:val="20"/>
           <w:szCs w:val="20"/>
         </w:rPr>
-        <w:t xml:space="preserve">The integration seams — payments, accounts, notifications, POS and courier — are 44 of the 153 days. None of them names a vendor, and none has to be rewritten when one is chosen: what remains per integration is an adapter against an interface that already exists and is already tested.</w:t>
+        <w:t xml:space="preserve">The integration seams — payments, accounts, notifications, POS and courier — are 44 of the 157 days. None of them names a vendor, and none has to be rewritten when one is chosen: what remains per integration is an adapter against an interface that already exists and is already tested.</w:t>
       </w:r>
     </w:p>
     <w:p>
@@ -14546,7 +14843,7 @@
                 <w:sz w:val="20"/>
                 <w:szCs w:val="20"/>
               </w:rPr>
-              <w:t xml:space="preserve">POS adapter and onboarding</w:t>
+              <w:t xml:space="preserve">GAAP adapter and onboarding</w:t>
             </w:r>
           </w:p>
         </w:tc>
@@ -14583,7 +14880,7 @@
                 <w:sz w:val="20"/>
                 <w:szCs w:val="20"/>
               </w:rPr>
-              <w:t xml:space="preserve">One adapter against the seam, menu mapping, reconciliation against the vendor’s own reports</w:t>
+              <w:t xml:space="preserve">The mapping, the payload and the completeness rule are built. What is left needs GAAP’s integration specification and their per-store code list, neither of which is public — see POS_INTEGRATION_BRIEF.md</w:t>
             </w:r>
           </w:p>
         </w:tc>
@@ -14621,7 +14918,7 @@
                 <w:sz w:val="20"/>
                 <w:szCs w:val="20"/>
               </w:rPr>
-              <w:t xml:space="preserve">6</w:t>
+              <w:t xml:space="preserve">4</w:t>
             </w:r>
           </w:p>
         </w:tc>
@@ -14658,7 +14955,7 @@
                 <w:sz w:val="20"/>
                 <w:szCs w:val="20"/>
               </w:rPr>
-              <w:t xml:space="preserve">POS vendor licence</w:t>
+              <w:t xml:space="preserve">GAAP integration fee</w:t>
             </w:r>
           </w:p>
         </w:tc>
@@ -15926,7 +16223,7 @@
                 <w:sz w:val="20"/>
                 <w:szCs w:val="20"/>
               </w:rPr>
-              <w:t xml:space="preserve">216 hours of engineering</w:t>
+              <w:t xml:space="preserve">200 hours of engineering</w:t>
             </w:r>
           </w:p>
         </w:tc>
@@ -15964,7 +16261,7 @@
                 <w:sz w:val="20"/>
                 <w:szCs w:val="20"/>
               </w:rPr>
-              <w:t xml:space="preserve">27</w:t>
+              <w:t xml:space="preserve">25</w:t>
             </w:r>
           </w:p>
         </w:tc>
@@ -16269,7 +16566,7 @@
                 <w:sz w:val="20"/>
                 <w:szCs w:val="20"/>
               </w:rPr>
-              <w:t xml:space="preserve">153</w:t>
+              <w:t xml:space="preserve">157</w:t>
             </w:r>
           </w:p>
         </w:tc>
@@ -16306,7 +16603,7 @@
                 <w:sz w:val="20"/>
                 <w:szCs w:val="20"/>
               </w:rPr>
-              <w:t xml:space="preserve">1 224</w:t>
+              <w:t xml:space="preserve">1 256</w:t>
             </w:r>
           </w:p>
         </w:tc>
@@ -16343,7 +16640,7 @@
                 <w:sz w:val="20"/>
                 <w:szCs w:val="20"/>
               </w:rPr>
-              <w:t xml:space="preserve">R 1 162 800</w:t>
+              <w:t xml:space="preserve">R 1 193 200</w:t>
             </w:r>
           </w:p>
         </w:tc>
@@ -16420,7 +16717,7 @@
                 <w:sz w:val="20"/>
                 <w:szCs w:val="20"/>
               </w:rPr>
-              <w:t xml:space="preserve">27</w:t>
+              <w:t xml:space="preserve">25</w:t>
             </w:r>
           </w:p>
         </w:tc>
@@ -16458,7 +16755,7 @@
                 <w:sz w:val="20"/>
                 <w:szCs w:val="20"/>
               </w:rPr>
-              <w:t xml:space="preserve">216</w:t>
+              <w:t xml:space="preserve">200</w:t>
             </w:r>
           </w:p>
         </w:tc>
@@ -16496,7 +16793,7 @@
                 <w:sz w:val="20"/>
                 <w:szCs w:val="20"/>
               </w:rPr>
-              <w:t xml:space="preserve">R 205 200</w:t>
+              <w:t xml:space="preserve">R 190 000</w:t>
             </w:r>
           </w:p>
         </w:tc>
@@ -16573,7 +16870,7 @@
                 <w:sz w:val="20"/>
                 <w:szCs w:val="20"/>
               </w:rPr>
-              <w:t xml:space="preserve">180</w:t>
+              <w:t xml:space="preserve">182</w:t>
             </w:r>
           </w:p>
         </w:tc>
@@ -16611,7 +16908,7 @@
                 <w:sz w:val="20"/>
                 <w:szCs w:val="20"/>
               </w:rPr>
-              <w:t xml:space="preserve">1 440</w:t>
+              <w:t xml:space="preserve">1 456</w:t>
             </w:r>
           </w:p>
         </w:tc>
@@ -16649,7 +16946,7 @@
                 <w:sz w:val="20"/>
                 <w:szCs w:val="20"/>
               </w:rPr>
-              <w:t xml:space="preserve">R 1 368 000</w:t>
+              <w:t xml:space="preserve">R 1 383 200</w:t>
             </w:r>
           </w:p>
         </w:tc>
@@ -16688,7 +16985,7 @@
           <w:sz w:val="20"/>
           <w:szCs w:val="20"/>
         </w:rPr>
-        <w:t xml:space="preserve">Roughly 85% of the engineering is done. </w:t>
+        <w:t xml:space="preserve">Roughly 86% of the engineering is done. </w:t>
       </w:r>
       <w:r>
         <w:rPr>

</xml_diff>

<commit_message>
Reprice: 160 built, 25 remaining
Three days added to the delivered column and none taken off the remaining one,
which is the honest arithmetic: bounce handling and the shortfall reports were
never in the estimate. They were things I built halfway and left, which is a
worse category than unbuilt.

Co-Authored-By: Claude Opus 5 <noreply@anthropic.com>
Claude-Session: https://claude.ai/code/session_01B2xsFCpQEfEHuTCkYzyD13
</commit_message>
<xml_diff>
--- a/WEBSITE_COSTINGS.docx
+++ b/WEBSITE_COSTINGS.docx
@@ -449,7 +449,7 @@
                 <w:sz w:val="20"/>
                 <w:szCs w:val="20"/>
               </w:rPr>
-              <w:t xml:space="preserve">d247e80</w:t>
+              <w:t xml:space="preserve">5e53a86</w:t>
             </w:r>
           </w:p>
         </w:tc>
@@ -1190,7 +1190,7 @@
                 <w:sz w:val="20"/>
                 <w:szCs w:val="20"/>
               </w:rPr>
-              <w:t xml:space="preserve">25</w:t>
+              <w:t xml:space="preserve">27</w:t>
             </w:r>
           </w:p>
         </w:tc>
@@ -1527,7 +1527,7 @@
                 <w:sz w:val="20"/>
                 <w:szCs w:val="20"/>
               </w:rPr>
-              <w:t xml:space="preserve">672</w:t>
+              <w:t xml:space="preserve">699</w:t>
             </w:r>
           </w:p>
         </w:tc>
@@ -1563,7 +1563,7 @@
                 <w:sz w:val="20"/>
                 <w:szCs w:val="20"/>
               </w:rPr>
-              <w:t xml:space="preserve">In 34 files; all passing</w:t>
+              <w:t xml:space="preserve">In 35 files; all passing</w:t>
             </w:r>
           </w:p>
         </w:tc>
@@ -3770,7 +3770,7 @@
                 <w:sz w:val="20"/>
                 <w:szCs w:val="20"/>
               </w:rPr>
-              <w:t xml:space="preserve">672 passing</w:t>
+              <w:t xml:space="preserve">699 passing</w:t>
             </w:r>
           </w:p>
         </w:tc>
@@ -3807,7 +3807,7 @@
                 <w:sz w:val="20"/>
                 <w:szCs w:val="20"/>
               </w:rPr>
-              <w:t xml:space="preserve">34 files, including four real worker processes racing on one file</w:t>
+              <w:t xml:space="preserve">35 files, including four real worker processes racing on one file</w:t>
             </w:r>
           </w:p>
         </w:tc>
@@ -8425,7 +8425,7 @@
                 <w:sz w:val="20"/>
                 <w:szCs w:val="20"/>
               </w:rPr>
-              <w:t xml:space="preserve">25</w:t>
+              <w:t xml:space="preserve">26</w:t>
             </w:r>
           </w:p>
         </w:tc>
@@ -8461,7 +8461,7 @@
                 <w:sz w:val="20"/>
                 <w:szCs w:val="20"/>
               </w:rPr>
-              <w:t xml:space="preserve">POS mapping and integration brief</w:t>
+              <w:t xml:space="preserve">Bounce handling and the shortfall reports</w:t>
             </w:r>
           </w:p>
         </w:tc>
@@ -8497,7 +8497,7 @@
                 <w:sz w:val="20"/>
                 <w:szCs w:val="20"/>
               </w:rPr>
-              <w:t xml:space="preserve">The catalogue-to-till code map with its three-state completeness rule, modifier codes keyed by group and label, an order translated into the facts a till needs, and the specification list to send GAAP</w:t>
+              <w:t xml:space="preserve">Mailgun bounce and complaint webhook with replay guards in shared state, a suppression list that tells a hard bounce from a complaint from a soft one, and the refused-handoff and suppressed-address reports surfaced on the console</w:t>
             </w:r>
           </w:p>
         </w:tc>
@@ -8534,7 +8534,7 @@
                 <w:sz w:val="20"/>
                 <w:szCs w:val="20"/>
               </w:rPr>
-              <w:t xml:space="preserve">4</w:t>
+              <w:t xml:space="preserve">3</w:t>
             </w:r>
           </w:p>
         </w:tc>
@@ -8574,7 +8574,7 @@
                 <w:sz w:val="20"/>
                 <w:szCs w:val="20"/>
               </w:rPr>
-              <w:t xml:space="preserve">24</w:t>
+              <w:t xml:space="preserve">25</w:t>
             </w:r>
           </w:p>
         </w:tc>
@@ -8611,7 +8611,7 @@
                 <w:sz w:val="20"/>
                 <w:szCs w:val="20"/>
               </w:rPr>
-              <w:t xml:space="preserve">Mailgun and Clickatell transports</w:t>
+              <w:t xml:space="preserve">POS mapping and integration brief</w:t>
             </w:r>
           </w:p>
         </w:tc>
@@ -8648,7 +8648,7 @@
                 <w:sz w:val="20"/>
                 <w:szCs w:val="20"/>
               </w:rPr>
-              <w:t xml:space="preserve">Email and SMS routed to separate providers, each falling back to the log independently; Clickatell’s per-message acceptance read rather than its status code, and Mailgun’s timestamp-and-token signature guarded against replay</w:t>
+              <w:t xml:space="preserve">The catalogue-to-till code map with its three-state completeness rule, modifier codes keyed by group and label, an order translated into the facts a till needs, and the specification list to send GAAP</w:t>
             </w:r>
           </w:p>
         </w:tc>
@@ -8725,7 +8725,7 @@
                 <w:sz w:val="20"/>
                 <w:szCs w:val="20"/>
               </w:rPr>
-              <w:t xml:space="preserve">23</w:t>
+              <w:t xml:space="preserve">24</w:t>
             </w:r>
           </w:p>
         </w:tc>
@@ -8761,7 +8761,7 @@
                 <w:sz w:val="20"/>
                 <w:szCs w:val="20"/>
               </w:rPr>
-              <w:t xml:space="preserve">Complete addresses and a container</w:t>
+              <w:t xml:space="preserve">Mailgun and Clickatell transports</w:t>
             </w:r>
           </w:p>
         </w:tc>
@@ -8797,7 +8797,7 @@
                 <w:sz w:val="20"/>
                 <w:szCs w:val="20"/>
               </w:rPr>
-              <w:t xml:space="preserve">The postal code through the checkout form, the schema, the order and the courier address; a multi-stage non-root image with the state file on a volume and a healthcheck on the endpoint that reports storage</w:t>
+              <w:t xml:space="preserve">Email and SMS routed to separate providers, each falling back to the log independently; Clickatell’s per-message acceptance read rather than its status code, and Mailgun’s timestamp-and-token signature guarded against replay</w:t>
             </w:r>
           </w:p>
         </w:tc>
@@ -8834,7 +8834,7 @@
                 <w:sz w:val="20"/>
                 <w:szCs w:val="20"/>
               </w:rPr>
-              <w:t xml:space="preserve">3</w:t>
+              <w:t xml:space="preserve">4</w:t>
             </w:r>
           </w:p>
         </w:tc>
@@ -8874,7 +8874,7 @@
                 <w:sz w:val="20"/>
                 <w:szCs w:val="20"/>
               </w:rPr>
-              <w:t xml:space="preserve">22</w:t>
+              <w:t xml:space="preserve">23</w:t>
             </w:r>
           </w:p>
         </w:tc>
@@ -8911,7 +8911,7 @@
                 <w:sz w:val="20"/>
                 <w:szCs w:val="20"/>
               </w:rPr>
-              <w:t xml:space="preserve">Uber Direct adapter</w:t>
+              <w:t xml:space="preserve">Complete addresses and a container</w:t>
             </w:r>
           </w:p>
         </w:tc>
@@ -8948,7 +8948,7 @@
                 <w:sz w:val="20"/>
                 <w:szCs w:val="20"/>
               </w:rPr>
-              <w:t xml:space="preserve">OAuth with a cached token, structured addresses built from what checkout collects, both of Uber’s status vocabularies, raw-byte webhook verification, and dispatch on ready rather than on order</w:t>
+              <w:t xml:space="preserve">The postal code through the checkout form, the schema, the order and the courier address; a multi-stage non-root image with the state file on a volume and a healthcheck on the endpoint that reports storage</w:t>
             </w:r>
           </w:p>
         </w:tc>
@@ -8986,7 +8986,7 @@
                 <w:sz w:val="20"/>
                 <w:szCs w:val="20"/>
               </w:rPr>
-              <w:t xml:space="preserve">5</w:t>
+              <w:t xml:space="preserve">3</w:t>
             </w:r>
           </w:p>
         </w:tc>
@@ -9025,7 +9025,7 @@
                 <w:sz w:val="20"/>
                 <w:szCs w:val="20"/>
               </w:rPr>
-              <w:t xml:space="preserve">21</w:t>
+              <w:t xml:space="preserve">22</w:t>
             </w:r>
           </w:p>
         </w:tc>
@@ -9061,7 +9061,7 @@
                 <w:sz w:val="20"/>
                 <w:szCs w:val="20"/>
               </w:rPr>
-              <w:t xml:space="preserve">PayFast adapter</w:t>
+              <w:t xml:space="preserve">Uber Direct adapter</w:t>
             </w:r>
           </w:p>
         </w:tc>
@@ -9097,7 +9097,7 @@
                 <w:sz w:val="20"/>
                 <w:szCs w:val="20"/>
               </w:rPr>
-              <w:t xml:space="preserve">PHP-compatible signing, all four of PayFast’s notification checks with the postback failing closed, status mapping, and an idempotency key that survives their PENDING-then-COMPLETE sequence</w:t>
+              <w:t xml:space="preserve">OAuth with a cached token, structured addresses built from what checkout collects, both of Uber’s status vocabularies, raw-byte webhook verification, and dispatch on ready rather than on order</w:t>
             </w:r>
           </w:p>
         </w:tc>
@@ -9134,7 +9134,7 @@
                 <w:sz w:val="20"/>
                 <w:szCs w:val="20"/>
               </w:rPr>
-              <w:t xml:space="preserve">4</w:t>
+              <w:t xml:space="preserve">5</w:t>
             </w:r>
           </w:p>
         </w:tc>
@@ -9149,7 +9149,7 @@
               <w:bottom w:val="single" w:color="D6CFC6" w:sz="4"/>
               <w:right w:val="single" w:color="D6CFC6" w:sz="4"/>
             </w:tcBorders>
-            <w:shd w:fill="FCE8EB" w:color="auto" w:val="clear"/>
+            <w:shd w:fill="F7F5F2" w:color="auto" w:val="clear"/>
             <w:tcMar>
               <w:top w:type="dxa" w:w="90"/>
               <w:left w:type="dxa" w:w="130"/>
@@ -9162,6 +9162,43 @@
             <w:pPr>
               <w:spacing w:after="0" w:line="240"/>
               <w:jc w:val="center"/>
+            </w:pPr>
+            <w:r>
+              <w:rPr>
+                <w:rFonts w:ascii="Calibri" w:cs="Calibri" w:eastAsia="Calibri" w:hAnsi="Calibri"/>
+                <w:b w:val="false"/>
+                <w:bCs w:val="false"/>
+                <w:i w:val="false"/>
+                <w:iCs w:val="false"/>
+                <w:color w:val="221E1F"/>
+                <w:sz w:val="20"/>
+                <w:szCs w:val="20"/>
+              </w:rPr>
+              <w:t xml:space="preserve">21</w:t>
+            </w:r>
+          </w:p>
+        </w:tc>
+        <w:tc>
+          <w:tcPr>
+            <w:tcW w:type="dxa" w:w="3084"/>
+            <w:tcBorders>
+              <w:top w:val="single" w:color="D6CFC6" w:sz="4"/>
+              <w:left w:val="single" w:color="D6CFC6" w:sz="4"/>
+              <w:bottom w:val="single" w:color="D6CFC6" w:sz="4"/>
+              <w:right w:val="single" w:color="D6CFC6" w:sz="4"/>
+            </w:tcBorders>
+            <w:shd w:fill="F7F5F2" w:color="auto" w:val="clear"/>
+            <w:tcMar>
+              <w:top w:type="dxa" w:w="90"/>
+              <w:left w:type="dxa" w:w="130"/>
+              <w:bottom w:type="dxa" w:w="90"/>
+              <w:right w:type="dxa" w:w="130"/>
+            </w:tcMar>
+            <w:vAlign w:val="center"/>
+          </w:tcPr>
+          <w:p>
+            <w:pPr>
+              <w:spacing w:after="0" w:line="240"/>
             </w:pPr>
             <w:r>
               <w:rPr>
@@ -9174,13 +9211,90 @@
                 <w:sz w:val="20"/>
                 <w:szCs w:val="20"/>
               </w:rPr>
-              <w:t xml:space="preserve"/>
-            </w:r>
-          </w:p>
-        </w:tc>
-        <w:tc>
-          <w:tcPr>
-            <w:tcW w:type="dxa" w:w="3084"/>
+              <w:t xml:space="preserve">PayFast adapter</w:t>
+            </w:r>
+          </w:p>
+        </w:tc>
+        <w:tc>
+          <w:tcPr>
+            <w:tcW w:type="dxa" w:w="5108"/>
+            <w:tcBorders>
+              <w:top w:val="single" w:color="D6CFC6" w:sz="4"/>
+              <w:left w:val="single" w:color="D6CFC6" w:sz="4"/>
+              <w:bottom w:val="single" w:color="D6CFC6" w:sz="4"/>
+              <w:right w:val="single" w:color="D6CFC6" w:sz="4"/>
+            </w:tcBorders>
+            <w:shd w:fill="F7F5F2" w:color="auto" w:val="clear"/>
+            <w:tcMar>
+              <w:top w:type="dxa" w:w="90"/>
+              <w:left w:type="dxa" w:w="130"/>
+              <w:bottom w:type="dxa" w:w="90"/>
+              <w:right w:type="dxa" w:w="130"/>
+            </w:tcMar>
+            <w:vAlign w:val="center"/>
+          </w:tcPr>
+          <w:p>
+            <w:pPr>
+              <w:spacing w:after="0" w:line="240"/>
+            </w:pPr>
+            <w:r>
+              <w:rPr>
+                <w:rFonts w:ascii="Calibri" w:cs="Calibri" w:eastAsia="Calibri" w:hAnsi="Calibri"/>
+                <w:b w:val="false"/>
+                <w:bCs w:val="false"/>
+                <w:i w:val="false"/>
+                <w:iCs w:val="false"/>
+                <w:color w:val="221E1F"/>
+                <w:sz w:val="20"/>
+                <w:szCs w:val="20"/>
+              </w:rPr>
+              <w:t xml:space="preserve">PHP-compatible signing, all four of PayFast’s notification checks with the postback failing closed, status mapping, and an idempotency key that survives their PENDING-then-COMPLETE sequence</w:t>
+            </w:r>
+          </w:p>
+        </w:tc>
+        <w:tc>
+          <w:tcPr>
+            <w:tcW w:type="dxa" w:w="964"/>
+            <w:tcBorders>
+              <w:top w:val="single" w:color="D6CFC6" w:sz="4"/>
+              <w:left w:val="single" w:color="D6CFC6" w:sz="4"/>
+              <w:bottom w:val="single" w:color="D6CFC6" w:sz="4"/>
+              <w:right w:val="single" w:color="D6CFC6" w:sz="4"/>
+            </w:tcBorders>
+            <w:shd w:fill="F7F5F2" w:color="auto" w:val="clear"/>
+            <w:tcMar>
+              <w:top w:type="dxa" w:w="90"/>
+              <w:left w:type="dxa" w:w="130"/>
+              <w:bottom w:type="dxa" w:w="90"/>
+              <w:right w:type="dxa" w:w="130"/>
+            </w:tcMar>
+            <w:vAlign w:val="center"/>
+          </w:tcPr>
+          <w:p>
+            <w:pPr>
+              <w:spacing w:after="0" w:line="240"/>
+              <w:jc w:val="right"/>
+            </w:pPr>
+            <w:r>
+              <w:rPr>
+                <w:rFonts w:ascii="Calibri" w:cs="Calibri" w:eastAsia="Calibri" w:hAnsi="Calibri"/>
+                <w:b w:val="false"/>
+                <w:bCs w:val="false"/>
+                <w:i w:val="false"/>
+                <w:iCs w:val="false"/>
+                <w:color w:val="221E1F"/>
+                <w:sz w:val="20"/>
+                <w:szCs w:val="20"/>
+              </w:rPr>
+              <w:t xml:space="preserve">4</w:t>
+            </w:r>
+          </w:p>
+        </w:tc>
+      </w:tr>
+      <w:tr>
+        <w:tc>
+          <w:tcPr>
+            <w:tcW w:type="dxa" w:w="482"/>
             <w:tcBorders>
               <w:top w:val="single" w:color="D6CFC6" w:sz="4"/>
               <w:left w:val="single" w:color="D6CFC6" w:sz="4"/>
@@ -9199,6 +9313,7 @@
           <w:p>
             <w:pPr>
               <w:spacing w:after="0" w:line="240"/>
+              <w:jc w:val="center"/>
             </w:pPr>
             <w:r>
               <w:rPr>
@@ -9211,13 +9326,13 @@
                 <w:sz w:val="20"/>
                 <w:szCs w:val="20"/>
               </w:rPr>
-              <w:t xml:space="preserve">Total</w:t>
-            </w:r>
-          </w:p>
-        </w:tc>
-        <w:tc>
-          <w:tcPr>
-            <w:tcW w:type="dxa" w:w="5108"/>
+              <w:t xml:space="preserve"/>
+            </w:r>
+          </w:p>
+        </w:tc>
+        <w:tc>
+          <w:tcPr>
+            <w:tcW w:type="dxa" w:w="3084"/>
             <w:tcBorders>
               <w:top w:val="single" w:color="D6CFC6" w:sz="4"/>
               <w:left w:val="single" w:color="D6CFC6" w:sz="4"/>
@@ -9248,13 +9363,13 @@
                 <w:sz w:val="20"/>
                 <w:szCs w:val="20"/>
               </w:rPr>
-              <w:t xml:space="preserve">Delivered scope</w:t>
-            </w:r>
-          </w:p>
-        </w:tc>
-        <w:tc>
-          <w:tcPr>
-            <w:tcW w:type="dxa" w:w="964"/>
+              <w:t xml:space="preserve">Total</w:t>
+            </w:r>
+          </w:p>
+        </w:tc>
+        <w:tc>
+          <w:tcPr>
+            <w:tcW w:type="dxa" w:w="5108"/>
             <w:tcBorders>
               <w:top w:val="single" w:color="D6CFC6" w:sz="4"/>
               <w:left w:val="single" w:color="D6CFC6" w:sz="4"/>
@@ -9273,7 +9388,6 @@
           <w:p>
             <w:pPr>
               <w:spacing w:after="0" w:line="240"/>
-              <w:jc w:val="right"/>
             </w:pPr>
             <w:r>
               <w:rPr>
@@ -9286,7 +9400,45 @@
                 <w:sz w:val="20"/>
                 <w:szCs w:val="20"/>
               </w:rPr>
-              <w:t xml:space="preserve">157</w:t>
+              <w:t xml:space="preserve">Delivered scope</w:t>
+            </w:r>
+          </w:p>
+        </w:tc>
+        <w:tc>
+          <w:tcPr>
+            <w:tcW w:type="dxa" w:w="964"/>
+            <w:tcBorders>
+              <w:top w:val="single" w:color="D6CFC6" w:sz="4"/>
+              <w:left w:val="single" w:color="D6CFC6" w:sz="4"/>
+              <w:bottom w:val="single" w:color="D6CFC6" w:sz="4"/>
+              <w:right w:val="single" w:color="D6CFC6" w:sz="4"/>
+            </w:tcBorders>
+            <w:shd w:fill="FCE8EB" w:color="auto" w:val="clear"/>
+            <w:tcMar>
+              <w:top w:type="dxa" w:w="90"/>
+              <w:left w:type="dxa" w:w="130"/>
+              <w:bottom w:type="dxa" w:w="90"/>
+              <w:right w:type="dxa" w:w="130"/>
+            </w:tcMar>
+            <w:vAlign w:val="center"/>
+          </w:tcPr>
+          <w:p>
+            <w:pPr>
+              <w:spacing w:after="0" w:line="240"/>
+              <w:jc w:val="right"/>
+            </w:pPr>
+            <w:r>
+              <w:rPr>
+                <w:rFonts w:ascii="Calibri" w:cs="Calibri" w:eastAsia="Calibri" w:hAnsi="Calibri"/>
+                <w:b/>
+                <w:bCs/>
+                <w:i w:val="false"/>
+                <w:iCs w:val="false"/>
+                <w:color w:val="221E1F"/>
+                <w:sz w:val="20"/>
+                <w:szCs w:val="20"/>
+              </w:rPr>
+              <w:t xml:space="preserve">160</w:t>
             </w:r>
           </w:p>
         </w:tc>
@@ -9338,7 +9490,7 @@
           <w:sz w:val="20"/>
           <w:szCs w:val="20"/>
         </w:rPr>
-        <w:t xml:space="preserve">19,998 hand-written lines over 157 days is about 150 a day. For tested, typed, reviewed production code that sits inside the normal 100–300 band, and lower than the 200 the first version of this document reconstructed — integration work carries more test and less code than storefront work does. The reconstruction is not inflated.</w:t>
+        <w:t xml:space="preserve">19,998 hand-written lines over 160 days is about 150 a day. For tested, typed, reviewed production code that sits inside the normal 100–300 band, and lower than the 200 the first version of this document reconstructed — integration work carries more test and less code than storefront work does. The reconstruction is not inflated.</w:t>
       </w:r>
     </w:p>
     <w:p>
@@ -9356,7 +9508,7 @@
           <w:sz w:val="20"/>
           <w:szCs w:val="20"/>
         </w:rPr>
-        <w:t xml:space="preserve">157 days is roughly 27 working weeks, or a little over six months for one person. Two people working in parallel would compress the calendar but not the total, and would add coordination cost.</w:t>
+        <w:t xml:space="preserve">160 days is roughly 27 working weeks, or a little over six months for one person. Two people working in parallel would compress the calendar but not the total, and would add coordination cost.</w:t>
       </w:r>
     </w:p>
     <w:p>
@@ -9427,7 +9579,7 @@
           <w:sz w:val="20"/>
           <w:szCs w:val="20"/>
         </w:rPr>
-        <w:t xml:space="preserve">Delivered scope: 157 days × 8 hours = 1256 hours.</w:t>
+        <w:t xml:space="preserve">Delivered scope: 160 days × 8 hours = 1280 hours.</w:t>
       </w:r>
     </w:p>
     <w:tbl>
@@ -9522,7 +9674,7 @@
                 <w:sz w:val="19"/>
                 <w:szCs w:val="19"/>
               </w:rPr>
-              <w:t xml:space="preserve">Cost of the 1256 hours (excl. VAT)</w:t>
+              <w:t xml:space="preserve">Cost of the 1280 hours (excl. VAT)</w:t>
             </w:r>
           </w:p>
         </w:tc>
@@ -9635,7 +9787,7 @@
                 <w:sz w:val="20"/>
                 <w:szCs w:val="20"/>
               </w:rPr>
-              <w:t xml:space="preserve">R 502 400</w:t>
+              <w:t xml:space="preserve">R 512 000</w:t>
             </w:r>
           </w:p>
         </w:tc>
@@ -9672,7 +9824,7 @@
                 <w:sz w:val="20"/>
                 <w:szCs w:val="20"/>
               </w:rPr>
-              <w:t xml:space="preserve">R 577 760</w:t>
+              <w:t xml:space="preserve">R 588 800</w:t>
             </w:r>
           </w:p>
         </w:tc>
@@ -9749,7 +9901,7 @@
                 <w:sz w:val="20"/>
                 <w:szCs w:val="20"/>
               </w:rPr>
-              <w:t xml:space="preserve">R 816 400</w:t>
+              <w:t xml:space="preserve">R 832 000</w:t>
             </w:r>
           </w:p>
         </w:tc>
@@ -9787,7 +9939,7 @@
                 <w:sz w:val="20"/>
                 <w:szCs w:val="20"/>
               </w:rPr>
-              <w:t xml:space="preserve">R 938 860</w:t>
+              <w:t xml:space="preserve">R 956 800</w:t>
             </w:r>
           </w:p>
         </w:tc>
@@ -9862,7 +10014,7 @@
                 <w:sz w:val="20"/>
                 <w:szCs w:val="20"/>
               </w:rPr>
-              <w:t xml:space="preserve">R 1 067 600</w:t>
+              <w:t xml:space="preserve">R 1 088 000</w:t>
             </w:r>
           </w:p>
         </w:tc>
@@ -9899,7 +10051,7 @@
                 <w:sz w:val="20"/>
                 <w:szCs w:val="20"/>
               </w:rPr>
-              <w:t xml:space="preserve">R 1 227 740</w:t>
+              <w:t xml:space="preserve">R 1 251 200</w:t>
             </w:r>
           </w:p>
         </w:tc>
@@ -9976,7 +10128,7 @@
                 <w:sz w:val="20"/>
                 <w:szCs w:val="20"/>
               </w:rPr>
-              <w:t xml:space="preserve">R 1 193 200</w:t>
+              <w:t xml:space="preserve">R 1 216 000</w:t>
             </w:r>
           </w:p>
         </w:tc>
@@ -10014,7 +10166,7 @@
                 <w:sz w:val="20"/>
                 <w:szCs w:val="20"/>
               </w:rPr>
-              <w:t xml:space="preserve">R 1 372 180</w:t>
+              <w:t xml:space="preserve">R 1 398 400</w:t>
             </w:r>
           </w:p>
         </w:tc>
@@ -10089,7 +10241,7 @@
                 <w:sz w:val="20"/>
                 <w:szCs w:val="20"/>
               </w:rPr>
-              <w:t xml:space="preserve">R 1 444 400</w:t>
+              <w:t xml:space="preserve">R 1 472 000</w:t>
             </w:r>
           </w:p>
         </w:tc>
@@ -10126,7 +10278,7 @@
                 <w:sz w:val="20"/>
                 <w:szCs w:val="20"/>
               </w:rPr>
-              <w:t xml:space="preserve">R 1 661 060</w:t>
+              <w:t xml:space="preserve">R 1 692 800</w:t>
             </w:r>
           </w:p>
         </w:tc>
@@ -10203,7 +10355,7 @@
                 <w:sz w:val="20"/>
                 <w:szCs w:val="20"/>
               </w:rPr>
-              <w:t xml:space="preserve">R 1 821 200</w:t>
+              <w:t xml:space="preserve">R 1 856 000</w:t>
             </w:r>
           </w:p>
         </w:tc>
@@ -10241,7 +10393,7 @@
                 <w:sz w:val="20"/>
                 <w:szCs w:val="20"/>
               </w:rPr>
-              <w:t xml:space="preserve">R 2 094 380</w:t>
+              <w:t xml:space="preserve">R 2 134 400</w:t>
             </w:r>
           </w:p>
         </w:tc>
@@ -10293,7 +10445,7 @@
           <w:sz w:val="20"/>
           <w:szCs w:val="20"/>
         </w:rPr>
-        <w:t xml:space="preserve">At an illustrative blended rate of R 950 an hour — chosen here only to make the rest of the document concrete — the delivered scope comes to R 1 193 200 excluding VAT, or R 1 372 180 including it. Replace the rate and every figure below moves proportionally.</w:t>
+        <w:t xml:space="preserve">At an illustrative blended rate of R 950 an hour — chosen here only to make the rest of the document concrete — the delivered scope comes to R 1 216 000 excluding VAT, or R 1 398 400 including it. Replace the rate and every figure below moves proportionally.</w:t>
       </w:r>
     </w:p>
     <w:p>
@@ -13540,7 +13692,7 @@
                 <w:sz w:val="20"/>
                 <w:szCs w:val="20"/>
               </w:rPr>
-              <w:t xml:space="preserve">POS mapping and integration brief</w:t>
+              <w:t xml:space="preserve">Bounce handling and the shortfall reports</w:t>
             </w:r>
           </w:p>
         </w:tc>
@@ -13577,7 +13729,7 @@
                 <w:sz w:val="20"/>
                 <w:szCs w:val="20"/>
               </w:rPr>
-              <w:t xml:space="preserve">4</w:t>
+              <w:t xml:space="preserve">3</w:t>
             </w:r>
           </w:p>
         </w:tc>
@@ -13614,7 +13766,7 @@
                 <w:sz w:val="20"/>
                 <w:szCs w:val="20"/>
               </w:rPr>
-              <w:t xml:space="preserve">32</w:t>
+              <w:t xml:space="preserve">24</w:t>
             </w:r>
           </w:p>
         </w:tc>
@@ -13651,7 +13803,7 @@
                 <w:sz w:val="20"/>
                 <w:szCs w:val="20"/>
               </w:rPr>
-              <w:t xml:space="preserve">R 30 400</w:t>
+              <w:t xml:space="preserve">R 22 800</w:t>
             </w:r>
           </w:p>
         </w:tc>
@@ -13690,7 +13842,7 @@
                 <w:sz w:val="20"/>
                 <w:szCs w:val="20"/>
               </w:rPr>
-              <w:t xml:space="preserve">Mailgun and Clickatell transports</w:t>
+              <w:t xml:space="preserve">POS mapping and integration brief</w:t>
             </w:r>
           </w:p>
         </w:tc>
@@ -13842,7 +13994,7 @@
                 <w:sz w:val="20"/>
                 <w:szCs w:val="20"/>
               </w:rPr>
-              <w:t xml:space="preserve">Complete addresses and a container</w:t>
+              <w:t xml:space="preserve">Mailgun and Clickatell transports</w:t>
             </w:r>
           </w:p>
         </w:tc>
@@ -13879,7 +14031,7 @@
                 <w:sz w:val="20"/>
                 <w:szCs w:val="20"/>
               </w:rPr>
-              <w:t xml:space="preserve">3</w:t>
+              <w:t xml:space="preserve">4</w:t>
             </w:r>
           </w:p>
         </w:tc>
@@ -13916,7 +14068,7 @@
                 <w:sz w:val="20"/>
                 <w:szCs w:val="20"/>
               </w:rPr>
-              <w:t xml:space="preserve">24</w:t>
+              <w:t xml:space="preserve">32</w:t>
             </w:r>
           </w:p>
         </w:tc>
@@ -13953,7 +14105,7 @@
                 <w:sz w:val="20"/>
                 <w:szCs w:val="20"/>
               </w:rPr>
-              <w:t xml:space="preserve">R 22 800</w:t>
+              <w:t xml:space="preserve">R 30 400</w:t>
             </w:r>
           </w:p>
         </w:tc>
@@ -13992,7 +14144,7 @@
                 <w:sz w:val="20"/>
                 <w:szCs w:val="20"/>
               </w:rPr>
-              <w:t xml:space="preserve">Uber Direct adapter</w:t>
+              <w:t xml:space="preserve">Complete addresses and a container</w:t>
             </w:r>
           </w:p>
         </w:tc>
@@ -14030,7 +14182,7 @@
                 <w:sz w:val="20"/>
                 <w:szCs w:val="20"/>
               </w:rPr>
-              <w:t xml:space="preserve">5</w:t>
+              <w:t xml:space="preserve">3</w:t>
             </w:r>
           </w:p>
         </w:tc>
@@ -14068,7 +14220,7 @@
                 <w:sz w:val="20"/>
                 <w:szCs w:val="20"/>
               </w:rPr>
-              <w:t xml:space="preserve">40</w:t>
+              <w:t xml:space="preserve">24</w:t>
             </w:r>
           </w:p>
         </w:tc>
@@ -14106,7 +14258,7 @@
                 <w:sz w:val="20"/>
                 <w:szCs w:val="20"/>
               </w:rPr>
-              <w:t xml:space="preserve">R 38 000</w:t>
+              <w:t xml:space="preserve">R 22 800</w:t>
             </w:r>
           </w:p>
         </w:tc>
@@ -14144,7 +14296,7 @@
                 <w:sz w:val="20"/>
                 <w:szCs w:val="20"/>
               </w:rPr>
-              <w:t xml:space="preserve">PayFast adapter</w:t>
+              <w:t xml:space="preserve">Uber Direct adapter</w:t>
             </w:r>
           </w:p>
         </w:tc>
@@ -14181,7 +14333,7 @@
                 <w:sz w:val="20"/>
                 <w:szCs w:val="20"/>
               </w:rPr>
-              <w:t xml:space="preserve">4</w:t>
+              <w:t xml:space="preserve">5</w:t>
             </w:r>
           </w:p>
         </w:tc>
@@ -14218,7 +14370,7 @@
                 <w:sz w:val="20"/>
                 <w:szCs w:val="20"/>
               </w:rPr>
-              <w:t xml:space="preserve">32</w:t>
+              <w:t xml:space="preserve">40</w:t>
             </w:r>
           </w:p>
         </w:tc>
@@ -14255,7 +14407,7 @@
                 <w:sz w:val="20"/>
                 <w:szCs w:val="20"/>
               </w:rPr>
-              <w:t xml:space="preserve">R 30 400</w:t>
+              <w:t xml:space="preserve">R 38 000</w:t>
             </w:r>
           </w:p>
         </w:tc>
@@ -14270,6 +14422,159 @@
               <w:bottom w:val="single" w:color="D6CFC6" w:sz="4"/>
               <w:right w:val="single" w:color="D6CFC6" w:sz="4"/>
             </w:tcBorders>
+            <w:shd w:fill="F7F5F2" w:color="auto" w:val="clear"/>
+            <w:tcMar>
+              <w:top w:type="dxa" w:w="90"/>
+              <w:left w:type="dxa" w:w="130"/>
+              <w:bottom w:type="dxa" w:w="90"/>
+              <w:right w:type="dxa" w:w="130"/>
+            </w:tcMar>
+            <w:vAlign w:val="center"/>
+          </w:tcPr>
+          <w:p>
+            <w:pPr>
+              <w:spacing w:after="0" w:line="240"/>
+            </w:pPr>
+            <w:r>
+              <w:rPr>
+                <w:rFonts w:ascii="Calibri" w:cs="Calibri" w:eastAsia="Calibri" w:hAnsi="Calibri"/>
+                <w:b w:val="false"/>
+                <w:bCs w:val="false"/>
+                <w:i w:val="false"/>
+                <w:iCs w:val="false"/>
+                <w:color w:val="221E1F"/>
+                <w:sz w:val="20"/>
+                <w:szCs w:val="20"/>
+              </w:rPr>
+              <w:t xml:space="preserve">PayFast adapter</w:t>
+            </w:r>
+          </w:p>
+        </w:tc>
+        <w:tc>
+          <w:tcPr>
+            <w:tcW w:type="dxa" w:w="1157"/>
+            <w:tcBorders>
+              <w:top w:val="single" w:color="D6CFC6" w:sz="4"/>
+              <w:left w:val="single" w:color="D6CFC6" w:sz="4"/>
+              <w:bottom w:val="single" w:color="D6CFC6" w:sz="4"/>
+              <w:right w:val="single" w:color="D6CFC6" w:sz="4"/>
+            </w:tcBorders>
+            <w:shd w:fill="F7F5F2" w:color="auto" w:val="clear"/>
+            <w:tcMar>
+              <w:top w:type="dxa" w:w="90"/>
+              <w:left w:type="dxa" w:w="130"/>
+              <w:bottom w:type="dxa" w:w="90"/>
+              <w:right w:type="dxa" w:w="130"/>
+            </w:tcMar>
+            <w:vAlign w:val="center"/>
+          </w:tcPr>
+          <w:p>
+            <w:pPr>
+              <w:spacing w:after="0" w:line="240"/>
+              <w:jc w:val="right"/>
+            </w:pPr>
+            <w:r>
+              <w:rPr>
+                <w:rFonts w:ascii="Calibri" w:cs="Calibri" w:eastAsia="Calibri" w:hAnsi="Calibri"/>
+                <w:b w:val="false"/>
+                <w:bCs w:val="false"/>
+                <w:i w:val="false"/>
+                <w:iCs w:val="false"/>
+                <w:color w:val="221E1F"/>
+                <w:sz w:val="20"/>
+                <w:szCs w:val="20"/>
+              </w:rPr>
+              <w:t xml:space="preserve">4</w:t>
+            </w:r>
+          </w:p>
+        </w:tc>
+        <w:tc>
+          <w:tcPr>
+            <w:tcW w:type="dxa" w:w="1542"/>
+            <w:tcBorders>
+              <w:top w:val="single" w:color="D6CFC6" w:sz="4"/>
+              <w:left w:val="single" w:color="D6CFC6" w:sz="4"/>
+              <w:bottom w:val="single" w:color="D6CFC6" w:sz="4"/>
+              <w:right w:val="single" w:color="D6CFC6" w:sz="4"/>
+            </w:tcBorders>
+            <w:shd w:fill="F7F5F2" w:color="auto" w:val="clear"/>
+            <w:tcMar>
+              <w:top w:type="dxa" w:w="90"/>
+              <w:left w:type="dxa" w:w="130"/>
+              <w:bottom w:type="dxa" w:w="90"/>
+              <w:right w:type="dxa" w:w="130"/>
+            </w:tcMar>
+            <w:vAlign w:val="center"/>
+          </w:tcPr>
+          <w:p>
+            <w:pPr>
+              <w:spacing w:after="0" w:line="240"/>
+              <w:jc w:val="right"/>
+            </w:pPr>
+            <w:r>
+              <w:rPr>
+                <w:rFonts w:ascii="Calibri" w:cs="Calibri" w:eastAsia="Calibri" w:hAnsi="Calibri"/>
+                <w:b w:val="false"/>
+                <w:bCs w:val="false"/>
+                <w:i w:val="false"/>
+                <w:iCs w:val="false"/>
+                <w:color w:val="221E1F"/>
+                <w:sz w:val="20"/>
+                <w:szCs w:val="20"/>
+              </w:rPr>
+              <w:t xml:space="preserve">32</w:t>
+            </w:r>
+          </w:p>
+        </w:tc>
+        <w:tc>
+          <w:tcPr>
+            <w:tcW w:type="dxa" w:w="1638"/>
+            <w:tcBorders>
+              <w:top w:val="single" w:color="D6CFC6" w:sz="4"/>
+              <w:left w:val="single" w:color="D6CFC6" w:sz="4"/>
+              <w:bottom w:val="single" w:color="D6CFC6" w:sz="4"/>
+              <w:right w:val="single" w:color="D6CFC6" w:sz="4"/>
+            </w:tcBorders>
+            <w:shd w:fill="F7F5F2" w:color="auto" w:val="clear"/>
+            <w:tcMar>
+              <w:top w:type="dxa" w:w="90"/>
+              <w:left w:type="dxa" w:w="130"/>
+              <w:bottom w:type="dxa" w:w="90"/>
+              <w:right w:type="dxa" w:w="130"/>
+            </w:tcMar>
+            <w:vAlign w:val="center"/>
+          </w:tcPr>
+          <w:p>
+            <w:pPr>
+              <w:spacing w:after="0" w:line="240"/>
+              <w:jc w:val="right"/>
+            </w:pPr>
+            <w:r>
+              <w:rPr>
+                <w:rFonts w:ascii="Calibri" w:cs="Calibri" w:eastAsia="Calibri" w:hAnsi="Calibri"/>
+                <w:b w:val="false"/>
+                <w:bCs w:val="false"/>
+                <w:i w:val="false"/>
+                <w:iCs w:val="false"/>
+                <w:color w:val="221E1F"/>
+                <w:sz w:val="20"/>
+                <w:szCs w:val="20"/>
+              </w:rPr>
+              <w:t xml:space="preserve">R 30 400</w:t>
+            </w:r>
+          </w:p>
+        </w:tc>
+      </w:tr>
+      <w:tr>
+        <w:tc>
+          <w:tcPr>
+            <w:tcW w:type="dxa" w:w="5301"/>
+            <w:tcBorders>
+              <w:top w:val="single" w:color="D6CFC6" w:sz="4"/>
+              <w:left w:val="single" w:color="D6CFC6" w:sz="4"/>
+              <w:bottom w:val="single" w:color="D6CFC6" w:sz="4"/>
+              <w:right w:val="single" w:color="D6CFC6" w:sz="4"/>
+            </w:tcBorders>
             <w:shd w:fill="FCE8EB" w:color="auto" w:val="clear"/>
             <w:tcMar>
               <w:top w:type="dxa" w:w="90"/>
@@ -14332,7 +14637,7 @@
                 <w:sz w:val="20"/>
                 <w:szCs w:val="20"/>
               </w:rPr>
-              <w:t xml:space="preserve">157</w:t>
+              <w:t xml:space="preserve">160</w:t>
             </w:r>
           </w:p>
         </w:tc>
@@ -14370,7 +14675,7 @@
                 <w:sz w:val="20"/>
                 <w:szCs w:val="20"/>
               </w:rPr>
-              <w:t xml:space="preserve">1 256</w:t>
+              <w:t xml:space="preserve">1 280</w:t>
             </w:r>
           </w:p>
         </w:tc>
@@ -14408,7 +14713,7 @@
                 <w:sz w:val="20"/>
                 <w:szCs w:val="20"/>
               </w:rPr>
-              <w:t xml:space="preserve">R 1 193 200</w:t>
+              <w:t xml:space="preserve">R 1 216 000</w:t>
             </w:r>
           </w:p>
         </w:tc>
@@ -14447,7 +14752,7 @@
           <w:sz w:val="20"/>
           <w:szCs w:val="20"/>
         </w:rPr>
-        <w:t xml:space="preserve">The integration seams — payments, accounts, notifications, POS and courier — are 44 of the 157 days. None of them names a vendor, and none has to be rewritten when one is chosen: what remains per integration is an adapter against an interface that already exists and is already tested.</w:t>
+        <w:t xml:space="preserve">The integration seams — payments, accounts, notifications, POS and courier — are 44 of the 160 days. None of them names a vendor, and none has to be rewritten when one is chosen: what remains per integration is an adapter against an interface that already exists and is already tested.</w:t>
       </w:r>
     </w:p>
     <w:p>
@@ -16566,7 +16871,7 @@
                 <w:sz w:val="20"/>
                 <w:szCs w:val="20"/>
               </w:rPr>
-              <w:t xml:space="preserve">157</w:t>
+              <w:t xml:space="preserve">160</w:t>
             </w:r>
           </w:p>
         </w:tc>
@@ -16603,7 +16908,7 @@
                 <w:sz w:val="20"/>
                 <w:szCs w:val="20"/>
               </w:rPr>
-              <w:t xml:space="preserve">1 256</w:t>
+              <w:t xml:space="preserve">1 280</w:t>
             </w:r>
           </w:p>
         </w:tc>
@@ -16640,7 +16945,7 @@
                 <w:sz w:val="20"/>
                 <w:szCs w:val="20"/>
               </w:rPr>
-              <w:t xml:space="preserve">R 1 193 200</w:t>
+              <w:t xml:space="preserve">R 1 216 000</w:t>
             </w:r>
           </w:p>
         </w:tc>
@@ -16870,7 +17175,7 @@
                 <w:sz w:val="20"/>
                 <w:szCs w:val="20"/>
               </w:rPr>
-              <w:t xml:space="preserve">182</w:t>
+              <w:t xml:space="preserve">185</w:t>
             </w:r>
           </w:p>
         </w:tc>
@@ -16908,7 +17213,7 @@
                 <w:sz w:val="20"/>
                 <w:szCs w:val="20"/>
               </w:rPr>
-              <w:t xml:space="preserve">1 456</w:t>
+              <w:t xml:space="preserve">1 480</w:t>
             </w:r>
           </w:p>
         </w:tc>
@@ -16946,7 +17251,7 @@
                 <w:sz w:val="20"/>
                 <w:szCs w:val="20"/>
               </w:rPr>
-              <w:t xml:space="preserve">R 1 383 200</w:t>
+              <w:t xml:space="preserve">R 1 406 000</w:t>
             </w:r>
           </w:p>
         </w:tc>

</xml_diff>

<commit_message>
Reprice, and correct three readiness claims that had gone stale
Adds the payment journey and the reset screens as workstreams: 169
delivered days, 25 remaining, 194 end to end.

The readiness table was describing an older build. Payment was "seam
built, refuses" when it is now wired through checkout to the journey and
refuses only for want of credentials; messaging was "a transport that
records rather than sends" after Mailgun and Clickatell went in; and
customer accounts still said password reset was waiting on a messaging
provider when it is built and reachable.

Co-Authored-By: Claude Opus 5 <noreply@anthropic.com>
Claude-Session: https://claude.ai/code/session_01B2xsFCpQEfEHuTCkYzyD13
</commit_message>
<xml_diff>
--- a/WEBSITE_COSTINGS.docx
+++ b/WEBSITE_COSTINGS.docx
@@ -1415,7 +1415,7 @@
                 <w:sz w:val="20"/>
                 <w:szCs w:val="20"/>
               </w:rPr>
-              <w:t xml:space="preserve">43</w:t>
+              <w:t xml:space="preserve">44</w:t>
             </w:r>
           </w:p>
         </w:tc>
@@ -1527,7 +1527,7 @@
                 <w:sz w:val="20"/>
                 <w:szCs w:val="20"/>
               </w:rPr>
-              <w:t xml:space="preserve">723</w:t>
+              <w:t xml:space="preserve">753</w:t>
             </w:r>
           </w:p>
         </w:tc>
@@ -1563,7 +1563,7 @@
                 <w:sz w:val="20"/>
                 <w:szCs w:val="20"/>
               </w:rPr>
-              <w:t xml:space="preserve">In 36 files; all passing</w:t>
+              <w:t xml:space="preserve">In 37 files; all passing</w:t>
             </w:r>
           </w:p>
         </w:tc>
@@ -1640,7 +1640,7 @@
                 <w:sz w:val="20"/>
                 <w:szCs w:val="20"/>
               </w:rPr>
-              <w:t xml:space="preserve">26,237</w:t>
+              <w:t xml:space="preserve">27,291</w:t>
             </w:r>
           </w:p>
         </w:tc>
@@ -1677,7 +1677,7 @@
                 <w:sz w:val="20"/>
                 <w:szCs w:val="20"/>
               </w:rPr>
-              <w:t xml:space="preserve">Application 11,300 · tests 9,541 · review build 2,563 · data, schema and tooling 2,110 · shared packages 723</w:t>
+              <w:t xml:space="preserve">Application 11,866 · tests 9,998 · review build 2,563 · data, schema and tooling 2,112 · shared packages 752</w:t>
             </w:r>
           </w:p>
         </w:tc>
@@ -1865,7 +1865,7 @@
                 <w:sz w:val="20"/>
                 <w:szCs w:val="20"/>
               </w:rPr>
-              <w:t xml:space="preserve">100</w:t>
+              <w:t xml:space="preserve">103</w:t>
             </w:r>
           </w:p>
         </w:tc>
@@ -3770,7 +3770,7 @@
                 <w:sz w:val="20"/>
                 <w:szCs w:val="20"/>
               </w:rPr>
-              <w:t xml:space="preserve">723 passing</w:t>
+              <w:t xml:space="preserve">753 passing</w:t>
             </w:r>
           </w:p>
         </w:tc>
@@ -3807,7 +3807,7 @@
                 <w:sz w:val="20"/>
                 <w:szCs w:val="20"/>
               </w:rPr>
-              <w:t xml:space="preserve">36 files, including four real worker processes racing on one file</w:t>
+              <w:t xml:space="preserve">37 files, including four real worker processes racing on one file</w:t>
             </w:r>
           </w:p>
         </w:tc>
@@ -4280,7 +4280,7 @@
                 <w:sz w:val="20"/>
                 <w:szCs w:val="20"/>
               </w:rPr>
-              <w:t xml:space="preserve">Seam built, refuses</w:t>
+              <w:t xml:space="preserve">Wired, refuses without credentials</w:t>
             </w:r>
           </w:p>
         </w:tc>
@@ -4316,7 +4316,7 @@
                 <w:sz w:val="20"/>
                 <w:szCs w:val="20"/>
               </w:rPr>
-              <w:t xml:space="preserve">Adapter interface, signature verification before parsing, settlement idempotent on the provider event id, sandbox provider. Endpoints answer 501 until a provider and merchant credentials exist.</w:t>
+              <w:t xml:space="preserve">PayFast adapter, signature verification before parsing, settlement idempotent on the provider event id. Checkout opens a payment and hands the customer to the gateway, the order screen shows what the payment is doing, and the kitchen does not cook unpaid food. Answers 501 until merchant credentials exist, which is what keeps this build refusing payment visibly.</w:t>
             </w:r>
           </w:p>
         </w:tc>
@@ -4615,7 +4615,7 @@
                 <w:sz w:val="20"/>
                 <w:szCs w:val="20"/>
               </w:rPr>
-              <w:t xml:space="preserve">Seam built, logs</w:t>
+              <w:t xml:space="preserve">Transports built, falls back to the log</w:t>
             </w:r>
           </w:p>
         </w:tc>
@@ -4652,7 +4652,7 @@
                 <w:sz w:val="20"/>
                 <w:szCs w:val="20"/>
               </w:rPr>
-              <w:t xml:space="preserve">Templates, a deliver-once ledger, a transport that records rather than sends. Waiting on a provider and sender identities.</w:t>
+              <w:t xml:space="preserve">Templates, a deliver-once ledger, Mailgun for email and Clickatell for SMS routed independently, bounce and complaint handling with a suppression list. Each falls back to writing to the audit log until its account exists. Waiting on a verified sending domain and a registered sender id.</w:t>
             </w:r>
           </w:p>
         </w:tc>
@@ -4762,7 +4762,7 @@
                 <w:sz w:val="20"/>
                 <w:szCs w:val="20"/>
               </w:rPr>
-              <w:t xml:space="preserve">scrypt passwords, signed sessions, saved addresses, order history scoped to the session. Password reset waits on the messaging provider.</w:t>
+              <w:t xml:space="preserve">scrypt passwords, signed sessions, saved addresses, order history scoped to the session, and password reset — hashed single-use tokens, reachable from the sign-in screen and from the emailed link. All of it has a screen.</w:t>
             </w:r>
           </w:p>
         </w:tc>
@@ -6548,7 +6548,7 @@
                 <w:sz w:val="20"/>
                 <w:szCs w:val="20"/>
               </w:rPr>
-              <w:t xml:space="preserve">The suite as it stood at this workstream: the 723 tests now in 36 files grew with the workstreams below. Driven through route handlers rather than helpers</w:t>
+              <w:t xml:space="preserve">The suite as it stood at this workstream: the 753 tests now in 37 files grew with the workstreams below. Driven through route handlers rather than helpers</w:t>
             </w:r>
           </w:p>
         </w:tc>
@@ -9449,7 +9449,7 @@
               <w:bottom w:val="single" w:color="D6CFC6" w:sz="4"/>
               <w:right w:val="single" w:color="D6CFC6" w:sz="4"/>
             </w:tcBorders>
-            <w:shd w:fill="FCE8EB" w:color="auto" w:val="clear"/>
+            <w:shd w:fill="F7F5F2" w:color="auto" w:val="clear"/>
             <w:tcMar>
               <w:top w:type="dxa" w:w="90"/>
               <w:left w:type="dxa" w:w="130"/>
@@ -9462,6 +9462,43 @@
             <w:pPr>
               <w:spacing w:after="0" w:line="240"/>
               <w:jc w:val="center"/>
+            </w:pPr>
+            <w:r>
+              <w:rPr>
+                <w:rFonts w:ascii="Calibri" w:cs="Calibri" w:eastAsia="Calibri" w:hAnsi="Calibri"/>
+                <w:b w:val="false"/>
+                <w:bCs w:val="false"/>
+                <w:i w:val="false"/>
+                <w:iCs w:val="false"/>
+                <w:color w:val="221E1F"/>
+                <w:sz w:val="20"/>
+                <w:szCs w:val="20"/>
+              </w:rPr>
+              <w:t xml:space="preserve">28</w:t>
+            </w:r>
+          </w:p>
+        </w:tc>
+        <w:tc>
+          <w:tcPr>
+            <w:tcW w:type="dxa" w:w="3084"/>
+            <w:tcBorders>
+              <w:top w:val="single" w:color="D6CFC6" w:sz="4"/>
+              <w:left w:val="single" w:color="D6CFC6" w:sz="4"/>
+              <w:bottom w:val="single" w:color="D6CFC6" w:sz="4"/>
+              <w:right w:val="single" w:color="D6CFC6" w:sz="4"/>
+            </w:tcBorders>
+            <w:shd w:fill="F7F5F2" w:color="auto" w:val="clear"/>
+            <w:tcMar>
+              <w:top w:type="dxa" w:w="90"/>
+              <w:left w:type="dxa" w:w="130"/>
+              <w:bottom w:type="dxa" w:w="90"/>
+              <w:right w:type="dxa" w:w="130"/>
+            </w:tcMar>
+            <w:vAlign w:val="center"/>
+          </w:tcPr>
+          <w:p>
+            <w:pPr>
+              <w:spacing w:after="0" w:line="240"/>
             </w:pPr>
             <w:r>
               <w:rPr>
@@ -9474,7 +9511,121 @@
                 <w:sz w:val="20"/>
                 <w:szCs w:val="20"/>
               </w:rPr>
-              <w:t xml:space="preserve"/>
+              <w:t xml:space="preserve">The payment journey</w:t>
+            </w:r>
+          </w:p>
+        </w:tc>
+        <w:tc>
+          <w:tcPr>
+            <w:tcW w:type="dxa" w:w="5108"/>
+            <w:tcBorders>
+              <w:top w:val="single" w:color="D6CFC6" w:sz="4"/>
+              <w:left w:val="single" w:color="D6CFC6" w:sz="4"/>
+              <w:bottom w:val="single" w:color="D6CFC6" w:sz="4"/>
+              <w:right w:val="single" w:color="D6CFC6" w:sz="4"/>
+            </w:tcBorders>
+            <w:shd w:fill="F7F5F2" w:color="auto" w:val="clear"/>
+            <w:tcMar>
+              <w:top w:type="dxa" w:w="90"/>
+              <w:left w:type="dxa" w:w="130"/>
+              <w:bottom w:type="dxa" w:w="90"/>
+              <w:right w:type="dxa" w:w="130"/>
+            </w:tcMar>
+            <w:vAlign w:val="center"/>
+          </w:tcPr>
+          <w:p>
+            <w:pPr>
+              <w:spacing w:after="0" w:line="240"/>
+            </w:pPr>
+            <w:r>
+              <w:rPr>
+                <w:rFonts w:ascii="Calibri" w:cs="Calibri" w:eastAsia="Calibri" w:hAnsi="Calibri"/>
+                <w:b w:val="false"/>
+                <w:bCs w:val="false"/>
+                <w:i w:val="false"/>
+                <w:iCs w:val="false"/>
+                <w:color w:val="221E1F"/>
+                <w:sz w:val="20"/>
+                <w:szCs w:val="20"/>
+              </w:rPr>
+              <w:t xml:space="preserve">The join between the payment stack and the customer, which did not exist: checkout had “no provider is configured” written into its markup whatever the deployment had, and nothing anywhere called the intent endpoint. Checkout now reads the real configuration on the server, opens a payment and hands the customer to the gateway; the order endpoint reports what the payment is doing; the journey shows it and offers a way to pay; and the kitchen no longer cooks food nobody has paid for. Includes the two redirect URLs that were per-deployment when the page to return to is per-order</w:t>
+            </w:r>
+          </w:p>
+        </w:tc>
+        <w:tc>
+          <w:tcPr>
+            <w:tcW w:type="dxa" w:w="964"/>
+            <w:tcBorders>
+              <w:top w:val="single" w:color="D6CFC6" w:sz="4"/>
+              <w:left w:val="single" w:color="D6CFC6" w:sz="4"/>
+              <w:bottom w:val="single" w:color="D6CFC6" w:sz="4"/>
+              <w:right w:val="single" w:color="D6CFC6" w:sz="4"/>
+            </w:tcBorders>
+            <w:shd w:fill="F7F5F2" w:color="auto" w:val="clear"/>
+            <w:tcMar>
+              <w:top w:type="dxa" w:w="90"/>
+              <w:left w:type="dxa" w:w="130"/>
+              <w:bottom w:type="dxa" w:w="90"/>
+              <w:right w:type="dxa" w:w="130"/>
+            </w:tcMar>
+            <w:vAlign w:val="center"/>
+          </w:tcPr>
+          <w:p>
+            <w:pPr>
+              <w:spacing w:after="0" w:line="240"/>
+              <w:jc w:val="right"/>
+            </w:pPr>
+            <w:r>
+              <w:rPr>
+                <w:rFonts w:ascii="Calibri" w:cs="Calibri" w:eastAsia="Calibri" w:hAnsi="Calibri"/>
+                <w:b w:val="false"/>
+                <w:bCs w:val="false"/>
+                <w:i w:val="false"/>
+                <w:iCs w:val="false"/>
+                <w:color w:val="221E1F"/>
+                <w:sz w:val="20"/>
+                <w:szCs w:val="20"/>
+              </w:rPr>
+              <w:t xml:space="preserve">4</w:t>
+            </w:r>
+          </w:p>
+        </w:tc>
+      </w:tr>
+      <w:tr>
+        <w:tc>
+          <w:tcPr>
+            <w:tcW w:type="dxa" w:w="482"/>
+            <w:tcBorders>
+              <w:top w:val="single" w:color="D6CFC6" w:sz="4"/>
+              <w:left w:val="single" w:color="D6CFC6" w:sz="4"/>
+              <w:bottom w:val="single" w:color="D6CFC6" w:sz="4"/>
+              <w:right w:val="single" w:color="D6CFC6" w:sz="4"/>
+            </w:tcBorders>
+            <w:tcMar>
+              <w:top w:type="dxa" w:w="90"/>
+              <w:left w:type="dxa" w:w="130"/>
+              <w:bottom w:type="dxa" w:w="90"/>
+              <w:right w:type="dxa" w:w="130"/>
+            </w:tcMar>
+            <w:vAlign w:val="center"/>
+          </w:tcPr>
+          <w:p>
+            <w:pPr>
+              <w:spacing w:after="0" w:line="240"/>
+              <w:jc w:val="center"/>
+            </w:pPr>
+            <w:r>
+              <w:rPr>
+                <w:rFonts w:ascii="Calibri" w:cs="Calibri" w:eastAsia="Calibri" w:hAnsi="Calibri"/>
+                <w:b w:val="false"/>
+                <w:bCs w:val="false"/>
+                <w:i w:val="false"/>
+                <w:iCs w:val="false"/>
+                <w:color w:val="221E1F"/>
+                <w:sz w:val="20"/>
+                <w:szCs w:val="20"/>
+              </w:rPr>
+              <w:t xml:space="preserve">29</w:t>
             </w:r>
           </w:p>
         </w:tc>
@@ -9487,7 +9638,6 @@
               <w:bottom w:val="single" w:color="D6CFC6" w:sz="4"/>
               <w:right w:val="single" w:color="D6CFC6" w:sz="4"/>
             </w:tcBorders>
-            <w:shd w:fill="FCE8EB" w:color="auto" w:val="clear"/>
             <w:tcMar>
               <w:top w:type="dxa" w:w="90"/>
               <w:left w:type="dxa" w:w="130"/>
@@ -9511,7 +9661,7 @@
                 <w:sz w:val="20"/>
                 <w:szCs w:val="20"/>
               </w:rPr>
-              <w:t xml:space="preserve">Total</w:t>
+              <w:t xml:space="preserve">Password reset, reachable</w:t>
             </w:r>
           </w:p>
         </w:tc>
@@ -9524,6 +9674,81 @@
               <w:bottom w:val="single" w:color="D6CFC6" w:sz="4"/>
               <w:right w:val="single" w:color="D6CFC6" w:sz="4"/>
             </w:tcBorders>
+            <w:tcMar>
+              <w:top w:type="dxa" w:w="90"/>
+              <w:left w:type="dxa" w:w="130"/>
+              <w:bottom w:type="dxa" w:w="90"/>
+              <w:right w:type="dxa" w:w="130"/>
+            </w:tcMar>
+            <w:vAlign w:val="center"/>
+          </w:tcPr>
+          <w:p>
+            <w:pPr>
+              <w:spacing w:after="0" w:line="240"/>
+            </w:pPr>
+            <w:r>
+              <w:rPr>
+                <w:rFonts w:ascii="Calibri" w:cs="Calibri" w:eastAsia="Calibri" w:hAnsi="Calibri"/>
+                <w:b w:val="false"/>
+                <w:bCs w:val="false"/>
+                <w:i w:val="false"/>
+                <w:iCs w:val="false"/>
+                <w:color w:val="221E1F"/>
+                <w:sz w:val="20"/>
+                <w:szCs w:val="20"/>
+              </w:rPr>
+              <w:t xml:space="preserve">The reset flow had no way in — no “forgot your password” anywhere on the site. The request and completion screens, arrival straight from the emailed link, and a link in the message instead of 43 characters to retype</w:t>
+            </w:r>
+          </w:p>
+        </w:tc>
+        <w:tc>
+          <w:tcPr>
+            <w:tcW w:type="dxa" w:w="964"/>
+            <w:tcBorders>
+              <w:top w:val="single" w:color="D6CFC6" w:sz="4"/>
+              <w:left w:val="single" w:color="D6CFC6" w:sz="4"/>
+              <w:bottom w:val="single" w:color="D6CFC6" w:sz="4"/>
+              <w:right w:val="single" w:color="D6CFC6" w:sz="4"/>
+            </w:tcBorders>
+            <w:tcMar>
+              <w:top w:type="dxa" w:w="90"/>
+              <w:left w:type="dxa" w:w="130"/>
+              <w:bottom w:type="dxa" w:w="90"/>
+              <w:right w:type="dxa" w:w="130"/>
+            </w:tcMar>
+            <w:vAlign w:val="center"/>
+          </w:tcPr>
+          <w:p>
+            <w:pPr>
+              <w:spacing w:after="0" w:line="240"/>
+              <w:jc w:val="right"/>
+            </w:pPr>
+            <w:r>
+              <w:rPr>
+                <w:rFonts w:ascii="Calibri" w:cs="Calibri" w:eastAsia="Calibri" w:hAnsi="Calibri"/>
+                <w:b w:val="false"/>
+                <w:bCs w:val="false"/>
+                <w:i w:val="false"/>
+                <w:iCs w:val="false"/>
+                <w:color w:val="221E1F"/>
+                <w:sz w:val="20"/>
+                <w:szCs w:val="20"/>
+              </w:rPr>
+              <w:t xml:space="preserve">2</w:t>
+            </w:r>
+          </w:p>
+        </w:tc>
+      </w:tr>
+      <w:tr>
+        <w:tc>
+          <w:tcPr>
+            <w:tcW w:type="dxa" w:w="482"/>
+            <w:tcBorders>
+              <w:top w:val="single" w:color="D6CFC6" w:sz="4"/>
+              <w:left w:val="single" w:color="D6CFC6" w:sz="4"/>
+              <w:bottom w:val="single" w:color="D6CFC6" w:sz="4"/>
+              <w:right w:val="single" w:color="D6CFC6" w:sz="4"/>
+            </w:tcBorders>
             <w:shd w:fill="FCE8EB" w:color="auto" w:val="clear"/>
             <w:tcMar>
               <w:top w:type="dxa" w:w="90"/>
@@ -9536,6 +9761,7 @@
           <w:p>
             <w:pPr>
               <w:spacing w:after="0" w:line="240"/>
+              <w:jc w:val="center"/>
             </w:pPr>
             <w:r>
               <w:rPr>
@@ -9548,13 +9774,13 @@
                 <w:sz w:val="20"/>
                 <w:szCs w:val="20"/>
               </w:rPr>
-              <w:t xml:space="preserve">Delivered scope</w:t>
-            </w:r>
-          </w:p>
-        </w:tc>
-        <w:tc>
-          <w:tcPr>
-            <w:tcW w:type="dxa" w:w="964"/>
+              <w:t xml:space="preserve"/>
+            </w:r>
+          </w:p>
+        </w:tc>
+        <w:tc>
+          <w:tcPr>
+            <w:tcW w:type="dxa" w:w="3084"/>
             <w:tcBorders>
               <w:top w:val="single" w:color="D6CFC6" w:sz="4"/>
               <w:left w:val="single" w:color="D6CFC6" w:sz="4"/>
@@ -9573,7 +9799,6 @@
           <w:p>
             <w:pPr>
               <w:spacing w:after="0" w:line="240"/>
-              <w:jc w:val="right"/>
             </w:pPr>
             <w:r>
               <w:rPr>
@@ -9586,7 +9811,82 @@
                 <w:sz w:val="20"/>
                 <w:szCs w:val="20"/>
               </w:rPr>
-              <w:t xml:space="preserve">163</w:t>
+              <w:t xml:space="preserve">Total</w:t>
+            </w:r>
+          </w:p>
+        </w:tc>
+        <w:tc>
+          <w:tcPr>
+            <w:tcW w:type="dxa" w:w="5108"/>
+            <w:tcBorders>
+              <w:top w:val="single" w:color="D6CFC6" w:sz="4"/>
+              <w:left w:val="single" w:color="D6CFC6" w:sz="4"/>
+              <w:bottom w:val="single" w:color="D6CFC6" w:sz="4"/>
+              <w:right w:val="single" w:color="D6CFC6" w:sz="4"/>
+            </w:tcBorders>
+            <w:shd w:fill="FCE8EB" w:color="auto" w:val="clear"/>
+            <w:tcMar>
+              <w:top w:type="dxa" w:w="90"/>
+              <w:left w:type="dxa" w:w="130"/>
+              <w:bottom w:type="dxa" w:w="90"/>
+              <w:right w:type="dxa" w:w="130"/>
+            </w:tcMar>
+            <w:vAlign w:val="center"/>
+          </w:tcPr>
+          <w:p>
+            <w:pPr>
+              <w:spacing w:after="0" w:line="240"/>
+            </w:pPr>
+            <w:r>
+              <w:rPr>
+                <w:rFonts w:ascii="Calibri" w:cs="Calibri" w:eastAsia="Calibri" w:hAnsi="Calibri"/>
+                <w:b/>
+                <w:bCs/>
+                <w:i w:val="false"/>
+                <w:iCs w:val="false"/>
+                <w:color w:val="221E1F"/>
+                <w:sz w:val="20"/>
+                <w:szCs w:val="20"/>
+              </w:rPr>
+              <w:t xml:space="preserve">Delivered scope</w:t>
+            </w:r>
+          </w:p>
+        </w:tc>
+        <w:tc>
+          <w:tcPr>
+            <w:tcW w:type="dxa" w:w="964"/>
+            <w:tcBorders>
+              <w:top w:val="single" w:color="D6CFC6" w:sz="4"/>
+              <w:left w:val="single" w:color="D6CFC6" w:sz="4"/>
+              <w:bottom w:val="single" w:color="D6CFC6" w:sz="4"/>
+              <w:right w:val="single" w:color="D6CFC6" w:sz="4"/>
+            </w:tcBorders>
+            <w:shd w:fill="FCE8EB" w:color="auto" w:val="clear"/>
+            <w:tcMar>
+              <w:top w:type="dxa" w:w="90"/>
+              <w:left w:type="dxa" w:w="130"/>
+              <w:bottom w:type="dxa" w:w="90"/>
+              <w:right w:type="dxa" w:w="130"/>
+            </w:tcMar>
+            <w:vAlign w:val="center"/>
+          </w:tcPr>
+          <w:p>
+            <w:pPr>
+              <w:spacing w:after="0" w:line="240"/>
+              <w:jc w:val="right"/>
+            </w:pPr>
+            <w:r>
+              <w:rPr>
+                <w:rFonts w:ascii="Calibri" w:cs="Calibri" w:eastAsia="Calibri" w:hAnsi="Calibri"/>
+                <w:b/>
+                <w:bCs/>
+                <w:i w:val="false"/>
+                <w:iCs w:val="false"/>
+                <w:color w:val="221E1F"/>
+                <w:sz w:val="20"/>
+                <w:szCs w:val="20"/>
+              </w:rPr>
+              <w:t xml:space="preserve">169</w:t>
             </w:r>
           </w:p>
         </w:tc>
@@ -9638,7 +9938,7 @@
           <w:sz w:val="20"/>
           <w:szCs w:val="20"/>
         </w:rPr>
-        <w:t xml:space="preserve">26,237 hand-written lines over 163 days is about 161 a day. For tested, typed, reviewed production code that sits inside the normal 100–300 band, and lower than the 200 the first version of this document reconstructed — integration work carries more test and less code than storefront work does. The reconstruction is not inflated.</w:t>
+        <w:t xml:space="preserve">27,291 hand-written lines over 169 days is about 161 a day. For tested, typed, reviewed production code that sits inside the normal 100–300 band, and lower than the 200 the first version of this document reconstructed — integration work carries more test and less code than storefront work does. The reconstruction is not inflated.</w:t>
       </w:r>
     </w:p>
     <w:p>
@@ -9656,7 +9956,7 @@
           <w:sz w:val="20"/>
           <w:szCs w:val="20"/>
         </w:rPr>
-        <w:t xml:space="preserve">163 days is roughly 27 working weeks, or a little over six months for one person. Two people working in parallel would compress the calendar but not the total, and would add coordination cost.</w:t>
+        <w:t xml:space="preserve">169 days is roughly 27 working weeks, or a little over six months for one person. Two people working in parallel would compress the calendar but not the total, and would add coordination cost.</w:t>
       </w:r>
     </w:p>
     <w:p>
@@ -9727,7 +10027,7 @@
           <w:sz w:val="20"/>
           <w:szCs w:val="20"/>
         </w:rPr>
-        <w:t xml:space="preserve">Delivered scope: 163 days × 8 hours = 1304 hours.</w:t>
+        <w:t xml:space="preserve">Delivered scope: 169 days × 8 hours = 1352 hours.</w:t>
       </w:r>
     </w:p>
     <w:tbl>
@@ -9822,7 +10122,7 @@
                 <w:sz w:val="19"/>
                 <w:szCs w:val="19"/>
               </w:rPr>
-              <w:t xml:space="preserve">Cost of the 1304 hours (excl. VAT)</w:t>
+              <w:t xml:space="preserve">Cost of the 1352 hours (excl. VAT)</w:t>
             </w:r>
           </w:p>
         </w:tc>
@@ -9935,7 +10235,7 @@
                 <w:sz w:val="20"/>
                 <w:szCs w:val="20"/>
               </w:rPr>
-              <w:t xml:space="preserve">R 521,600</w:t>
+              <w:t xml:space="preserve">R 540,800</w:t>
             </w:r>
           </w:p>
         </w:tc>
@@ -9972,7 +10272,7 @@
                 <w:sz w:val="20"/>
                 <w:szCs w:val="20"/>
               </w:rPr>
-              <w:t xml:space="preserve">R 599,840</w:t>
+              <w:t xml:space="preserve">R 621,920</w:t>
             </w:r>
           </w:p>
         </w:tc>
@@ -10049,7 +10349,7 @@
                 <w:sz w:val="20"/>
                 <w:szCs w:val="20"/>
               </w:rPr>
-              <w:t xml:space="preserve">R 847,600</w:t>
+              <w:t xml:space="preserve">R 878,800</w:t>
             </w:r>
           </w:p>
         </w:tc>
@@ -10087,7 +10387,7 @@
                 <w:sz w:val="20"/>
                 <w:szCs w:val="20"/>
               </w:rPr>
-              <w:t xml:space="preserve">R 974,740</w:t>
+              <w:t xml:space="preserve">R 1,010,620</w:t>
             </w:r>
           </w:p>
         </w:tc>
@@ -10162,7 +10462,7 @@
                 <w:sz w:val="20"/>
                 <w:szCs w:val="20"/>
               </w:rPr>
-              <w:t xml:space="preserve">R 1,108,400</w:t>
+              <w:t xml:space="preserve">R 1,149,200</w:t>
             </w:r>
           </w:p>
         </w:tc>
@@ -10199,7 +10499,7 @@
                 <w:sz w:val="20"/>
                 <w:szCs w:val="20"/>
               </w:rPr>
-              <w:t xml:space="preserve">R 1,274,660</w:t>
+              <w:t xml:space="preserve">R 1,321,580</w:t>
             </w:r>
           </w:p>
         </w:tc>
@@ -10276,7 +10576,7 @@
                 <w:sz w:val="20"/>
                 <w:szCs w:val="20"/>
               </w:rPr>
-              <w:t xml:space="preserve">R 1,238,800</w:t>
+              <w:t xml:space="preserve">R 1,284,400</w:t>
             </w:r>
           </w:p>
         </w:tc>
@@ -10314,7 +10614,7 @@
                 <w:sz w:val="20"/>
                 <w:szCs w:val="20"/>
               </w:rPr>
-              <w:t xml:space="preserve">R 1,424,620</w:t>
+              <w:t xml:space="preserve">R 1,477,060</w:t>
             </w:r>
           </w:p>
         </w:tc>
@@ -10389,7 +10689,7 @@
                 <w:sz w:val="20"/>
                 <w:szCs w:val="20"/>
               </w:rPr>
-              <w:t xml:space="preserve">R 1,499,600</w:t>
+              <w:t xml:space="preserve">R 1,554,800</w:t>
             </w:r>
           </w:p>
         </w:tc>
@@ -10426,7 +10726,7 @@
                 <w:sz w:val="20"/>
                 <w:szCs w:val="20"/>
               </w:rPr>
-              <w:t xml:space="preserve">R 1,724,540</w:t>
+              <w:t xml:space="preserve">R 1,788,020</w:t>
             </w:r>
           </w:p>
         </w:tc>
@@ -10503,7 +10803,7 @@
                 <w:sz w:val="20"/>
                 <w:szCs w:val="20"/>
               </w:rPr>
-              <w:t xml:space="preserve">R 1,890,800</w:t>
+              <w:t xml:space="preserve">R 1,960,400</w:t>
             </w:r>
           </w:p>
         </w:tc>
@@ -10541,7 +10841,7 @@
                 <w:sz w:val="20"/>
                 <w:szCs w:val="20"/>
               </w:rPr>
-              <w:t xml:space="preserve">R 2,174,420</w:t>
+              <w:t xml:space="preserve">R 2,254,460</w:t>
             </w:r>
           </w:p>
         </w:tc>
@@ -10593,7 +10893,7 @@
           <w:sz w:val="20"/>
           <w:szCs w:val="20"/>
         </w:rPr>
-        <w:t xml:space="preserve">At an illustrative blended rate of R 950 an hour — chosen here only to make the rest of the document concrete — the delivered scope comes to R 1,238,800 excluding VAT, or R 1,424,620 including it. Replace the rate and every figure below moves proportionally.</w:t>
+        <w:t xml:space="preserve">At an illustrative blended rate of R 950 an hour — chosen here only to make the rest of the document concrete — the delivered scope comes to R 1,284,400 excluding VAT, or R 1,477,060 including it. Replace the rate and every figure below moves proportionally.</w:t>
       </w:r>
     </w:p>
     <w:p>
@@ -14872,6 +15172,308 @@
               <w:bottom w:val="single" w:color="D6CFC6" w:sz="4"/>
               <w:right w:val="single" w:color="D6CFC6" w:sz="4"/>
             </w:tcBorders>
+            <w:shd w:fill="F7F5F2" w:color="auto" w:val="clear"/>
+            <w:tcMar>
+              <w:top w:type="dxa" w:w="90"/>
+              <w:left w:type="dxa" w:w="130"/>
+              <w:bottom w:type="dxa" w:w="90"/>
+              <w:right w:type="dxa" w:w="130"/>
+            </w:tcMar>
+            <w:vAlign w:val="center"/>
+          </w:tcPr>
+          <w:p>
+            <w:pPr>
+              <w:spacing w:after="0" w:line="240"/>
+            </w:pPr>
+            <w:r>
+              <w:rPr>
+                <w:rFonts w:ascii="Calibri" w:cs="Calibri" w:eastAsia="Calibri" w:hAnsi="Calibri"/>
+                <w:b w:val="false"/>
+                <w:bCs w:val="false"/>
+                <w:i w:val="false"/>
+                <w:iCs w:val="false"/>
+                <w:color w:val="221E1F"/>
+                <w:sz w:val="20"/>
+                <w:szCs w:val="20"/>
+              </w:rPr>
+              <w:t xml:space="preserve">The payment journey</w:t>
+            </w:r>
+          </w:p>
+        </w:tc>
+        <w:tc>
+          <w:tcPr>
+            <w:tcW w:type="dxa" w:w="1157"/>
+            <w:tcBorders>
+              <w:top w:val="single" w:color="D6CFC6" w:sz="4"/>
+              <w:left w:val="single" w:color="D6CFC6" w:sz="4"/>
+              <w:bottom w:val="single" w:color="D6CFC6" w:sz="4"/>
+              <w:right w:val="single" w:color="D6CFC6" w:sz="4"/>
+            </w:tcBorders>
+            <w:shd w:fill="F7F5F2" w:color="auto" w:val="clear"/>
+            <w:tcMar>
+              <w:top w:type="dxa" w:w="90"/>
+              <w:left w:type="dxa" w:w="130"/>
+              <w:bottom w:type="dxa" w:w="90"/>
+              <w:right w:type="dxa" w:w="130"/>
+            </w:tcMar>
+            <w:vAlign w:val="center"/>
+          </w:tcPr>
+          <w:p>
+            <w:pPr>
+              <w:spacing w:after="0" w:line="240"/>
+              <w:jc w:val="right"/>
+            </w:pPr>
+            <w:r>
+              <w:rPr>
+                <w:rFonts w:ascii="Calibri" w:cs="Calibri" w:eastAsia="Calibri" w:hAnsi="Calibri"/>
+                <w:b w:val="false"/>
+                <w:bCs w:val="false"/>
+                <w:i w:val="false"/>
+                <w:iCs w:val="false"/>
+                <w:color w:val="221E1F"/>
+                <w:sz w:val="20"/>
+                <w:szCs w:val="20"/>
+              </w:rPr>
+              <w:t xml:space="preserve">4</w:t>
+            </w:r>
+          </w:p>
+        </w:tc>
+        <w:tc>
+          <w:tcPr>
+            <w:tcW w:type="dxa" w:w="1542"/>
+            <w:tcBorders>
+              <w:top w:val="single" w:color="D6CFC6" w:sz="4"/>
+              <w:left w:val="single" w:color="D6CFC6" w:sz="4"/>
+              <w:bottom w:val="single" w:color="D6CFC6" w:sz="4"/>
+              <w:right w:val="single" w:color="D6CFC6" w:sz="4"/>
+            </w:tcBorders>
+            <w:shd w:fill="F7F5F2" w:color="auto" w:val="clear"/>
+            <w:tcMar>
+              <w:top w:type="dxa" w:w="90"/>
+              <w:left w:type="dxa" w:w="130"/>
+              <w:bottom w:type="dxa" w:w="90"/>
+              <w:right w:type="dxa" w:w="130"/>
+            </w:tcMar>
+            <w:vAlign w:val="center"/>
+          </w:tcPr>
+          <w:p>
+            <w:pPr>
+              <w:spacing w:after="0" w:line="240"/>
+              <w:jc w:val="right"/>
+            </w:pPr>
+            <w:r>
+              <w:rPr>
+                <w:rFonts w:ascii="Calibri" w:cs="Calibri" w:eastAsia="Calibri" w:hAnsi="Calibri"/>
+                <w:b w:val="false"/>
+                <w:bCs w:val="false"/>
+                <w:i w:val="false"/>
+                <w:iCs w:val="false"/>
+                <w:color w:val="221E1F"/>
+                <w:sz w:val="20"/>
+                <w:szCs w:val="20"/>
+              </w:rPr>
+              <w:t xml:space="preserve">32</w:t>
+            </w:r>
+          </w:p>
+        </w:tc>
+        <w:tc>
+          <w:tcPr>
+            <w:tcW w:type="dxa" w:w="1638"/>
+            <w:tcBorders>
+              <w:top w:val="single" w:color="D6CFC6" w:sz="4"/>
+              <w:left w:val="single" w:color="D6CFC6" w:sz="4"/>
+              <w:bottom w:val="single" w:color="D6CFC6" w:sz="4"/>
+              <w:right w:val="single" w:color="D6CFC6" w:sz="4"/>
+            </w:tcBorders>
+            <w:shd w:fill="F7F5F2" w:color="auto" w:val="clear"/>
+            <w:tcMar>
+              <w:top w:type="dxa" w:w="90"/>
+              <w:left w:type="dxa" w:w="130"/>
+              <w:bottom w:type="dxa" w:w="90"/>
+              <w:right w:type="dxa" w:w="130"/>
+            </w:tcMar>
+            <w:vAlign w:val="center"/>
+          </w:tcPr>
+          <w:p>
+            <w:pPr>
+              <w:spacing w:after="0" w:line="240"/>
+              <w:jc w:val="right"/>
+            </w:pPr>
+            <w:r>
+              <w:rPr>
+                <w:rFonts w:ascii="Calibri" w:cs="Calibri" w:eastAsia="Calibri" w:hAnsi="Calibri"/>
+                <w:b w:val="false"/>
+                <w:bCs w:val="false"/>
+                <w:i w:val="false"/>
+                <w:iCs w:val="false"/>
+                <w:color w:val="221E1F"/>
+                <w:sz w:val="20"/>
+                <w:szCs w:val="20"/>
+              </w:rPr>
+              <w:t xml:space="preserve">R 30,400</w:t>
+            </w:r>
+          </w:p>
+        </w:tc>
+      </w:tr>
+      <w:tr>
+        <w:tc>
+          <w:tcPr>
+            <w:tcW w:type="dxa" w:w="5301"/>
+            <w:tcBorders>
+              <w:top w:val="single" w:color="D6CFC6" w:sz="4"/>
+              <w:left w:val="single" w:color="D6CFC6" w:sz="4"/>
+              <w:bottom w:val="single" w:color="D6CFC6" w:sz="4"/>
+              <w:right w:val="single" w:color="D6CFC6" w:sz="4"/>
+            </w:tcBorders>
+            <w:tcMar>
+              <w:top w:type="dxa" w:w="90"/>
+              <w:left w:type="dxa" w:w="130"/>
+              <w:bottom w:type="dxa" w:w="90"/>
+              <w:right w:type="dxa" w:w="130"/>
+            </w:tcMar>
+            <w:vAlign w:val="center"/>
+          </w:tcPr>
+          <w:p>
+            <w:pPr>
+              <w:spacing w:after="0" w:line="240"/>
+            </w:pPr>
+            <w:r>
+              <w:rPr>
+                <w:rFonts w:ascii="Calibri" w:cs="Calibri" w:eastAsia="Calibri" w:hAnsi="Calibri"/>
+                <w:b w:val="false"/>
+                <w:bCs w:val="false"/>
+                <w:i w:val="false"/>
+                <w:iCs w:val="false"/>
+                <w:color w:val="221E1F"/>
+                <w:sz w:val="20"/>
+                <w:szCs w:val="20"/>
+              </w:rPr>
+              <w:t xml:space="preserve">Password reset, reachable</w:t>
+            </w:r>
+          </w:p>
+        </w:tc>
+        <w:tc>
+          <w:tcPr>
+            <w:tcW w:type="dxa" w:w="1157"/>
+            <w:tcBorders>
+              <w:top w:val="single" w:color="D6CFC6" w:sz="4"/>
+              <w:left w:val="single" w:color="D6CFC6" w:sz="4"/>
+              <w:bottom w:val="single" w:color="D6CFC6" w:sz="4"/>
+              <w:right w:val="single" w:color="D6CFC6" w:sz="4"/>
+            </w:tcBorders>
+            <w:tcMar>
+              <w:top w:type="dxa" w:w="90"/>
+              <w:left w:type="dxa" w:w="130"/>
+              <w:bottom w:type="dxa" w:w="90"/>
+              <w:right w:type="dxa" w:w="130"/>
+            </w:tcMar>
+            <w:vAlign w:val="center"/>
+          </w:tcPr>
+          <w:p>
+            <w:pPr>
+              <w:spacing w:after="0" w:line="240"/>
+              <w:jc w:val="right"/>
+            </w:pPr>
+            <w:r>
+              <w:rPr>
+                <w:rFonts w:ascii="Calibri" w:cs="Calibri" w:eastAsia="Calibri" w:hAnsi="Calibri"/>
+                <w:b w:val="false"/>
+                <w:bCs w:val="false"/>
+                <w:i w:val="false"/>
+                <w:iCs w:val="false"/>
+                <w:color w:val="221E1F"/>
+                <w:sz w:val="20"/>
+                <w:szCs w:val="20"/>
+              </w:rPr>
+              <w:t xml:space="preserve">2</w:t>
+            </w:r>
+          </w:p>
+        </w:tc>
+        <w:tc>
+          <w:tcPr>
+            <w:tcW w:type="dxa" w:w="1542"/>
+            <w:tcBorders>
+              <w:top w:val="single" w:color="D6CFC6" w:sz="4"/>
+              <w:left w:val="single" w:color="D6CFC6" w:sz="4"/>
+              <w:bottom w:val="single" w:color="D6CFC6" w:sz="4"/>
+              <w:right w:val="single" w:color="D6CFC6" w:sz="4"/>
+            </w:tcBorders>
+            <w:tcMar>
+              <w:top w:type="dxa" w:w="90"/>
+              <w:left w:type="dxa" w:w="130"/>
+              <w:bottom w:type="dxa" w:w="90"/>
+              <w:right w:type="dxa" w:w="130"/>
+            </w:tcMar>
+            <w:vAlign w:val="center"/>
+          </w:tcPr>
+          <w:p>
+            <w:pPr>
+              <w:spacing w:after="0" w:line="240"/>
+              <w:jc w:val="right"/>
+            </w:pPr>
+            <w:r>
+              <w:rPr>
+                <w:rFonts w:ascii="Calibri" w:cs="Calibri" w:eastAsia="Calibri" w:hAnsi="Calibri"/>
+                <w:b w:val="false"/>
+                <w:bCs w:val="false"/>
+                <w:i w:val="false"/>
+                <w:iCs w:val="false"/>
+                <w:color w:val="221E1F"/>
+                <w:sz w:val="20"/>
+                <w:szCs w:val="20"/>
+              </w:rPr>
+              <w:t xml:space="preserve">16</w:t>
+            </w:r>
+          </w:p>
+        </w:tc>
+        <w:tc>
+          <w:tcPr>
+            <w:tcW w:type="dxa" w:w="1638"/>
+            <w:tcBorders>
+              <w:top w:val="single" w:color="D6CFC6" w:sz="4"/>
+              <w:left w:val="single" w:color="D6CFC6" w:sz="4"/>
+              <w:bottom w:val="single" w:color="D6CFC6" w:sz="4"/>
+              <w:right w:val="single" w:color="D6CFC6" w:sz="4"/>
+            </w:tcBorders>
+            <w:tcMar>
+              <w:top w:type="dxa" w:w="90"/>
+              <w:left w:type="dxa" w:w="130"/>
+              <w:bottom w:type="dxa" w:w="90"/>
+              <w:right w:type="dxa" w:w="130"/>
+            </w:tcMar>
+            <w:vAlign w:val="center"/>
+          </w:tcPr>
+          <w:p>
+            <w:pPr>
+              <w:spacing w:after="0" w:line="240"/>
+              <w:jc w:val="right"/>
+            </w:pPr>
+            <w:r>
+              <w:rPr>
+                <w:rFonts w:ascii="Calibri" w:cs="Calibri" w:eastAsia="Calibri" w:hAnsi="Calibri"/>
+                <w:b w:val="false"/>
+                <w:bCs w:val="false"/>
+                <w:i w:val="false"/>
+                <w:iCs w:val="false"/>
+                <w:color w:val="221E1F"/>
+                <w:sz w:val="20"/>
+                <w:szCs w:val="20"/>
+              </w:rPr>
+              <w:t xml:space="preserve">R 15,200</w:t>
+            </w:r>
+          </w:p>
+        </w:tc>
+      </w:tr>
+      <w:tr>
+        <w:tc>
+          <w:tcPr>
+            <w:tcW w:type="dxa" w:w="5301"/>
+            <w:tcBorders>
+              <w:top w:val="single" w:color="D6CFC6" w:sz="4"/>
+              <w:left w:val="single" w:color="D6CFC6" w:sz="4"/>
+              <w:bottom w:val="single" w:color="D6CFC6" w:sz="4"/>
+              <w:right w:val="single" w:color="D6CFC6" w:sz="4"/>
+            </w:tcBorders>
             <w:shd w:fill="FCE8EB" w:color="auto" w:val="clear"/>
             <w:tcMar>
               <w:top w:type="dxa" w:w="90"/>
@@ -14934,7 +15536,7 @@
                 <w:sz w:val="20"/>
                 <w:szCs w:val="20"/>
               </w:rPr>
-              <w:t xml:space="preserve">163</w:t>
+              <w:t xml:space="preserve">169</w:t>
             </w:r>
           </w:p>
         </w:tc>
@@ -14972,7 +15574,7 @@
                 <w:sz w:val="20"/>
                 <w:szCs w:val="20"/>
               </w:rPr>
-              <w:t xml:space="preserve">1,304</w:t>
+              <w:t xml:space="preserve">1,352</w:t>
             </w:r>
           </w:p>
         </w:tc>
@@ -15010,7 +15612,7 @@
                 <w:sz w:val="20"/>
                 <w:szCs w:val="20"/>
               </w:rPr>
-              <w:t xml:space="preserve">R 1,238,800</w:t>
+              <w:t xml:space="preserve">R 1,284,400</w:t>
             </w:r>
           </w:p>
         </w:tc>
@@ -15049,7 +15651,7 @@
           <w:sz w:val="20"/>
           <w:szCs w:val="20"/>
         </w:rPr>
-        <w:t xml:space="preserve">The integration seams — payments, accounts, notifications, POS and courier — are 44 of the 163 days. None of them names a vendor, and none has to be rewritten when one is chosen: what remains per integration is an adapter against an interface that already exists and is already tested.</w:t>
+        <w:t xml:space="preserve">The integration seams — payments, accounts, notifications, POS and courier — are 44 of the 169 days. None of them names a vendor, and none has to be rewritten when one is chosen: what remains per integration is an adapter against an interface that already exists and is already tested.</w:t>
       </w:r>
     </w:p>
     <w:p>
@@ -15333,7 +15935,7 @@
                 <w:sz w:val="20"/>
                 <w:szCs w:val="20"/>
               </w:rPr>
-              <w:t xml:space="preserve">The adapter is written and tested. What is left needs a merchant account: confirming PayFast accepts our signature, then failure and retry testing against their sandbox</w:t>
+              <w:t xml:space="preserve">The adapter is written and the checkout journey through it is built end to end. What is left needs a merchant account: confirming PayFast accepts our signature, then failure and retry testing against their sandbox</w:t>
             </w:r>
           </w:p>
         </w:tc>
@@ -17168,7 +17770,7 @@
                 <w:sz w:val="20"/>
                 <w:szCs w:val="20"/>
               </w:rPr>
-              <w:t xml:space="preserve">163</w:t>
+              <w:t xml:space="preserve">169</w:t>
             </w:r>
           </w:p>
         </w:tc>
@@ -17205,7 +17807,7 @@
                 <w:sz w:val="20"/>
                 <w:szCs w:val="20"/>
               </w:rPr>
-              <w:t xml:space="preserve">1,304</w:t>
+              <w:t xml:space="preserve">1,352</w:t>
             </w:r>
           </w:p>
         </w:tc>
@@ -17242,7 +17844,7 @@
                 <w:sz w:val="20"/>
                 <w:szCs w:val="20"/>
               </w:rPr>
-              <w:t xml:space="preserve">R 1,238,800</w:t>
+              <w:t xml:space="preserve">R 1,284,400</w:t>
             </w:r>
           </w:p>
         </w:tc>
@@ -17472,7 +18074,7 @@
                 <w:sz w:val="20"/>
                 <w:szCs w:val="20"/>
               </w:rPr>
-              <w:t xml:space="preserve">188</w:t>
+              <w:t xml:space="preserve">194</w:t>
             </w:r>
           </w:p>
         </w:tc>
@@ -17510,7 +18112,7 @@
                 <w:sz w:val="20"/>
                 <w:szCs w:val="20"/>
               </w:rPr>
-              <w:t xml:space="preserve">1,504</w:t>
+              <w:t xml:space="preserve">1,552</w:t>
             </w:r>
           </w:p>
         </w:tc>
@@ -17548,7 +18150,7 @@
                 <w:sz w:val="20"/>
                 <w:szCs w:val="20"/>
               </w:rPr>
-              <w:t xml:space="preserve">R 1,428,800</w:t>
+              <w:t xml:space="preserve">R 1,474,400</w:t>
             </w:r>
           </w:p>
         </w:tc>

</xml_diff>

<commit_message>
Reprice with the console workstream
172 delivered days, 25 remaining, 197 end to end. The measured counts
move with it: 26 endpoints, 769 tests in 38 files.

Co-Authored-By: Claude Opus 5 <noreply@anthropic.com>
Claude-Session: https://claude.ai/code/session_01B2xsFCpQEfEHuTCkYzyD13
</commit_message>
<xml_diff>
--- a/WEBSITE_COSTINGS.docx
+++ b/WEBSITE_COSTINGS.docx
@@ -1190,7 +1190,7 @@
                 <w:sz w:val="20"/>
                 <w:szCs w:val="20"/>
               </w:rPr>
-              <w:t xml:space="preserve">25</w:t>
+              <w:t xml:space="preserve">26</w:t>
             </w:r>
           </w:p>
         </w:tc>
@@ -1527,7 +1527,7 @@
                 <w:sz w:val="20"/>
                 <w:szCs w:val="20"/>
               </w:rPr>
-              <w:t xml:space="preserve">753</w:t>
+              <w:t xml:space="preserve">769</w:t>
             </w:r>
           </w:p>
         </w:tc>
@@ -1563,7 +1563,7 @@
                 <w:sz w:val="20"/>
                 <w:szCs w:val="20"/>
               </w:rPr>
-              <w:t xml:space="preserve">In 37 files; all passing</w:t>
+              <w:t xml:space="preserve">In 38 files; all passing</w:t>
             </w:r>
           </w:p>
         </w:tc>
@@ -1640,7 +1640,7 @@
                 <w:sz w:val="20"/>
                 <w:szCs w:val="20"/>
               </w:rPr>
-              <w:t xml:space="preserve">27,291</w:t>
+              <w:t xml:space="preserve">27,878</w:t>
             </w:r>
           </w:p>
         </w:tc>
@@ -1677,7 +1677,7 @@
                 <w:sz w:val="20"/>
                 <w:szCs w:val="20"/>
               </w:rPr>
-              <w:t xml:space="preserve">Application 11,866 · tests 9,998 · review build 2,563 · data, schema and tooling 2,112 · shared packages 752</w:t>
+              <w:t xml:space="preserve">Application 12,154 · tests 10,296 · review build 2,563 · data, schema and tooling 2,113 · shared packages 752</w:t>
             </w:r>
           </w:p>
         </w:tc>
@@ -1865,7 +1865,7 @@
                 <w:sz w:val="20"/>
                 <w:szCs w:val="20"/>
               </w:rPr>
-              <w:t xml:space="preserve">103</w:t>
+              <w:t xml:space="preserve">105</w:t>
             </w:r>
           </w:p>
         </w:tc>
@@ -3770,7 +3770,7 @@
                 <w:sz w:val="20"/>
                 <w:szCs w:val="20"/>
               </w:rPr>
-              <w:t xml:space="preserve">753 passing</w:t>
+              <w:t xml:space="preserve">769 passing</w:t>
             </w:r>
           </w:p>
         </w:tc>
@@ -3807,7 +3807,7 @@
                 <w:sz w:val="20"/>
                 <w:szCs w:val="20"/>
               </w:rPr>
-              <w:t xml:space="preserve">37 files, including four real worker processes racing on one file</w:t>
+              <w:t xml:space="preserve">38 files, including four real worker processes racing on one file</w:t>
             </w:r>
           </w:p>
         </w:tc>
@@ -6548,7 +6548,7 @@
                 <w:sz w:val="20"/>
                 <w:szCs w:val="20"/>
               </w:rPr>
-              <w:t xml:space="preserve">The suite as it stood at this workstream: the 753 tests now in 37 files grew with the workstreams below. Driven through route handlers rather than helpers</w:t>
+              <w:t xml:space="preserve">The suite as it stood at this workstream: the 769 tests now in 38 files grew with the workstreams below. Driven through route handlers rather than helpers</w:t>
             </w:r>
           </w:p>
         </w:tc>
@@ -9749,7 +9749,7 @@
               <w:bottom w:val="single" w:color="D6CFC6" w:sz="4"/>
               <w:right w:val="single" w:color="D6CFC6" w:sz="4"/>
             </w:tcBorders>
-            <w:shd w:fill="FCE8EB" w:color="auto" w:val="clear"/>
+            <w:shd w:fill="F7F5F2" w:color="auto" w:val="clear"/>
             <w:tcMar>
               <w:top w:type="dxa" w:w="90"/>
               <w:left w:type="dxa" w:w="130"/>
@@ -9762,6 +9762,43 @@
             <w:pPr>
               <w:spacing w:after="0" w:line="240"/>
               <w:jc w:val="center"/>
+            </w:pPr>
+            <w:r>
+              <w:rPr>
+                <w:rFonts w:ascii="Calibri" w:cs="Calibri" w:eastAsia="Calibri" w:hAnsi="Calibri"/>
+                <w:b w:val="false"/>
+                <w:bCs w:val="false"/>
+                <w:i w:val="false"/>
+                <w:iCs w:val="false"/>
+                <w:color w:val="221E1F"/>
+                <w:sz w:val="20"/>
+                <w:szCs w:val="20"/>
+              </w:rPr>
+              <w:t xml:space="preserve">30</w:t>
+            </w:r>
+          </w:p>
+        </w:tc>
+        <w:tc>
+          <w:tcPr>
+            <w:tcW w:type="dxa" w:w="3084"/>
+            <w:tcBorders>
+              <w:top w:val="single" w:color="D6CFC6" w:sz="4"/>
+              <w:left w:val="single" w:color="D6CFC6" w:sz="4"/>
+              <w:bottom w:val="single" w:color="D6CFC6" w:sz="4"/>
+              <w:right w:val="single" w:color="D6CFC6" w:sz="4"/>
+            </w:tcBorders>
+            <w:shd w:fill="F7F5F2" w:color="auto" w:val="clear"/>
+            <w:tcMar>
+              <w:top w:type="dxa" w:w="90"/>
+              <w:left w:type="dxa" w:w="130"/>
+              <w:bottom w:type="dxa" w:w="90"/>
+              <w:right w:type="dxa" w:w="130"/>
+            </w:tcMar>
+            <w:vAlign w:val="center"/>
+          </w:tcPr>
+          <w:p>
+            <w:pPr>
+              <w:spacing w:after="0" w:line="240"/>
             </w:pPr>
             <w:r>
               <w:rPr>
@@ -9774,13 +9811,90 @@
                 <w:sz w:val="20"/>
                 <w:szCs w:val="20"/>
               </w:rPr>
-              <w:t xml:space="preserve"/>
-            </w:r>
-          </w:p>
-        </w:tc>
-        <w:tc>
-          <w:tcPr>
-            <w:tcW w:type="dxa" w:w="3084"/>
+              <w:t xml:space="preserve">An operations console that can act</w:t>
+            </w:r>
+          </w:p>
+        </w:tc>
+        <w:tc>
+          <w:tcPr>
+            <w:tcW w:type="dxa" w:w="5108"/>
+            <w:tcBorders>
+              <w:top w:val="single" w:color="D6CFC6" w:sz="4"/>
+              <w:left w:val="single" w:color="D6CFC6" w:sz="4"/>
+              <w:bottom w:val="single" w:color="D6CFC6" w:sz="4"/>
+              <w:right w:val="single" w:color="D6CFC6" w:sz="4"/>
+            </w:tcBorders>
+            <w:shd w:fill="F7F5F2" w:color="auto" w:val="clear"/>
+            <w:tcMar>
+              <w:top w:type="dxa" w:w="90"/>
+              <w:left w:type="dxa" w:w="130"/>
+              <w:bottom w:type="dxa" w:w="90"/>
+              <w:right w:type="dxa" w:w="130"/>
+            </w:tcMar>
+            <w:vAlign w:val="center"/>
+          </w:tcPr>
+          <w:p>
+            <w:pPr>
+              <w:spacing w:after="0" w:line="240"/>
+            </w:pPr>
+            <w:r>
+              <w:rPr>
+                <w:rFonts w:ascii="Calibri" w:cs="Calibri" w:eastAsia="Calibri" w:hAnsi="Calibri"/>
+                <w:b w:val="false"/>
+                <w:bCs w:val="false"/>
+                <w:i w:val="false"/>
+                <w:iCs w:val="false"/>
+                <w:color w:val="221E1F"/>
+                <w:sz w:val="20"/>
+                <w:szCs w:val="20"/>
+              </w:rPr>
+              <w:t xml:space="preserve">The Problems tab named an action — “worth retrying” — and did not provide it, and the suppression list offered nothing at all. A retry that refuses to send a handoff twice and refuses one the adapter called final, a restore that undoes a bounce but never a complaint, both reporting what happened rather than refreshing a list that looks unchanged. Plus the payment ledger, which was settled and reconciled by tests and shown to nobody, with the provider reference an operator needs to find a payment in the gateway’s dashboard</w:t>
+            </w:r>
+          </w:p>
+        </w:tc>
+        <w:tc>
+          <w:tcPr>
+            <w:tcW w:type="dxa" w:w="964"/>
+            <w:tcBorders>
+              <w:top w:val="single" w:color="D6CFC6" w:sz="4"/>
+              <w:left w:val="single" w:color="D6CFC6" w:sz="4"/>
+              <w:bottom w:val="single" w:color="D6CFC6" w:sz="4"/>
+              <w:right w:val="single" w:color="D6CFC6" w:sz="4"/>
+            </w:tcBorders>
+            <w:shd w:fill="F7F5F2" w:color="auto" w:val="clear"/>
+            <w:tcMar>
+              <w:top w:type="dxa" w:w="90"/>
+              <w:left w:type="dxa" w:w="130"/>
+              <w:bottom w:type="dxa" w:w="90"/>
+              <w:right w:type="dxa" w:w="130"/>
+            </w:tcMar>
+            <w:vAlign w:val="center"/>
+          </w:tcPr>
+          <w:p>
+            <w:pPr>
+              <w:spacing w:after="0" w:line="240"/>
+              <w:jc w:val="right"/>
+            </w:pPr>
+            <w:r>
+              <w:rPr>
+                <w:rFonts w:ascii="Calibri" w:cs="Calibri" w:eastAsia="Calibri" w:hAnsi="Calibri"/>
+                <w:b w:val="false"/>
+                <w:bCs w:val="false"/>
+                <w:i w:val="false"/>
+                <w:iCs w:val="false"/>
+                <w:color w:val="221E1F"/>
+                <w:sz w:val="20"/>
+                <w:szCs w:val="20"/>
+              </w:rPr>
+              <w:t xml:space="preserve">3</w:t>
+            </w:r>
+          </w:p>
+        </w:tc>
+      </w:tr>
+      <w:tr>
+        <w:tc>
+          <w:tcPr>
+            <w:tcW w:type="dxa" w:w="482"/>
             <w:tcBorders>
               <w:top w:val="single" w:color="D6CFC6" w:sz="4"/>
               <w:left w:val="single" w:color="D6CFC6" w:sz="4"/>
@@ -9799,6 +9913,7 @@
           <w:p>
             <w:pPr>
               <w:spacing w:after="0" w:line="240"/>
+              <w:jc w:val="center"/>
             </w:pPr>
             <w:r>
               <w:rPr>
@@ -9811,13 +9926,13 @@
                 <w:sz w:val="20"/>
                 <w:szCs w:val="20"/>
               </w:rPr>
-              <w:t xml:space="preserve">Total</w:t>
-            </w:r>
-          </w:p>
-        </w:tc>
-        <w:tc>
-          <w:tcPr>
-            <w:tcW w:type="dxa" w:w="5108"/>
+              <w:t xml:space="preserve"/>
+            </w:r>
+          </w:p>
+        </w:tc>
+        <w:tc>
+          <w:tcPr>
+            <w:tcW w:type="dxa" w:w="3084"/>
             <w:tcBorders>
               <w:top w:val="single" w:color="D6CFC6" w:sz="4"/>
               <w:left w:val="single" w:color="D6CFC6" w:sz="4"/>
@@ -9848,13 +9963,13 @@
                 <w:sz w:val="20"/>
                 <w:szCs w:val="20"/>
               </w:rPr>
-              <w:t xml:space="preserve">Delivered scope</w:t>
-            </w:r>
-          </w:p>
-        </w:tc>
-        <w:tc>
-          <w:tcPr>
-            <w:tcW w:type="dxa" w:w="964"/>
+              <w:t xml:space="preserve">Total</w:t>
+            </w:r>
+          </w:p>
+        </w:tc>
+        <w:tc>
+          <w:tcPr>
+            <w:tcW w:type="dxa" w:w="5108"/>
             <w:tcBorders>
               <w:top w:val="single" w:color="D6CFC6" w:sz="4"/>
               <w:left w:val="single" w:color="D6CFC6" w:sz="4"/>
@@ -9873,7 +9988,6 @@
           <w:p>
             <w:pPr>
               <w:spacing w:after="0" w:line="240"/>
-              <w:jc w:val="right"/>
             </w:pPr>
             <w:r>
               <w:rPr>
@@ -9886,7 +10000,45 @@
                 <w:sz w:val="20"/>
                 <w:szCs w:val="20"/>
               </w:rPr>
-              <w:t xml:space="preserve">169</w:t>
+              <w:t xml:space="preserve">Delivered scope</w:t>
+            </w:r>
+          </w:p>
+        </w:tc>
+        <w:tc>
+          <w:tcPr>
+            <w:tcW w:type="dxa" w:w="964"/>
+            <w:tcBorders>
+              <w:top w:val="single" w:color="D6CFC6" w:sz="4"/>
+              <w:left w:val="single" w:color="D6CFC6" w:sz="4"/>
+              <w:bottom w:val="single" w:color="D6CFC6" w:sz="4"/>
+              <w:right w:val="single" w:color="D6CFC6" w:sz="4"/>
+            </w:tcBorders>
+            <w:shd w:fill="FCE8EB" w:color="auto" w:val="clear"/>
+            <w:tcMar>
+              <w:top w:type="dxa" w:w="90"/>
+              <w:left w:type="dxa" w:w="130"/>
+              <w:bottom w:type="dxa" w:w="90"/>
+              <w:right w:type="dxa" w:w="130"/>
+            </w:tcMar>
+            <w:vAlign w:val="center"/>
+          </w:tcPr>
+          <w:p>
+            <w:pPr>
+              <w:spacing w:after="0" w:line="240"/>
+              <w:jc w:val="right"/>
+            </w:pPr>
+            <w:r>
+              <w:rPr>
+                <w:rFonts w:ascii="Calibri" w:cs="Calibri" w:eastAsia="Calibri" w:hAnsi="Calibri"/>
+                <w:b/>
+                <w:bCs/>
+                <w:i w:val="false"/>
+                <w:iCs w:val="false"/>
+                <w:color w:val="221E1F"/>
+                <w:sz w:val="20"/>
+                <w:szCs w:val="20"/>
+              </w:rPr>
+              <w:t xml:space="preserve">172</w:t>
             </w:r>
           </w:p>
         </w:tc>
@@ -9938,7 +10090,7 @@
           <w:sz w:val="20"/>
           <w:szCs w:val="20"/>
         </w:rPr>
-        <w:t xml:space="preserve">27,291 hand-written lines over 169 days is about 161 a day. For tested, typed, reviewed production code that sits inside the normal 100–300 band, and lower than the 200 the first version of this document reconstructed — integration work carries more test and less code than storefront work does. The reconstruction is not inflated.</w:t>
+        <w:t xml:space="preserve">27,878 hand-written lines over 172 days is about 162 a day. For tested, typed, reviewed production code that sits inside the normal 100–300 band, and lower than the 200 the first version of this document reconstructed — integration work carries more test and less code than storefront work does. The reconstruction is not inflated.</w:t>
       </w:r>
     </w:p>
     <w:p>
@@ -9956,7 +10108,7 @@
           <w:sz w:val="20"/>
           <w:szCs w:val="20"/>
         </w:rPr>
-        <w:t xml:space="preserve">169 days is roughly 27 working weeks, or a little over six months for one person. Two people working in parallel would compress the calendar but not the total, and would add coordination cost.</w:t>
+        <w:t xml:space="preserve">172 days is roughly 27 working weeks, or a little over six months for one person. Two people working in parallel would compress the calendar but not the total, and would add coordination cost.</w:t>
       </w:r>
     </w:p>
     <w:p>
@@ -10027,7 +10179,7 @@
           <w:sz w:val="20"/>
           <w:szCs w:val="20"/>
         </w:rPr>
-        <w:t xml:space="preserve">Delivered scope: 169 days × 8 hours = 1352 hours.</w:t>
+        <w:t xml:space="preserve">Delivered scope: 172 days × 8 hours = 1376 hours.</w:t>
       </w:r>
     </w:p>
     <w:tbl>
@@ -10122,7 +10274,7 @@
                 <w:sz w:val="19"/>
                 <w:szCs w:val="19"/>
               </w:rPr>
-              <w:t xml:space="preserve">Cost of the 1352 hours (excl. VAT)</w:t>
+              <w:t xml:space="preserve">Cost of the 1376 hours (excl. VAT)</w:t>
             </w:r>
           </w:p>
         </w:tc>
@@ -10235,7 +10387,7 @@
                 <w:sz w:val="20"/>
                 <w:szCs w:val="20"/>
               </w:rPr>
-              <w:t xml:space="preserve">R 540,800</w:t>
+              <w:t xml:space="preserve">R 550,400</w:t>
             </w:r>
           </w:p>
         </w:tc>
@@ -10272,7 +10424,7 @@
                 <w:sz w:val="20"/>
                 <w:szCs w:val="20"/>
               </w:rPr>
-              <w:t xml:space="preserve">R 621,920</w:t>
+              <w:t xml:space="preserve">R 632,960</w:t>
             </w:r>
           </w:p>
         </w:tc>
@@ -10349,7 +10501,7 @@
                 <w:sz w:val="20"/>
                 <w:szCs w:val="20"/>
               </w:rPr>
-              <w:t xml:space="preserve">R 878,800</w:t>
+              <w:t xml:space="preserve">R 894,400</w:t>
             </w:r>
           </w:p>
         </w:tc>
@@ -10387,7 +10539,7 @@
                 <w:sz w:val="20"/>
                 <w:szCs w:val="20"/>
               </w:rPr>
-              <w:t xml:space="preserve">R 1,010,620</w:t>
+              <w:t xml:space="preserve">R 1,028,560</w:t>
             </w:r>
           </w:p>
         </w:tc>
@@ -10462,7 +10614,7 @@
                 <w:sz w:val="20"/>
                 <w:szCs w:val="20"/>
               </w:rPr>
-              <w:t xml:space="preserve">R 1,149,200</w:t>
+              <w:t xml:space="preserve">R 1,169,600</w:t>
             </w:r>
           </w:p>
         </w:tc>
@@ -10499,7 +10651,7 @@
                 <w:sz w:val="20"/>
                 <w:szCs w:val="20"/>
               </w:rPr>
-              <w:t xml:space="preserve">R 1,321,580</w:t>
+              <w:t xml:space="preserve">R 1,345,040</w:t>
             </w:r>
           </w:p>
         </w:tc>
@@ -10576,7 +10728,7 @@
                 <w:sz w:val="20"/>
                 <w:szCs w:val="20"/>
               </w:rPr>
-              <w:t xml:space="preserve">R 1,284,400</w:t>
+              <w:t xml:space="preserve">R 1,307,200</w:t>
             </w:r>
           </w:p>
         </w:tc>
@@ -10614,7 +10766,7 @@
                 <w:sz w:val="20"/>
                 <w:szCs w:val="20"/>
               </w:rPr>
-              <w:t xml:space="preserve">R 1,477,060</w:t>
+              <w:t xml:space="preserve">R 1,503,280</w:t>
             </w:r>
           </w:p>
         </w:tc>
@@ -10689,7 +10841,7 @@
                 <w:sz w:val="20"/>
                 <w:szCs w:val="20"/>
               </w:rPr>
-              <w:t xml:space="preserve">R 1,554,800</w:t>
+              <w:t xml:space="preserve">R 1,582,400</w:t>
             </w:r>
           </w:p>
         </w:tc>
@@ -10726,7 +10878,7 @@
                 <w:sz w:val="20"/>
                 <w:szCs w:val="20"/>
               </w:rPr>
-              <w:t xml:space="preserve">R 1,788,020</w:t>
+              <w:t xml:space="preserve">R 1,819,760</w:t>
             </w:r>
           </w:p>
         </w:tc>
@@ -10803,7 +10955,7 @@
                 <w:sz w:val="20"/>
                 <w:szCs w:val="20"/>
               </w:rPr>
-              <w:t xml:space="preserve">R 1,960,400</w:t>
+              <w:t xml:space="preserve">R 1,995,200</w:t>
             </w:r>
           </w:p>
         </w:tc>
@@ -10841,7 +10993,7 @@
                 <w:sz w:val="20"/>
                 <w:szCs w:val="20"/>
               </w:rPr>
-              <w:t xml:space="preserve">R 2,254,460</w:t>
+              <w:t xml:space="preserve">R 2,294,480</w:t>
             </w:r>
           </w:p>
         </w:tc>
@@ -10893,7 +11045,7 @@
           <w:sz w:val="20"/>
           <w:szCs w:val="20"/>
         </w:rPr>
-        <w:t xml:space="preserve">At an illustrative blended rate of R 950 an hour — chosen here only to make the rest of the document concrete — the delivered scope comes to R 1,284,400 excluding VAT, or R 1,477,060 including it. Replace the rate and every figure below moves proportionally.</w:t>
+        <w:t xml:space="preserve">At an illustrative blended rate of R 950 an hour — chosen here only to make the rest of the document concrete — the delivered scope comes to R 1,307,200 excluding VAT, or R 1,503,280 including it. Replace the rate and every figure below moves proportionally.</w:t>
       </w:r>
     </w:p>
     <w:p>
@@ -15474,6 +15626,159 @@
               <w:bottom w:val="single" w:color="D6CFC6" w:sz="4"/>
               <w:right w:val="single" w:color="D6CFC6" w:sz="4"/>
             </w:tcBorders>
+            <w:shd w:fill="F7F5F2" w:color="auto" w:val="clear"/>
+            <w:tcMar>
+              <w:top w:type="dxa" w:w="90"/>
+              <w:left w:type="dxa" w:w="130"/>
+              <w:bottom w:type="dxa" w:w="90"/>
+              <w:right w:type="dxa" w:w="130"/>
+            </w:tcMar>
+            <w:vAlign w:val="center"/>
+          </w:tcPr>
+          <w:p>
+            <w:pPr>
+              <w:spacing w:after="0" w:line="240"/>
+            </w:pPr>
+            <w:r>
+              <w:rPr>
+                <w:rFonts w:ascii="Calibri" w:cs="Calibri" w:eastAsia="Calibri" w:hAnsi="Calibri"/>
+                <w:b w:val="false"/>
+                <w:bCs w:val="false"/>
+                <w:i w:val="false"/>
+                <w:iCs w:val="false"/>
+                <w:color w:val="221E1F"/>
+                <w:sz w:val="20"/>
+                <w:szCs w:val="20"/>
+              </w:rPr>
+              <w:t xml:space="preserve">An operations console that can act</w:t>
+            </w:r>
+          </w:p>
+        </w:tc>
+        <w:tc>
+          <w:tcPr>
+            <w:tcW w:type="dxa" w:w="1157"/>
+            <w:tcBorders>
+              <w:top w:val="single" w:color="D6CFC6" w:sz="4"/>
+              <w:left w:val="single" w:color="D6CFC6" w:sz="4"/>
+              <w:bottom w:val="single" w:color="D6CFC6" w:sz="4"/>
+              <w:right w:val="single" w:color="D6CFC6" w:sz="4"/>
+            </w:tcBorders>
+            <w:shd w:fill="F7F5F2" w:color="auto" w:val="clear"/>
+            <w:tcMar>
+              <w:top w:type="dxa" w:w="90"/>
+              <w:left w:type="dxa" w:w="130"/>
+              <w:bottom w:type="dxa" w:w="90"/>
+              <w:right w:type="dxa" w:w="130"/>
+            </w:tcMar>
+            <w:vAlign w:val="center"/>
+          </w:tcPr>
+          <w:p>
+            <w:pPr>
+              <w:spacing w:after="0" w:line="240"/>
+              <w:jc w:val="right"/>
+            </w:pPr>
+            <w:r>
+              <w:rPr>
+                <w:rFonts w:ascii="Calibri" w:cs="Calibri" w:eastAsia="Calibri" w:hAnsi="Calibri"/>
+                <w:b w:val="false"/>
+                <w:bCs w:val="false"/>
+                <w:i w:val="false"/>
+                <w:iCs w:val="false"/>
+                <w:color w:val="221E1F"/>
+                <w:sz w:val="20"/>
+                <w:szCs w:val="20"/>
+              </w:rPr>
+              <w:t xml:space="preserve">3</w:t>
+            </w:r>
+          </w:p>
+        </w:tc>
+        <w:tc>
+          <w:tcPr>
+            <w:tcW w:type="dxa" w:w="1542"/>
+            <w:tcBorders>
+              <w:top w:val="single" w:color="D6CFC6" w:sz="4"/>
+              <w:left w:val="single" w:color="D6CFC6" w:sz="4"/>
+              <w:bottom w:val="single" w:color="D6CFC6" w:sz="4"/>
+              <w:right w:val="single" w:color="D6CFC6" w:sz="4"/>
+            </w:tcBorders>
+            <w:shd w:fill="F7F5F2" w:color="auto" w:val="clear"/>
+            <w:tcMar>
+              <w:top w:type="dxa" w:w="90"/>
+              <w:left w:type="dxa" w:w="130"/>
+              <w:bottom w:type="dxa" w:w="90"/>
+              <w:right w:type="dxa" w:w="130"/>
+            </w:tcMar>
+            <w:vAlign w:val="center"/>
+          </w:tcPr>
+          <w:p>
+            <w:pPr>
+              <w:spacing w:after="0" w:line="240"/>
+              <w:jc w:val="right"/>
+            </w:pPr>
+            <w:r>
+              <w:rPr>
+                <w:rFonts w:ascii="Calibri" w:cs="Calibri" w:eastAsia="Calibri" w:hAnsi="Calibri"/>
+                <w:b w:val="false"/>
+                <w:bCs w:val="false"/>
+                <w:i w:val="false"/>
+                <w:iCs w:val="false"/>
+                <w:color w:val="221E1F"/>
+                <w:sz w:val="20"/>
+                <w:szCs w:val="20"/>
+              </w:rPr>
+              <w:t xml:space="preserve">24</w:t>
+            </w:r>
+          </w:p>
+        </w:tc>
+        <w:tc>
+          <w:tcPr>
+            <w:tcW w:type="dxa" w:w="1638"/>
+            <w:tcBorders>
+              <w:top w:val="single" w:color="D6CFC6" w:sz="4"/>
+              <w:left w:val="single" w:color="D6CFC6" w:sz="4"/>
+              <w:bottom w:val="single" w:color="D6CFC6" w:sz="4"/>
+              <w:right w:val="single" w:color="D6CFC6" w:sz="4"/>
+            </w:tcBorders>
+            <w:shd w:fill="F7F5F2" w:color="auto" w:val="clear"/>
+            <w:tcMar>
+              <w:top w:type="dxa" w:w="90"/>
+              <w:left w:type="dxa" w:w="130"/>
+              <w:bottom w:type="dxa" w:w="90"/>
+              <w:right w:type="dxa" w:w="130"/>
+            </w:tcMar>
+            <w:vAlign w:val="center"/>
+          </w:tcPr>
+          <w:p>
+            <w:pPr>
+              <w:spacing w:after="0" w:line="240"/>
+              <w:jc w:val="right"/>
+            </w:pPr>
+            <w:r>
+              <w:rPr>
+                <w:rFonts w:ascii="Calibri" w:cs="Calibri" w:eastAsia="Calibri" w:hAnsi="Calibri"/>
+                <w:b w:val="false"/>
+                <w:bCs w:val="false"/>
+                <w:i w:val="false"/>
+                <w:iCs w:val="false"/>
+                <w:color w:val="221E1F"/>
+                <w:sz w:val="20"/>
+                <w:szCs w:val="20"/>
+              </w:rPr>
+              <w:t xml:space="preserve">R 22,800</w:t>
+            </w:r>
+          </w:p>
+        </w:tc>
+      </w:tr>
+      <w:tr>
+        <w:tc>
+          <w:tcPr>
+            <w:tcW w:type="dxa" w:w="5301"/>
+            <w:tcBorders>
+              <w:top w:val="single" w:color="D6CFC6" w:sz="4"/>
+              <w:left w:val="single" w:color="D6CFC6" w:sz="4"/>
+              <w:bottom w:val="single" w:color="D6CFC6" w:sz="4"/>
+              <w:right w:val="single" w:color="D6CFC6" w:sz="4"/>
+            </w:tcBorders>
             <w:shd w:fill="FCE8EB" w:color="auto" w:val="clear"/>
             <w:tcMar>
               <w:top w:type="dxa" w:w="90"/>
@@ -15536,7 +15841,7 @@
                 <w:sz w:val="20"/>
                 <w:szCs w:val="20"/>
               </w:rPr>
-              <w:t xml:space="preserve">169</w:t>
+              <w:t xml:space="preserve">172</w:t>
             </w:r>
           </w:p>
         </w:tc>
@@ -15574,7 +15879,7 @@
                 <w:sz w:val="20"/>
                 <w:szCs w:val="20"/>
               </w:rPr>
-              <w:t xml:space="preserve">1,352</w:t>
+              <w:t xml:space="preserve">1,376</w:t>
             </w:r>
           </w:p>
         </w:tc>
@@ -15612,7 +15917,7 @@
                 <w:sz w:val="20"/>
                 <w:szCs w:val="20"/>
               </w:rPr>
-              <w:t xml:space="preserve">R 1,284,400</w:t>
+              <w:t xml:space="preserve">R 1,307,200</w:t>
             </w:r>
           </w:p>
         </w:tc>
@@ -15651,7 +15956,7 @@
           <w:sz w:val="20"/>
           <w:szCs w:val="20"/>
         </w:rPr>
-        <w:t xml:space="preserve">The integration seams — payments, accounts, notifications, POS and courier — are 44 of the 169 days. None of them names a vendor, and none has to be rewritten when one is chosen: what remains per integration is an adapter against an interface that already exists and is already tested.</w:t>
+        <w:t xml:space="preserve">The integration seams — payments, accounts, notifications, POS and courier — are 44 of the 172 days. None of them names a vendor, and none has to be rewritten when one is chosen: what remains per integration is an adapter against an interface that already exists and is already tested.</w:t>
       </w:r>
     </w:p>
     <w:p>
@@ -17770,7 +18075,7 @@
                 <w:sz w:val="20"/>
                 <w:szCs w:val="20"/>
               </w:rPr>
-              <w:t xml:space="preserve">169</w:t>
+              <w:t xml:space="preserve">172</w:t>
             </w:r>
           </w:p>
         </w:tc>
@@ -17807,7 +18112,7 @@
                 <w:sz w:val="20"/>
                 <w:szCs w:val="20"/>
               </w:rPr>
-              <w:t xml:space="preserve">1,352</w:t>
+              <w:t xml:space="preserve">1,376</w:t>
             </w:r>
           </w:p>
         </w:tc>
@@ -17844,7 +18149,7 @@
                 <w:sz w:val="20"/>
                 <w:szCs w:val="20"/>
               </w:rPr>
-              <w:t xml:space="preserve">R 1,284,400</w:t>
+              <w:t xml:space="preserve">R 1,307,200</w:t>
             </w:r>
           </w:p>
         </w:tc>
@@ -18074,7 +18379,7 @@
                 <w:sz w:val="20"/>
                 <w:szCs w:val="20"/>
               </w:rPr>
-              <w:t xml:space="preserve">194</w:t>
+              <w:t xml:space="preserve">197</w:t>
             </w:r>
           </w:p>
         </w:tc>
@@ -18112,7 +18417,7 @@
                 <w:sz w:val="20"/>
                 <w:szCs w:val="20"/>
               </w:rPr>
-              <w:t xml:space="preserve">1,552</w:t>
+              <w:t xml:space="preserve">1,576</w:t>
             </w:r>
           </w:p>
         </w:tc>
@@ -18150,7 +18455,7 @@
                 <w:sz w:val="20"/>
                 <w:szCs w:val="20"/>
               </w:rPr>
-              <w:t xml:space="preserve">R 1,474,400</w:t>
+              <w:t xml:space="preserve">R 1,497,200</w:t>
             </w:r>
           </w:p>
         </w:tc>

</xml_diff>

<commit_message>
Reprice with the loyalty and availability workstreams
176 delivered days, 25 remaining, 201 end to end. 780 tests in 38 files.

Co-Authored-By: Claude Opus 5 <noreply@anthropic.com>
Claude-Session: https://claude.ai/code/session_01B2xsFCpQEfEHuTCkYzyD13
</commit_message>
<xml_diff>
--- a/WEBSITE_COSTINGS.docx
+++ b/WEBSITE_COSTINGS.docx
@@ -1527,7 +1527,7 @@
                 <w:sz w:val="20"/>
                 <w:szCs w:val="20"/>
               </w:rPr>
-              <w:t xml:space="preserve">769</w:t>
+              <w:t xml:space="preserve">780</w:t>
             </w:r>
           </w:p>
         </w:tc>
@@ -1640,7 +1640,7 @@
                 <w:sz w:val="20"/>
                 <w:szCs w:val="20"/>
               </w:rPr>
-              <w:t xml:space="preserve">27,878</w:t>
+              <w:t xml:space="preserve">28,218</w:t>
             </w:r>
           </w:p>
         </w:tc>
@@ -1677,7 +1677,7 @@
                 <w:sz w:val="20"/>
                 <w:szCs w:val="20"/>
               </w:rPr>
-              <w:t xml:space="preserve">Application 12,154 · tests 10,296 · review build 2,563 · data, schema and tooling 2,113 · shared packages 752</w:t>
+              <w:t xml:space="preserve">Application 12,333 · tests 10,441 · review build 2,563 · data, schema and tooling 2,115 · shared packages 766</w:t>
             </w:r>
           </w:p>
         </w:tc>
@@ -1865,7 +1865,7 @@
                 <w:sz w:val="20"/>
                 <w:szCs w:val="20"/>
               </w:rPr>
-              <w:t xml:space="preserve">105</w:t>
+              <w:t xml:space="preserve">108</w:t>
             </w:r>
           </w:p>
         </w:tc>
@@ -3770,7 +3770,7 @@
                 <w:sz w:val="20"/>
                 <w:szCs w:val="20"/>
               </w:rPr>
-              <w:t xml:space="preserve">769 passing</w:t>
+              <w:t xml:space="preserve">780 passing</w:t>
             </w:r>
           </w:p>
         </w:tc>
@@ -6548,7 +6548,7 @@
                 <w:sz w:val="20"/>
                 <w:szCs w:val="20"/>
               </w:rPr>
-              <w:t xml:space="preserve">The suite as it stood at this workstream: the 769 tests now in 38 files grew with the workstreams below. Driven through route handlers rather than helpers</w:t>
+              <w:t xml:space="preserve">The suite as it stood at this workstream: the 780 tests now in 38 files grew with the workstreams below. Driven through route handlers rather than helpers</w:t>
             </w:r>
           </w:p>
         </w:tc>
@@ -9774,7 +9774,7 @@
                 <w:sz w:val="20"/>
                 <w:szCs w:val="20"/>
               </w:rPr>
-              <w:t xml:space="preserve">30</w:t>
+              <w:t xml:space="preserve">31</w:t>
             </w:r>
           </w:p>
         </w:tc>
@@ -9811,7 +9811,7 @@
                 <w:sz w:val="20"/>
                 <w:szCs w:val="20"/>
               </w:rPr>
-              <w:t xml:space="preserve">An operations console that can act</w:t>
+              <w:t xml:space="preserve">Loyalty, corrected</w:t>
             </w:r>
           </w:p>
         </w:tc>
@@ -9848,7 +9848,7 @@
                 <w:sz w:val="20"/>
                 <w:szCs w:val="20"/>
               </w:rPr>
-              <w:t xml:space="preserve">The Problems tab named an action — “worth retrying” — and did not provide it, and the suppression list offered nothing at all. A retry that refuses to send a handoff twice and refuses one the adapter called final, a restore that undoes a bounce but never a complaint, both reporting what happened rather than refreshing a list that looks unchanged. Plus the payment ledger, which was settled and reconciled by tests and shown to nobody, with the provider reference an operator needs to find a payment in the gateway’s dashboard</w:t>
+              <w:t xml:space="preserve">Points were credited when an order was placed, so a signed-in customer could place one, take the points and cancel it — and it contradicted the rewards page, which says they post on completion. They now post on the completion transition, once, in the order store where both callers reach it, with the credit and the record that it happened in one state write. Plus the rewards page, which was showing this browser’s figure under the heading “your balance” while the account page showed the server’s: two numbers for one customer, and zero on a phone they had not ordered from</w:t>
             </w:r>
           </w:p>
         </w:tc>
@@ -9901,7 +9901,6 @@
               <w:bottom w:val="single" w:color="D6CFC6" w:sz="4"/>
               <w:right w:val="single" w:color="D6CFC6" w:sz="4"/>
             </w:tcBorders>
-            <w:shd w:fill="FCE8EB" w:color="auto" w:val="clear"/>
             <w:tcMar>
               <w:top w:type="dxa" w:w="90"/>
               <w:left w:type="dxa" w:w="130"/>
@@ -9914,6 +9913,42 @@
             <w:pPr>
               <w:spacing w:after="0" w:line="240"/>
               <w:jc w:val="center"/>
+            </w:pPr>
+            <w:r>
+              <w:rPr>
+                <w:rFonts w:ascii="Calibri" w:cs="Calibri" w:eastAsia="Calibri" w:hAnsi="Calibri"/>
+                <w:b w:val="false"/>
+                <w:bCs w:val="false"/>
+                <w:i w:val="false"/>
+                <w:iCs w:val="false"/>
+                <w:color w:val="221E1F"/>
+                <w:sz w:val="20"/>
+                <w:szCs w:val="20"/>
+              </w:rPr>
+              <w:t xml:space="preserve">32</w:t>
+            </w:r>
+          </w:p>
+        </w:tc>
+        <w:tc>
+          <w:tcPr>
+            <w:tcW w:type="dxa" w:w="3084"/>
+            <w:tcBorders>
+              <w:top w:val="single" w:color="D6CFC6" w:sz="4"/>
+              <w:left w:val="single" w:color="D6CFC6" w:sz="4"/>
+              <w:bottom w:val="single" w:color="D6CFC6" w:sz="4"/>
+              <w:right w:val="single" w:color="D6CFC6" w:sz="4"/>
+            </w:tcBorders>
+            <w:tcMar>
+              <w:top w:type="dxa" w:w="90"/>
+              <w:left w:type="dxa" w:w="130"/>
+              <w:bottom w:type="dxa" w:w="90"/>
+              <w:right w:type="dxa" w:w="130"/>
+            </w:tcMar>
+            <w:vAlign w:val="center"/>
+          </w:tcPr>
+          <w:p>
+            <w:pPr>
+              <w:spacing w:after="0" w:line="240"/>
             </w:pPr>
             <w:r>
               <w:rPr>
@@ -9926,7 +9961,120 @@
                 <w:sz w:val="20"/>
                 <w:szCs w:val="20"/>
               </w:rPr>
-              <w:t xml:space="preserve"/>
+              <w:t xml:space="preserve">Availability from the till</w:t>
+            </w:r>
+          </w:p>
+        </w:tc>
+        <w:tc>
+          <w:tcPr>
+            <w:tcW w:type="dxa" w:w="5108"/>
+            <w:tcBorders>
+              <w:top w:val="single" w:color="D6CFC6" w:sz="4"/>
+              <w:left w:val="single" w:color="D6CFC6" w:sz="4"/>
+              <w:bottom w:val="single" w:color="D6CFC6" w:sz="4"/>
+              <w:right w:val="single" w:color="D6CFC6" w:sz="4"/>
+            </w:tcBorders>
+            <w:tcMar>
+              <w:top w:type="dxa" w:w="90"/>
+              <w:left w:type="dxa" w:w="130"/>
+              <w:bottom w:type="dxa" w:w="90"/>
+              <w:right w:type="dxa" w:w="130"/>
+            </w:tcMar>
+            <w:vAlign w:val="center"/>
+          </w:tcPr>
+          <w:p>
+            <w:pPr>
+              <w:spacing w:after="0" w:line="240"/>
+            </w:pPr>
+            <w:r>
+              <w:rPr>
+                <w:rFonts w:ascii="Calibri" w:cs="Calibri" w:eastAsia="Calibri" w:hAnsi="Calibri"/>
+                <w:b w:val="false"/>
+                <w:bCs w:val="false"/>
+                <w:i w:val="false"/>
+                <w:iCs w:val="false"/>
+                <w:color w:val="221E1F"/>
+                <w:sz w:val="20"/>
+                <w:szCs w:val="20"/>
+              </w:rPr>
+              <w:t xml:space="preserve">The sync was built with the care that matters — an unreachable till returns null rather than an empty list, so a hiccup at the kitchen cannot put every sold-out item back on sale — and nothing called it. Now reachable from the console, replacing rather than merging, because the till is the source of truth for what has run out</w:t>
+            </w:r>
+          </w:p>
+        </w:tc>
+        <w:tc>
+          <w:tcPr>
+            <w:tcW w:type="dxa" w:w="964"/>
+            <w:tcBorders>
+              <w:top w:val="single" w:color="D6CFC6" w:sz="4"/>
+              <w:left w:val="single" w:color="D6CFC6" w:sz="4"/>
+              <w:bottom w:val="single" w:color="D6CFC6" w:sz="4"/>
+              <w:right w:val="single" w:color="D6CFC6" w:sz="4"/>
+            </w:tcBorders>
+            <w:tcMar>
+              <w:top w:type="dxa" w:w="90"/>
+              <w:left w:type="dxa" w:w="130"/>
+              <w:bottom w:type="dxa" w:w="90"/>
+              <w:right w:type="dxa" w:w="130"/>
+            </w:tcMar>
+            <w:vAlign w:val="center"/>
+          </w:tcPr>
+          <w:p>
+            <w:pPr>
+              <w:spacing w:after="0" w:line="240"/>
+              <w:jc w:val="right"/>
+            </w:pPr>
+            <w:r>
+              <w:rPr>
+                <w:rFonts w:ascii="Calibri" w:cs="Calibri" w:eastAsia="Calibri" w:hAnsi="Calibri"/>
+                <w:b w:val="false"/>
+                <w:bCs w:val="false"/>
+                <w:i w:val="false"/>
+                <w:iCs w:val="false"/>
+                <w:color w:val="221E1F"/>
+                <w:sz w:val="20"/>
+                <w:szCs w:val="20"/>
+              </w:rPr>
+              <w:t xml:space="preserve">1</w:t>
+            </w:r>
+          </w:p>
+        </w:tc>
+      </w:tr>
+      <w:tr>
+        <w:tc>
+          <w:tcPr>
+            <w:tcW w:type="dxa" w:w="482"/>
+            <w:tcBorders>
+              <w:top w:val="single" w:color="D6CFC6" w:sz="4"/>
+              <w:left w:val="single" w:color="D6CFC6" w:sz="4"/>
+              <w:bottom w:val="single" w:color="D6CFC6" w:sz="4"/>
+              <w:right w:val="single" w:color="D6CFC6" w:sz="4"/>
+            </w:tcBorders>
+            <w:shd w:fill="F7F5F2" w:color="auto" w:val="clear"/>
+            <w:tcMar>
+              <w:top w:type="dxa" w:w="90"/>
+              <w:left w:type="dxa" w:w="130"/>
+              <w:bottom w:type="dxa" w:w="90"/>
+              <w:right w:type="dxa" w:w="130"/>
+            </w:tcMar>
+            <w:vAlign w:val="center"/>
+          </w:tcPr>
+          <w:p>
+            <w:pPr>
+              <w:spacing w:after="0" w:line="240"/>
+              <w:jc w:val="center"/>
+            </w:pPr>
+            <w:r>
+              <w:rPr>
+                <w:rFonts w:ascii="Calibri" w:cs="Calibri" w:eastAsia="Calibri" w:hAnsi="Calibri"/>
+                <w:b w:val="false"/>
+                <w:bCs w:val="false"/>
+                <w:i w:val="false"/>
+                <w:iCs w:val="false"/>
+                <w:color w:val="221E1F"/>
+                <w:sz w:val="20"/>
+                <w:szCs w:val="20"/>
+              </w:rPr>
+              <w:t xml:space="preserve">30</w:t>
             </w:r>
           </w:p>
         </w:tc>
@@ -9939,7 +10087,7 @@
               <w:bottom w:val="single" w:color="D6CFC6" w:sz="4"/>
               <w:right w:val="single" w:color="D6CFC6" w:sz="4"/>
             </w:tcBorders>
-            <w:shd w:fill="FCE8EB" w:color="auto" w:val="clear"/>
+            <w:shd w:fill="F7F5F2" w:color="auto" w:val="clear"/>
             <w:tcMar>
               <w:top w:type="dxa" w:w="90"/>
               <w:left w:type="dxa" w:w="130"/>
@@ -9963,7 +10111,7 @@
                 <w:sz w:val="20"/>
                 <w:szCs w:val="20"/>
               </w:rPr>
-              <w:t xml:space="preserve">Total</w:t>
+              <w:t xml:space="preserve">An operations console that can act</w:t>
             </w:r>
           </w:p>
         </w:tc>
@@ -9976,6 +10124,83 @@
               <w:bottom w:val="single" w:color="D6CFC6" w:sz="4"/>
               <w:right w:val="single" w:color="D6CFC6" w:sz="4"/>
             </w:tcBorders>
+            <w:shd w:fill="F7F5F2" w:color="auto" w:val="clear"/>
+            <w:tcMar>
+              <w:top w:type="dxa" w:w="90"/>
+              <w:left w:type="dxa" w:w="130"/>
+              <w:bottom w:type="dxa" w:w="90"/>
+              <w:right w:type="dxa" w:w="130"/>
+            </w:tcMar>
+            <w:vAlign w:val="center"/>
+          </w:tcPr>
+          <w:p>
+            <w:pPr>
+              <w:spacing w:after="0" w:line="240"/>
+            </w:pPr>
+            <w:r>
+              <w:rPr>
+                <w:rFonts w:ascii="Calibri" w:cs="Calibri" w:eastAsia="Calibri" w:hAnsi="Calibri"/>
+                <w:b w:val="false"/>
+                <w:bCs w:val="false"/>
+                <w:i w:val="false"/>
+                <w:iCs w:val="false"/>
+                <w:color w:val="221E1F"/>
+                <w:sz w:val="20"/>
+                <w:szCs w:val="20"/>
+              </w:rPr>
+              <w:t xml:space="preserve">The Problems tab named an action — “worth retrying” — and did not provide it, and the suppression list offered nothing at all. A retry that refuses to send a handoff twice and refuses one the adapter called final, a restore that undoes a bounce but never a complaint, both reporting what happened rather than refreshing a list that looks unchanged. Plus the payment ledger, which was settled and reconciled by tests and shown to nobody, with the provider reference an operator needs to find a payment in the gateway’s dashboard</w:t>
+            </w:r>
+          </w:p>
+        </w:tc>
+        <w:tc>
+          <w:tcPr>
+            <w:tcW w:type="dxa" w:w="964"/>
+            <w:tcBorders>
+              <w:top w:val="single" w:color="D6CFC6" w:sz="4"/>
+              <w:left w:val="single" w:color="D6CFC6" w:sz="4"/>
+              <w:bottom w:val="single" w:color="D6CFC6" w:sz="4"/>
+              <w:right w:val="single" w:color="D6CFC6" w:sz="4"/>
+            </w:tcBorders>
+            <w:shd w:fill="F7F5F2" w:color="auto" w:val="clear"/>
+            <w:tcMar>
+              <w:top w:type="dxa" w:w="90"/>
+              <w:left w:type="dxa" w:w="130"/>
+              <w:bottom w:type="dxa" w:w="90"/>
+              <w:right w:type="dxa" w:w="130"/>
+            </w:tcMar>
+            <w:vAlign w:val="center"/>
+          </w:tcPr>
+          <w:p>
+            <w:pPr>
+              <w:spacing w:after="0" w:line="240"/>
+              <w:jc w:val="right"/>
+            </w:pPr>
+            <w:r>
+              <w:rPr>
+                <w:rFonts w:ascii="Calibri" w:cs="Calibri" w:eastAsia="Calibri" w:hAnsi="Calibri"/>
+                <w:b w:val="false"/>
+                <w:bCs w:val="false"/>
+                <w:i w:val="false"/>
+                <w:iCs w:val="false"/>
+                <w:color w:val="221E1F"/>
+                <w:sz w:val="20"/>
+                <w:szCs w:val="20"/>
+              </w:rPr>
+              <w:t xml:space="preserve">3</w:t>
+            </w:r>
+          </w:p>
+        </w:tc>
+      </w:tr>
+      <w:tr>
+        <w:tc>
+          <w:tcPr>
+            <w:tcW w:type="dxa" w:w="482"/>
+            <w:tcBorders>
+              <w:top w:val="single" w:color="D6CFC6" w:sz="4"/>
+              <w:left w:val="single" w:color="D6CFC6" w:sz="4"/>
+              <w:bottom w:val="single" w:color="D6CFC6" w:sz="4"/>
+              <w:right w:val="single" w:color="D6CFC6" w:sz="4"/>
+            </w:tcBorders>
             <w:shd w:fill="FCE8EB" w:color="auto" w:val="clear"/>
             <w:tcMar>
               <w:top w:type="dxa" w:w="90"/>
@@ -9988,6 +10213,7 @@
           <w:p>
             <w:pPr>
               <w:spacing w:after="0" w:line="240"/>
+              <w:jc w:val="center"/>
             </w:pPr>
             <w:r>
               <w:rPr>
@@ -10000,13 +10226,13 @@
                 <w:sz w:val="20"/>
                 <w:szCs w:val="20"/>
               </w:rPr>
-              <w:t xml:space="preserve">Delivered scope</w:t>
-            </w:r>
-          </w:p>
-        </w:tc>
-        <w:tc>
-          <w:tcPr>
-            <w:tcW w:type="dxa" w:w="964"/>
+              <w:t xml:space="preserve"/>
+            </w:r>
+          </w:p>
+        </w:tc>
+        <w:tc>
+          <w:tcPr>
+            <w:tcW w:type="dxa" w:w="3084"/>
             <w:tcBorders>
               <w:top w:val="single" w:color="D6CFC6" w:sz="4"/>
               <w:left w:val="single" w:color="D6CFC6" w:sz="4"/>
@@ -10025,7 +10251,6 @@
           <w:p>
             <w:pPr>
               <w:spacing w:after="0" w:line="240"/>
-              <w:jc w:val="right"/>
             </w:pPr>
             <w:r>
               <w:rPr>
@@ -10038,7 +10263,82 @@
                 <w:sz w:val="20"/>
                 <w:szCs w:val="20"/>
               </w:rPr>
-              <w:t xml:space="preserve">172</w:t>
+              <w:t xml:space="preserve">Total</w:t>
+            </w:r>
+          </w:p>
+        </w:tc>
+        <w:tc>
+          <w:tcPr>
+            <w:tcW w:type="dxa" w:w="5108"/>
+            <w:tcBorders>
+              <w:top w:val="single" w:color="D6CFC6" w:sz="4"/>
+              <w:left w:val="single" w:color="D6CFC6" w:sz="4"/>
+              <w:bottom w:val="single" w:color="D6CFC6" w:sz="4"/>
+              <w:right w:val="single" w:color="D6CFC6" w:sz="4"/>
+            </w:tcBorders>
+            <w:shd w:fill="FCE8EB" w:color="auto" w:val="clear"/>
+            <w:tcMar>
+              <w:top w:type="dxa" w:w="90"/>
+              <w:left w:type="dxa" w:w="130"/>
+              <w:bottom w:type="dxa" w:w="90"/>
+              <w:right w:type="dxa" w:w="130"/>
+            </w:tcMar>
+            <w:vAlign w:val="center"/>
+          </w:tcPr>
+          <w:p>
+            <w:pPr>
+              <w:spacing w:after="0" w:line="240"/>
+            </w:pPr>
+            <w:r>
+              <w:rPr>
+                <w:rFonts w:ascii="Calibri" w:cs="Calibri" w:eastAsia="Calibri" w:hAnsi="Calibri"/>
+                <w:b/>
+                <w:bCs/>
+                <w:i w:val="false"/>
+                <w:iCs w:val="false"/>
+                <w:color w:val="221E1F"/>
+                <w:sz w:val="20"/>
+                <w:szCs w:val="20"/>
+              </w:rPr>
+              <w:t xml:space="preserve">Delivered scope</w:t>
+            </w:r>
+          </w:p>
+        </w:tc>
+        <w:tc>
+          <w:tcPr>
+            <w:tcW w:type="dxa" w:w="964"/>
+            <w:tcBorders>
+              <w:top w:val="single" w:color="D6CFC6" w:sz="4"/>
+              <w:left w:val="single" w:color="D6CFC6" w:sz="4"/>
+              <w:bottom w:val="single" w:color="D6CFC6" w:sz="4"/>
+              <w:right w:val="single" w:color="D6CFC6" w:sz="4"/>
+            </w:tcBorders>
+            <w:shd w:fill="FCE8EB" w:color="auto" w:val="clear"/>
+            <w:tcMar>
+              <w:top w:type="dxa" w:w="90"/>
+              <w:left w:type="dxa" w:w="130"/>
+              <w:bottom w:type="dxa" w:w="90"/>
+              <w:right w:type="dxa" w:w="130"/>
+            </w:tcMar>
+            <w:vAlign w:val="center"/>
+          </w:tcPr>
+          <w:p>
+            <w:pPr>
+              <w:spacing w:after="0" w:line="240"/>
+              <w:jc w:val="right"/>
+            </w:pPr>
+            <w:r>
+              <w:rPr>
+                <w:rFonts w:ascii="Calibri" w:cs="Calibri" w:eastAsia="Calibri" w:hAnsi="Calibri"/>
+                <w:b/>
+                <w:bCs/>
+                <w:i w:val="false"/>
+                <w:iCs w:val="false"/>
+                <w:color w:val="221E1F"/>
+                <w:sz w:val="20"/>
+                <w:szCs w:val="20"/>
+              </w:rPr>
+              <w:t xml:space="preserve">176</w:t>
             </w:r>
           </w:p>
         </w:tc>
@@ -10090,7 +10390,7 @@
           <w:sz w:val="20"/>
           <w:szCs w:val="20"/>
         </w:rPr>
-        <w:t xml:space="preserve">27,878 hand-written lines over 172 days is about 162 a day. For tested, typed, reviewed production code that sits inside the normal 100–300 band, and lower than the 200 the first version of this document reconstructed — integration work carries more test and less code than storefront work does. The reconstruction is not inflated.</w:t>
+        <w:t xml:space="preserve">28,218 hand-written lines over 176 days is about 160 a day. For tested, typed, reviewed production code that sits inside the normal 100–300 band, and lower than the 200 the first version of this document reconstructed — integration work carries more test and less code than storefront work does. The reconstruction is not inflated.</w:t>
       </w:r>
     </w:p>
     <w:p>
@@ -10108,7 +10408,7 @@
           <w:sz w:val="20"/>
           <w:szCs w:val="20"/>
         </w:rPr>
-        <w:t xml:space="preserve">172 days is roughly 27 working weeks, or a little over six months for one person. Two people working in parallel would compress the calendar but not the total, and would add coordination cost.</w:t>
+        <w:t xml:space="preserve">176 days is roughly 27 working weeks, or a little over six months for one person. Two people working in parallel would compress the calendar but not the total, and would add coordination cost.</w:t>
       </w:r>
     </w:p>
     <w:p>
@@ -10179,7 +10479,7 @@
           <w:sz w:val="20"/>
           <w:szCs w:val="20"/>
         </w:rPr>
-        <w:t xml:space="preserve">Delivered scope: 172 days × 8 hours = 1376 hours.</w:t>
+        <w:t xml:space="preserve">Delivered scope: 176 days × 8 hours = 1408 hours.</w:t>
       </w:r>
     </w:p>
     <w:tbl>
@@ -10274,7 +10574,7 @@
                 <w:sz w:val="19"/>
                 <w:szCs w:val="19"/>
               </w:rPr>
-              <w:t xml:space="preserve">Cost of the 1376 hours (excl. VAT)</w:t>
+              <w:t xml:space="preserve">Cost of the 1408 hours (excl. VAT)</w:t>
             </w:r>
           </w:p>
         </w:tc>
@@ -10387,7 +10687,7 @@
                 <w:sz w:val="20"/>
                 <w:szCs w:val="20"/>
               </w:rPr>
-              <w:t xml:space="preserve">R 550,400</w:t>
+              <w:t xml:space="preserve">R 563,200</w:t>
             </w:r>
           </w:p>
         </w:tc>
@@ -10424,7 +10724,7 @@
                 <w:sz w:val="20"/>
                 <w:szCs w:val="20"/>
               </w:rPr>
-              <w:t xml:space="preserve">R 632,960</w:t>
+              <w:t xml:space="preserve">R 647,680</w:t>
             </w:r>
           </w:p>
         </w:tc>
@@ -10501,7 +10801,7 @@
                 <w:sz w:val="20"/>
                 <w:szCs w:val="20"/>
               </w:rPr>
-              <w:t xml:space="preserve">R 894,400</w:t>
+              <w:t xml:space="preserve">R 915,200</w:t>
             </w:r>
           </w:p>
         </w:tc>
@@ -10539,7 +10839,7 @@
                 <w:sz w:val="20"/>
                 <w:szCs w:val="20"/>
               </w:rPr>
-              <w:t xml:space="preserve">R 1,028,560</w:t>
+              <w:t xml:space="preserve">R 1,052,480</w:t>
             </w:r>
           </w:p>
         </w:tc>
@@ -10614,7 +10914,7 @@
                 <w:sz w:val="20"/>
                 <w:szCs w:val="20"/>
               </w:rPr>
-              <w:t xml:space="preserve">R 1,169,600</w:t>
+              <w:t xml:space="preserve">R 1,196,800</w:t>
             </w:r>
           </w:p>
         </w:tc>
@@ -10651,7 +10951,7 @@
                 <w:sz w:val="20"/>
                 <w:szCs w:val="20"/>
               </w:rPr>
-              <w:t xml:space="preserve">R 1,345,040</w:t>
+              <w:t xml:space="preserve">R 1,376,320</w:t>
             </w:r>
           </w:p>
         </w:tc>
@@ -10728,7 +11028,7 @@
                 <w:sz w:val="20"/>
                 <w:szCs w:val="20"/>
               </w:rPr>
-              <w:t xml:space="preserve">R 1,307,200</w:t>
+              <w:t xml:space="preserve">R 1,337,600</w:t>
             </w:r>
           </w:p>
         </w:tc>
@@ -10766,7 +11066,7 @@
                 <w:sz w:val="20"/>
                 <w:szCs w:val="20"/>
               </w:rPr>
-              <w:t xml:space="preserve">R 1,503,280</w:t>
+              <w:t xml:space="preserve">R 1,538,240</w:t>
             </w:r>
           </w:p>
         </w:tc>
@@ -10841,7 +11141,7 @@
                 <w:sz w:val="20"/>
                 <w:szCs w:val="20"/>
               </w:rPr>
-              <w:t xml:space="preserve">R 1,582,400</w:t>
+              <w:t xml:space="preserve">R 1,619,200</w:t>
             </w:r>
           </w:p>
         </w:tc>
@@ -10878,7 +11178,7 @@
                 <w:sz w:val="20"/>
                 <w:szCs w:val="20"/>
               </w:rPr>
-              <w:t xml:space="preserve">R 1,819,760</w:t>
+              <w:t xml:space="preserve">R 1,862,080</w:t>
             </w:r>
           </w:p>
         </w:tc>
@@ -10955,7 +11255,7 @@
                 <w:sz w:val="20"/>
                 <w:szCs w:val="20"/>
               </w:rPr>
-              <w:t xml:space="preserve">R 1,995,200</w:t>
+              <w:t xml:space="preserve">R 2,041,600</w:t>
             </w:r>
           </w:p>
         </w:tc>
@@ -10993,7 +11293,7 @@
                 <w:sz w:val="20"/>
                 <w:szCs w:val="20"/>
               </w:rPr>
-              <w:t xml:space="preserve">R 2,294,480</w:t>
+              <w:t xml:space="preserve">R 2,347,840</w:t>
             </w:r>
           </w:p>
         </w:tc>
@@ -11045,7 +11345,7 @@
           <w:sz w:val="20"/>
           <w:szCs w:val="20"/>
         </w:rPr>
-        <w:t xml:space="preserve">At an illustrative blended rate of R 950 an hour — chosen here only to make the rest of the document concrete — the delivered scope comes to R 1,307,200 excluding VAT, or R 1,503,280 including it. Replace the rate and every figure below moves proportionally.</w:t>
+        <w:t xml:space="preserve">At an illustrative blended rate of R 950 an hour — chosen here only to make the rest of the document concrete — the delivered scope comes to R 1,337,600 excluding VAT, or R 1,538,240 including it. Replace the rate and every figure below moves proportionally.</w:t>
       </w:r>
     </w:p>
     <w:p>
@@ -15650,7 +15950,7 @@
                 <w:sz w:val="20"/>
                 <w:szCs w:val="20"/>
               </w:rPr>
-              <w:t xml:space="preserve">An operations console that can act</w:t>
+              <w:t xml:space="preserve">Loyalty, corrected</w:t>
             </w:r>
           </w:p>
         </w:tc>
@@ -15779,6 +16079,308 @@
               <w:bottom w:val="single" w:color="D6CFC6" w:sz="4"/>
               <w:right w:val="single" w:color="D6CFC6" w:sz="4"/>
             </w:tcBorders>
+            <w:tcMar>
+              <w:top w:type="dxa" w:w="90"/>
+              <w:left w:type="dxa" w:w="130"/>
+              <w:bottom w:type="dxa" w:w="90"/>
+              <w:right w:type="dxa" w:w="130"/>
+            </w:tcMar>
+            <w:vAlign w:val="center"/>
+          </w:tcPr>
+          <w:p>
+            <w:pPr>
+              <w:spacing w:after="0" w:line="240"/>
+            </w:pPr>
+            <w:r>
+              <w:rPr>
+                <w:rFonts w:ascii="Calibri" w:cs="Calibri" w:eastAsia="Calibri" w:hAnsi="Calibri"/>
+                <w:b w:val="false"/>
+                <w:bCs w:val="false"/>
+                <w:i w:val="false"/>
+                <w:iCs w:val="false"/>
+                <w:color w:val="221E1F"/>
+                <w:sz w:val="20"/>
+                <w:szCs w:val="20"/>
+              </w:rPr>
+              <w:t xml:space="preserve">Availability from the till</w:t>
+            </w:r>
+          </w:p>
+        </w:tc>
+        <w:tc>
+          <w:tcPr>
+            <w:tcW w:type="dxa" w:w="1157"/>
+            <w:tcBorders>
+              <w:top w:val="single" w:color="D6CFC6" w:sz="4"/>
+              <w:left w:val="single" w:color="D6CFC6" w:sz="4"/>
+              <w:bottom w:val="single" w:color="D6CFC6" w:sz="4"/>
+              <w:right w:val="single" w:color="D6CFC6" w:sz="4"/>
+            </w:tcBorders>
+            <w:tcMar>
+              <w:top w:type="dxa" w:w="90"/>
+              <w:left w:type="dxa" w:w="130"/>
+              <w:bottom w:type="dxa" w:w="90"/>
+              <w:right w:type="dxa" w:w="130"/>
+            </w:tcMar>
+            <w:vAlign w:val="center"/>
+          </w:tcPr>
+          <w:p>
+            <w:pPr>
+              <w:spacing w:after="0" w:line="240"/>
+              <w:jc w:val="right"/>
+            </w:pPr>
+            <w:r>
+              <w:rPr>
+                <w:rFonts w:ascii="Calibri" w:cs="Calibri" w:eastAsia="Calibri" w:hAnsi="Calibri"/>
+                <w:b w:val="false"/>
+                <w:bCs w:val="false"/>
+                <w:i w:val="false"/>
+                <w:iCs w:val="false"/>
+                <w:color w:val="221E1F"/>
+                <w:sz w:val="20"/>
+                <w:szCs w:val="20"/>
+              </w:rPr>
+              <w:t xml:space="preserve">1</w:t>
+            </w:r>
+          </w:p>
+        </w:tc>
+        <w:tc>
+          <w:tcPr>
+            <w:tcW w:type="dxa" w:w="1542"/>
+            <w:tcBorders>
+              <w:top w:val="single" w:color="D6CFC6" w:sz="4"/>
+              <w:left w:val="single" w:color="D6CFC6" w:sz="4"/>
+              <w:bottom w:val="single" w:color="D6CFC6" w:sz="4"/>
+              <w:right w:val="single" w:color="D6CFC6" w:sz="4"/>
+            </w:tcBorders>
+            <w:tcMar>
+              <w:top w:type="dxa" w:w="90"/>
+              <w:left w:type="dxa" w:w="130"/>
+              <w:bottom w:type="dxa" w:w="90"/>
+              <w:right w:type="dxa" w:w="130"/>
+            </w:tcMar>
+            <w:vAlign w:val="center"/>
+          </w:tcPr>
+          <w:p>
+            <w:pPr>
+              <w:spacing w:after="0" w:line="240"/>
+              <w:jc w:val="right"/>
+            </w:pPr>
+            <w:r>
+              <w:rPr>
+                <w:rFonts w:ascii="Calibri" w:cs="Calibri" w:eastAsia="Calibri" w:hAnsi="Calibri"/>
+                <w:b w:val="false"/>
+                <w:bCs w:val="false"/>
+                <w:i w:val="false"/>
+                <w:iCs w:val="false"/>
+                <w:color w:val="221E1F"/>
+                <w:sz w:val="20"/>
+                <w:szCs w:val="20"/>
+              </w:rPr>
+              <w:t xml:space="preserve">8</w:t>
+            </w:r>
+          </w:p>
+        </w:tc>
+        <w:tc>
+          <w:tcPr>
+            <w:tcW w:type="dxa" w:w="1638"/>
+            <w:tcBorders>
+              <w:top w:val="single" w:color="D6CFC6" w:sz="4"/>
+              <w:left w:val="single" w:color="D6CFC6" w:sz="4"/>
+              <w:bottom w:val="single" w:color="D6CFC6" w:sz="4"/>
+              <w:right w:val="single" w:color="D6CFC6" w:sz="4"/>
+            </w:tcBorders>
+            <w:tcMar>
+              <w:top w:type="dxa" w:w="90"/>
+              <w:left w:type="dxa" w:w="130"/>
+              <w:bottom w:type="dxa" w:w="90"/>
+              <w:right w:type="dxa" w:w="130"/>
+            </w:tcMar>
+            <w:vAlign w:val="center"/>
+          </w:tcPr>
+          <w:p>
+            <w:pPr>
+              <w:spacing w:after="0" w:line="240"/>
+              <w:jc w:val="right"/>
+            </w:pPr>
+            <w:r>
+              <w:rPr>
+                <w:rFonts w:ascii="Calibri" w:cs="Calibri" w:eastAsia="Calibri" w:hAnsi="Calibri"/>
+                <w:b w:val="false"/>
+                <w:bCs w:val="false"/>
+                <w:i w:val="false"/>
+                <w:iCs w:val="false"/>
+                <w:color w:val="221E1F"/>
+                <w:sz w:val="20"/>
+                <w:szCs w:val="20"/>
+              </w:rPr>
+              <w:t xml:space="preserve">R 7,600</w:t>
+            </w:r>
+          </w:p>
+        </w:tc>
+      </w:tr>
+      <w:tr>
+        <w:tc>
+          <w:tcPr>
+            <w:tcW w:type="dxa" w:w="5301"/>
+            <w:tcBorders>
+              <w:top w:val="single" w:color="D6CFC6" w:sz="4"/>
+              <w:left w:val="single" w:color="D6CFC6" w:sz="4"/>
+              <w:bottom w:val="single" w:color="D6CFC6" w:sz="4"/>
+              <w:right w:val="single" w:color="D6CFC6" w:sz="4"/>
+            </w:tcBorders>
+            <w:shd w:fill="F7F5F2" w:color="auto" w:val="clear"/>
+            <w:tcMar>
+              <w:top w:type="dxa" w:w="90"/>
+              <w:left w:type="dxa" w:w="130"/>
+              <w:bottom w:type="dxa" w:w="90"/>
+              <w:right w:type="dxa" w:w="130"/>
+            </w:tcMar>
+            <w:vAlign w:val="center"/>
+          </w:tcPr>
+          <w:p>
+            <w:pPr>
+              <w:spacing w:after="0" w:line="240"/>
+            </w:pPr>
+            <w:r>
+              <w:rPr>
+                <w:rFonts w:ascii="Calibri" w:cs="Calibri" w:eastAsia="Calibri" w:hAnsi="Calibri"/>
+                <w:b w:val="false"/>
+                <w:bCs w:val="false"/>
+                <w:i w:val="false"/>
+                <w:iCs w:val="false"/>
+                <w:color w:val="221E1F"/>
+                <w:sz w:val="20"/>
+                <w:szCs w:val="20"/>
+              </w:rPr>
+              <w:t xml:space="preserve">An operations console that can act</w:t>
+            </w:r>
+          </w:p>
+        </w:tc>
+        <w:tc>
+          <w:tcPr>
+            <w:tcW w:type="dxa" w:w="1157"/>
+            <w:tcBorders>
+              <w:top w:val="single" w:color="D6CFC6" w:sz="4"/>
+              <w:left w:val="single" w:color="D6CFC6" w:sz="4"/>
+              <w:bottom w:val="single" w:color="D6CFC6" w:sz="4"/>
+              <w:right w:val="single" w:color="D6CFC6" w:sz="4"/>
+            </w:tcBorders>
+            <w:shd w:fill="F7F5F2" w:color="auto" w:val="clear"/>
+            <w:tcMar>
+              <w:top w:type="dxa" w:w="90"/>
+              <w:left w:type="dxa" w:w="130"/>
+              <w:bottom w:type="dxa" w:w="90"/>
+              <w:right w:type="dxa" w:w="130"/>
+            </w:tcMar>
+            <w:vAlign w:val="center"/>
+          </w:tcPr>
+          <w:p>
+            <w:pPr>
+              <w:spacing w:after="0" w:line="240"/>
+              <w:jc w:val="right"/>
+            </w:pPr>
+            <w:r>
+              <w:rPr>
+                <w:rFonts w:ascii="Calibri" w:cs="Calibri" w:eastAsia="Calibri" w:hAnsi="Calibri"/>
+                <w:b w:val="false"/>
+                <w:bCs w:val="false"/>
+                <w:i w:val="false"/>
+                <w:iCs w:val="false"/>
+                <w:color w:val="221E1F"/>
+                <w:sz w:val="20"/>
+                <w:szCs w:val="20"/>
+              </w:rPr>
+              <w:t xml:space="preserve">3</w:t>
+            </w:r>
+          </w:p>
+        </w:tc>
+        <w:tc>
+          <w:tcPr>
+            <w:tcW w:type="dxa" w:w="1542"/>
+            <w:tcBorders>
+              <w:top w:val="single" w:color="D6CFC6" w:sz="4"/>
+              <w:left w:val="single" w:color="D6CFC6" w:sz="4"/>
+              <w:bottom w:val="single" w:color="D6CFC6" w:sz="4"/>
+              <w:right w:val="single" w:color="D6CFC6" w:sz="4"/>
+            </w:tcBorders>
+            <w:shd w:fill="F7F5F2" w:color="auto" w:val="clear"/>
+            <w:tcMar>
+              <w:top w:type="dxa" w:w="90"/>
+              <w:left w:type="dxa" w:w="130"/>
+              <w:bottom w:type="dxa" w:w="90"/>
+              <w:right w:type="dxa" w:w="130"/>
+            </w:tcMar>
+            <w:vAlign w:val="center"/>
+          </w:tcPr>
+          <w:p>
+            <w:pPr>
+              <w:spacing w:after="0" w:line="240"/>
+              <w:jc w:val="right"/>
+            </w:pPr>
+            <w:r>
+              <w:rPr>
+                <w:rFonts w:ascii="Calibri" w:cs="Calibri" w:eastAsia="Calibri" w:hAnsi="Calibri"/>
+                <w:b w:val="false"/>
+                <w:bCs w:val="false"/>
+                <w:i w:val="false"/>
+                <w:iCs w:val="false"/>
+                <w:color w:val="221E1F"/>
+                <w:sz w:val="20"/>
+                <w:szCs w:val="20"/>
+              </w:rPr>
+              <w:t xml:space="preserve">24</w:t>
+            </w:r>
+          </w:p>
+        </w:tc>
+        <w:tc>
+          <w:tcPr>
+            <w:tcW w:type="dxa" w:w="1638"/>
+            <w:tcBorders>
+              <w:top w:val="single" w:color="D6CFC6" w:sz="4"/>
+              <w:left w:val="single" w:color="D6CFC6" w:sz="4"/>
+              <w:bottom w:val="single" w:color="D6CFC6" w:sz="4"/>
+              <w:right w:val="single" w:color="D6CFC6" w:sz="4"/>
+            </w:tcBorders>
+            <w:shd w:fill="F7F5F2" w:color="auto" w:val="clear"/>
+            <w:tcMar>
+              <w:top w:type="dxa" w:w="90"/>
+              <w:left w:type="dxa" w:w="130"/>
+              <w:bottom w:type="dxa" w:w="90"/>
+              <w:right w:type="dxa" w:w="130"/>
+            </w:tcMar>
+            <w:vAlign w:val="center"/>
+          </w:tcPr>
+          <w:p>
+            <w:pPr>
+              <w:spacing w:after="0" w:line="240"/>
+              <w:jc w:val="right"/>
+            </w:pPr>
+            <w:r>
+              <w:rPr>
+                <w:rFonts w:ascii="Calibri" w:cs="Calibri" w:eastAsia="Calibri" w:hAnsi="Calibri"/>
+                <w:b w:val="false"/>
+                <w:bCs w:val="false"/>
+                <w:i w:val="false"/>
+                <w:iCs w:val="false"/>
+                <w:color w:val="221E1F"/>
+                <w:sz w:val="20"/>
+                <w:szCs w:val="20"/>
+              </w:rPr>
+              <w:t xml:space="preserve">R 22,800</w:t>
+            </w:r>
+          </w:p>
+        </w:tc>
+      </w:tr>
+      <w:tr>
+        <w:tc>
+          <w:tcPr>
+            <w:tcW w:type="dxa" w:w="5301"/>
+            <w:tcBorders>
+              <w:top w:val="single" w:color="D6CFC6" w:sz="4"/>
+              <w:left w:val="single" w:color="D6CFC6" w:sz="4"/>
+              <w:bottom w:val="single" w:color="D6CFC6" w:sz="4"/>
+              <w:right w:val="single" w:color="D6CFC6" w:sz="4"/>
+            </w:tcBorders>
             <w:shd w:fill="FCE8EB" w:color="auto" w:val="clear"/>
             <w:tcMar>
               <w:top w:type="dxa" w:w="90"/>
@@ -15841,7 +16443,7 @@
                 <w:sz w:val="20"/>
                 <w:szCs w:val="20"/>
               </w:rPr>
-              <w:t xml:space="preserve">172</w:t>
+              <w:t xml:space="preserve">176</w:t>
             </w:r>
           </w:p>
         </w:tc>
@@ -15879,7 +16481,7 @@
                 <w:sz w:val="20"/>
                 <w:szCs w:val="20"/>
               </w:rPr>
-              <w:t xml:space="preserve">1,376</w:t>
+              <w:t xml:space="preserve">1,408</w:t>
             </w:r>
           </w:p>
         </w:tc>
@@ -15917,7 +16519,7 @@
                 <w:sz w:val="20"/>
                 <w:szCs w:val="20"/>
               </w:rPr>
-              <w:t xml:space="preserve">R 1,307,200</w:t>
+              <w:t xml:space="preserve">R 1,337,600</w:t>
             </w:r>
           </w:p>
         </w:tc>
@@ -15956,7 +16558,7 @@
           <w:sz w:val="20"/>
           <w:szCs w:val="20"/>
         </w:rPr>
-        <w:t xml:space="preserve">The integration seams — payments, accounts, notifications, POS and courier — are 44 of the 172 days. None of them names a vendor, and none has to be rewritten when one is chosen: what remains per integration is an adapter against an interface that already exists and is already tested.</w:t>
+        <w:t xml:space="preserve">The integration seams — payments, accounts, notifications, POS and courier — are 44 of the 176 days. None of them names a vendor, and none has to be rewritten when one is chosen: what remains per integration is an adapter against an interface that already exists and is already tested.</w:t>
       </w:r>
     </w:p>
     <w:p>
@@ -18075,7 +18677,7 @@
                 <w:sz w:val="20"/>
                 <w:szCs w:val="20"/>
               </w:rPr>
-              <w:t xml:space="preserve">172</w:t>
+              <w:t xml:space="preserve">176</w:t>
             </w:r>
           </w:p>
         </w:tc>
@@ -18112,7 +18714,7 @@
                 <w:sz w:val="20"/>
                 <w:szCs w:val="20"/>
               </w:rPr>
-              <w:t xml:space="preserve">1,376</w:t>
+              <w:t xml:space="preserve">1,408</w:t>
             </w:r>
           </w:p>
         </w:tc>
@@ -18149,7 +18751,7 @@
                 <w:sz w:val="20"/>
                 <w:szCs w:val="20"/>
               </w:rPr>
-              <w:t xml:space="preserve">R 1,307,200</w:t>
+              <w:t xml:space="preserve">R 1,337,600</w:t>
             </w:r>
           </w:p>
         </w:tc>
@@ -18379,7 +18981,7 @@
                 <w:sz w:val="20"/>
                 <w:szCs w:val="20"/>
               </w:rPr>
-              <w:t xml:space="preserve">197</w:t>
+              <w:t xml:space="preserve">201</w:t>
             </w:r>
           </w:p>
         </w:tc>
@@ -18417,7 +19019,7 @@
                 <w:sz w:val="20"/>
                 <w:szCs w:val="20"/>
               </w:rPr>
-              <w:t xml:space="preserve">1,576</w:t>
+              <w:t xml:space="preserve">1,608</w:t>
             </w:r>
           </w:p>
         </w:tc>
@@ -18455,7 +19057,7 @@
                 <w:sz w:val="20"/>
                 <w:szCs w:val="20"/>
               </w:rPr>
-              <w:t xml:space="preserve">R 1,497,200</w:t>
+              <w:t xml:space="preserve">R 1,527,600</w:t>
             </w:r>
           </w:p>
         </w:tc>
@@ -18494,7 +19096,7 @@
           <w:sz w:val="20"/>
           <w:szCs w:val="20"/>
         </w:rPr>
-        <w:t xml:space="preserve">Roughly 87% of the engineering is done. </w:t>
+        <w:t xml:space="preserve">Roughly 88% of the engineering is done. </w:t>
       </w:r>
       <w:r>
         <w:rPr>

</xml_diff>

<commit_message>
Reprice with the offer-conditions workstream
180 delivered days, 25 remaining, 205 end to end. 812 tests in 40 files.

Co-Authored-By: Claude Opus 5 <noreply@anthropic.com>
Claude-Session: https://claude.ai/code/session_01B2xsFCpQEfEHuTCkYzyD13
</commit_message>
<xml_diff>
--- a/WEBSITE_COSTINGS.docx
+++ b/WEBSITE_COSTINGS.docx
@@ -1415,7 +1415,7 @@
                 <w:sz w:val="20"/>
                 <w:szCs w:val="20"/>
               </w:rPr>
-              <w:t xml:space="preserve">44</w:t>
+              <w:t xml:space="preserve">45</w:t>
             </w:r>
           </w:p>
         </w:tc>
@@ -1527,7 +1527,7 @@
                 <w:sz w:val="20"/>
                 <w:szCs w:val="20"/>
               </w:rPr>
-              <w:t xml:space="preserve">780</w:t>
+              <w:t xml:space="preserve">812</w:t>
             </w:r>
           </w:p>
         </w:tc>
@@ -1563,7 +1563,7 @@
                 <w:sz w:val="20"/>
                 <w:szCs w:val="20"/>
               </w:rPr>
-              <w:t xml:space="preserve">In 38 files; all passing</w:t>
+              <w:t xml:space="preserve">In 40 files; all passing</w:t>
             </w:r>
           </w:p>
         </w:tc>
@@ -1640,7 +1640,7 @@
                 <w:sz w:val="20"/>
                 <w:szCs w:val="20"/>
               </w:rPr>
-              <w:t xml:space="preserve">28,218</w:t>
+              <w:t xml:space="preserve">28,946</w:t>
             </w:r>
           </w:p>
         </w:tc>
@@ -1677,7 +1677,7 @@
                 <w:sz w:val="20"/>
                 <w:szCs w:val="20"/>
               </w:rPr>
-              <w:t xml:space="preserve">Application 12,333 · tests 10,441 · review build 2,563 · data, schema and tooling 2,115 · shared packages 766</w:t>
+              <w:t xml:space="preserve">Application 12,519 · tests 10,926 · review build 2,563 · data, schema and tooling 2,130 · shared packages 808</w:t>
             </w:r>
           </w:p>
         </w:tc>
@@ -1865,7 +1865,7 @@
                 <w:sz w:val="20"/>
                 <w:szCs w:val="20"/>
               </w:rPr>
-              <w:t xml:space="preserve">108</w:t>
+              <w:t xml:space="preserve">111</w:t>
             </w:r>
           </w:p>
         </w:tc>
@@ -3770,7 +3770,7 @@
                 <w:sz w:val="20"/>
                 <w:szCs w:val="20"/>
               </w:rPr>
-              <w:t xml:space="preserve">780 passing</w:t>
+              <w:t xml:space="preserve">812 passing</w:t>
             </w:r>
           </w:p>
         </w:tc>
@@ -3807,7 +3807,7 @@
                 <w:sz w:val="20"/>
                 <w:szCs w:val="20"/>
               </w:rPr>
-              <w:t xml:space="preserve">38 files, including four real worker processes racing on one file</w:t>
+              <w:t xml:space="preserve">40 files, including four real worker processes racing on one file</w:t>
             </w:r>
           </w:p>
         </w:tc>
@@ -6548,7 +6548,7 @@
                 <w:sz w:val="20"/>
                 <w:szCs w:val="20"/>
               </w:rPr>
-              <w:t xml:space="preserve">The suite as it stood at this workstream: the 780 tests now in 38 files grew with the workstreams below. Driven through route handlers rather than helpers</w:t>
+              <w:t xml:space="preserve">The suite as it stood at this workstream: the 812 tests now in 40 files grew with the workstreams below. Driven through route handlers rather than helpers</w:t>
             </w:r>
           </w:p>
         </w:tc>
@@ -10074,7 +10074,7 @@
                 <w:sz w:val="20"/>
                 <w:szCs w:val="20"/>
               </w:rPr>
-              <w:t xml:space="preserve">30</w:t>
+              <w:t xml:space="preserve">33</w:t>
             </w:r>
           </w:p>
         </w:tc>
@@ -10111,7 +10111,7 @@
                 <w:sz w:val="20"/>
                 <w:szCs w:val="20"/>
               </w:rPr>
-              <w:t xml:space="preserve">An operations console that can act</w:t>
+              <w:t xml:space="preserve">Offer conditions, enforced</w:t>
             </w:r>
           </w:p>
         </w:tc>
@@ -10148,7 +10148,7 @@
                 <w:sz w:val="20"/>
                 <w:szCs w:val="20"/>
               </w:rPr>
-              <w:t xml:space="preserve">The Problems tab named an action — “worth retrying” — and did not provide it, and the suppression list offered nothing at all. A retry that refuses to send a handoff twice and refuses one the adapter called final, a restore that undoes a bounce but never a complaint, both reporting what happened rather than refreshing a list that looks unchanged. Plus the payment ledger, which was settled and reconciled by tests and shown to nobody, with the provider reference an operator needs to find a payment in the gateway’s dashboard</w:t>
+              <w:t xml:space="preserve">Every promotion advertised its terms as a sentence and nothing checked any of them: an offer sold as “Every Wednesday, 11:00 to close” took its discount at any hour on any day, one sold as collection only worked on a delivery, and one sold as “New accounts, one use” worked for anybody repeatedly. Each offer now carries its conditions in a form the checkout can check as well as a form the customer can read, enforced on the server. The discount also comes off the product the offer names rather than the whole basket — “twenty percent off every sauced wing” was taking twenty percent off the chicken and the drinks beside them</w:t>
             </w:r>
           </w:p>
         </w:tc>
@@ -10186,7 +10186,7 @@
                 <w:sz w:val="20"/>
                 <w:szCs w:val="20"/>
               </w:rPr>
-              <w:t xml:space="preserve">3</w:t>
+              <w:t xml:space="preserve">4</w:t>
             </w:r>
           </w:p>
         </w:tc>
@@ -10201,7 +10201,6 @@
               <w:bottom w:val="single" w:color="D6CFC6" w:sz="4"/>
               <w:right w:val="single" w:color="D6CFC6" w:sz="4"/>
             </w:tcBorders>
-            <w:shd w:fill="FCE8EB" w:color="auto" w:val="clear"/>
             <w:tcMar>
               <w:top w:type="dxa" w:w="90"/>
               <w:left w:type="dxa" w:w="130"/>
@@ -10214,6 +10213,42 @@
             <w:pPr>
               <w:spacing w:after="0" w:line="240"/>
               <w:jc w:val="center"/>
+            </w:pPr>
+            <w:r>
+              <w:rPr>
+                <w:rFonts w:ascii="Calibri" w:cs="Calibri" w:eastAsia="Calibri" w:hAnsi="Calibri"/>
+                <w:b w:val="false"/>
+                <w:bCs w:val="false"/>
+                <w:i w:val="false"/>
+                <w:iCs w:val="false"/>
+                <w:color w:val="221E1F"/>
+                <w:sz w:val="20"/>
+                <w:szCs w:val="20"/>
+              </w:rPr>
+              <w:t xml:space="preserve">30</w:t>
+            </w:r>
+          </w:p>
+        </w:tc>
+        <w:tc>
+          <w:tcPr>
+            <w:tcW w:type="dxa" w:w="3084"/>
+            <w:tcBorders>
+              <w:top w:val="single" w:color="D6CFC6" w:sz="4"/>
+              <w:left w:val="single" w:color="D6CFC6" w:sz="4"/>
+              <w:bottom w:val="single" w:color="D6CFC6" w:sz="4"/>
+              <w:right w:val="single" w:color="D6CFC6" w:sz="4"/>
+            </w:tcBorders>
+            <w:tcMar>
+              <w:top w:type="dxa" w:w="90"/>
+              <w:left w:type="dxa" w:w="130"/>
+              <w:bottom w:type="dxa" w:w="90"/>
+              <w:right w:type="dxa" w:w="130"/>
+            </w:tcMar>
+            <w:vAlign w:val="center"/>
+          </w:tcPr>
+          <w:p>
+            <w:pPr>
+              <w:spacing w:after="0" w:line="240"/>
             </w:pPr>
             <w:r>
               <w:rPr>
@@ -10226,13 +10261,88 @@
                 <w:sz w:val="20"/>
                 <w:szCs w:val="20"/>
               </w:rPr>
-              <w:t xml:space="preserve"/>
-            </w:r>
-          </w:p>
-        </w:tc>
-        <w:tc>
-          <w:tcPr>
-            <w:tcW w:type="dxa" w:w="3084"/>
+              <w:t xml:space="preserve">An operations console that can act</w:t>
+            </w:r>
+          </w:p>
+        </w:tc>
+        <w:tc>
+          <w:tcPr>
+            <w:tcW w:type="dxa" w:w="5108"/>
+            <w:tcBorders>
+              <w:top w:val="single" w:color="D6CFC6" w:sz="4"/>
+              <w:left w:val="single" w:color="D6CFC6" w:sz="4"/>
+              <w:bottom w:val="single" w:color="D6CFC6" w:sz="4"/>
+              <w:right w:val="single" w:color="D6CFC6" w:sz="4"/>
+            </w:tcBorders>
+            <w:tcMar>
+              <w:top w:type="dxa" w:w="90"/>
+              <w:left w:type="dxa" w:w="130"/>
+              <w:bottom w:type="dxa" w:w="90"/>
+              <w:right w:type="dxa" w:w="130"/>
+            </w:tcMar>
+            <w:vAlign w:val="center"/>
+          </w:tcPr>
+          <w:p>
+            <w:pPr>
+              <w:spacing w:after="0" w:line="240"/>
+            </w:pPr>
+            <w:r>
+              <w:rPr>
+                <w:rFonts w:ascii="Calibri" w:cs="Calibri" w:eastAsia="Calibri" w:hAnsi="Calibri"/>
+                <w:b w:val="false"/>
+                <w:bCs w:val="false"/>
+                <w:i w:val="false"/>
+                <w:iCs w:val="false"/>
+                <w:color w:val="221E1F"/>
+                <w:sz w:val="20"/>
+                <w:szCs w:val="20"/>
+              </w:rPr>
+              <w:t xml:space="preserve">The Problems tab named an action — “worth retrying” — and did not provide it, and the suppression list offered nothing at all. A retry that refuses to send a handoff twice and refuses one the adapter called final, a restore that undoes a bounce but never a complaint, both reporting what happened rather than refreshing a list that looks unchanged. Plus the payment ledger, which was settled and reconciled by tests and shown to nobody, with the provider reference an operator needs to find a payment in the gateway’s dashboard</w:t>
+            </w:r>
+          </w:p>
+        </w:tc>
+        <w:tc>
+          <w:tcPr>
+            <w:tcW w:type="dxa" w:w="964"/>
+            <w:tcBorders>
+              <w:top w:val="single" w:color="D6CFC6" w:sz="4"/>
+              <w:left w:val="single" w:color="D6CFC6" w:sz="4"/>
+              <w:bottom w:val="single" w:color="D6CFC6" w:sz="4"/>
+              <w:right w:val="single" w:color="D6CFC6" w:sz="4"/>
+            </w:tcBorders>
+            <w:tcMar>
+              <w:top w:type="dxa" w:w="90"/>
+              <w:left w:type="dxa" w:w="130"/>
+              <w:bottom w:type="dxa" w:w="90"/>
+              <w:right w:type="dxa" w:w="130"/>
+            </w:tcMar>
+            <w:vAlign w:val="center"/>
+          </w:tcPr>
+          <w:p>
+            <w:pPr>
+              <w:spacing w:after="0" w:line="240"/>
+              <w:jc w:val="right"/>
+            </w:pPr>
+            <w:r>
+              <w:rPr>
+                <w:rFonts w:ascii="Calibri" w:cs="Calibri" w:eastAsia="Calibri" w:hAnsi="Calibri"/>
+                <w:b w:val="false"/>
+                <w:bCs w:val="false"/>
+                <w:i w:val="false"/>
+                <w:iCs w:val="false"/>
+                <w:color w:val="221E1F"/>
+                <w:sz w:val="20"/>
+                <w:szCs w:val="20"/>
+              </w:rPr>
+              <w:t xml:space="preserve">3</w:t>
+            </w:r>
+          </w:p>
+        </w:tc>
+      </w:tr>
+      <w:tr>
+        <w:tc>
+          <w:tcPr>
+            <w:tcW w:type="dxa" w:w="482"/>
             <w:tcBorders>
               <w:top w:val="single" w:color="D6CFC6" w:sz="4"/>
               <w:left w:val="single" w:color="D6CFC6" w:sz="4"/>
@@ -10251,6 +10361,7 @@
           <w:p>
             <w:pPr>
               <w:spacing w:after="0" w:line="240"/>
+              <w:jc w:val="center"/>
             </w:pPr>
             <w:r>
               <w:rPr>
@@ -10263,13 +10374,13 @@
                 <w:sz w:val="20"/>
                 <w:szCs w:val="20"/>
               </w:rPr>
-              <w:t xml:space="preserve">Total</w:t>
-            </w:r>
-          </w:p>
-        </w:tc>
-        <w:tc>
-          <w:tcPr>
-            <w:tcW w:type="dxa" w:w="5108"/>
+              <w:t xml:space="preserve"/>
+            </w:r>
+          </w:p>
+        </w:tc>
+        <w:tc>
+          <w:tcPr>
+            <w:tcW w:type="dxa" w:w="3084"/>
             <w:tcBorders>
               <w:top w:val="single" w:color="D6CFC6" w:sz="4"/>
               <w:left w:val="single" w:color="D6CFC6" w:sz="4"/>
@@ -10300,13 +10411,13 @@
                 <w:sz w:val="20"/>
                 <w:szCs w:val="20"/>
               </w:rPr>
-              <w:t xml:space="preserve">Delivered scope</w:t>
-            </w:r>
-          </w:p>
-        </w:tc>
-        <w:tc>
-          <w:tcPr>
-            <w:tcW w:type="dxa" w:w="964"/>
+              <w:t xml:space="preserve">Total</w:t>
+            </w:r>
+          </w:p>
+        </w:tc>
+        <w:tc>
+          <w:tcPr>
+            <w:tcW w:type="dxa" w:w="5108"/>
             <w:tcBorders>
               <w:top w:val="single" w:color="D6CFC6" w:sz="4"/>
               <w:left w:val="single" w:color="D6CFC6" w:sz="4"/>
@@ -10325,7 +10436,6 @@
           <w:p>
             <w:pPr>
               <w:spacing w:after="0" w:line="240"/>
-              <w:jc w:val="right"/>
             </w:pPr>
             <w:r>
               <w:rPr>
@@ -10338,7 +10448,45 @@
                 <w:sz w:val="20"/>
                 <w:szCs w:val="20"/>
               </w:rPr>
-              <w:t xml:space="preserve">176</w:t>
+              <w:t xml:space="preserve">Delivered scope</w:t>
+            </w:r>
+          </w:p>
+        </w:tc>
+        <w:tc>
+          <w:tcPr>
+            <w:tcW w:type="dxa" w:w="964"/>
+            <w:tcBorders>
+              <w:top w:val="single" w:color="D6CFC6" w:sz="4"/>
+              <w:left w:val="single" w:color="D6CFC6" w:sz="4"/>
+              <w:bottom w:val="single" w:color="D6CFC6" w:sz="4"/>
+              <w:right w:val="single" w:color="D6CFC6" w:sz="4"/>
+            </w:tcBorders>
+            <w:shd w:fill="FCE8EB" w:color="auto" w:val="clear"/>
+            <w:tcMar>
+              <w:top w:type="dxa" w:w="90"/>
+              <w:left w:type="dxa" w:w="130"/>
+              <w:bottom w:type="dxa" w:w="90"/>
+              <w:right w:type="dxa" w:w="130"/>
+            </w:tcMar>
+            <w:vAlign w:val="center"/>
+          </w:tcPr>
+          <w:p>
+            <w:pPr>
+              <w:spacing w:after="0" w:line="240"/>
+              <w:jc w:val="right"/>
+            </w:pPr>
+            <w:r>
+              <w:rPr>
+                <w:rFonts w:ascii="Calibri" w:cs="Calibri" w:eastAsia="Calibri" w:hAnsi="Calibri"/>
+                <w:b/>
+                <w:bCs/>
+                <w:i w:val="false"/>
+                <w:iCs w:val="false"/>
+                <w:color w:val="221E1F"/>
+                <w:sz w:val="20"/>
+                <w:szCs w:val="20"/>
+              </w:rPr>
+              <w:t xml:space="preserve">180</w:t>
             </w:r>
           </w:p>
         </w:tc>
@@ -10390,7 +10538,7 @@
           <w:sz w:val="20"/>
           <w:szCs w:val="20"/>
         </w:rPr>
-        <w:t xml:space="preserve">28,218 hand-written lines over 176 days is about 160 a day. For tested, typed, reviewed production code that sits inside the normal 100–300 band, and lower than the 200 the first version of this document reconstructed — integration work carries more test and less code than storefront work does. The reconstruction is not inflated.</w:t>
+        <w:t xml:space="preserve">28,946 hand-written lines over 180 days is about 161 a day. For tested, typed, reviewed production code that sits inside the normal 100–300 band, and lower than the 200 the first version of this document reconstructed — integration work carries more test and less code than storefront work does. The reconstruction is not inflated.</w:t>
       </w:r>
     </w:p>
     <w:p>
@@ -10408,7 +10556,7 @@
           <w:sz w:val="20"/>
           <w:szCs w:val="20"/>
         </w:rPr>
-        <w:t xml:space="preserve">176 days is roughly 27 working weeks, or a little over six months for one person. Two people working in parallel would compress the calendar but not the total, and would add coordination cost.</w:t>
+        <w:t xml:space="preserve">180 days is roughly 27 working weeks, or a little over six months for one person. Two people working in parallel would compress the calendar but not the total, and would add coordination cost.</w:t>
       </w:r>
     </w:p>
     <w:p>
@@ -10479,7 +10627,7 @@
           <w:sz w:val="20"/>
           <w:szCs w:val="20"/>
         </w:rPr>
-        <w:t xml:space="preserve">Delivered scope: 176 days × 8 hours = 1408 hours.</w:t>
+        <w:t xml:space="preserve">Delivered scope: 180 days × 8 hours = 1440 hours.</w:t>
       </w:r>
     </w:p>
     <w:tbl>
@@ -10574,7 +10722,7 @@
                 <w:sz w:val="19"/>
                 <w:szCs w:val="19"/>
               </w:rPr>
-              <w:t xml:space="preserve">Cost of the 1408 hours (excl. VAT)</w:t>
+              <w:t xml:space="preserve">Cost of the 1440 hours (excl. VAT)</w:t>
             </w:r>
           </w:p>
         </w:tc>
@@ -10687,7 +10835,7 @@
                 <w:sz w:val="20"/>
                 <w:szCs w:val="20"/>
               </w:rPr>
-              <w:t xml:space="preserve">R 563,200</w:t>
+              <w:t xml:space="preserve">R 576,000</w:t>
             </w:r>
           </w:p>
         </w:tc>
@@ -10724,7 +10872,7 @@
                 <w:sz w:val="20"/>
                 <w:szCs w:val="20"/>
               </w:rPr>
-              <w:t xml:space="preserve">R 647,680</w:t>
+              <w:t xml:space="preserve">R 662,400</w:t>
             </w:r>
           </w:p>
         </w:tc>
@@ -10801,7 +10949,7 @@
                 <w:sz w:val="20"/>
                 <w:szCs w:val="20"/>
               </w:rPr>
-              <w:t xml:space="preserve">R 915,200</w:t>
+              <w:t xml:space="preserve">R 936,000</w:t>
             </w:r>
           </w:p>
         </w:tc>
@@ -10839,7 +10987,7 @@
                 <w:sz w:val="20"/>
                 <w:szCs w:val="20"/>
               </w:rPr>
-              <w:t xml:space="preserve">R 1,052,480</w:t>
+              <w:t xml:space="preserve">R 1,076,400</w:t>
             </w:r>
           </w:p>
         </w:tc>
@@ -10914,7 +11062,7 @@
                 <w:sz w:val="20"/>
                 <w:szCs w:val="20"/>
               </w:rPr>
-              <w:t xml:space="preserve">R 1,196,800</w:t>
+              <w:t xml:space="preserve">R 1,224,000</w:t>
             </w:r>
           </w:p>
         </w:tc>
@@ -10951,7 +11099,7 @@
                 <w:sz w:val="20"/>
                 <w:szCs w:val="20"/>
               </w:rPr>
-              <w:t xml:space="preserve">R 1,376,320</w:t>
+              <w:t xml:space="preserve">R 1,407,600</w:t>
             </w:r>
           </w:p>
         </w:tc>
@@ -11028,7 +11176,7 @@
                 <w:sz w:val="20"/>
                 <w:szCs w:val="20"/>
               </w:rPr>
-              <w:t xml:space="preserve">R 1,337,600</w:t>
+              <w:t xml:space="preserve">R 1,368,000</w:t>
             </w:r>
           </w:p>
         </w:tc>
@@ -11066,7 +11214,7 @@
                 <w:sz w:val="20"/>
                 <w:szCs w:val="20"/>
               </w:rPr>
-              <w:t xml:space="preserve">R 1,538,240</w:t>
+              <w:t xml:space="preserve">R 1,573,200</w:t>
             </w:r>
           </w:p>
         </w:tc>
@@ -11141,7 +11289,7 @@
                 <w:sz w:val="20"/>
                 <w:szCs w:val="20"/>
               </w:rPr>
-              <w:t xml:space="preserve">R 1,619,200</w:t>
+              <w:t xml:space="preserve">R 1,656,000</w:t>
             </w:r>
           </w:p>
         </w:tc>
@@ -11178,7 +11326,7 @@
                 <w:sz w:val="20"/>
                 <w:szCs w:val="20"/>
               </w:rPr>
-              <w:t xml:space="preserve">R 1,862,080</w:t>
+              <w:t xml:space="preserve">R 1,904,400</w:t>
             </w:r>
           </w:p>
         </w:tc>
@@ -11255,7 +11403,7 @@
                 <w:sz w:val="20"/>
                 <w:szCs w:val="20"/>
               </w:rPr>
-              <w:t xml:space="preserve">R 2,041,600</w:t>
+              <w:t xml:space="preserve">R 2,088,000</w:t>
             </w:r>
           </w:p>
         </w:tc>
@@ -11293,7 +11441,7 @@
                 <w:sz w:val="20"/>
                 <w:szCs w:val="20"/>
               </w:rPr>
-              <w:t xml:space="preserve">R 2,347,840</w:t>
+              <w:t xml:space="preserve">R 2,401,200</w:t>
             </w:r>
           </w:p>
         </w:tc>
@@ -11345,7 +11493,7 @@
           <w:sz w:val="20"/>
           <w:szCs w:val="20"/>
         </w:rPr>
-        <w:t xml:space="preserve">At an illustrative blended rate of R 950 an hour — chosen here only to make the rest of the document concrete — the delivered scope comes to R 1,337,600 excluding VAT, or R 1,538,240 including it. Replace the rate and every figure below moves proportionally.</w:t>
+        <w:t xml:space="preserve">At an illustrative blended rate of R 950 an hour — chosen here only to make the rest of the document concrete — the delivered scope comes to R 1,368,000 excluding VAT, or R 1,573,200 including it. Replace the rate and every figure below moves proportionally.</w:t>
       </w:r>
     </w:p>
     <w:p>
@@ -16252,7 +16400,7 @@
                 <w:sz w:val="20"/>
                 <w:szCs w:val="20"/>
               </w:rPr>
-              <w:t xml:space="preserve">An operations console that can act</w:t>
+              <w:t xml:space="preserve">Offer conditions, enforced</w:t>
             </w:r>
           </w:p>
         </w:tc>
@@ -16290,7 +16438,7 @@
                 <w:sz w:val="20"/>
                 <w:szCs w:val="20"/>
               </w:rPr>
-              <w:t xml:space="preserve">3</w:t>
+              <w:t xml:space="preserve">4</w:t>
             </w:r>
           </w:p>
         </w:tc>
@@ -16328,7 +16476,7 @@
                 <w:sz w:val="20"/>
                 <w:szCs w:val="20"/>
               </w:rPr>
-              <w:t xml:space="preserve">24</w:t>
+              <w:t xml:space="preserve">32</w:t>
             </w:r>
           </w:p>
         </w:tc>
@@ -16366,7 +16514,7 @@
                 <w:sz w:val="20"/>
                 <w:szCs w:val="20"/>
               </w:rPr>
-              <w:t xml:space="preserve">R 22,800</w:t>
+              <w:t xml:space="preserve">R 30,400</w:t>
             </w:r>
           </w:p>
         </w:tc>
@@ -16381,6 +16529,155 @@
               <w:bottom w:val="single" w:color="D6CFC6" w:sz="4"/>
               <w:right w:val="single" w:color="D6CFC6" w:sz="4"/>
             </w:tcBorders>
+            <w:tcMar>
+              <w:top w:type="dxa" w:w="90"/>
+              <w:left w:type="dxa" w:w="130"/>
+              <w:bottom w:type="dxa" w:w="90"/>
+              <w:right w:type="dxa" w:w="130"/>
+            </w:tcMar>
+            <w:vAlign w:val="center"/>
+          </w:tcPr>
+          <w:p>
+            <w:pPr>
+              <w:spacing w:after="0" w:line="240"/>
+            </w:pPr>
+            <w:r>
+              <w:rPr>
+                <w:rFonts w:ascii="Calibri" w:cs="Calibri" w:eastAsia="Calibri" w:hAnsi="Calibri"/>
+                <w:b w:val="false"/>
+                <w:bCs w:val="false"/>
+                <w:i w:val="false"/>
+                <w:iCs w:val="false"/>
+                <w:color w:val="221E1F"/>
+                <w:sz w:val="20"/>
+                <w:szCs w:val="20"/>
+              </w:rPr>
+              <w:t xml:space="preserve">An operations console that can act</w:t>
+            </w:r>
+          </w:p>
+        </w:tc>
+        <w:tc>
+          <w:tcPr>
+            <w:tcW w:type="dxa" w:w="1157"/>
+            <w:tcBorders>
+              <w:top w:val="single" w:color="D6CFC6" w:sz="4"/>
+              <w:left w:val="single" w:color="D6CFC6" w:sz="4"/>
+              <w:bottom w:val="single" w:color="D6CFC6" w:sz="4"/>
+              <w:right w:val="single" w:color="D6CFC6" w:sz="4"/>
+            </w:tcBorders>
+            <w:tcMar>
+              <w:top w:type="dxa" w:w="90"/>
+              <w:left w:type="dxa" w:w="130"/>
+              <w:bottom w:type="dxa" w:w="90"/>
+              <w:right w:type="dxa" w:w="130"/>
+            </w:tcMar>
+            <w:vAlign w:val="center"/>
+          </w:tcPr>
+          <w:p>
+            <w:pPr>
+              <w:spacing w:after="0" w:line="240"/>
+              <w:jc w:val="right"/>
+            </w:pPr>
+            <w:r>
+              <w:rPr>
+                <w:rFonts w:ascii="Calibri" w:cs="Calibri" w:eastAsia="Calibri" w:hAnsi="Calibri"/>
+                <w:b w:val="false"/>
+                <w:bCs w:val="false"/>
+                <w:i w:val="false"/>
+                <w:iCs w:val="false"/>
+                <w:color w:val="221E1F"/>
+                <w:sz w:val="20"/>
+                <w:szCs w:val="20"/>
+              </w:rPr>
+              <w:t xml:space="preserve">3</w:t>
+            </w:r>
+          </w:p>
+        </w:tc>
+        <w:tc>
+          <w:tcPr>
+            <w:tcW w:type="dxa" w:w="1542"/>
+            <w:tcBorders>
+              <w:top w:val="single" w:color="D6CFC6" w:sz="4"/>
+              <w:left w:val="single" w:color="D6CFC6" w:sz="4"/>
+              <w:bottom w:val="single" w:color="D6CFC6" w:sz="4"/>
+              <w:right w:val="single" w:color="D6CFC6" w:sz="4"/>
+            </w:tcBorders>
+            <w:tcMar>
+              <w:top w:type="dxa" w:w="90"/>
+              <w:left w:type="dxa" w:w="130"/>
+              <w:bottom w:type="dxa" w:w="90"/>
+              <w:right w:type="dxa" w:w="130"/>
+            </w:tcMar>
+            <w:vAlign w:val="center"/>
+          </w:tcPr>
+          <w:p>
+            <w:pPr>
+              <w:spacing w:after="0" w:line="240"/>
+              <w:jc w:val="right"/>
+            </w:pPr>
+            <w:r>
+              <w:rPr>
+                <w:rFonts w:ascii="Calibri" w:cs="Calibri" w:eastAsia="Calibri" w:hAnsi="Calibri"/>
+                <w:b w:val="false"/>
+                <w:bCs w:val="false"/>
+                <w:i w:val="false"/>
+                <w:iCs w:val="false"/>
+                <w:color w:val="221E1F"/>
+                <w:sz w:val="20"/>
+                <w:szCs w:val="20"/>
+              </w:rPr>
+              <w:t xml:space="preserve">24</w:t>
+            </w:r>
+          </w:p>
+        </w:tc>
+        <w:tc>
+          <w:tcPr>
+            <w:tcW w:type="dxa" w:w="1638"/>
+            <w:tcBorders>
+              <w:top w:val="single" w:color="D6CFC6" w:sz="4"/>
+              <w:left w:val="single" w:color="D6CFC6" w:sz="4"/>
+              <w:bottom w:val="single" w:color="D6CFC6" w:sz="4"/>
+              <w:right w:val="single" w:color="D6CFC6" w:sz="4"/>
+            </w:tcBorders>
+            <w:tcMar>
+              <w:top w:type="dxa" w:w="90"/>
+              <w:left w:type="dxa" w:w="130"/>
+              <w:bottom w:type="dxa" w:w="90"/>
+              <w:right w:type="dxa" w:w="130"/>
+            </w:tcMar>
+            <w:vAlign w:val="center"/>
+          </w:tcPr>
+          <w:p>
+            <w:pPr>
+              <w:spacing w:after="0" w:line="240"/>
+              <w:jc w:val="right"/>
+            </w:pPr>
+            <w:r>
+              <w:rPr>
+                <w:rFonts w:ascii="Calibri" w:cs="Calibri" w:eastAsia="Calibri" w:hAnsi="Calibri"/>
+                <w:b w:val="false"/>
+                <w:bCs w:val="false"/>
+                <w:i w:val="false"/>
+                <w:iCs w:val="false"/>
+                <w:color w:val="221E1F"/>
+                <w:sz w:val="20"/>
+                <w:szCs w:val="20"/>
+              </w:rPr>
+              <w:t xml:space="preserve">R 22,800</w:t>
+            </w:r>
+          </w:p>
+        </w:tc>
+      </w:tr>
+      <w:tr>
+        <w:tc>
+          <w:tcPr>
+            <w:tcW w:type="dxa" w:w="5301"/>
+            <w:tcBorders>
+              <w:top w:val="single" w:color="D6CFC6" w:sz="4"/>
+              <w:left w:val="single" w:color="D6CFC6" w:sz="4"/>
+              <w:bottom w:val="single" w:color="D6CFC6" w:sz="4"/>
+              <w:right w:val="single" w:color="D6CFC6" w:sz="4"/>
+            </w:tcBorders>
             <w:shd w:fill="FCE8EB" w:color="auto" w:val="clear"/>
             <w:tcMar>
               <w:top w:type="dxa" w:w="90"/>
@@ -16443,7 +16740,7 @@
                 <w:sz w:val="20"/>
                 <w:szCs w:val="20"/>
               </w:rPr>
-              <w:t xml:space="preserve">176</w:t>
+              <w:t xml:space="preserve">180</w:t>
             </w:r>
           </w:p>
         </w:tc>
@@ -16481,7 +16778,7 @@
                 <w:sz w:val="20"/>
                 <w:szCs w:val="20"/>
               </w:rPr>
-              <w:t xml:space="preserve">1,408</w:t>
+              <w:t xml:space="preserve">1,440</w:t>
             </w:r>
           </w:p>
         </w:tc>
@@ -16519,7 +16816,7 @@
                 <w:sz w:val="20"/>
                 <w:szCs w:val="20"/>
               </w:rPr>
-              <w:t xml:space="preserve">R 1,337,600</w:t>
+              <w:t xml:space="preserve">R 1,368,000</w:t>
             </w:r>
           </w:p>
         </w:tc>
@@ -16558,7 +16855,7 @@
           <w:sz w:val="20"/>
           <w:szCs w:val="20"/>
         </w:rPr>
-        <w:t xml:space="preserve">The integration seams — payments, accounts, notifications, POS and courier — are 44 of the 176 days. None of them names a vendor, and none has to be rewritten when one is chosen: what remains per integration is an adapter against an interface that already exists and is already tested.</w:t>
+        <w:t xml:space="preserve">The integration seams — payments, accounts, notifications, POS and courier — are 44 of the 180 days. None of them names a vendor, and none has to be rewritten when one is chosen: what remains per integration is an adapter against an interface that already exists and is already tested.</w:t>
       </w:r>
     </w:p>
     <w:p>
@@ -18677,7 +18974,7 @@
                 <w:sz w:val="20"/>
                 <w:szCs w:val="20"/>
               </w:rPr>
-              <w:t xml:space="preserve">176</w:t>
+              <w:t xml:space="preserve">180</w:t>
             </w:r>
           </w:p>
         </w:tc>
@@ -18714,7 +19011,7 @@
                 <w:sz w:val="20"/>
                 <w:szCs w:val="20"/>
               </w:rPr>
-              <w:t xml:space="preserve">1,408</w:t>
+              <w:t xml:space="preserve">1,440</w:t>
             </w:r>
           </w:p>
         </w:tc>
@@ -18751,7 +19048,7 @@
                 <w:sz w:val="20"/>
                 <w:szCs w:val="20"/>
               </w:rPr>
-              <w:t xml:space="preserve">R 1,337,600</w:t>
+              <w:t xml:space="preserve">R 1,368,000</w:t>
             </w:r>
           </w:p>
         </w:tc>
@@ -18981,7 +19278,7 @@
                 <w:sz w:val="20"/>
                 <w:szCs w:val="20"/>
               </w:rPr>
-              <w:t xml:space="preserve">201</w:t>
+              <w:t xml:space="preserve">205</w:t>
             </w:r>
           </w:p>
         </w:tc>
@@ -19019,7 +19316,7 @@
                 <w:sz w:val="20"/>
                 <w:szCs w:val="20"/>
               </w:rPr>
-              <w:t xml:space="preserve">1,608</w:t>
+              <w:t xml:space="preserve">1,640</w:t>
             </w:r>
           </w:p>
         </w:tc>
@@ -19057,7 +19354,7 @@
                 <w:sz w:val="20"/>
                 <w:szCs w:val="20"/>
               </w:rPr>
-              <w:t xml:space="preserve">R 1,527,600</w:t>
+              <w:t xml:space="preserve">R 1,558,000</w:t>
             </w:r>
           </w:p>
         </w:tc>

</xml_diff>

<commit_message>
Reprice with the trading-hours workstream
182 delivered days, 25 remaining, 207 end to end. 817 tests in 40 files.

Co-Authored-By: Claude Opus 5 <noreply@anthropic.com>
Claude-Session: https://claude.ai/code/session_01B2xsFCpQEfEHuTCkYzyD13
</commit_message>
<xml_diff>
--- a/WEBSITE_COSTINGS.docx
+++ b/WEBSITE_COSTINGS.docx
@@ -1527,7 +1527,7 @@
                 <w:sz w:val="20"/>
                 <w:szCs w:val="20"/>
               </w:rPr>
-              <w:t xml:space="preserve">812</w:t>
+              <w:t xml:space="preserve">817</w:t>
             </w:r>
           </w:p>
         </w:tc>
@@ -1640,7 +1640,7 @@
                 <w:sz w:val="20"/>
                 <w:szCs w:val="20"/>
               </w:rPr>
-              <w:t xml:space="preserve">28,946</w:t>
+              <w:t xml:space="preserve">29,131</w:t>
             </w:r>
           </w:p>
         </w:tc>
@@ -1677,7 +1677,7 @@
                 <w:sz w:val="20"/>
                 <w:szCs w:val="20"/>
               </w:rPr>
-              <w:t xml:space="preserve">Application 12,519 · tests 10,926 · review build 2,563 · data, schema and tooling 2,130 · shared packages 808</w:t>
+              <w:t xml:space="preserve">Application 12,584 · tests 11,045 · review build 2,563 · data, schema and tooling 2,131 · shared packages 808</w:t>
             </w:r>
           </w:p>
         </w:tc>
@@ -1865,7 +1865,7 @@
                 <w:sz w:val="20"/>
                 <w:szCs w:val="20"/>
               </w:rPr>
-              <w:t xml:space="preserve">111</w:t>
+              <w:t xml:space="preserve">113</w:t>
             </w:r>
           </w:p>
         </w:tc>
@@ -3770,7 +3770,7 @@
                 <w:sz w:val="20"/>
                 <w:szCs w:val="20"/>
               </w:rPr>
-              <w:t xml:space="preserve">812 passing</w:t>
+              <w:t xml:space="preserve">817 passing</w:t>
             </w:r>
           </w:p>
         </w:tc>
@@ -6548,7 +6548,7 @@
                 <w:sz w:val="20"/>
                 <w:szCs w:val="20"/>
               </w:rPr>
-              <w:t xml:space="preserve">The suite as it stood at this workstream: the 812 tests now in 40 files grew with the workstreams below. Driven through route handlers rather than helpers</w:t>
+              <w:t xml:space="preserve">The suite as it stood at this workstream: the 817 tests now in 40 files grew with the workstreams below. Driven through route handlers rather than helpers</w:t>
             </w:r>
           </w:p>
         </w:tc>
@@ -10225,7 +10225,7 @@
                 <w:sz w:val="20"/>
                 <w:szCs w:val="20"/>
               </w:rPr>
-              <w:t xml:space="preserve">30</w:t>
+              <w:t xml:space="preserve">34</w:t>
             </w:r>
           </w:p>
         </w:tc>
@@ -10261,7 +10261,7 @@
                 <w:sz w:val="20"/>
                 <w:szCs w:val="20"/>
               </w:rPr>
-              <w:t xml:space="preserve">An operations console that can act</w:t>
+              <w:t xml:space="preserve">Trading hours, enforced</w:t>
             </w:r>
           </w:p>
         </w:tc>
@@ -10297,7 +10297,7 @@
                 <w:sz w:val="20"/>
                 <w:szCs w:val="20"/>
               </w:rPr>
-              <w:t xml:space="preserve">The Problems tab named an action — “worth retrying” — and did not provide it, and the suppression list offered nothing at all. A retry that refuses to send a handoff twice and refuses one the adapter called final, a restore that undoes a bounce but never a complaint, both reporting what happened rather than refreshing a list that looks unchanged. Plus the payment ledger, which was settled and reconciled by tests and shown to nobody, with the provider reference an operator needs to find a payment in the gateway’s dashboard</w:t>
+              <w:t xml:space="preserve">The site had displayed “Open” and “Closed” from the day it was built and checked neither, so an order at three in the morning was accepted, priced, confirmed and sent to a kitchen nobody was standing in. Refused on the server with the store’s own hours, and said on the checkout screen before the form rather than after it. Includes consolidating the two SAST clocks into one, and pinning the suite to a fixed moment — thirteen files place an order through the real route and had been passing all day and failing after 22:00</w:t>
             </w:r>
           </w:p>
         </w:tc>
@@ -10334,7 +10334,7 @@
                 <w:sz w:val="20"/>
                 <w:szCs w:val="20"/>
               </w:rPr>
-              <w:t xml:space="preserve">3</w:t>
+              <w:t xml:space="preserve">2</w:t>
             </w:r>
           </w:p>
         </w:tc>
@@ -10349,7 +10349,7 @@
               <w:bottom w:val="single" w:color="D6CFC6" w:sz="4"/>
               <w:right w:val="single" w:color="D6CFC6" w:sz="4"/>
             </w:tcBorders>
-            <w:shd w:fill="FCE8EB" w:color="auto" w:val="clear"/>
+            <w:shd w:fill="F7F5F2" w:color="auto" w:val="clear"/>
             <w:tcMar>
               <w:top w:type="dxa" w:w="90"/>
               <w:left w:type="dxa" w:w="130"/>
@@ -10362,6 +10362,43 @@
             <w:pPr>
               <w:spacing w:after="0" w:line="240"/>
               <w:jc w:val="center"/>
+            </w:pPr>
+            <w:r>
+              <w:rPr>
+                <w:rFonts w:ascii="Calibri" w:cs="Calibri" w:eastAsia="Calibri" w:hAnsi="Calibri"/>
+                <w:b w:val="false"/>
+                <w:bCs w:val="false"/>
+                <w:i w:val="false"/>
+                <w:iCs w:val="false"/>
+                <w:color w:val="221E1F"/>
+                <w:sz w:val="20"/>
+                <w:szCs w:val="20"/>
+              </w:rPr>
+              <w:t xml:space="preserve">30</w:t>
+            </w:r>
+          </w:p>
+        </w:tc>
+        <w:tc>
+          <w:tcPr>
+            <w:tcW w:type="dxa" w:w="3084"/>
+            <w:tcBorders>
+              <w:top w:val="single" w:color="D6CFC6" w:sz="4"/>
+              <w:left w:val="single" w:color="D6CFC6" w:sz="4"/>
+              <w:bottom w:val="single" w:color="D6CFC6" w:sz="4"/>
+              <w:right w:val="single" w:color="D6CFC6" w:sz="4"/>
+            </w:tcBorders>
+            <w:shd w:fill="F7F5F2" w:color="auto" w:val="clear"/>
+            <w:tcMar>
+              <w:top w:type="dxa" w:w="90"/>
+              <w:left w:type="dxa" w:w="130"/>
+              <w:bottom w:type="dxa" w:w="90"/>
+              <w:right w:type="dxa" w:w="130"/>
+            </w:tcMar>
+            <w:vAlign w:val="center"/>
+          </w:tcPr>
+          <w:p>
+            <w:pPr>
+              <w:spacing w:after="0" w:line="240"/>
             </w:pPr>
             <w:r>
               <w:rPr>
@@ -10374,13 +10411,90 @@
                 <w:sz w:val="20"/>
                 <w:szCs w:val="20"/>
               </w:rPr>
-              <w:t xml:space="preserve"/>
-            </w:r>
-          </w:p>
-        </w:tc>
-        <w:tc>
-          <w:tcPr>
-            <w:tcW w:type="dxa" w:w="3084"/>
+              <w:t xml:space="preserve">An operations console that can act</w:t>
+            </w:r>
+          </w:p>
+        </w:tc>
+        <w:tc>
+          <w:tcPr>
+            <w:tcW w:type="dxa" w:w="5108"/>
+            <w:tcBorders>
+              <w:top w:val="single" w:color="D6CFC6" w:sz="4"/>
+              <w:left w:val="single" w:color="D6CFC6" w:sz="4"/>
+              <w:bottom w:val="single" w:color="D6CFC6" w:sz="4"/>
+              <w:right w:val="single" w:color="D6CFC6" w:sz="4"/>
+            </w:tcBorders>
+            <w:shd w:fill="F7F5F2" w:color="auto" w:val="clear"/>
+            <w:tcMar>
+              <w:top w:type="dxa" w:w="90"/>
+              <w:left w:type="dxa" w:w="130"/>
+              <w:bottom w:type="dxa" w:w="90"/>
+              <w:right w:type="dxa" w:w="130"/>
+            </w:tcMar>
+            <w:vAlign w:val="center"/>
+          </w:tcPr>
+          <w:p>
+            <w:pPr>
+              <w:spacing w:after="0" w:line="240"/>
+            </w:pPr>
+            <w:r>
+              <w:rPr>
+                <w:rFonts w:ascii="Calibri" w:cs="Calibri" w:eastAsia="Calibri" w:hAnsi="Calibri"/>
+                <w:b w:val="false"/>
+                <w:bCs w:val="false"/>
+                <w:i w:val="false"/>
+                <w:iCs w:val="false"/>
+                <w:color w:val="221E1F"/>
+                <w:sz w:val="20"/>
+                <w:szCs w:val="20"/>
+              </w:rPr>
+              <w:t xml:space="preserve">The Problems tab named an action — “worth retrying” — and did not provide it, and the suppression list offered nothing at all. A retry that refuses to send a handoff twice and refuses one the adapter called final, a restore that undoes a bounce but never a complaint, both reporting what happened rather than refreshing a list that looks unchanged. Plus the payment ledger, which was settled and reconciled by tests and shown to nobody, with the provider reference an operator needs to find a payment in the gateway’s dashboard</w:t>
+            </w:r>
+          </w:p>
+        </w:tc>
+        <w:tc>
+          <w:tcPr>
+            <w:tcW w:type="dxa" w:w="964"/>
+            <w:tcBorders>
+              <w:top w:val="single" w:color="D6CFC6" w:sz="4"/>
+              <w:left w:val="single" w:color="D6CFC6" w:sz="4"/>
+              <w:bottom w:val="single" w:color="D6CFC6" w:sz="4"/>
+              <w:right w:val="single" w:color="D6CFC6" w:sz="4"/>
+            </w:tcBorders>
+            <w:shd w:fill="F7F5F2" w:color="auto" w:val="clear"/>
+            <w:tcMar>
+              <w:top w:type="dxa" w:w="90"/>
+              <w:left w:type="dxa" w:w="130"/>
+              <w:bottom w:type="dxa" w:w="90"/>
+              <w:right w:type="dxa" w:w="130"/>
+            </w:tcMar>
+            <w:vAlign w:val="center"/>
+          </w:tcPr>
+          <w:p>
+            <w:pPr>
+              <w:spacing w:after="0" w:line="240"/>
+              <w:jc w:val="right"/>
+            </w:pPr>
+            <w:r>
+              <w:rPr>
+                <w:rFonts w:ascii="Calibri" w:cs="Calibri" w:eastAsia="Calibri" w:hAnsi="Calibri"/>
+                <w:b w:val="false"/>
+                <w:bCs w:val="false"/>
+                <w:i w:val="false"/>
+                <w:iCs w:val="false"/>
+                <w:color w:val="221E1F"/>
+                <w:sz w:val="20"/>
+                <w:szCs w:val="20"/>
+              </w:rPr>
+              <w:t xml:space="preserve">3</w:t>
+            </w:r>
+          </w:p>
+        </w:tc>
+      </w:tr>
+      <w:tr>
+        <w:tc>
+          <w:tcPr>
+            <w:tcW w:type="dxa" w:w="482"/>
             <w:tcBorders>
               <w:top w:val="single" w:color="D6CFC6" w:sz="4"/>
               <w:left w:val="single" w:color="D6CFC6" w:sz="4"/>
@@ -10399,6 +10513,7 @@
           <w:p>
             <w:pPr>
               <w:spacing w:after="0" w:line="240"/>
+              <w:jc w:val="center"/>
             </w:pPr>
             <w:r>
               <w:rPr>
@@ -10411,13 +10526,13 @@
                 <w:sz w:val="20"/>
                 <w:szCs w:val="20"/>
               </w:rPr>
-              <w:t xml:space="preserve">Total</w:t>
-            </w:r>
-          </w:p>
-        </w:tc>
-        <w:tc>
-          <w:tcPr>
-            <w:tcW w:type="dxa" w:w="5108"/>
+              <w:t xml:space="preserve"/>
+            </w:r>
+          </w:p>
+        </w:tc>
+        <w:tc>
+          <w:tcPr>
+            <w:tcW w:type="dxa" w:w="3084"/>
             <w:tcBorders>
               <w:top w:val="single" w:color="D6CFC6" w:sz="4"/>
               <w:left w:val="single" w:color="D6CFC6" w:sz="4"/>
@@ -10448,13 +10563,13 @@
                 <w:sz w:val="20"/>
                 <w:szCs w:val="20"/>
               </w:rPr>
-              <w:t xml:space="preserve">Delivered scope</w:t>
-            </w:r>
-          </w:p>
-        </w:tc>
-        <w:tc>
-          <w:tcPr>
-            <w:tcW w:type="dxa" w:w="964"/>
+              <w:t xml:space="preserve">Total</w:t>
+            </w:r>
+          </w:p>
+        </w:tc>
+        <w:tc>
+          <w:tcPr>
+            <w:tcW w:type="dxa" w:w="5108"/>
             <w:tcBorders>
               <w:top w:val="single" w:color="D6CFC6" w:sz="4"/>
               <w:left w:val="single" w:color="D6CFC6" w:sz="4"/>
@@ -10473,7 +10588,6 @@
           <w:p>
             <w:pPr>
               <w:spacing w:after="0" w:line="240"/>
-              <w:jc w:val="right"/>
             </w:pPr>
             <w:r>
               <w:rPr>
@@ -10486,7 +10600,45 @@
                 <w:sz w:val="20"/>
                 <w:szCs w:val="20"/>
               </w:rPr>
-              <w:t xml:space="preserve">180</w:t>
+              <w:t xml:space="preserve">Delivered scope</w:t>
+            </w:r>
+          </w:p>
+        </w:tc>
+        <w:tc>
+          <w:tcPr>
+            <w:tcW w:type="dxa" w:w="964"/>
+            <w:tcBorders>
+              <w:top w:val="single" w:color="D6CFC6" w:sz="4"/>
+              <w:left w:val="single" w:color="D6CFC6" w:sz="4"/>
+              <w:bottom w:val="single" w:color="D6CFC6" w:sz="4"/>
+              <w:right w:val="single" w:color="D6CFC6" w:sz="4"/>
+            </w:tcBorders>
+            <w:shd w:fill="FCE8EB" w:color="auto" w:val="clear"/>
+            <w:tcMar>
+              <w:top w:type="dxa" w:w="90"/>
+              <w:left w:type="dxa" w:w="130"/>
+              <w:bottom w:type="dxa" w:w="90"/>
+              <w:right w:type="dxa" w:w="130"/>
+            </w:tcMar>
+            <w:vAlign w:val="center"/>
+          </w:tcPr>
+          <w:p>
+            <w:pPr>
+              <w:spacing w:after="0" w:line="240"/>
+              <w:jc w:val="right"/>
+            </w:pPr>
+            <w:r>
+              <w:rPr>
+                <w:rFonts w:ascii="Calibri" w:cs="Calibri" w:eastAsia="Calibri" w:hAnsi="Calibri"/>
+                <w:b/>
+                <w:bCs/>
+                <w:i w:val="false"/>
+                <w:iCs w:val="false"/>
+                <w:color w:val="221E1F"/>
+                <w:sz w:val="20"/>
+                <w:szCs w:val="20"/>
+              </w:rPr>
+              <w:t xml:space="preserve">182</w:t>
             </w:r>
           </w:p>
         </w:tc>
@@ -10538,7 +10690,7 @@
           <w:sz w:val="20"/>
           <w:szCs w:val="20"/>
         </w:rPr>
-        <w:t xml:space="preserve">28,946 hand-written lines over 180 days is about 161 a day. For tested, typed, reviewed production code that sits inside the normal 100–300 band, and lower than the 200 the first version of this document reconstructed — integration work carries more test and less code than storefront work does. The reconstruction is not inflated.</w:t>
+        <w:t xml:space="preserve">29,131 hand-written lines over 182 days is about 160 a day. For tested, typed, reviewed production code that sits inside the normal 100–300 band, and lower than the 200 the first version of this document reconstructed — integration work carries more test and less code than storefront work does. The reconstruction is not inflated.</w:t>
       </w:r>
     </w:p>
     <w:p>
@@ -10556,7 +10708,7 @@
           <w:sz w:val="20"/>
           <w:szCs w:val="20"/>
         </w:rPr>
-        <w:t xml:space="preserve">180 days is roughly 27 working weeks, or a little over six months for one person. Two people working in parallel would compress the calendar but not the total, and would add coordination cost.</w:t>
+        <w:t xml:space="preserve">182 days is roughly 27 working weeks, or a little over six months for one person. Two people working in parallel would compress the calendar but not the total, and would add coordination cost.</w:t>
       </w:r>
     </w:p>
     <w:p>
@@ -10627,7 +10779,7 @@
           <w:sz w:val="20"/>
           <w:szCs w:val="20"/>
         </w:rPr>
-        <w:t xml:space="preserve">Delivered scope: 180 days × 8 hours = 1440 hours.</w:t>
+        <w:t xml:space="preserve">Delivered scope: 182 days × 8 hours = 1456 hours.</w:t>
       </w:r>
     </w:p>
     <w:tbl>
@@ -10722,7 +10874,7 @@
                 <w:sz w:val="19"/>
                 <w:szCs w:val="19"/>
               </w:rPr>
-              <w:t xml:space="preserve">Cost of the 1440 hours (excl. VAT)</w:t>
+              <w:t xml:space="preserve">Cost of the 1456 hours (excl. VAT)</w:t>
             </w:r>
           </w:p>
         </w:tc>
@@ -10835,7 +10987,7 @@
                 <w:sz w:val="20"/>
                 <w:szCs w:val="20"/>
               </w:rPr>
-              <w:t xml:space="preserve">R 576,000</w:t>
+              <w:t xml:space="preserve">R 582,400</w:t>
             </w:r>
           </w:p>
         </w:tc>
@@ -10872,7 +11024,7 @@
                 <w:sz w:val="20"/>
                 <w:szCs w:val="20"/>
               </w:rPr>
-              <w:t xml:space="preserve">R 662,400</w:t>
+              <w:t xml:space="preserve">R 669,760</w:t>
             </w:r>
           </w:p>
         </w:tc>
@@ -10949,7 +11101,7 @@
                 <w:sz w:val="20"/>
                 <w:szCs w:val="20"/>
               </w:rPr>
-              <w:t xml:space="preserve">R 936,000</w:t>
+              <w:t xml:space="preserve">R 946,400</w:t>
             </w:r>
           </w:p>
         </w:tc>
@@ -10987,7 +11139,7 @@
                 <w:sz w:val="20"/>
                 <w:szCs w:val="20"/>
               </w:rPr>
-              <w:t xml:space="preserve">R 1,076,400</w:t>
+              <w:t xml:space="preserve">R 1,088,360</w:t>
             </w:r>
           </w:p>
         </w:tc>
@@ -11062,7 +11214,7 @@
                 <w:sz w:val="20"/>
                 <w:szCs w:val="20"/>
               </w:rPr>
-              <w:t xml:space="preserve">R 1,224,000</w:t>
+              <w:t xml:space="preserve">R 1,237,600</w:t>
             </w:r>
           </w:p>
         </w:tc>
@@ -11099,7 +11251,7 @@
                 <w:sz w:val="20"/>
                 <w:szCs w:val="20"/>
               </w:rPr>
-              <w:t xml:space="preserve">R 1,407,600</w:t>
+              <w:t xml:space="preserve">R 1,423,240</w:t>
             </w:r>
           </w:p>
         </w:tc>
@@ -11176,7 +11328,7 @@
                 <w:sz w:val="20"/>
                 <w:szCs w:val="20"/>
               </w:rPr>
-              <w:t xml:space="preserve">R 1,368,000</w:t>
+              <w:t xml:space="preserve">R 1,383,200</w:t>
             </w:r>
           </w:p>
         </w:tc>
@@ -11214,7 +11366,7 @@
                 <w:sz w:val="20"/>
                 <w:szCs w:val="20"/>
               </w:rPr>
-              <w:t xml:space="preserve">R 1,573,200</w:t>
+              <w:t xml:space="preserve">R 1,590,680</w:t>
             </w:r>
           </w:p>
         </w:tc>
@@ -11289,7 +11441,7 @@
                 <w:sz w:val="20"/>
                 <w:szCs w:val="20"/>
               </w:rPr>
-              <w:t xml:space="preserve">R 1,656,000</w:t>
+              <w:t xml:space="preserve">R 1,674,400</w:t>
             </w:r>
           </w:p>
         </w:tc>
@@ -11326,7 +11478,7 @@
                 <w:sz w:val="20"/>
                 <w:szCs w:val="20"/>
               </w:rPr>
-              <w:t xml:space="preserve">R 1,904,400</w:t>
+              <w:t xml:space="preserve">R 1,925,560</w:t>
             </w:r>
           </w:p>
         </w:tc>
@@ -11403,7 +11555,7 @@
                 <w:sz w:val="20"/>
                 <w:szCs w:val="20"/>
               </w:rPr>
-              <w:t xml:space="preserve">R 2,088,000</w:t>
+              <w:t xml:space="preserve">R 2,111,200</w:t>
             </w:r>
           </w:p>
         </w:tc>
@@ -11441,7 +11593,7 @@
                 <w:sz w:val="20"/>
                 <w:szCs w:val="20"/>
               </w:rPr>
-              <w:t xml:space="preserve">R 2,401,200</w:t>
+              <w:t xml:space="preserve">R 2,427,880</w:t>
             </w:r>
           </w:p>
         </w:tc>
@@ -11493,7 +11645,7 @@
           <w:sz w:val="20"/>
           <w:szCs w:val="20"/>
         </w:rPr>
-        <w:t xml:space="preserve">At an illustrative blended rate of R 950 an hour — chosen here only to make the rest of the document concrete — the delivered scope comes to R 1,368,000 excluding VAT, or R 1,573,200 including it. Replace the rate and every figure below moves proportionally.</w:t>
+        <w:t xml:space="preserve">At an illustrative blended rate of R 950 an hour — chosen here only to make the rest of the document concrete — the delivered scope comes to R 1,383,200 excluding VAT, or R 1,590,680 including it. Replace the rate and every figure below moves proportionally.</w:t>
       </w:r>
     </w:p>
     <w:p>
@@ -16552,7 +16704,7 @@
                 <w:sz w:val="20"/>
                 <w:szCs w:val="20"/>
               </w:rPr>
-              <w:t xml:space="preserve">An operations console that can act</w:t>
+              <w:t xml:space="preserve">Trading hours, enforced</w:t>
             </w:r>
           </w:p>
         </w:tc>
@@ -16589,7 +16741,7 @@
                 <w:sz w:val="20"/>
                 <w:szCs w:val="20"/>
               </w:rPr>
-              <w:t xml:space="preserve">3</w:t>
+              <w:t xml:space="preserve">2</w:t>
             </w:r>
           </w:p>
         </w:tc>
@@ -16626,7 +16778,7 @@
                 <w:sz w:val="20"/>
                 <w:szCs w:val="20"/>
               </w:rPr>
-              <w:t xml:space="preserve">24</w:t>
+              <w:t xml:space="preserve">16</w:t>
             </w:r>
           </w:p>
         </w:tc>
@@ -16663,7 +16815,7 @@
                 <w:sz w:val="20"/>
                 <w:szCs w:val="20"/>
               </w:rPr>
-              <w:t xml:space="preserve">R 22,800</w:t>
+              <w:t xml:space="preserve">R 15,200</w:t>
             </w:r>
           </w:p>
         </w:tc>
@@ -16678,6 +16830,159 @@
               <w:bottom w:val="single" w:color="D6CFC6" w:sz="4"/>
               <w:right w:val="single" w:color="D6CFC6" w:sz="4"/>
             </w:tcBorders>
+            <w:shd w:fill="F7F5F2" w:color="auto" w:val="clear"/>
+            <w:tcMar>
+              <w:top w:type="dxa" w:w="90"/>
+              <w:left w:type="dxa" w:w="130"/>
+              <w:bottom w:type="dxa" w:w="90"/>
+              <w:right w:type="dxa" w:w="130"/>
+            </w:tcMar>
+            <w:vAlign w:val="center"/>
+          </w:tcPr>
+          <w:p>
+            <w:pPr>
+              <w:spacing w:after="0" w:line="240"/>
+            </w:pPr>
+            <w:r>
+              <w:rPr>
+                <w:rFonts w:ascii="Calibri" w:cs="Calibri" w:eastAsia="Calibri" w:hAnsi="Calibri"/>
+                <w:b w:val="false"/>
+                <w:bCs w:val="false"/>
+                <w:i w:val="false"/>
+                <w:iCs w:val="false"/>
+                <w:color w:val="221E1F"/>
+                <w:sz w:val="20"/>
+                <w:szCs w:val="20"/>
+              </w:rPr>
+              <w:t xml:space="preserve">An operations console that can act</w:t>
+            </w:r>
+          </w:p>
+        </w:tc>
+        <w:tc>
+          <w:tcPr>
+            <w:tcW w:type="dxa" w:w="1157"/>
+            <w:tcBorders>
+              <w:top w:val="single" w:color="D6CFC6" w:sz="4"/>
+              <w:left w:val="single" w:color="D6CFC6" w:sz="4"/>
+              <w:bottom w:val="single" w:color="D6CFC6" w:sz="4"/>
+              <w:right w:val="single" w:color="D6CFC6" w:sz="4"/>
+            </w:tcBorders>
+            <w:shd w:fill="F7F5F2" w:color="auto" w:val="clear"/>
+            <w:tcMar>
+              <w:top w:type="dxa" w:w="90"/>
+              <w:left w:type="dxa" w:w="130"/>
+              <w:bottom w:type="dxa" w:w="90"/>
+              <w:right w:type="dxa" w:w="130"/>
+            </w:tcMar>
+            <w:vAlign w:val="center"/>
+          </w:tcPr>
+          <w:p>
+            <w:pPr>
+              <w:spacing w:after="0" w:line="240"/>
+              <w:jc w:val="right"/>
+            </w:pPr>
+            <w:r>
+              <w:rPr>
+                <w:rFonts w:ascii="Calibri" w:cs="Calibri" w:eastAsia="Calibri" w:hAnsi="Calibri"/>
+                <w:b w:val="false"/>
+                <w:bCs w:val="false"/>
+                <w:i w:val="false"/>
+                <w:iCs w:val="false"/>
+                <w:color w:val="221E1F"/>
+                <w:sz w:val="20"/>
+                <w:szCs w:val="20"/>
+              </w:rPr>
+              <w:t xml:space="preserve">3</w:t>
+            </w:r>
+          </w:p>
+        </w:tc>
+        <w:tc>
+          <w:tcPr>
+            <w:tcW w:type="dxa" w:w="1542"/>
+            <w:tcBorders>
+              <w:top w:val="single" w:color="D6CFC6" w:sz="4"/>
+              <w:left w:val="single" w:color="D6CFC6" w:sz="4"/>
+              <w:bottom w:val="single" w:color="D6CFC6" w:sz="4"/>
+              <w:right w:val="single" w:color="D6CFC6" w:sz="4"/>
+            </w:tcBorders>
+            <w:shd w:fill="F7F5F2" w:color="auto" w:val="clear"/>
+            <w:tcMar>
+              <w:top w:type="dxa" w:w="90"/>
+              <w:left w:type="dxa" w:w="130"/>
+              <w:bottom w:type="dxa" w:w="90"/>
+              <w:right w:type="dxa" w:w="130"/>
+            </w:tcMar>
+            <w:vAlign w:val="center"/>
+          </w:tcPr>
+          <w:p>
+            <w:pPr>
+              <w:spacing w:after="0" w:line="240"/>
+              <w:jc w:val="right"/>
+            </w:pPr>
+            <w:r>
+              <w:rPr>
+                <w:rFonts w:ascii="Calibri" w:cs="Calibri" w:eastAsia="Calibri" w:hAnsi="Calibri"/>
+                <w:b w:val="false"/>
+                <w:bCs w:val="false"/>
+                <w:i w:val="false"/>
+                <w:iCs w:val="false"/>
+                <w:color w:val="221E1F"/>
+                <w:sz w:val="20"/>
+                <w:szCs w:val="20"/>
+              </w:rPr>
+              <w:t xml:space="preserve">24</w:t>
+            </w:r>
+          </w:p>
+        </w:tc>
+        <w:tc>
+          <w:tcPr>
+            <w:tcW w:type="dxa" w:w="1638"/>
+            <w:tcBorders>
+              <w:top w:val="single" w:color="D6CFC6" w:sz="4"/>
+              <w:left w:val="single" w:color="D6CFC6" w:sz="4"/>
+              <w:bottom w:val="single" w:color="D6CFC6" w:sz="4"/>
+              <w:right w:val="single" w:color="D6CFC6" w:sz="4"/>
+            </w:tcBorders>
+            <w:shd w:fill="F7F5F2" w:color="auto" w:val="clear"/>
+            <w:tcMar>
+              <w:top w:type="dxa" w:w="90"/>
+              <w:left w:type="dxa" w:w="130"/>
+              <w:bottom w:type="dxa" w:w="90"/>
+              <w:right w:type="dxa" w:w="130"/>
+            </w:tcMar>
+            <w:vAlign w:val="center"/>
+          </w:tcPr>
+          <w:p>
+            <w:pPr>
+              <w:spacing w:after="0" w:line="240"/>
+              <w:jc w:val="right"/>
+            </w:pPr>
+            <w:r>
+              <w:rPr>
+                <w:rFonts w:ascii="Calibri" w:cs="Calibri" w:eastAsia="Calibri" w:hAnsi="Calibri"/>
+                <w:b w:val="false"/>
+                <w:bCs w:val="false"/>
+                <w:i w:val="false"/>
+                <w:iCs w:val="false"/>
+                <w:color w:val="221E1F"/>
+                <w:sz w:val="20"/>
+                <w:szCs w:val="20"/>
+              </w:rPr>
+              <w:t xml:space="preserve">R 22,800</w:t>
+            </w:r>
+          </w:p>
+        </w:tc>
+      </w:tr>
+      <w:tr>
+        <w:tc>
+          <w:tcPr>
+            <w:tcW w:type="dxa" w:w="5301"/>
+            <w:tcBorders>
+              <w:top w:val="single" w:color="D6CFC6" w:sz="4"/>
+              <w:left w:val="single" w:color="D6CFC6" w:sz="4"/>
+              <w:bottom w:val="single" w:color="D6CFC6" w:sz="4"/>
+              <w:right w:val="single" w:color="D6CFC6" w:sz="4"/>
+            </w:tcBorders>
             <w:shd w:fill="FCE8EB" w:color="auto" w:val="clear"/>
             <w:tcMar>
               <w:top w:type="dxa" w:w="90"/>
@@ -16740,7 +17045,7 @@
                 <w:sz w:val="20"/>
                 <w:szCs w:val="20"/>
               </w:rPr>
-              <w:t xml:space="preserve">180</w:t>
+              <w:t xml:space="preserve">182</w:t>
             </w:r>
           </w:p>
         </w:tc>
@@ -16778,7 +17083,7 @@
                 <w:sz w:val="20"/>
                 <w:szCs w:val="20"/>
               </w:rPr>
-              <w:t xml:space="preserve">1,440</w:t>
+              <w:t xml:space="preserve">1,456</w:t>
             </w:r>
           </w:p>
         </w:tc>
@@ -16816,7 +17121,7 @@
                 <w:sz w:val="20"/>
                 <w:szCs w:val="20"/>
               </w:rPr>
-              <w:t xml:space="preserve">R 1,368,000</w:t>
+              <w:t xml:space="preserve">R 1,383,200</w:t>
             </w:r>
           </w:p>
         </w:tc>
@@ -16855,7 +17160,7 @@
           <w:sz w:val="20"/>
           <w:szCs w:val="20"/>
         </w:rPr>
-        <w:t xml:space="preserve">The integration seams — payments, accounts, notifications, POS and courier — are 44 of the 180 days. None of them names a vendor, and none has to be rewritten when one is chosen: what remains per integration is an adapter against an interface that already exists and is already tested.</w:t>
+        <w:t xml:space="preserve">The integration seams — payments, accounts, notifications, POS and courier — are 44 of the 182 days. None of them names a vendor, and none has to be rewritten when one is chosen: what remains per integration is an adapter against an interface that already exists and is already tested.</w:t>
       </w:r>
     </w:p>
     <w:p>
@@ -18974,7 +19279,7 @@
                 <w:sz w:val="20"/>
                 <w:szCs w:val="20"/>
               </w:rPr>
-              <w:t xml:space="preserve">180</w:t>
+              <w:t xml:space="preserve">182</w:t>
             </w:r>
           </w:p>
         </w:tc>
@@ -19011,7 +19316,7 @@
                 <w:sz w:val="20"/>
                 <w:szCs w:val="20"/>
               </w:rPr>
-              <w:t xml:space="preserve">1,440</w:t>
+              <w:t xml:space="preserve">1,456</w:t>
             </w:r>
           </w:p>
         </w:tc>
@@ -19048,7 +19353,7 @@
                 <w:sz w:val="20"/>
                 <w:szCs w:val="20"/>
               </w:rPr>
-              <w:t xml:space="preserve">R 1,368,000</w:t>
+              <w:t xml:space="preserve">R 1,383,200</w:t>
             </w:r>
           </w:p>
         </w:tc>
@@ -19278,7 +19583,7 @@
                 <w:sz w:val="20"/>
                 <w:szCs w:val="20"/>
               </w:rPr>
-              <w:t xml:space="preserve">205</w:t>
+              <w:t xml:space="preserve">207</w:t>
             </w:r>
           </w:p>
         </w:tc>
@@ -19316,7 +19621,7 @@
                 <w:sz w:val="20"/>
                 <w:szCs w:val="20"/>
               </w:rPr>
-              <w:t xml:space="preserve">1,640</w:t>
+              <w:t xml:space="preserve">1,656</w:t>
             </w:r>
           </w:p>
         </w:tc>
@@ -19354,7 +19659,7 @@
                 <w:sz w:val="20"/>
                 <w:szCs w:val="20"/>
               </w:rPr>
-              <w:t xml:space="preserve">R 1,558,000</w:t>
+              <w:t xml:space="preserve">R 1,573,200</w:t>
             </w:r>
           </w:p>
         </w:tc>

</xml_diff>

<commit_message>
Reprice with the courier-ETA workstream
183 delivered days, 25 remaining, 208 end to end. 822 tests in 40 files.

Co-Authored-By: Claude Opus 5 <noreply@anthropic.com>
Claude-Session: https://claude.ai/code/session_01B2xsFCpQEfEHuTCkYzyD13
</commit_message>
<xml_diff>
--- a/WEBSITE_COSTINGS.docx
+++ b/WEBSITE_COSTINGS.docx
@@ -1527,7 +1527,7 @@
                 <w:sz w:val="20"/>
                 <w:szCs w:val="20"/>
               </w:rPr>
-              <w:t xml:space="preserve">817</w:t>
+              <w:t xml:space="preserve">822</w:t>
             </w:r>
           </w:p>
         </w:tc>
@@ -1640,7 +1640,7 @@
                 <w:sz w:val="20"/>
                 <w:szCs w:val="20"/>
               </w:rPr>
-              <w:t xml:space="preserve">29,131</w:t>
+              <w:t xml:space="preserve">29,271</w:t>
             </w:r>
           </w:p>
         </w:tc>
@@ -1677,7 +1677,7 @@
                 <w:sz w:val="20"/>
                 <w:szCs w:val="20"/>
               </w:rPr>
-              <w:t xml:space="preserve">Application 12,584 · tests 11,045 · review build 2,563 · data, schema and tooling 2,131 · shared packages 808</w:t>
+              <w:t xml:space="preserve">Application 12,637 · tests 11,117 · review build 2,563 · data, schema and tooling 2,132 · shared packages 822</w:t>
             </w:r>
           </w:p>
         </w:tc>
@@ -1865,7 +1865,7 @@
                 <w:sz w:val="20"/>
                 <w:szCs w:val="20"/>
               </w:rPr>
-              <w:t xml:space="preserve">113</w:t>
+              <w:t xml:space="preserve">115</w:t>
             </w:r>
           </w:p>
         </w:tc>
@@ -3770,7 +3770,7 @@
                 <w:sz w:val="20"/>
                 <w:szCs w:val="20"/>
               </w:rPr>
-              <w:t xml:space="preserve">817 passing</w:t>
+              <w:t xml:space="preserve">822 passing</w:t>
             </w:r>
           </w:p>
         </w:tc>
@@ -6548,7 +6548,7 @@
                 <w:sz w:val="20"/>
                 <w:szCs w:val="20"/>
               </w:rPr>
-              <w:t xml:space="preserve">The suite as it stood at this workstream: the 817 tests now in 40 files grew with the workstreams below. Driven through route handlers rather than helpers</w:t>
+              <w:t xml:space="preserve">The suite as it stood at this workstream: the 822 tests now in 40 files grew with the workstreams below. Driven through route handlers rather than helpers</w:t>
             </w:r>
           </w:p>
         </w:tc>
@@ -10374,7 +10374,7 @@
                 <w:sz w:val="20"/>
                 <w:szCs w:val="20"/>
               </w:rPr>
-              <w:t xml:space="preserve">30</w:t>
+              <w:t xml:space="preserve">35</w:t>
             </w:r>
           </w:p>
         </w:tc>
@@ -10411,7 +10411,7 @@
                 <w:sz w:val="20"/>
                 <w:szCs w:val="20"/>
               </w:rPr>
-              <w:t xml:space="preserve">An operations console that can act</w:t>
+              <w:t xml:space="preserve">The driver’s estimate</w:t>
             </w:r>
           </w:p>
         </w:tc>
@@ -10448,7 +10448,7 @@
                 <w:sz w:val="20"/>
                 <w:szCs w:val="20"/>
               </w:rPr>
-              <w:t xml:space="preserve">The Problems tab named an action — “worth retrying” — and did not provide it, and the suppression list offered nothing at all. A retry that refuses to send a handoff twice and refuses one the adapter called final, a restore that undoes a bounce but never a complaint, both reporting what happened rather than refreshing a list that looks unchanged. Plus the payment ledger, which was settled and reconciled by tests and shown to nobody, with the provider reference an operator needs to find a payment in the gateway’s dashboard</w:t>
+              <w:t xml:space="preserve">Uber sends an ETA on every courier position update; the webhook parsed it into a typed field and dropped it, so the journey showed the window quoted at checkout — a constant — for as long as a customer waited. Recorded before the status is read, because the events carrying an estimate are the ones that move no state; not put back onto a finished order; and labelled on the screen, because “from your driver” is a different promise from one made before anybody was dispatched</w:t>
             </w:r>
           </w:p>
         </w:tc>
@@ -10486,7 +10486,7 @@
                 <w:sz w:val="20"/>
                 <w:szCs w:val="20"/>
               </w:rPr>
-              <w:t xml:space="preserve">3</w:t>
+              <w:t xml:space="preserve">1</w:t>
             </w:r>
           </w:p>
         </w:tc>
@@ -10501,7 +10501,6 @@
               <w:bottom w:val="single" w:color="D6CFC6" w:sz="4"/>
               <w:right w:val="single" w:color="D6CFC6" w:sz="4"/>
             </w:tcBorders>
-            <w:shd w:fill="FCE8EB" w:color="auto" w:val="clear"/>
             <w:tcMar>
               <w:top w:type="dxa" w:w="90"/>
               <w:left w:type="dxa" w:w="130"/>
@@ -10514,6 +10513,42 @@
             <w:pPr>
               <w:spacing w:after="0" w:line="240"/>
               <w:jc w:val="center"/>
+            </w:pPr>
+            <w:r>
+              <w:rPr>
+                <w:rFonts w:ascii="Calibri" w:cs="Calibri" w:eastAsia="Calibri" w:hAnsi="Calibri"/>
+                <w:b w:val="false"/>
+                <w:bCs w:val="false"/>
+                <w:i w:val="false"/>
+                <w:iCs w:val="false"/>
+                <w:color w:val="221E1F"/>
+                <w:sz w:val="20"/>
+                <w:szCs w:val="20"/>
+              </w:rPr>
+              <w:t xml:space="preserve">30</w:t>
+            </w:r>
+          </w:p>
+        </w:tc>
+        <w:tc>
+          <w:tcPr>
+            <w:tcW w:type="dxa" w:w="3084"/>
+            <w:tcBorders>
+              <w:top w:val="single" w:color="D6CFC6" w:sz="4"/>
+              <w:left w:val="single" w:color="D6CFC6" w:sz="4"/>
+              <w:bottom w:val="single" w:color="D6CFC6" w:sz="4"/>
+              <w:right w:val="single" w:color="D6CFC6" w:sz="4"/>
+            </w:tcBorders>
+            <w:tcMar>
+              <w:top w:type="dxa" w:w="90"/>
+              <w:left w:type="dxa" w:w="130"/>
+              <w:bottom w:type="dxa" w:w="90"/>
+              <w:right w:type="dxa" w:w="130"/>
+            </w:tcMar>
+            <w:vAlign w:val="center"/>
+          </w:tcPr>
+          <w:p>
+            <w:pPr>
+              <w:spacing w:after="0" w:line="240"/>
             </w:pPr>
             <w:r>
               <w:rPr>
@@ -10526,13 +10561,88 @@
                 <w:sz w:val="20"/>
                 <w:szCs w:val="20"/>
               </w:rPr>
-              <w:t xml:space="preserve"/>
-            </w:r>
-          </w:p>
-        </w:tc>
-        <w:tc>
-          <w:tcPr>
-            <w:tcW w:type="dxa" w:w="3084"/>
+              <w:t xml:space="preserve">An operations console that can act</w:t>
+            </w:r>
+          </w:p>
+        </w:tc>
+        <w:tc>
+          <w:tcPr>
+            <w:tcW w:type="dxa" w:w="5108"/>
+            <w:tcBorders>
+              <w:top w:val="single" w:color="D6CFC6" w:sz="4"/>
+              <w:left w:val="single" w:color="D6CFC6" w:sz="4"/>
+              <w:bottom w:val="single" w:color="D6CFC6" w:sz="4"/>
+              <w:right w:val="single" w:color="D6CFC6" w:sz="4"/>
+            </w:tcBorders>
+            <w:tcMar>
+              <w:top w:type="dxa" w:w="90"/>
+              <w:left w:type="dxa" w:w="130"/>
+              <w:bottom w:type="dxa" w:w="90"/>
+              <w:right w:type="dxa" w:w="130"/>
+            </w:tcMar>
+            <w:vAlign w:val="center"/>
+          </w:tcPr>
+          <w:p>
+            <w:pPr>
+              <w:spacing w:after="0" w:line="240"/>
+            </w:pPr>
+            <w:r>
+              <w:rPr>
+                <w:rFonts w:ascii="Calibri" w:cs="Calibri" w:eastAsia="Calibri" w:hAnsi="Calibri"/>
+                <w:b w:val="false"/>
+                <w:bCs w:val="false"/>
+                <w:i w:val="false"/>
+                <w:iCs w:val="false"/>
+                <w:color w:val="221E1F"/>
+                <w:sz w:val="20"/>
+                <w:szCs w:val="20"/>
+              </w:rPr>
+              <w:t xml:space="preserve">The Problems tab named an action — “worth retrying” — and did not provide it, and the suppression list offered nothing at all. A retry that refuses to send a handoff twice and refuses one the adapter called final, a restore that undoes a bounce but never a complaint, both reporting what happened rather than refreshing a list that looks unchanged. Plus the payment ledger, which was settled and reconciled by tests and shown to nobody, with the provider reference an operator needs to find a payment in the gateway’s dashboard</w:t>
+            </w:r>
+          </w:p>
+        </w:tc>
+        <w:tc>
+          <w:tcPr>
+            <w:tcW w:type="dxa" w:w="964"/>
+            <w:tcBorders>
+              <w:top w:val="single" w:color="D6CFC6" w:sz="4"/>
+              <w:left w:val="single" w:color="D6CFC6" w:sz="4"/>
+              <w:bottom w:val="single" w:color="D6CFC6" w:sz="4"/>
+              <w:right w:val="single" w:color="D6CFC6" w:sz="4"/>
+            </w:tcBorders>
+            <w:tcMar>
+              <w:top w:type="dxa" w:w="90"/>
+              <w:left w:type="dxa" w:w="130"/>
+              <w:bottom w:type="dxa" w:w="90"/>
+              <w:right w:type="dxa" w:w="130"/>
+            </w:tcMar>
+            <w:vAlign w:val="center"/>
+          </w:tcPr>
+          <w:p>
+            <w:pPr>
+              <w:spacing w:after="0" w:line="240"/>
+              <w:jc w:val="right"/>
+            </w:pPr>
+            <w:r>
+              <w:rPr>
+                <w:rFonts w:ascii="Calibri" w:cs="Calibri" w:eastAsia="Calibri" w:hAnsi="Calibri"/>
+                <w:b w:val="false"/>
+                <w:bCs w:val="false"/>
+                <w:i w:val="false"/>
+                <w:iCs w:val="false"/>
+                <w:color w:val="221E1F"/>
+                <w:sz w:val="20"/>
+                <w:szCs w:val="20"/>
+              </w:rPr>
+              <w:t xml:space="preserve">3</w:t>
+            </w:r>
+          </w:p>
+        </w:tc>
+      </w:tr>
+      <w:tr>
+        <w:tc>
+          <w:tcPr>
+            <w:tcW w:type="dxa" w:w="482"/>
             <w:tcBorders>
               <w:top w:val="single" w:color="D6CFC6" w:sz="4"/>
               <w:left w:val="single" w:color="D6CFC6" w:sz="4"/>
@@ -10551,6 +10661,7 @@
           <w:p>
             <w:pPr>
               <w:spacing w:after="0" w:line="240"/>
+              <w:jc w:val="center"/>
             </w:pPr>
             <w:r>
               <w:rPr>
@@ -10563,13 +10674,13 @@
                 <w:sz w:val="20"/>
                 <w:szCs w:val="20"/>
               </w:rPr>
-              <w:t xml:space="preserve">Total</w:t>
-            </w:r>
-          </w:p>
-        </w:tc>
-        <w:tc>
-          <w:tcPr>
-            <w:tcW w:type="dxa" w:w="5108"/>
+              <w:t xml:space="preserve"/>
+            </w:r>
+          </w:p>
+        </w:tc>
+        <w:tc>
+          <w:tcPr>
+            <w:tcW w:type="dxa" w:w="3084"/>
             <w:tcBorders>
               <w:top w:val="single" w:color="D6CFC6" w:sz="4"/>
               <w:left w:val="single" w:color="D6CFC6" w:sz="4"/>
@@ -10600,13 +10711,13 @@
                 <w:sz w:val="20"/>
                 <w:szCs w:val="20"/>
               </w:rPr>
-              <w:t xml:space="preserve">Delivered scope</w:t>
-            </w:r>
-          </w:p>
-        </w:tc>
-        <w:tc>
-          <w:tcPr>
-            <w:tcW w:type="dxa" w:w="964"/>
+              <w:t xml:space="preserve">Total</w:t>
+            </w:r>
+          </w:p>
+        </w:tc>
+        <w:tc>
+          <w:tcPr>
+            <w:tcW w:type="dxa" w:w="5108"/>
             <w:tcBorders>
               <w:top w:val="single" w:color="D6CFC6" w:sz="4"/>
               <w:left w:val="single" w:color="D6CFC6" w:sz="4"/>
@@ -10625,7 +10736,6 @@
           <w:p>
             <w:pPr>
               <w:spacing w:after="0" w:line="240"/>
-              <w:jc w:val="right"/>
             </w:pPr>
             <w:r>
               <w:rPr>
@@ -10638,7 +10748,45 @@
                 <w:sz w:val="20"/>
                 <w:szCs w:val="20"/>
               </w:rPr>
-              <w:t xml:space="preserve">182</w:t>
+              <w:t xml:space="preserve">Delivered scope</w:t>
+            </w:r>
+          </w:p>
+        </w:tc>
+        <w:tc>
+          <w:tcPr>
+            <w:tcW w:type="dxa" w:w="964"/>
+            <w:tcBorders>
+              <w:top w:val="single" w:color="D6CFC6" w:sz="4"/>
+              <w:left w:val="single" w:color="D6CFC6" w:sz="4"/>
+              <w:bottom w:val="single" w:color="D6CFC6" w:sz="4"/>
+              <w:right w:val="single" w:color="D6CFC6" w:sz="4"/>
+            </w:tcBorders>
+            <w:shd w:fill="FCE8EB" w:color="auto" w:val="clear"/>
+            <w:tcMar>
+              <w:top w:type="dxa" w:w="90"/>
+              <w:left w:type="dxa" w:w="130"/>
+              <w:bottom w:type="dxa" w:w="90"/>
+              <w:right w:type="dxa" w:w="130"/>
+            </w:tcMar>
+            <w:vAlign w:val="center"/>
+          </w:tcPr>
+          <w:p>
+            <w:pPr>
+              <w:spacing w:after="0" w:line="240"/>
+              <w:jc w:val="right"/>
+            </w:pPr>
+            <w:r>
+              <w:rPr>
+                <w:rFonts w:ascii="Calibri" w:cs="Calibri" w:eastAsia="Calibri" w:hAnsi="Calibri"/>
+                <w:b/>
+                <w:bCs/>
+                <w:i w:val="false"/>
+                <w:iCs w:val="false"/>
+                <w:color w:val="221E1F"/>
+                <w:sz w:val="20"/>
+                <w:szCs w:val="20"/>
+              </w:rPr>
+              <w:t xml:space="preserve">183</w:t>
             </w:r>
           </w:p>
         </w:tc>
@@ -10690,7 +10838,7 @@
           <w:sz w:val="20"/>
           <w:szCs w:val="20"/>
         </w:rPr>
-        <w:t xml:space="preserve">29,131 hand-written lines over 182 days is about 160 a day. For tested, typed, reviewed production code that sits inside the normal 100–300 band, and lower than the 200 the first version of this document reconstructed — integration work carries more test and less code than storefront work does. The reconstruction is not inflated.</w:t>
+        <w:t xml:space="preserve">29,271 hand-written lines over 183 days is about 160 a day. For tested, typed, reviewed production code that sits inside the normal 100–300 band, and lower than the 200 the first version of this document reconstructed — integration work carries more test and less code than storefront work does. The reconstruction is not inflated.</w:t>
       </w:r>
     </w:p>
     <w:p>
@@ -10708,7 +10856,7 @@
           <w:sz w:val="20"/>
           <w:szCs w:val="20"/>
         </w:rPr>
-        <w:t xml:space="preserve">182 days is roughly 27 working weeks, or a little over six months for one person. Two people working in parallel would compress the calendar but not the total, and would add coordination cost.</w:t>
+        <w:t xml:space="preserve">183 days is roughly 27 working weeks, or a little over six months for one person. Two people working in parallel would compress the calendar but not the total, and would add coordination cost.</w:t>
       </w:r>
     </w:p>
     <w:p>
@@ -10779,7 +10927,7 @@
           <w:sz w:val="20"/>
           <w:szCs w:val="20"/>
         </w:rPr>
-        <w:t xml:space="preserve">Delivered scope: 182 days × 8 hours = 1456 hours.</w:t>
+        <w:t xml:space="preserve">Delivered scope: 183 days × 8 hours = 1464 hours.</w:t>
       </w:r>
     </w:p>
     <w:tbl>
@@ -10874,7 +11022,7 @@
                 <w:sz w:val="19"/>
                 <w:szCs w:val="19"/>
               </w:rPr>
-              <w:t xml:space="preserve">Cost of the 1456 hours (excl. VAT)</w:t>
+              <w:t xml:space="preserve">Cost of the 1464 hours (excl. VAT)</w:t>
             </w:r>
           </w:p>
         </w:tc>
@@ -10987,7 +11135,7 @@
                 <w:sz w:val="20"/>
                 <w:szCs w:val="20"/>
               </w:rPr>
-              <w:t xml:space="preserve">R 582,400</w:t>
+              <w:t xml:space="preserve">R 585,600</w:t>
             </w:r>
           </w:p>
         </w:tc>
@@ -11024,7 +11172,7 @@
                 <w:sz w:val="20"/>
                 <w:szCs w:val="20"/>
               </w:rPr>
-              <w:t xml:space="preserve">R 669,760</w:t>
+              <w:t xml:space="preserve">R 673,440</w:t>
             </w:r>
           </w:p>
         </w:tc>
@@ -11101,7 +11249,7 @@
                 <w:sz w:val="20"/>
                 <w:szCs w:val="20"/>
               </w:rPr>
-              <w:t xml:space="preserve">R 946,400</w:t>
+              <w:t xml:space="preserve">R 951,600</w:t>
             </w:r>
           </w:p>
         </w:tc>
@@ -11139,7 +11287,7 @@
                 <w:sz w:val="20"/>
                 <w:szCs w:val="20"/>
               </w:rPr>
-              <w:t xml:space="preserve">R 1,088,360</w:t>
+              <w:t xml:space="preserve">R 1,094,340</w:t>
             </w:r>
           </w:p>
         </w:tc>
@@ -11214,7 +11362,7 @@
                 <w:sz w:val="20"/>
                 <w:szCs w:val="20"/>
               </w:rPr>
-              <w:t xml:space="preserve">R 1,237,600</w:t>
+              <w:t xml:space="preserve">R 1,244,400</w:t>
             </w:r>
           </w:p>
         </w:tc>
@@ -11251,7 +11399,7 @@
                 <w:sz w:val="20"/>
                 <w:szCs w:val="20"/>
               </w:rPr>
-              <w:t xml:space="preserve">R 1,423,240</w:t>
+              <w:t xml:space="preserve">R 1,431,060</w:t>
             </w:r>
           </w:p>
         </w:tc>
@@ -11328,7 +11476,7 @@
                 <w:sz w:val="20"/>
                 <w:szCs w:val="20"/>
               </w:rPr>
-              <w:t xml:space="preserve">R 1,383,200</w:t>
+              <w:t xml:space="preserve">R 1,390,800</w:t>
             </w:r>
           </w:p>
         </w:tc>
@@ -11366,7 +11514,7 @@
                 <w:sz w:val="20"/>
                 <w:szCs w:val="20"/>
               </w:rPr>
-              <w:t xml:space="preserve">R 1,590,680</w:t>
+              <w:t xml:space="preserve">R 1,599,420</w:t>
             </w:r>
           </w:p>
         </w:tc>
@@ -11441,7 +11589,7 @@
                 <w:sz w:val="20"/>
                 <w:szCs w:val="20"/>
               </w:rPr>
-              <w:t xml:space="preserve">R 1,674,400</w:t>
+              <w:t xml:space="preserve">R 1,683,600</w:t>
             </w:r>
           </w:p>
         </w:tc>
@@ -11478,7 +11626,7 @@
                 <w:sz w:val="20"/>
                 <w:szCs w:val="20"/>
               </w:rPr>
-              <w:t xml:space="preserve">R 1,925,560</w:t>
+              <w:t xml:space="preserve">R 1,936,140</w:t>
             </w:r>
           </w:p>
         </w:tc>
@@ -11555,7 +11703,7 @@
                 <w:sz w:val="20"/>
                 <w:szCs w:val="20"/>
               </w:rPr>
-              <w:t xml:space="preserve">R 2,111,200</w:t>
+              <w:t xml:space="preserve">R 2,122,800</w:t>
             </w:r>
           </w:p>
         </w:tc>
@@ -11593,7 +11741,7 @@
                 <w:sz w:val="20"/>
                 <w:szCs w:val="20"/>
               </w:rPr>
-              <w:t xml:space="preserve">R 2,427,880</w:t>
+              <w:t xml:space="preserve">R 2,441,220</w:t>
             </w:r>
           </w:p>
         </w:tc>
@@ -11645,7 +11793,7 @@
           <w:sz w:val="20"/>
           <w:szCs w:val="20"/>
         </w:rPr>
-        <w:t xml:space="preserve">At an illustrative blended rate of R 950 an hour — chosen here only to make the rest of the document concrete — the delivered scope comes to R 1,383,200 excluding VAT, or R 1,590,680 including it. Replace the rate and every figure below moves proportionally.</w:t>
+        <w:t xml:space="preserve">At an illustrative blended rate of R 950 an hour — chosen here only to make the rest of the document concrete — the delivered scope comes to R 1,390,800 excluding VAT, or R 1,599,420 including it. Replace the rate and every figure below moves proportionally.</w:t>
       </w:r>
     </w:p>
     <w:p>
@@ -16854,7 +17002,7 @@
                 <w:sz w:val="20"/>
                 <w:szCs w:val="20"/>
               </w:rPr>
-              <w:t xml:space="preserve">An operations console that can act</w:t>
+              <w:t xml:space="preserve">The driver’s estimate</w:t>
             </w:r>
           </w:p>
         </w:tc>
@@ -16892,7 +17040,7 @@
                 <w:sz w:val="20"/>
                 <w:szCs w:val="20"/>
               </w:rPr>
-              <w:t xml:space="preserve">3</w:t>
+              <w:t xml:space="preserve">1</w:t>
             </w:r>
           </w:p>
         </w:tc>
@@ -16930,7 +17078,7 @@
                 <w:sz w:val="20"/>
                 <w:szCs w:val="20"/>
               </w:rPr>
-              <w:t xml:space="preserve">24</w:t>
+              <w:t xml:space="preserve">8</w:t>
             </w:r>
           </w:p>
         </w:tc>
@@ -16968,7 +17116,7 @@
                 <w:sz w:val="20"/>
                 <w:szCs w:val="20"/>
               </w:rPr>
-              <w:t xml:space="preserve">R 22,800</w:t>
+              <w:t xml:space="preserve">R 7,600</w:t>
             </w:r>
           </w:p>
         </w:tc>
@@ -16983,6 +17131,155 @@
               <w:bottom w:val="single" w:color="D6CFC6" w:sz="4"/>
               <w:right w:val="single" w:color="D6CFC6" w:sz="4"/>
             </w:tcBorders>
+            <w:tcMar>
+              <w:top w:type="dxa" w:w="90"/>
+              <w:left w:type="dxa" w:w="130"/>
+              <w:bottom w:type="dxa" w:w="90"/>
+              <w:right w:type="dxa" w:w="130"/>
+            </w:tcMar>
+            <w:vAlign w:val="center"/>
+          </w:tcPr>
+          <w:p>
+            <w:pPr>
+              <w:spacing w:after="0" w:line="240"/>
+            </w:pPr>
+            <w:r>
+              <w:rPr>
+                <w:rFonts w:ascii="Calibri" w:cs="Calibri" w:eastAsia="Calibri" w:hAnsi="Calibri"/>
+                <w:b w:val="false"/>
+                <w:bCs w:val="false"/>
+                <w:i w:val="false"/>
+                <w:iCs w:val="false"/>
+                <w:color w:val="221E1F"/>
+                <w:sz w:val="20"/>
+                <w:szCs w:val="20"/>
+              </w:rPr>
+              <w:t xml:space="preserve">An operations console that can act</w:t>
+            </w:r>
+          </w:p>
+        </w:tc>
+        <w:tc>
+          <w:tcPr>
+            <w:tcW w:type="dxa" w:w="1157"/>
+            <w:tcBorders>
+              <w:top w:val="single" w:color="D6CFC6" w:sz="4"/>
+              <w:left w:val="single" w:color="D6CFC6" w:sz="4"/>
+              <w:bottom w:val="single" w:color="D6CFC6" w:sz="4"/>
+              <w:right w:val="single" w:color="D6CFC6" w:sz="4"/>
+            </w:tcBorders>
+            <w:tcMar>
+              <w:top w:type="dxa" w:w="90"/>
+              <w:left w:type="dxa" w:w="130"/>
+              <w:bottom w:type="dxa" w:w="90"/>
+              <w:right w:type="dxa" w:w="130"/>
+            </w:tcMar>
+            <w:vAlign w:val="center"/>
+          </w:tcPr>
+          <w:p>
+            <w:pPr>
+              <w:spacing w:after="0" w:line="240"/>
+              <w:jc w:val="right"/>
+            </w:pPr>
+            <w:r>
+              <w:rPr>
+                <w:rFonts w:ascii="Calibri" w:cs="Calibri" w:eastAsia="Calibri" w:hAnsi="Calibri"/>
+                <w:b w:val="false"/>
+                <w:bCs w:val="false"/>
+                <w:i w:val="false"/>
+                <w:iCs w:val="false"/>
+                <w:color w:val="221E1F"/>
+                <w:sz w:val="20"/>
+                <w:szCs w:val="20"/>
+              </w:rPr>
+              <w:t xml:space="preserve">3</w:t>
+            </w:r>
+          </w:p>
+        </w:tc>
+        <w:tc>
+          <w:tcPr>
+            <w:tcW w:type="dxa" w:w="1542"/>
+            <w:tcBorders>
+              <w:top w:val="single" w:color="D6CFC6" w:sz="4"/>
+              <w:left w:val="single" w:color="D6CFC6" w:sz="4"/>
+              <w:bottom w:val="single" w:color="D6CFC6" w:sz="4"/>
+              <w:right w:val="single" w:color="D6CFC6" w:sz="4"/>
+            </w:tcBorders>
+            <w:tcMar>
+              <w:top w:type="dxa" w:w="90"/>
+              <w:left w:type="dxa" w:w="130"/>
+              <w:bottom w:type="dxa" w:w="90"/>
+              <w:right w:type="dxa" w:w="130"/>
+            </w:tcMar>
+            <w:vAlign w:val="center"/>
+          </w:tcPr>
+          <w:p>
+            <w:pPr>
+              <w:spacing w:after="0" w:line="240"/>
+              <w:jc w:val="right"/>
+            </w:pPr>
+            <w:r>
+              <w:rPr>
+                <w:rFonts w:ascii="Calibri" w:cs="Calibri" w:eastAsia="Calibri" w:hAnsi="Calibri"/>
+                <w:b w:val="false"/>
+                <w:bCs w:val="false"/>
+                <w:i w:val="false"/>
+                <w:iCs w:val="false"/>
+                <w:color w:val="221E1F"/>
+                <w:sz w:val="20"/>
+                <w:szCs w:val="20"/>
+              </w:rPr>
+              <w:t xml:space="preserve">24</w:t>
+            </w:r>
+          </w:p>
+        </w:tc>
+        <w:tc>
+          <w:tcPr>
+            <w:tcW w:type="dxa" w:w="1638"/>
+            <w:tcBorders>
+              <w:top w:val="single" w:color="D6CFC6" w:sz="4"/>
+              <w:left w:val="single" w:color="D6CFC6" w:sz="4"/>
+              <w:bottom w:val="single" w:color="D6CFC6" w:sz="4"/>
+              <w:right w:val="single" w:color="D6CFC6" w:sz="4"/>
+            </w:tcBorders>
+            <w:tcMar>
+              <w:top w:type="dxa" w:w="90"/>
+              <w:left w:type="dxa" w:w="130"/>
+              <w:bottom w:type="dxa" w:w="90"/>
+              <w:right w:type="dxa" w:w="130"/>
+            </w:tcMar>
+            <w:vAlign w:val="center"/>
+          </w:tcPr>
+          <w:p>
+            <w:pPr>
+              <w:spacing w:after="0" w:line="240"/>
+              <w:jc w:val="right"/>
+            </w:pPr>
+            <w:r>
+              <w:rPr>
+                <w:rFonts w:ascii="Calibri" w:cs="Calibri" w:eastAsia="Calibri" w:hAnsi="Calibri"/>
+                <w:b w:val="false"/>
+                <w:bCs w:val="false"/>
+                <w:i w:val="false"/>
+                <w:iCs w:val="false"/>
+                <w:color w:val="221E1F"/>
+                <w:sz w:val="20"/>
+                <w:szCs w:val="20"/>
+              </w:rPr>
+              <w:t xml:space="preserve">R 22,800</w:t>
+            </w:r>
+          </w:p>
+        </w:tc>
+      </w:tr>
+      <w:tr>
+        <w:tc>
+          <w:tcPr>
+            <w:tcW w:type="dxa" w:w="5301"/>
+            <w:tcBorders>
+              <w:top w:val="single" w:color="D6CFC6" w:sz="4"/>
+              <w:left w:val="single" w:color="D6CFC6" w:sz="4"/>
+              <w:bottom w:val="single" w:color="D6CFC6" w:sz="4"/>
+              <w:right w:val="single" w:color="D6CFC6" w:sz="4"/>
+            </w:tcBorders>
             <w:shd w:fill="FCE8EB" w:color="auto" w:val="clear"/>
             <w:tcMar>
               <w:top w:type="dxa" w:w="90"/>
@@ -17045,7 +17342,7 @@
                 <w:sz w:val="20"/>
                 <w:szCs w:val="20"/>
               </w:rPr>
-              <w:t xml:space="preserve">182</w:t>
+              <w:t xml:space="preserve">183</w:t>
             </w:r>
           </w:p>
         </w:tc>
@@ -17083,7 +17380,7 @@
                 <w:sz w:val="20"/>
                 <w:szCs w:val="20"/>
               </w:rPr>
-              <w:t xml:space="preserve">1,456</w:t>
+              <w:t xml:space="preserve">1,464</w:t>
             </w:r>
           </w:p>
         </w:tc>
@@ -17121,7 +17418,7 @@
                 <w:sz w:val="20"/>
                 <w:szCs w:val="20"/>
               </w:rPr>
-              <w:t xml:space="preserve">R 1,383,200</w:t>
+              <w:t xml:space="preserve">R 1,390,800</w:t>
             </w:r>
           </w:p>
         </w:tc>
@@ -17160,7 +17457,7 @@
           <w:sz w:val="20"/>
           <w:szCs w:val="20"/>
         </w:rPr>
-        <w:t xml:space="preserve">The integration seams — payments, accounts, notifications, POS and courier — are 44 of the 182 days. None of them names a vendor, and none has to be rewritten when one is chosen: what remains per integration is an adapter against an interface that already exists and is already tested.</w:t>
+        <w:t xml:space="preserve">The integration seams — payments, accounts, notifications, POS and courier — are 44 of the 183 days. None of them names a vendor, and none has to be rewritten when one is chosen: what remains per integration is an adapter against an interface that already exists and is already tested.</w:t>
       </w:r>
     </w:p>
     <w:p>
@@ -19279,7 +19576,7 @@
                 <w:sz w:val="20"/>
                 <w:szCs w:val="20"/>
               </w:rPr>
-              <w:t xml:space="preserve">182</w:t>
+              <w:t xml:space="preserve">183</w:t>
             </w:r>
           </w:p>
         </w:tc>
@@ -19316,7 +19613,7 @@
                 <w:sz w:val="20"/>
                 <w:szCs w:val="20"/>
               </w:rPr>
-              <w:t xml:space="preserve">1,456</w:t>
+              <w:t xml:space="preserve">1,464</w:t>
             </w:r>
           </w:p>
         </w:tc>
@@ -19353,7 +19650,7 @@
                 <w:sz w:val="20"/>
                 <w:szCs w:val="20"/>
               </w:rPr>
-              <w:t xml:space="preserve">R 1,383,200</w:t>
+              <w:t xml:space="preserve">R 1,390,800</w:t>
             </w:r>
           </w:p>
         </w:tc>
@@ -19583,7 +19880,7 @@
                 <w:sz w:val="20"/>
                 <w:szCs w:val="20"/>
               </w:rPr>
-              <w:t xml:space="preserve">207</w:t>
+              <w:t xml:space="preserve">208</w:t>
             </w:r>
           </w:p>
         </w:tc>
@@ -19621,7 +19918,7 @@
                 <w:sz w:val="20"/>
                 <w:szCs w:val="20"/>
               </w:rPr>
-              <w:t xml:space="preserve">1,656</w:t>
+              <w:t xml:space="preserve">1,664</w:t>
             </w:r>
           </w:p>
         </w:tc>
@@ -19659,7 +19956,7 @@
                 <w:sz w:val="20"/>
                 <w:szCs w:val="20"/>
               </w:rPr>
-              <w:t xml:space="preserve">R 1,573,200</w:t>
+              <w:t xml:space="preserve">R 1,580,800</w:t>
             </w:r>
           </w:p>
         </w:tc>

</xml_diff>

<commit_message>
Reprice with the error-boundary and rewards-ladder workstreams
186 delivered days, 25 remaining, 211 end to end. 837 tests in 41 files.

Co-Authored-By: Claude Opus 5 <noreply@anthropic.com>
Claude-Session: https://claude.ai/code/session_01B2xsFCpQEfEHuTCkYzyD13
</commit_message>
<xml_diff>
--- a/WEBSITE_COSTINGS.docx
+++ b/WEBSITE_COSTINGS.docx
@@ -1415,7 +1415,7 @@
                 <w:sz w:val="20"/>
                 <w:szCs w:val="20"/>
               </w:rPr>
-              <w:t xml:space="preserve">45</w:t>
+              <w:t xml:space="preserve">46</w:t>
             </w:r>
           </w:p>
         </w:tc>
@@ -1527,7 +1527,7 @@
                 <w:sz w:val="20"/>
                 <w:szCs w:val="20"/>
               </w:rPr>
-              <w:t xml:space="preserve">822</w:t>
+              <w:t xml:space="preserve">837</w:t>
             </w:r>
           </w:p>
         </w:tc>
@@ -1563,7 +1563,7 @@
                 <w:sz w:val="20"/>
                 <w:szCs w:val="20"/>
               </w:rPr>
-              <w:t xml:space="preserve">In 40 files; all passing</w:t>
+              <w:t xml:space="preserve">In 41 files; all passing</w:t>
             </w:r>
           </w:p>
         </w:tc>
@@ -1640,7 +1640,7 @@
                 <w:sz w:val="20"/>
                 <w:szCs w:val="20"/>
               </w:rPr>
-              <w:t xml:space="preserve">29,271</w:t>
+              <w:t xml:space="preserve">29,768</w:t>
             </w:r>
           </w:p>
         </w:tc>
@@ -1677,7 +1677,7 @@
                 <w:sz w:val="20"/>
                 <w:szCs w:val="20"/>
               </w:rPr>
-              <w:t xml:space="preserve">Application 12,637 · tests 11,117 · review build 2,563 · data, schema and tooling 2,132 · shared packages 822</w:t>
+              <w:t xml:space="preserve">Application 12,971 · tests 11,278 · review build 2,563 · data, schema and tooling 2,134 · shared packages 822</w:t>
             </w:r>
           </w:p>
         </w:tc>
@@ -1865,7 +1865,7 @@
                 <w:sz w:val="20"/>
                 <w:szCs w:val="20"/>
               </w:rPr>
-              <w:t xml:space="preserve">115</w:t>
+              <w:t xml:space="preserve">118</w:t>
             </w:r>
           </w:p>
         </w:tc>
@@ -3770,7 +3770,7 @@
                 <w:sz w:val="20"/>
                 <w:szCs w:val="20"/>
               </w:rPr>
-              <w:t xml:space="preserve">822 passing</w:t>
+              <w:t xml:space="preserve">837 passing</w:t>
             </w:r>
           </w:p>
         </w:tc>
@@ -3807,7 +3807,7 @@
                 <w:sz w:val="20"/>
                 <w:szCs w:val="20"/>
               </w:rPr>
-              <w:t xml:space="preserve">40 files, including four real worker processes racing on one file</w:t>
+              <w:t xml:space="preserve">41 files, including four real worker processes racing on one file</w:t>
             </w:r>
           </w:p>
         </w:tc>
@@ -6548,7 +6548,7 @@
                 <w:sz w:val="20"/>
                 <w:szCs w:val="20"/>
               </w:rPr>
-              <w:t xml:space="preserve">The suite as it stood at this workstream: the 822 tests now in 40 files grew with the workstreams below. Driven through route handlers rather than helpers</w:t>
+              <w:t xml:space="preserve">The suite as it stood at this workstream: the 837 tests now in 41 files grew with the workstreams below. Driven through route handlers rather than helpers</w:t>
             </w:r>
           </w:p>
         </w:tc>
@@ -10525,7 +10525,7 @@
                 <w:sz w:val="20"/>
                 <w:szCs w:val="20"/>
               </w:rPr>
-              <w:t xml:space="preserve">30</w:t>
+              <w:t xml:space="preserve">36</w:t>
             </w:r>
           </w:p>
         </w:tc>
@@ -10561,7 +10561,7 @@
                 <w:sz w:val="20"/>
                 <w:szCs w:val="20"/>
               </w:rPr>
-              <w:t xml:space="preserve">An operations console that can act</w:t>
+              <w:t xml:space="preserve">The screens for when things break</w:t>
             </w:r>
           </w:p>
         </w:tc>
@@ -10597,7 +10597,7 @@
                 <w:sz w:val="20"/>
                 <w:szCs w:val="20"/>
               </w:rPr>
-              <w:t xml:space="preserve">The Problems tab named an action — “worth retrying” — and did not provide it, and the suppression list offered nothing at all. A retry that refuses to send a handoff twice and refuses one the adapter called final, a restore that undoes a bounce but never a complaint, both reporting what happened rather than refreshing a list that looks unchanged. Plus the payment ledger, which was settled and reconciled by tests and shown to nobody, with the provider reference an operator needs to find a payment in the gateway’s dashboard</w:t>
+              <w:t xml:space="preserve">There were none: the product route calls notFound() deliberately, so a bad URL reached the framework’s bare default, and any render error showed a white page reading “Application error”. A branded 404 with somewhere to go, an error boundary that offers a retry first and shows an opaque reference for a telephone call, and a last-resort page that renders its own document because the root layout is what has failed. The accessibility scans now read the pages as well as the components</w:t>
             </w:r>
           </w:p>
         </w:tc>
@@ -10634,7 +10634,7 @@
                 <w:sz w:val="20"/>
                 <w:szCs w:val="20"/>
               </w:rPr>
-              <w:t xml:space="preserve">3</w:t>
+              <w:t xml:space="preserve">2</w:t>
             </w:r>
           </w:p>
         </w:tc>
@@ -10649,7 +10649,7 @@
               <w:bottom w:val="single" w:color="D6CFC6" w:sz="4"/>
               <w:right w:val="single" w:color="D6CFC6" w:sz="4"/>
             </w:tcBorders>
-            <w:shd w:fill="FCE8EB" w:color="auto" w:val="clear"/>
+            <w:shd w:fill="F7F5F2" w:color="auto" w:val="clear"/>
             <w:tcMar>
               <w:top w:type="dxa" w:w="90"/>
               <w:left w:type="dxa" w:w="130"/>
@@ -10662,6 +10662,43 @@
             <w:pPr>
               <w:spacing w:after="0" w:line="240"/>
               <w:jc w:val="center"/>
+            </w:pPr>
+            <w:r>
+              <w:rPr>
+                <w:rFonts w:ascii="Calibri" w:cs="Calibri" w:eastAsia="Calibri" w:hAnsi="Calibri"/>
+                <w:b w:val="false"/>
+                <w:bCs w:val="false"/>
+                <w:i w:val="false"/>
+                <w:iCs w:val="false"/>
+                <w:color w:val="221E1F"/>
+                <w:sz w:val="20"/>
+                <w:szCs w:val="20"/>
+              </w:rPr>
+              <w:t xml:space="preserve">37</w:t>
+            </w:r>
+          </w:p>
+        </w:tc>
+        <w:tc>
+          <w:tcPr>
+            <w:tcW w:type="dxa" w:w="3084"/>
+            <w:tcBorders>
+              <w:top w:val="single" w:color="D6CFC6" w:sz="4"/>
+              <w:left w:val="single" w:color="D6CFC6" w:sz="4"/>
+              <w:bottom w:val="single" w:color="D6CFC6" w:sz="4"/>
+              <w:right w:val="single" w:color="D6CFC6" w:sz="4"/>
+            </w:tcBorders>
+            <w:shd w:fill="F7F5F2" w:color="auto" w:val="clear"/>
+            <w:tcMar>
+              <w:top w:type="dxa" w:w="90"/>
+              <w:left w:type="dxa" w:w="130"/>
+              <w:bottom w:type="dxa" w:w="90"/>
+              <w:right w:type="dxa" w:w="130"/>
+            </w:tcMar>
+            <w:vAlign w:val="center"/>
+          </w:tcPr>
+          <w:p>
+            <w:pPr>
+              <w:spacing w:after="0" w:line="240"/>
             </w:pPr>
             <w:r>
               <w:rPr>
@@ -10674,7 +10711,121 @@
                 <w:sz w:val="20"/>
                 <w:szCs w:val="20"/>
               </w:rPr>
-              <w:t xml:space="preserve"/>
+              <w:t xml:space="preserve">The rewards ladder</w:t>
+            </w:r>
+          </w:p>
+        </w:tc>
+        <w:tc>
+          <w:tcPr>
+            <w:tcW w:type="dxa" w:w="5108"/>
+            <w:tcBorders>
+              <w:top w:val="single" w:color="D6CFC6" w:sz="4"/>
+              <w:left w:val="single" w:color="D6CFC6" w:sz="4"/>
+              <w:bottom w:val="single" w:color="D6CFC6" w:sz="4"/>
+              <w:right w:val="single" w:color="D6CFC6" w:sz="4"/>
+            </w:tcBorders>
+            <w:shd w:fill="F7F5F2" w:color="auto" w:val="clear"/>
+            <w:tcMar>
+              <w:top w:type="dxa" w:w="90"/>
+              <w:left w:type="dxa" w:w="130"/>
+              <w:bottom w:type="dxa" w:w="90"/>
+              <w:right w:type="dxa" w:w="130"/>
+            </w:tcMar>
+            <w:vAlign w:val="center"/>
+          </w:tcPr>
+          <w:p>
+            <w:pPr>
+              <w:spacing w:after="0" w:line="240"/>
+            </w:pPr>
+            <w:r>
+              <w:rPr>
+                <w:rFonts w:ascii="Calibri" w:cs="Calibri" w:eastAsia="Calibri" w:hAnsi="Calibri"/>
+                <w:b w:val="false"/>
+                <w:bCs w:val="false"/>
+                <w:i w:val="false"/>
+                <w:iCs w:val="false"/>
+                <w:color w:val="221E1F"/>
+                <w:sz w:val="20"/>
+                <w:szCs w:val="20"/>
+              </w:rPr>
+              <w:t xml:space="preserve">Three tiers were listed on the page and nothing worked out which one a customer had reached. The standing, the gap to the next rung, the boundary at the threshold rather than one point past it, and a note in the code for whoever wires in-store redemption — the tiers are lifetime points and the figure is a balance, which are the same number only while nothing spends them</w:t>
+            </w:r>
+          </w:p>
+        </w:tc>
+        <w:tc>
+          <w:tcPr>
+            <w:tcW w:type="dxa" w:w="964"/>
+            <w:tcBorders>
+              <w:top w:val="single" w:color="D6CFC6" w:sz="4"/>
+              <w:left w:val="single" w:color="D6CFC6" w:sz="4"/>
+              <w:bottom w:val="single" w:color="D6CFC6" w:sz="4"/>
+              <w:right w:val="single" w:color="D6CFC6" w:sz="4"/>
+            </w:tcBorders>
+            <w:shd w:fill="F7F5F2" w:color="auto" w:val="clear"/>
+            <w:tcMar>
+              <w:top w:type="dxa" w:w="90"/>
+              <w:left w:type="dxa" w:w="130"/>
+              <w:bottom w:type="dxa" w:w="90"/>
+              <w:right w:type="dxa" w:w="130"/>
+            </w:tcMar>
+            <w:vAlign w:val="center"/>
+          </w:tcPr>
+          <w:p>
+            <w:pPr>
+              <w:spacing w:after="0" w:line="240"/>
+              <w:jc w:val="right"/>
+            </w:pPr>
+            <w:r>
+              <w:rPr>
+                <w:rFonts w:ascii="Calibri" w:cs="Calibri" w:eastAsia="Calibri" w:hAnsi="Calibri"/>
+                <w:b w:val="false"/>
+                <w:bCs w:val="false"/>
+                <w:i w:val="false"/>
+                <w:iCs w:val="false"/>
+                <w:color w:val="221E1F"/>
+                <w:sz w:val="20"/>
+                <w:szCs w:val="20"/>
+              </w:rPr>
+              <w:t xml:space="preserve">1</w:t>
+            </w:r>
+          </w:p>
+        </w:tc>
+      </w:tr>
+      <w:tr>
+        <w:tc>
+          <w:tcPr>
+            <w:tcW w:type="dxa" w:w="482"/>
+            <w:tcBorders>
+              <w:top w:val="single" w:color="D6CFC6" w:sz="4"/>
+              <w:left w:val="single" w:color="D6CFC6" w:sz="4"/>
+              <w:bottom w:val="single" w:color="D6CFC6" w:sz="4"/>
+              <w:right w:val="single" w:color="D6CFC6" w:sz="4"/>
+            </w:tcBorders>
+            <w:tcMar>
+              <w:top w:type="dxa" w:w="90"/>
+              <w:left w:type="dxa" w:w="130"/>
+              <w:bottom w:type="dxa" w:w="90"/>
+              <w:right w:type="dxa" w:w="130"/>
+            </w:tcMar>
+            <w:vAlign w:val="center"/>
+          </w:tcPr>
+          <w:p>
+            <w:pPr>
+              <w:spacing w:after="0" w:line="240"/>
+              <w:jc w:val="center"/>
+            </w:pPr>
+            <w:r>
+              <w:rPr>
+                <w:rFonts w:ascii="Calibri" w:cs="Calibri" w:eastAsia="Calibri" w:hAnsi="Calibri"/>
+                <w:b w:val="false"/>
+                <w:bCs w:val="false"/>
+                <w:i w:val="false"/>
+                <w:iCs w:val="false"/>
+                <w:color w:val="221E1F"/>
+                <w:sz w:val="20"/>
+                <w:szCs w:val="20"/>
+              </w:rPr>
+              <w:t xml:space="preserve">30</w:t>
             </w:r>
           </w:p>
         </w:tc>
@@ -10687,7 +10838,6 @@
               <w:bottom w:val="single" w:color="D6CFC6" w:sz="4"/>
               <w:right w:val="single" w:color="D6CFC6" w:sz="4"/>
             </w:tcBorders>
-            <w:shd w:fill="FCE8EB" w:color="auto" w:val="clear"/>
             <w:tcMar>
               <w:top w:type="dxa" w:w="90"/>
               <w:left w:type="dxa" w:w="130"/>
@@ -10711,7 +10861,7 @@
                 <w:sz w:val="20"/>
                 <w:szCs w:val="20"/>
               </w:rPr>
-              <w:t xml:space="preserve">Total</w:t>
+              <w:t xml:space="preserve">An operations console that can act</w:t>
             </w:r>
           </w:p>
         </w:tc>
@@ -10724,6 +10874,81 @@
               <w:bottom w:val="single" w:color="D6CFC6" w:sz="4"/>
               <w:right w:val="single" w:color="D6CFC6" w:sz="4"/>
             </w:tcBorders>
+            <w:tcMar>
+              <w:top w:type="dxa" w:w="90"/>
+              <w:left w:type="dxa" w:w="130"/>
+              <w:bottom w:type="dxa" w:w="90"/>
+              <w:right w:type="dxa" w:w="130"/>
+            </w:tcMar>
+            <w:vAlign w:val="center"/>
+          </w:tcPr>
+          <w:p>
+            <w:pPr>
+              <w:spacing w:after="0" w:line="240"/>
+            </w:pPr>
+            <w:r>
+              <w:rPr>
+                <w:rFonts w:ascii="Calibri" w:cs="Calibri" w:eastAsia="Calibri" w:hAnsi="Calibri"/>
+                <w:b w:val="false"/>
+                <w:bCs w:val="false"/>
+                <w:i w:val="false"/>
+                <w:iCs w:val="false"/>
+                <w:color w:val="221E1F"/>
+                <w:sz w:val="20"/>
+                <w:szCs w:val="20"/>
+              </w:rPr>
+              <w:t xml:space="preserve">The Problems tab named an action — “worth retrying” — and did not provide it, and the suppression list offered nothing at all. A retry that refuses to send a handoff twice and refuses one the adapter called final, a restore that undoes a bounce but never a complaint, both reporting what happened rather than refreshing a list that looks unchanged. Plus the payment ledger, which was settled and reconciled by tests and shown to nobody, with the provider reference an operator needs to find a payment in the gateway’s dashboard</w:t>
+            </w:r>
+          </w:p>
+        </w:tc>
+        <w:tc>
+          <w:tcPr>
+            <w:tcW w:type="dxa" w:w="964"/>
+            <w:tcBorders>
+              <w:top w:val="single" w:color="D6CFC6" w:sz="4"/>
+              <w:left w:val="single" w:color="D6CFC6" w:sz="4"/>
+              <w:bottom w:val="single" w:color="D6CFC6" w:sz="4"/>
+              <w:right w:val="single" w:color="D6CFC6" w:sz="4"/>
+            </w:tcBorders>
+            <w:tcMar>
+              <w:top w:type="dxa" w:w="90"/>
+              <w:left w:type="dxa" w:w="130"/>
+              <w:bottom w:type="dxa" w:w="90"/>
+              <w:right w:type="dxa" w:w="130"/>
+            </w:tcMar>
+            <w:vAlign w:val="center"/>
+          </w:tcPr>
+          <w:p>
+            <w:pPr>
+              <w:spacing w:after="0" w:line="240"/>
+              <w:jc w:val="right"/>
+            </w:pPr>
+            <w:r>
+              <w:rPr>
+                <w:rFonts w:ascii="Calibri" w:cs="Calibri" w:eastAsia="Calibri" w:hAnsi="Calibri"/>
+                <w:b w:val="false"/>
+                <w:bCs w:val="false"/>
+                <w:i w:val="false"/>
+                <w:iCs w:val="false"/>
+                <w:color w:val="221E1F"/>
+                <w:sz w:val="20"/>
+                <w:szCs w:val="20"/>
+              </w:rPr>
+              <w:t xml:space="preserve">3</w:t>
+            </w:r>
+          </w:p>
+        </w:tc>
+      </w:tr>
+      <w:tr>
+        <w:tc>
+          <w:tcPr>
+            <w:tcW w:type="dxa" w:w="482"/>
+            <w:tcBorders>
+              <w:top w:val="single" w:color="D6CFC6" w:sz="4"/>
+              <w:left w:val="single" w:color="D6CFC6" w:sz="4"/>
+              <w:bottom w:val="single" w:color="D6CFC6" w:sz="4"/>
+              <w:right w:val="single" w:color="D6CFC6" w:sz="4"/>
+            </w:tcBorders>
             <w:shd w:fill="FCE8EB" w:color="auto" w:val="clear"/>
             <w:tcMar>
               <w:top w:type="dxa" w:w="90"/>
@@ -10736,6 +10961,7 @@
           <w:p>
             <w:pPr>
               <w:spacing w:after="0" w:line="240"/>
+              <w:jc w:val="center"/>
             </w:pPr>
             <w:r>
               <w:rPr>
@@ -10748,13 +10974,13 @@
                 <w:sz w:val="20"/>
                 <w:szCs w:val="20"/>
               </w:rPr>
-              <w:t xml:space="preserve">Delivered scope</w:t>
-            </w:r>
-          </w:p>
-        </w:tc>
-        <w:tc>
-          <w:tcPr>
-            <w:tcW w:type="dxa" w:w="964"/>
+              <w:t xml:space="preserve"/>
+            </w:r>
+          </w:p>
+        </w:tc>
+        <w:tc>
+          <w:tcPr>
+            <w:tcW w:type="dxa" w:w="3084"/>
             <w:tcBorders>
               <w:top w:val="single" w:color="D6CFC6" w:sz="4"/>
               <w:left w:val="single" w:color="D6CFC6" w:sz="4"/>
@@ -10773,7 +10999,6 @@
           <w:p>
             <w:pPr>
               <w:spacing w:after="0" w:line="240"/>
-              <w:jc w:val="right"/>
             </w:pPr>
             <w:r>
               <w:rPr>
@@ -10786,7 +11011,82 @@
                 <w:sz w:val="20"/>
                 <w:szCs w:val="20"/>
               </w:rPr>
-              <w:t xml:space="preserve">183</w:t>
+              <w:t xml:space="preserve">Total</w:t>
+            </w:r>
+          </w:p>
+        </w:tc>
+        <w:tc>
+          <w:tcPr>
+            <w:tcW w:type="dxa" w:w="5108"/>
+            <w:tcBorders>
+              <w:top w:val="single" w:color="D6CFC6" w:sz="4"/>
+              <w:left w:val="single" w:color="D6CFC6" w:sz="4"/>
+              <w:bottom w:val="single" w:color="D6CFC6" w:sz="4"/>
+              <w:right w:val="single" w:color="D6CFC6" w:sz="4"/>
+            </w:tcBorders>
+            <w:shd w:fill="FCE8EB" w:color="auto" w:val="clear"/>
+            <w:tcMar>
+              <w:top w:type="dxa" w:w="90"/>
+              <w:left w:type="dxa" w:w="130"/>
+              <w:bottom w:type="dxa" w:w="90"/>
+              <w:right w:type="dxa" w:w="130"/>
+            </w:tcMar>
+            <w:vAlign w:val="center"/>
+          </w:tcPr>
+          <w:p>
+            <w:pPr>
+              <w:spacing w:after="0" w:line="240"/>
+            </w:pPr>
+            <w:r>
+              <w:rPr>
+                <w:rFonts w:ascii="Calibri" w:cs="Calibri" w:eastAsia="Calibri" w:hAnsi="Calibri"/>
+                <w:b/>
+                <w:bCs/>
+                <w:i w:val="false"/>
+                <w:iCs w:val="false"/>
+                <w:color w:val="221E1F"/>
+                <w:sz w:val="20"/>
+                <w:szCs w:val="20"/>
+              </w:rPr>
+              <w:t xml:space="preserve">Delivered scope</w:t>
+            </w:r>
+          </w:p>
+        </w:tc>
+        <w:tc>
+          <w:tcPr>
+            <w:tcW w:type="dxa" w:w="964"/>
+            <w:tcBorders>
+              <w:top w:val="single" w:color="D6CFC6" w:sz="4"/>
+              <w:left w:val="single" w:color="D6CFC6" w:sz="4"/>
+              <w:bottom w:val="single" w:color="D6CFC6" w:sz="4"/>
+              <w:right w:val="single" w:color="D6CFC6" w:sz="4"/>
+            </w:tcBorders>
+            <w:shd w:fill="FCE8EB" w:color="auto" w:val="clear"/>
+            <w:tcMar>
+              <w:top w:type="dxa" w:w="90"/>
+              <w:left w:type="dxa" w:w="130"/>
+              <w:bottom w:type="dxa" w:w="90"/>
+              <w:right w:type="dxa" w:w="130"/>
+            </w:tcMar>
+            <w:vAlign w:val="center"/>
+          </w:tcPr>
+          <w:p>
+            <w:pPr>
+              <w:spacing w:after="0" w:line="240"/>
+              <w:jc w:val="right"/>
+            </w:pPr>
+            <w:r>
+              <w:rPr>
+                <w:rFonts w:ascii="Calibri" w:cs="Calibri" w:eastAsia="Calibri" w:hAnsi="Calibri"/>
+                <w:b/>
+                <w:bCs/>
+                <w:i w:val="false"/>
+                <w:iCs w:val="false"/>
+                <w:color w:val="221E1F"/>
+                <w:sz w:val="20"/>
+                <w:szCs w:val="20"/>
+              </w:rPr>
+              <w:t xml:space="preserve">186</w:t>
             </w:r>
           </w:p>
         </w:tc>
@@ -10838,7 +11138,7 @@
           <w:sz w:val="20"/>
           <w:szCs w:val="20"/>
         </w:rPr>
-        <w:t xml:space="preserve">29,271 hand-written lines over 183 days is about 160 a day. For tested, typed, reviewed production code that sits inside the normal 100–300 band, and lower than the 200 the first version of this document reconstructed — integration work carries more test and less code than storefront work does. The reconstruction is not inflated.</w:t>
+        <w:t xml:space="preserve">29,768 hand-written lines over 186 days is about 160 a day. For tested, typed, reviewed production code that sits inside the normal 100–300 band, and lower than the 200 the first version of this document reconstructed — integration work carries more test and less code than storefront work does. The reconstruction is not inflated.</w:t>
       </w:r>
     </w:p>
     <w:p>
@@ -10856,7 +11156,7 @@
           <w:sz w:val="20"/>
           <w:szCs w:val="20"/>
         </w:rPr>
-        <w:t xml:space="preserve">183 days is roughly 27 working weeks, or a little over six months for one person. Two people working in parallel would compress the calendar but not the total, and would add coordination cost.</w:t>
+        <w:t xml:space="preserve">186 days is roughly 27 working weeks, or a little over six months for one person. Two people working in parallel would compress the calendar but not the total, and would add coordination cost.</w:t>
       </w:r>
     </w:p>
     <w:p>
@@ -10927,7 +11227,7 @@
           <w:sz w:val="20"/>
           <w:szCs w:val="20"/>
         </w:rPr>
-        <w:t xml:space="preserve">Delivered scope: 183 days × 8 hours = 1464 hours.</w:t>
+        <w:t xml:space="preserve">Delivered scope: 186 days × 8 hours = 1488 hours.</w:t>
       </w:r>
     </w:p>
     <w:tbl>
@@ -11022,7 +11322,7 @@
                 <w:sz w:val="19"/>
                 <w:szCs w:val="19"/>
               </w:rPr>
-              <w:t xml:space="preserve">Cost of the 1464 hours (excl. VAT)</w:t>
+              <w:t xml:space="preserve">Cost of the 1488 hours (excl. VAT)</w:t>
             </w:r>
           </w:p>
         </w:tc>
@@ -11135,7 +11435,7 @@
                 <w:sz w:val="20"/>
                 <w:szCs w:val="20"/>
               </w:rPr>
-              <w:t xml:space="preserve">R 585,600</w:t>
+              <w:t xml:space="preserve">R 595,200</w:t>
             </w:r>
           </w:p>
         </w:tc>
@@ -11172,7 +11472,7 @@
                 <w:sz w:val="20"/>
                 <w:szCs w:val="20"/>
               </w:rPr>
-              <w:t xml:space="preserve">R 673,440</w:t>
+              <w:t xml:space="preserve">R 684,480</w:t>
             </w:r>
           </w:p>
         </w:tc>
@@ -11249,7 +11549,7 @@
                 <w:sz w:val="20"/>
                 <w:szCs w:val="20"/>
               </w:rPr>
-              <w:t xml:space="preserve">R 951,600</w:t>
+              <w:t xml:space="preserve">R 967,200</w:t>
             </w:r>
           </w:p>
         </w:tc>
@@ -11287,7 +11587,7 @@
                 <w:sz w:val="20"/>
                 <w:szCs w:val="20"/>
               </w:rPr>
-              <w:t xml:space="preserve">R 1,094,340</w:t>
+              <w:t xml:space="preserve">R 1,112,280</w:t>
             </w:r>
           </w:p>
         </w:tc>
@@ -11362,7 +11662,7 @@
                 <w:sz w:val="20"/>
                 <w:szCs w:val="20"/>
               </w:rPr>
-              <w:t xml:space="preserve">R 1,244,400</w:t>
+              <w:t xml:space="preserve">R 1,264,800</w:t>
             </w:r>
           </w:p>
         </w:tc>
@@ -11399,7 +11699,7 @@
                 <w:sz w:val="20"/>
                 <w:szCs w:val="20"/>
               </w:rPr>
-              <w:t xml:space="preserve">R 1,431,060</w:t>
+              <w:t xml:space="preserve">R 1,454,520</w:t>
             </w:r>
           </w:p>
         </w:tc>
@@ -11476,7 +11776,7 @@
                 <w:sz w:val="20"/>
                 <w:szCs w:val="20"/>
               </w:rPr>
-              <w:t xml:space="preserve">R 1,390,800</w:t>
+              <w:t xml:space="preserve">R 1,413,600</w:t>
             </w:r>
           </w:p>
         </w:tc>
@@ -11514,7 +11814,7 @@
                 <w:sz w:val="20"/>
                 <w:szCs w:val="20"/>
               </w:rPr>
-              <w:t xml:space="preserve">R 1,599,420</w:t>
+              <w:t xml:space="preserve">R 1,625,640</w:t>
             </w:r>
           </w:p>
         </w:tc>
@@ -11589,7 +11889,7 @@
                 <w:sz w:val="20"/>
                 <w:szCs w:val="20"/>
               </w:rPr>
-              <w:t xml:space="preserve">R 1,683,600</w:t>
+              <w:t xml:space="preserve">R 1,711,200</w:t>
             </w:r>
           </w:p>
         </w:tc>
@@ -11626,7 +11926,7 @@
                 <w:sz w:val="20"/>
                 <w:szCs w:val="20"/>
               </w:rPr>
-              <w:t xml:space="preserve">R 1,936,140</w:t>
+              <w:t xml:space="preserve">R 1,967,880</w:t>
             </w:r>
           </w:p>
         </w:tc>
@@ -11703,7 +12003,7 @@
                 <w:sz w:val="20"/>
                 <w:szCs w:val="20"/>
               </w:rPr>
-              <w:t xml:space="preserve">R 2,122,800</w:t>
+              <w:t xml:space="preserve">R 2,157,600</w:t>
             </w:r>
           </w:p>
         </w:tc>
@@ -11741,7 +12041,7 @@
                 <w:sz w:val="20"/>
                 <w:szCs w:val="20"/>
               </w:rPr>
-              <w:t xml:space="preserve">R 2,441,220</w:t>
+              <w:t xml:space="preserve">R 2,481,240</w:t>
             </w:r>
           </w:p>
         </w:tc>
@@ -11793,7 +12093,7 @@
           <w:sz w:val="20"/>
           <w:szCs w:val="20"/>
         </w:rPr>
-        <w:t xml:space="preserve">At an illustrative blended rate of R 950 an hour — chosen here only to make the rest of the document concrete — the delivered scope comes to R 1,390,800 excluding VAT, or R 1,599,420 including it. Replace the rate and every figure below moves proportionally.</w:t>
+        <w:t xml:space="preserve">At an illustrative blended rate of R 950 an hour — chosen here only to make the rest of the document concrete — the delivered scope comes to R 1,413,600 excluding VAT, or R 1,625,640 including it. Replace the rate and every figure below moves proportionally.</w:t>
       </w:r>
     </w:p>
     <w:p>
@@ -17154,7 +17454,7 @@
                 <w:sz w:val="20"/>
                 <w:szCs w:val="20"/>
               </w:rPr>
-              <w:t xml:space="preserve">An operations console that can act</w:t>
+              <w:t xml:space="preserve">The screens for when things break</w:t>
             </w:r>
           </w:p>
         </w:tc>
@@ -17191,7 +17491,7 @@
                 <w:sz w:val="20"/>
                 <w:szCs w:val="20"/>
               </w:rPr>
-              <w:t xml:space="preserve">3</w:t>
+              <w:t xml:space="preserve">2</w:t>
             </w:r>
           </w:p>
         </w:tc>
@@ -17228,7 +17528,7 @@
                 <w:sz w:val="20"/>
                 <w:szCs w:val="20"/>
               </w:rPr>
-              <w:t xml:space="preserve">24</w:t>
+              <w:t xml:space="preserve">16</w:t>
             </w:r>
           </w:p>
         </w:tc>
@@ -17265,7 +17565,7 @@
                 <w:sz w:val="20"/>
                 <w:szCs w:val="20"/>
               </w:rPr>
-              <w:t xml:space="preserve">R 22,800</w:t>
+              <w:t xml:space="preserve">R 15,200</w:t>
             </w:r>
           </w:p>
         </w:tc>
@@ -17280,6 +17580,308 @@
               <w:bottom w:val="single" w:color="D6CFC6" w:sz="4"/>
               <w:right w:val="single" w:color="D6CFC6" w:sz="4"/>
             </w:tcBorders>
+            <w:shd w:fill="F7F5F2" w:color="auto" w:val="clear"/>
+            <w:tcMar>
+              <w:top w:type="dxa" w:w="90"/>
+              <w:left w:type="dxa" w:w="130"/>
+              <w:bottom w:type="dxa" w:w="90"/>
+              <w:right w:type="dxa" w:w="130"/>
+            </w:tcMar>
+            <w:vAlign w:val="center"/>
+          </w:tcPr>
+          <w:p>
+            <w:pPr>
+              <w:spacing w:after="0" w:line="240"/>
+            </w:pPr>
+            <w:r>
+              <w:rPr>
+                <w:rFonts w:ascii="Calibri" w:cs="Calibri" w:eastAsia="Calibri" w:hAnsi="Calibri"/>
+                <w:b w:val="false"/>
+                <w:bCs w:val="false"/>
+                <w:i w:val="false"/>
+                <w:iCs w:val="false"/>
+                <w:color w:val="221E1F"/>
+                <w:sz w:val="20"/>
+                <w:szCs w:val="20"/>
+              </w:rPr>
+              <w:t xml:space="preserve">The rewards ladder</w:t>
+            </w:r>
+          </w:p>
+        </w:tc>
+        <w:tc>
+          <w:tcPr>
+            <w:tcW w:type="dxa" w:w="1157"/>
+            <w:tcBorders>
+              <w:top w:val="single" w:color="D6CFC6" w:sz="4"/>
+              <w:left w:val="single" w:color="D6CFC6" w:sz="4"/>
+              <w:bottom w:val="single" w:color="D6CFC6" w:sz="4"/>
+              <w:right w:val="single" w:color="D6CFC6" w:sz="4"/>
+            </w:tcBorders>
+            <w:shd w:fill="F7F5F2" w:color="auto" w:val="clear"/>
+            <w:tcMar>
+              <w:top w:type="dxa" w:w="90"/>
+              <w:left w:type="dxa" w:w="130"/>
+              <w:bottom w:type="dxa" w:w="90"/>
+              <w:right w:type="dxa" w:w="130"/>
+            </w:tcMar>
+            <w:vAlign w:val="center"/>
+          </w:tcPr>
+          <w:p>
+            <w:pPr>
+              <w:spacing w:after="0" w:line="240"/>
+              <w:jc w:val="right"/>
+            </w:pPr>
+            <w:r>
+              <w:rPr>
+                <w:rFonts w:ascii="Calibri" w:cs="Calibri" w:eastAsia="Calibri" w:hAnsi="Calibri"/>
+                <w:b w:val="false"/>
+                <w:bCs w:val="false"/>
+                <w:i w:val="false"/>
+                <w:iCs w:val="false"/>
+                <w:color w:val="221E1F"/>
+                <w:sz w:val="20"/>
+                <w:szCs w:val="20"/>
+              </w:rPr>
+              <w:t xml:space="preserve">1</w:t>
+            </w:r>
+          </w:p>
+        </w:tc>
+        <w:tc>
+          <w:tcPr>
+            <w:tcW w:type="dxa" w:w="1542"/>
+            <w:tcBorders>
+              <w:top w:val="single" w:color="D6CFC6" w:sz="4"/>
+              <w:left w:val="single" w:color="D6CFC6" w:sz="4"/>
+              <w:bottom w:val="single" w:color="D6CFC6" w:sz="4"/>
+              <w:right w:val="single" w:color="D6CFC6" w:sz="4"/>
+            </w:tcBorders>
+            <w:shd w:fill="F7F5F2" w:color="auto" w:val="clear"/>
+            <w:tcMar>
+              <w:top w:type="dxa" w:w="90"/>
+              <w:left w:type="dxa" w:w="130"/>
+              <w:bottom w:type="dxa" w:w="90"/>
+              <w:right w:type="dxa" w:w="130"/>
+            </w:tcMar>
+            <w:vAlign w:val="center"/>
+          </w:tcPr>
+          <w:p>
+            <w:pPr>
+              <w:spacing w:after="0" w:line="240"/>
+              <w:jc w:val="right"/>
+            </w:pPr>
+            <w:r>
+              <w:rPr>
+                <w:rFonts w:ascii="Calibri" w:cs="Calibri" w:eastAsia="Calibri" w:hAnsi="Calibri"/>
+                <w:b w:val="false"/>
+                <w:bCs w:val="false"/>
+                <w:i w:val="false"/>
+                <w:iCs w:val="false"/>
+                <w:color w:val="221E1F"/>
+                <w:sz w:val="20"/>
+                <w:szCs w:val="20"/>
+              </w:rPr>
+              <w:t xml:space="preserve">8</w:t>
+            </w:r>
+          </w:p>
+        </w:tc>
+        <w:tc>
+          <w:tcPr>
+            <w:tcW w:type="dxa" w:w="1638"/>
+            <w:tcBorders>
+              <w:top w:val="single" w:color="D6CFC6" w:sz="4"/>
+              <w:left w:val="single" w:color="D6CFC6" w:sz="4"/>
+              <w:bottom w:val="single" w:color="D6CFC6" w:sz="4"/>
+              <w:right w:val="single" w:color="D6CFC6" w:sz="4"/>
+            </w:tcBorders>
+            <w:shd w:fill="F7F5F2" w:color="auto" w:val="clear"/>
+            <w:tcMar>
+              <w:top w:type="dxa" w:w="90"/>
+              <w:left w:type="dxa" w:w="130"/>
+              <w:bottom w:type="dxa" w:w="90"/>
+              <w:right w:type="dxa" w:w="130"/>
+            </w:tcMar>
+            <w:vAlign w:val="center"/>
+          </w:tcPr>
+          <w:p>
+            <w:pPr>
+              <w:spacing w:after="0" w:line="240"/>
+              <w:jc w:val="right"/>
+            </w:pPr>
+            <w:r>
+              <w:rPr>
+                <w:rFonts w:ascii="Calibri" w:cs="Calibri" w:eastAsia="Calibri" w:hAnsi="Calibri"/>
+                <w:b w:val="false"/>
+                <w:bCs w:val="false"/>
+                <w:i w:val="false"/>
+                <w:iCs w:val="false"/>
+                <w:color w:val="221E1F"/>
+                <w:sz w:val="20"/>
+                <w:szCs w:val="20"/>
+              </w:rPr>
+              <w:t xml:space="preserve">R 7,600</w:t>
+            </w:r>
+          </w:p>
+        </w:tc>
+      </w:tr>
+      <w:tr>
+        <w:tc>
+          <w:tcPr>
+            <w:tcW w:type="dxa" w:w="5301"/>
+            <w:tcBorders>
+              <w:top w:val="single" w:color="D6CFC6" w:sz="4"/>
+              <w:left w:val="single" w:color="D6CFC6" w:sz="4"/>
+              <w:bottom w:val="single" w:color="D6CFC6" w:sz="4"/>
+              <w:right w:val="single" w:color="D6CFC6" w:sz="4"/>
+            </w:tcBorders>
+            <w:tcMar>
+              <w:top w:type="dxa" w:w="90"/>
+              <w:left w:type="dxa" w:w="130"/>
+              <w:bottom w:type="dxa" w:w="90"/>
+              <w:right w:type="dxa" w:w="130"/>
+            </w:tcMar>
+            <w:vAlign w:val="center"/>
+          </w:tcPr>
+          <w:p>
+            <w:pPr>
+              <w:spacing w:after="0" w:line="240"/>
+            </w:pPr>
+            <w:r>
+              <w:rPr>
+                <w:rFonts w:ascii="Calibri" w:cs="Calibri" w:eastAsia="Calibri" w:hAnsi="Calibri"/>
+                <w:b w:val="false"/>
+                <w:bCs w:val="false"/>
+                <w:i w:val="false"/>
+                <w:iCs w:val="false"/>
+                <w:color w:val="221E1F"/>
+                <w:sz w:val="20"/>
+                <w:szCs w:val="20"/>
+              </w:rPr>
+              <w:t xml:space="preserve">An operations console that can act</w:t>
+            </w:r>
+          </w:p>
+        </w:tc>
+        <w:tc>
+          <w:tcPr>
+            <w:tcW w:type="dxa" w:w="1157"/>
+            <w:tcBorders>
+              <w:top w:val="single" w:color="D6CFC6" w:sz="4"/>
+              <w:left w:val="single" w:color="D6CFC6" w:sz="4"/>
+              <w:bottom w:val="single" w:color="D6CFC6" w:sz="4"/>
+              <w:right w:val="single" w:color="D6CFC6" w:sz="4"/>
+            </w:tcBorders>
+            <w:tcMar>
+              <w:top w:type="dxa" w:w="90"/>
+              <w:left w:type="dxa" w:w="130"/>
+              <w:bottom w:type="dxa" w:w="90"/>
+              <w:right w:type="dxa" w:w="130"/>
+            </w:tcMar>
+            <w:vAlign w:val="center"/>
+          </w:tcPr>
+          <w:p>
+            <w:pPr>
+              <w:spacing w:after="0" w:line="240"/>
+              <w:jc w:val="right"/>
+            </w:pPr>
+            <w:r>
+              <w:rPr>
+                <w:rFonts w:ascii="Calibri" w:cs="Calibri" w:eastAsia="Calibri" w:hAnsi="Calibri"/>
+                <w:b w:val="false"/>
+                <w:bCs w:val="false"/>
+                <w:i w:val="false"/>
+                <w:iCs w:val="false"/>
+                <w:color w:val="221E1F"/>
+                <w:sz w:val="20"/>
+                <w:szCs w:val="20"/>
+              </w:rPr>
+              <w:t xml:space="preserve">3</w:t>
+            </w:r>
+          </w:p>
+        </w:tc>
+        <w:tc>
+          <w:tcPr>
+            <w:tcW w:type="dxa" w:w="1542"/>
+            <w:tcBorders>
+              <w:top w:val="single" w:color="D6CFC6" w:sz="4"/>
+              <w:left w:val="single" w:color="D6CFC6" w:sz="4"/>
+              <w:bottom w:val="single" w:color="D6CFC6" w:sz="4"/>
+              <w:right w:val="single" w:color="D6CFC6" w:sz="4"/>
+            </w:tcBorders>
+            <w:tcMar>
+              <w:top w:type="dxa" w:w="90"/>
+              <w:left w:type="dxa" w:w="130"/>
+              <w:bottom w:type="dxa" w:w="90"/>
+              <w:right w:type="dxa" w:w="130"/>
+            </w:tcMar>
+            <w:vAlign w:val="center"/>
+          </w:tcPr>
+          <w:p>
+            <w:pPr>
+              <w:spacing w:after="0" w:line="240"/>
+              <w:jc w:val="right"/>
+            </w:pPr>
+            <w:r>
+              <w:rPr>
+                <w:rFonts w:ascii="Calibri" w:cs="Calibri" w:eastAsia="Calibri" w:hAnsi="Calibri"/>
+                <w:b w:val="false"/>
+                <w:bCs w:val="false"/>
+                <w:i w:val="false"/>
+                <w:iCs w:val="false"/>
+                <w:color w:val="221E1F"/>
+                <w:sz w:val="20"/>
+                <w:szCs w:val="20"/>
+              </w:rPr>
+              <w:t xml:space="preserve">24</w:t>
+            </w:r>
+          </w:p>
+        </w:tc>
+        <w:tc>
+          <w:tcPr>
+            <w:tcW w:type="dxa" w:w="1638"/>
+            <w:tcBorders>
+              <w:top w:val="single" w:color="D6CFC6" w:sz="4"/>
+              <w:left w:val="single" w:color="D6CFC6" w:sz="4"/>
+              <w:bottom w:val="single" w:color="D6CFC6" w:sz="4"/>
+              <w:right w:val="single" w:color="D6CFC6" w:sz="4"/>
+            </w:tcBorders>
+            <w:tcMar>
+              <w:top w:type="dxa" w:w="90"/>
+              <w:left w:type="dxa" w:w="130"/>
+              <w:bottom w:type="dxa" w:w="90"/>
+              <w:right w:type="dxa" w:w="130"/>
+            </w:tcMar>
+            <w:vAlign w:val="center"/>
+          </w:tcPr>
+          <w:p>
+            <w:pPr>
+              <w:spacing w:after="0" w:line="240"/>
+              <w:jc w:val="right"/>
+            </w:pPr>
+            <w:r>
+              <w:rPr>
+                <w:rFonts w:ascii="Calibri" w:cs="Calibri" w:eastAsia="Calibri" w:hAnsi="Calibri"/>
+                <w:b w:val="false"/>
+                <w:bCs w:val="false"/>
+                <w:i w:val="false"/>
+                <w:iCs w:val="false"/>
+                <w:color w:val="221E1F"/>
+                <w:sz w:val="20"/>
+                <w:szCs w:val="20"/>
+              </w:rPr>
+              <w:t xml:space="preserve">R 22,800</w:t>
+            </w:r>
+          </w:p>
+        </w:tc>
+      </w:tr>
+      <w:tr>
+        <w:tc>
+          <w:tcPr>
+            <w:tcW w:type="dxa" w:w="5301"/>
+            <w:tcBorders>
+              <w:top w:val="single" w:color="D6CFC6" w:sz="4"/>
+              <w:left w:val="single" w:color="D6CFC6" w:sz="4"/>
+              <w:bottom w:val="single" w:color="D6CFC6" w:sz="4"/>
+              <w:right w:val="single" w:color="D6CFC6" w:sz="4"/>
+            </w:tcBorders>
             <w:shd w:fill="FCE8EB" w:color="auto" w:val="clear"/>
             <w:tcMar>
               <w:top w:type="dxa" w:w="90"/>
@@ -17342,7 +17944,7 @@
                 <w:sz w:val="20"/>
                 <w:szCs w:val="20"/>
               </w:rPr>
-              <w:t xml:space="preserve">183</w:t>
+              <w:t xml:space="preserve">186</w:t>
             </w:r>
           </w:p>
         </w:tc>
@@ -17380,7 +17982,7 @@
                 <w:sz w:val="20"/>
                 <w:szCs w:val="20"/>
               </w:rPr>
-              <w:t xml:space="preserve">1,464</w:t>
+              <w:t xml:space="preserve">1,488</w:t>
             </w:r>
           </w:p>
         </w:tc>
@@ -17418,7 +18020,7 @@
                 <w:sz w:val="20"/>
                 <w:szCs w:val="20"/>
               </w:rPr>
-              <w:t xml:space="preserve">R 1,390,800</w:t>
+              <w:t xml:space="preserve">R 1,413,600</w:t>
             </w:r>
           </w:p>
         </w:tc>
@@ -17457,7 +18059,7 @@
           <w:sz w:val="20"/>
           <w:szCs w:val="20"/>
         </w:rPr>
-        <w:t xml:space="preserve">The integration seams — payments, accounts, notifications, POS and courier — are 44 of the 183 days. None of them names a vendor, and none has to be rewritten when one is chosen: what remains per integration is an adapter against an interface that already exists and is already tested.</w:t>
+        <w:t xml:space="preserve">The integration seams — payments, accounts, notifications, POS and courier — are 44 of the 186 days. None of them names a vendor, and none has to be rewritten when one is chosen: what remains per integration is an adapter against an interface that already exists and is already tested.</w:t>
       </w:r>
     </w:p>
     <w:p>
@@ -19576,7 +20178,7 @@
                 <w:sz w:val="20"/>
                 <w:szCs w:val="20"/>
               </w:rPr>
-              <w:t xml:space="preserve">183</w:t>
+              <w:t xml:space="preserve">186</w:t>
             </w:r>
           </w:p>
         </w:tc>
@@ -19613,7 +20215,7 @@
                 <w:sz w:val="20"/>
                 <w:szCs w:val="20"/>
               </w:rPr>
-              <w:t xml:space="preserve">1,464</w:t>
+              <w:t xml:space="preserve">1,488</w:t>
             </w:r>
           </w:p>
         </w:tc>
@@ -19650,7 +20252,7 @@
                 <w:sz w:val="20"/>
                 <w:szCs w:val="20"/>
               </w:rPr>
-              <w:t xml:space="preserve">R 1,390,800</w:t>
+              <w:t xml:space="preserve">R 1,413,600</w:t>
             </w:r>
           </w:p>
         </w:tc>
@@ -19880,7 +20482,7 @@
                 <w:sz w:val="20"/>
                 <w:szCs w:val="20"/>
               </w:rPr>
-              <w:t xml:space="preserve">208</w:t>
+              <w:t xml:space="preserve">211</w:t>
             </w:r>
           </w:p>
         </w:tc>
@@ -19918,7 +20520,7 @@
                 <w:sz w:val="20"/>
                 <w:szCs w:val="20"/>
               </w:rPr>
-              <w:t xml:space="preserve">1,664</w:t>
+              <w:t xml:space="preserve">1,688</w:t>
             </w:r>
           </w:p>
         </w:tc>
@@ -19956,7 +20558,7 @@
                 <w:sz w:val="20"/>
                 <w:szCs w:val="20"/>
               </w:rPr>
-              <w:t xml:space="preserve">R 1,580,800</w:t>
+              <w:t xml:space="preserve">R 1,603,600</w:t>
             </w:r>
           </w:p>
         </w:tc>

</xml_diff>

<commit_message>
Narrow four exports nothing outside their own file used
A final sweep for unreachable code found none — every endpoint has a
caller, or is a webhook a vendor calls, or is the health check. What it
did find is four functions exported when nothing outside their module
uses them. An export says "this is part of my interface"; four of these
were saying it untruthfully.

paymentStatusFor is folded into paymentFor rather than hidden. Both
answered the same question and only one of them answers it usefully: the
narrower returns a status alone, and from a bare null a caller cannot
tell "no gateway on this deployment" from "not paid yet" — which is the
distinction the whole two-field shape exists to keep.

Co-Authored-By: Claude Opus 5 <noreply@anthropic.com>
Claude-Session: https://claude.ai/code/session_01B2xsFCpQEfEHuTCkYzyD13
</commit_message>
<xml_diff>
--- a/WEBSITE_COSTINGS.docx
+++ b/WEBSITE_COSTINGS.docx
@@ -449,7 +449,7 @@
                 <w:sz w:val="20"/>
                 <w:szCs w:val="20"/>
               </w:rPr>
-              <w:t xml:space="preserve">099e6cc</w:t>
+              <w:t xml:space="preserve">97fda59</w:t>
             </w:r>
           </w:p>
         </w:tc>
@@ -1640,7 +1640,7 @@
                 <w:sz w:val="20"/>
                 <w:szCs w:val="20"/>
               </w:rPr>
-              <w:t xml:space="preserve">29,854</w:t>
+              <w:t xml:space="preserve">29,858</w:t>
             </w:r>
           </w:p>
         </w:tc>
@@ -1677,7 +1677,7 @@
                 <w:sz w:val="20"/>
                 <w:szCs w:val="20"/>
               </w:rPr>
-              <w:t xml:space="preserve">Application 12,971 · tests 11,317 · review build 2,585 · data, schema and tooling 2,159 · shared packages 822</w:t>
+              <w:t xml:space="preserve">Application 12,975 · tests 11,317 · review build 2,585 · data, schema and tooling 2,159 · shared packages 822</w:t>
             </w:r>
           </w:p>
         </w:tc>
@@ -1865,7 +1865,7 @@
                 <w:sz w:val="20"/>
                 <w:szCs w:val="20"/>
               </w:rPr>
-              <w:t xml:space="preserve">120</w:t>
+              <w:t xml:space="preserve">121</w:t>
             </w:r>
           </w:p>
         </w:tc>
@@ -11290,7 +11290,7 @@
           <w:sz w:val="20"/>
           <w:szCs w:val="20"/>
         </w:rPr>
-        <w:t xml:space="preserve">29,854 hand-written lines over 187 days is about 160 a day. For tested, typed, reviewed production code that sits inside the normal 100–300 band, and lower than the 200 the first version of this document reconstructed — integration work carries more test and less code than storefront work does. The reconstruction is not inflated.</w:t>
+        <w:t xml:space="preserve">29,858 hand-written lines over 187 days is about 160 a day. For tested, typed, reviewed production code that sits inside the normal 100–300 band, and lower than the 200 the first version of this document reconstructed — integration work carries more test and less code than storefront work does. The reconstruction is not inflated.</w:t>
       </w:r>
     </w:p>
     <w:p>

</xml_diff>

<commit_message>
Restamp the audit at the commit it describes
Co-Authored-By: Claude Opus 5 <noreply@anthropic.com>
Claude-Session: https://claude.ai/code/session_01B2xsFCpQEfEHuTCkYzyD13
</commit_message>
<xml_diff>
--- a/WEBSITE_COSTINGS.docx
+++ b/WEBSITE_COSTINGS.docx
@@ -449,7 +449,7 @@
                 <w:sz w:val="20"/>
                 <w:szCs w:val="20"/>
               </w:rPr>
-              <w:t xml:space="preserve">9354925</w:t>
+              <w:t xml:space="preserve">4859976</w:t>
             </w:r>
           </w:p>
         </w:tc>
@@ -1865,7 +1865,7 @@
                 <w:sz w:val="20"/>
                 <w:szCs w:val="20"/>
               </w:rPr>
-              <w:t xml:space="preserve">132</w:t>
+              <w:t xml:space="preserve">133</w:t>
             </w:r>
           </w:p>
         </w:tc>

</xml_diff>